<commit_message>
Rehearsing Sovereignty: sourced introduction and full reference list
Rewrite the introduction in a plain scholarly register with real inline
citations (Lee 2018; Hogarth 2018; CNAS 2026; CSIS 2026; Sastry et al. 2024;
WSJ 2026; IISS 2026; Hendrycks, Schmidt & Wang 2025; Reshef Kera et al. 2026),
replace the 'wind tunnel' metaphor with the deliberative-vs-war-games framing,
and add a 14-item verified reference list. Rebuild the DOCX to match.

Co-Authored-By: Claude Opus 4.8 <noreply@anthropic.com>
</commit_message>
<xml_diff>
--- a/paper-rehearsing-sovereignty/Rehearsing-Sovereignty.docx
+++ b/paper-rehearsing-sovereignty/Rehearsing-Sovereignty.docx
@@ -38,7 +38,7 @@
     </w:p>
     <w:p>
       <w:r>
-        <w:t>The AI Cold War is usually told as a contest between the United States and China over the best models and the largest stock of compute. That telling assumes the nation-state is the unit of power, that winning means holding the best domestic system, and that authority follows capability. None of the three holds up well against current arrangements, and this article works out an alternative. We build on meta-sovereignty, the idea of authority performed through signals, imaginaries, and infrastructural promises rather than enforceable control, and we introduce synthetic rehearsal: a multi-agent language-model staging, with human intervention and prompt design as controls, that externalizes and lets us observe the maintenance work of performed sovereignty under live contestation. Three agents argue as China, the United States, and the European Union, each reading a distinct policy corpus, while human participants interrupt, reprompt, and summon guest agents. First-pass dictionary coding of thirty-seven substantive sessions finds the agents distinguishable along the lines they were designed to occupy, and finds their discourse moving from posture toward concession once humans intervene. The evidence is output-level. It carries no claim about model internals, real state intentions, or future outcomes. It is a wind tunnel, not a crystal ball.</w:t>
+        <w:t>The rivalry over artificial intelligence between the United States and China is commonly described as a race for the best models and the largest supply of compute. This description assumes that the nation-state is the unit of power, that winning means owning a sovereign AI system, and that authority follows capability. Current practice contradicts all three, since states now assert sovereignty through infrastructure they neither own nor operate, financed and controlled by others. We build on the concept of meta-sovereignty, which treats authority as performed through signals, imaginaries, and infrastructural promises rather than exercised through enforceable control. Meta-sovereignty has so far been studied only after the fact, from finished announcements. We add a way to observe it as it happens. Synthetic rehearsal stages performed sovereignty with language-model agents and treats human intervention and prompt design as experimental controls. Three agents argue as China, the United States, and the European Union, each grounded in a distinct policy corpus, while participants interrupt them, reprompt them, and introduce further agents. A first pass of dictionary coding over thirty-seven substantive sessions shows that the agents remain distinguishable along their assigned positions, and that their discourse moves from confrontation toward concession after a human intervenes. The method yields evidence about what is said, not about model internals, state intentions, or future events. Its aim is deliberative rather than predictive. Where war games are held privately among security professionals, a synthetic rehearsal is inexpensive and repeatable, and it lets citizens, civil-society organizations, and elected representatives question the positions of the major powers and examine which AI futures they would defend.</w:t>
       </w:r>
     </w:p>
     <w:p>
@@ -51,27 +51,32 @@
     </w:p>
     <w:p>
       <w:r>
-        <w:t>The dominant story about artificial intelligence and great-power rivalry is a race: two powers competing to train the best models and amass the most compute, with victory going to whichever assembles the strongest domestic system. The story is intuitive and it organizes much of the policy commentary, but it rests on three assumptions that the present arrangement does not bear out. It treats the nation-state as the natural unit of power. It equates winning with holding the best system inside one's own borders. And it assumes that authority follows capability, so that whoever builds the most will command the most. If any of these fails, the race metaphor stops explaining what states are actually doing when they invoke AI, and the events of 2025 and 2026 fail all three at once.</w:t>
+        <w:t>The rivalry over artificial intelligence is commonly told as a race between the United States and China to train the best models and amass the most compute, an account that has shaped popular and policy discussion since the late 2010s (Lee, 2018; Hogarth, 2018). The account rests on three assumptions. It treats the nation-state as the natural unit of power. It equates winning with holding the best system inside one's own borders. And it assumes that authority follows capability, so that whoever builds the most will command the most. If any assumption fails, the race stops describing what states are actually doing when they invoke AI. The developments of 2025 and 2026 fail all three together.</w:t>
       </w:r>
     </w:p>
     <w:p>
       <w:r>
-        <w:t>Consider the count. The Center for a New American Security records one hundred and eighty-four government-backed sovereign-AI projects across sixty-seven states, most of them dependent on foreign chips, clouds, or models. Taken as a count of announcements the figure is neutral, but read against the dependence it exposes it says something the race framing cannot accommodate: states are declaring sovereignty through infrastructure they do not control, so capability and authority have come apart rather than moved together. A second episode points the same way. The Wall Street Journal reports that access to Nvidia chips figured in the diplomacy around the Armenia-Azerbaijan settlement. Whatever the exact mechanism, chip access there works less as a measure of who holds the best model than as a bargaining instrument, a signal traded among parties none of whom is the strongest builder. In both cases the medium of the performance is the stack itself, and the actors who matter extend well beyond the two presumed racers.</w:t>
+        <w:t>Consider the count. The Center for a New American Security records one hundred and eighty-four government-backed sovereign-AI projects across sixty-seven states, most of them dependent on foreign chips, clouds, or models (CNAS, 2026). As a tally of announcements the figure is neutral. Read against the dependence it exposes, it registers something the race cannot accommodate: states declare sovereignty through infrastructure they do not control, so capability and authority come apart rather than move together. The instrument of leverage has also shifted from ownership to access. The United States has extended control from the export of chips to the licensing of access to frontier models themselves (CSIS, 2026), and the diffusion of compute now turns on who grants entry to a supply chain rather than who holds it outright (Sastry et al., 2024). A single episode makes the point concrete. The promise of Nvidia chips reportedly figured in the diplomacy around the Armenia-Azerbaijan settlement (Wall Street Journal, 2026). Whatever the exact mechanism, chip access there worked less as a measure of who held the best model than as a bargaining instrument, a signal traded among parties none of whom was the strongest builder. Investment can deepen the same dependence it is meant to escape, as the Gulf states' infrastructure spending shows (IISS, 2026). In each case the medium of the performance is the stack itself, and the actors who matter extend well beyond the two presumed racers.</w:t>
       </w:r>
     </w:p>
     <w:p>
       <w:r>
-        <w:t>Meta-sovereignty offers a framing that fits these observations. Reshef Kera, Natan, Turgeman and Ofek (2026) describe authority performed through signals, imaginaries, and infrastructural promises rather than enforceable control, "a mode of rule sustained by infrastructures that do not yet exist, by fictions that persuade before they materialize, and by costly signals that substitute for control." Read this way the sovereign-AI wave is not a failure to achieve autonomy but a dramaturgy of autonomy, a performance whose currency is the promise. The account has one limit that bears on method. It works retrospectively, from finished pledges and announcements, so it can reconstruct the script after the curtain falls but cannot watch the performance being defended, revised, or refused while it runs.</w:t>
+        <w:t>Meta-sovereignty offers a framing that fits these observations. Reshef Kera, Natan, Turgeman and Ofek (2026) describe authority performed through signals, imaginaries, and infrastructural promises rather than enforceable control, "a mode of rule sustained by infrastructures that do not yet exist, by fictions that persuade before they materialize, and by costly signals that substitute for control." On this reading the sovereign-AI wave is not a failed bid for autonomy but a performance of autonomy whose currency is the promise. The account carries one limit that bears on method. It works retrospectively, from finished pledges, so it can reconstruct the script after the fact but cannot observe the performance being defended, revised, or refused while it runs.</w:t>
       </w:r>
     </w:p>
     <w:p>
       <w:r>
-        <w:t>We build an instrument for watching that maintenance work as it happens, and we name what the instrument produces. The instrument is a human-AI roundtable. Three language-model agents argue as China, the United States, and the European Union, each reading its own per-actor policy corpus, while human participants set the opening prompt, interrupt, reprompt, and summon guest agents into the room. The concept is synthetic rehearsal: a multi-agent language-model staging, with human intervention and prompt design as controls, that externalizes the maintenance work of performed sovereignty, along with its fracture points, so that both can be observed under live contestation. Three commitments bound what we claim. The evidence is output-level, consisting of transcripts and generated artifacts, and it licenses no inference about model internals or the real intentions of any state. The method studies how sovereignty imaginaries become legible, circulate, and are contested, and it neither forecasts outcomes nor measures capability. The models are trained on the same discourse the roundtable examines, so the rehearsal can reproduce the very imaginaries it interrogates, a reflexivity we treat as a standing limit rather than a defect to be argued away. The apparatus is a wind tunnel, not a crystal ball, and agency belongs to the arrangement as a whole, to models, corpora, prompts, interface, human participants, and audience together, never to any agent alone.</w:t>
+        <w:t>We build an instrument for observing that work as it happens, and we name what the instrument produces. The instrument is a human-AI roundtable. Three language-model agents argue as China, the United States, and the European Union, each reading its own policy corpus, while human participants set the opening prompt, interrupt, reprompt, and introduce further agents. The concept is synthetic rehearsal: a multi-agent language-model staging, with human intervention and prompt design as experimental controls, that externalizes the maintenance of performed sovereignty and its points of failure so that both can be observed under live contestation. Three commitments bound the claim. The evidence is output-level, consisting of transcripts and generated artifacts, and it licenses no inference about model internals or the real intentions of any state. The method studies how sovereignty imaginaries become legible, circulate, and are contested, and it neither forecasts outcomes nor measures capability. The models are trained on the same discourse the roundtable examines, so the rehearsal can reproduce the imaginaries it interrogates, a reflexivity we treat as a standing limit. Agency belongs to the arrangement as a whole, to models, corpora, prompts, interface, participants, and audience together, and not to any agent alone.</w:t>
       </w:r>
     </w:p>
     <w:p>
       <w:r>
-        <w:t>The rest of the article develops this in order. The next section places synthetic rehearsal in a genealogy running from Derrida's account of great-power conflict as "fabulously textual," through Fearon on costly signaling and Ezrahi on necessary fictions, to meta-sovereignty, and it states the gap each of these leaves open. A methods section sets out the roundtable, its three registers of debate, propaganda-lab, and mirror-world, and the coding scheme. A results section reports the first-pass dictionary coding over the substantive corpus, where the agents prove distinguishable along their designed lines and the discourse shifts from posture toward concession after human intervention. An interpretation section reads that corpus as a single performance viewed at increasing interpretive distance. The conclusion returns to the reflexivity limit and to what a wind tunnel for sovereignty can and cannot tell us.</w:t>
+        <w:t>The aim of the exercise is deliberative rather than predictive, and this distinguishes it from the war game it superficially resembles. War games and their recent AI variants rehearse conflict privately, among military and security professionals, and increasingly frame the field through deterrence and the risk of pre-emption (Hendrycks, Schmidt and Wang, 2025). A synthetic rehearsal reverses the access conditions. It is inexpensive and repeatable, and it admits citizens, civil-society organizations, and elected representatives into a room that is otherwise closed, where they can question the positions of the major powers and examine which AI futures they are prepared to defend before those futures are presented as settled.</w:t>
+      </w:r>
+    </w:p>
+    <w:p>
+      <w:r>
+        <w:t>The remainder of the article develops this in order. The next section places synthetic rehearsal in a genealogy running from Derrida's account of great-power conflict as "fabulously textual," through Fearon on costly signaling and Ezrahi on necessary fictions, to meta-sovereignty, and states the gap each of these leaves open. A methods section sets out the roundtable, its three registers of debate, propaganda-lab, and mirror-world, and the coding scheme. A results section reports the first-pass coding over the substantive corpus, where the agents prove distinguishable along their designed lines and the discourse shifts from confrontation toward concession after human intervention. An interpretation section reads that corpus as a single performance viewed at increasing interpretive distance. The conclusion returns to the reflexivity limit and to what the method can and cannot establish.</w:t>
       </w:r>
     </w:p>
     <w:p>
@@ -1531,7 +1536,7 @@
         <w:rPr>
           <w:sz w:val="20"/>
         </w:rPr>
-        <w:t>Reshef Kera, D., Natan, O., Turgeman, M., &amp; Ofek, H. (2026). Europe’s AI future as a meta-sovereign imaginary. European Journal of Futures Research, 14(1). doi:10.1186/s40309-025-00261-9</w:t>
+        <w:t>Center for a New American Security (2026). Sovereign AI’s Second Wave Is Coming Into View. CNAS Insights.</w:t>
       </w:r>
     </w:p>
     <w:p>
@@ -1542,7 +1547,18 @@
         <w:rPr>
           <w:sz w:val="20"/>
         </w:rPr>
-        <w:t>Derrida, J. (1984). No Apocalypse, Not Now. Diacritics, 14(2), 20–31.</w:t>
+        <w:t>Center for Strategic and International Studies (2026). The Department of Commerce Restricted Access to Anthropic’s Latest Models: What Comes Next.</w:t>
+      </w:r>
+    </w:p>
+    <w:p>
+      <w:pPr>
+        <w:pStyle w:val="ListNumber"/>
+      </w:pPr>
+      <w:r>
+        <w:rPr>
+          <w:sz w:val="20"/>
+        </w:rPr>
+        <w:t>Derrida, J. (1984). No Apocalypse, Not Now (Full Speed Ahead, Seven Missiles, Seven Missives). Diacritics, 14(2), 20–31.</w:t>
       </w:r>
     </w:p>
     <w:p>
@@ -1564,6 +1580,17 @@
         <w:rPr>
           <w:sz w:val="20"/>
         </w:rPr>
+        <w:t>Ezrahi, Y. (2012). Imagined Democracies: Necessary Political Fictions. Cambridge University Press.</w:t>
+      </w:r>
+    </w:p>
+    <w:p>
+      <w:pPr>
+        <w:pStyle w:val="ListNumber"/>
+      </w:pPr>
+      <w:r>
+        <w:rPr>
+          <w:sz w:val="20"/>
+        </w:rPr>
         <w:t>Fearon, J. D. (1995). Rationalist explanations for war. International Organization, 49(3), 379–414.</w:t>
       </w:r>
     </w:p>
@@ -1575,7 +1602,7 @@
         <w:rPr>
           <w:sz w:val="20"/>
         </w:rPr>
-        <w:t>Ezrahi, Y. (2012). Imagined Democracies: Necessary Political Fictions. Cambridge University Press.</w:t>
+        <w:t>Hendrycks, D., Schmidt, E., &amp; Wang, A. (2025). Superintelligence Strategy. arXiv:2503.05628.</w:t>
       </w:r>
     </w:p>
     <w:p>
@@ -1586,7 +1613,7 @@
         <w:rPr>
           <w:sz w:val="20"/>
         </w:rPr>
-        <w:t>Center for a New American Security (2026). Sovereign AI’s Second Wave. CNAS Insights.</w:t>
+        <w:t>Hogarth, I. (2018). AI Nationalism. ianhogarth.com, 13 June 2018.</w:t>
       </w:r>
     </w:p>
     <w:p>
@@ -1597,7 +1624,7 @@
         <w:rPr>
           <w:sz w:val="20"/>
         </w:rPr>
-        <w:t>Center for Strategic and International Studies (2026). Restricted access to frontier models: what comes next.</w:t>
+        <w:t>International Institute for Strategic Studies (2026). Gulf AI Infrastructure and the Limits of Technological Sovereignty. Strategic Comments.</w:t>
       </w:r>
     </w:p>
     <w:p>
@@ -1608,7 +1635,29 @@
         <w:rPr>
           <w:sz w:val="20"/>
         </w:rPr>
-        <w:t>International Institute for Strategic Studies (2026). Gulf AI infrastructure and the limits of technological sovereignty.</w:t>
+        <w:t>Lee, K.-F. (2018). AI Superpowers: China, Silicon Valley, and the New World Order. Houghton Mifflin Harcourt.</w:t>
+      </w:r>
+    </w:p>
+    <w:p>
+      <w:pPr>
+        <w:pStyle w:val="ListNumber"/>
+      </w:pPr>
+      <w:r>
+        <w:rPr>
+          <w:sz w:val="20"/>
+        </w:rPr>
+        <w:t>Reshef Kera, D., Natan, O., Turgeman, M., &amp; Ofek, H. (2026). Europe’s AI future as a meta-sovereign imaginary: negotiating global norms, sovereign machines, and infrastructural futures through AI simulations. European Journal of Futures Research, 14(1). doi:10.1186/s40309-025-00261-9</w:t>
+      </w:r>
+    </w:p>
+    <w:p>
+      <w:pPr>
+        <w:pStyle w:val="ListNumber"/>
+      </w:pPr>
+      <w:r>
+        <w:rPr>
+          <w:sz w:val="20"/>
+        </w:rPr>
+        <w:t>Sastry, G., Heim, L., Belfield, H., Anderljung, M., et al. (2024). Computing Power and the Governance of Artificial Intelligence. arXiv:2402.08797.</w:t>
       </w:r>
     </w:p>
     <w:p>
@@ -1620,6 +1669,17 @@
           <w:sz w:val="20"/>
         </w:rPr>
         <w:t>Spitz, A. (2026). AI Has a Territory: Data Centers, Sovereignty, and the Geopolitics of AI Infrastructure. Working paper.</w:t>
+      </w:r>
+    </w:p>
+    <w:p>
+      <w:pPr>
+        <w:pStyle w:val="ListNumber"/>
+      </w:pPr>
+      <w:r>
+        <w:rPr>
+          <w:sz w:val="20"/>
+        </w:rPr>
+        <w:t>Wall Street Journal (2026). U.S. Used Promise of Nvidia Chips to Broker Armenia–Azerbaijan Peace Deal.</w:t>
       </w:r>
     </w:p>
     <w:sectPr>

</xml_diff>

<commit_message>
DOCX: embed the three visualizations inline; add Schelling, Jervis, Weber references (23 total)
Co-Authored-By: Claude Opus 4.8 <noreply@anthropic.com>
</commit_message>
<xml_diff>
--- a/paper-rehearsing-sovereignty/Rehearsing-Sovereignty.docx
+++ b/paper-rehearsing-sovereignty/Rehearsing-Sovereignty.docx
@@ -70,19 +70,98 @@
         <w:rPr>
           <w:rFonts w:asciiTheme="minorBidi" w:hAnsiTheme="minorBidi"/>
         </w:rPr>
-        <w:t xml:space="preserve">The rivalry over artificial intelligence between the United States and China is usually described as a race for the best models and the largest supply of compute. That description assumes that the nation-state is the unit of power, that winning means owning a sovereign AI system, and that authority follows capability. Current practice contradicts all three. States now assert sovereignty through infrastructure they neither own nor operate, financed and controlled by others. </w:t>
-      </w:r>
-      <w:r>
-        <w:rPr>
-          <w:rFonts w:asciiTheme="minorBidi" w:hAnsiTheme="minorBidi"/>
-        </w:rPr>
-        <w:t>To capture this, w</w:t>
-      </w:r>
-      <w:r>
-        <w:rPr>
-          <w:rFonts w:asciiTheme="minorBidi" w:hAnsiTheme="minorBidi"/>
-        </w:rPr>
-        <w:t>e build on the concept of meta-sovereignty, which treats authority as performed through signals, imaginaries, and infrastructural promises rather than exercised through enforceable control. That concept has so far been studied only after the fact, from finished announcements, and we add a way to observe it while it happens. Synthetic rehearsal stages performed sovereignty with language-model agents, using human intervention and prompt design as experimental controls. Three agents argue as China, the United States, and the European Union, each grounded in a distinct policy corpus, while participants interrupt them, reprompt them, and introduce further agents. A first pass of dictionary coding over thirty-seven substantive sessions shows that the agents remain distinguishable along their assigned positions, and that their discourse moves from confrontation toward concession once a human intervenes. The method provides evidence about what the agents generate, not about model internals, state intentions, or future events. Its aim is deliberative rather than predictive. War games are held privately among security professionals. A synthetic rehearsal is inexpensive and repeatable, and it lets citizens, civil-society organizations, and elected representatives question the positions of the major powers and weigh which AI futures they would defend</w:t>
+        <w:t xml:space="preserve">The rivalry over artificial intelligence between the United States and China is usually described as a race for the best models and the largest supply of compute. That description assumes that the nation-state is the unit of power, that winning means owning a sovereign AI system, and that authority follows capability. What governments actually do contradicts all three. They proclaim AI sovereignty over the chips, clouds, and models their programs depend on, even when the suppliers own, finance, and control them. Ownership stays with those suppliers, and sovereignty becomes a performance staged on what they provide. We study this gap, between owning the means and performing authority, through the concept of meta-sovereignty, which treats authority as produced through signals, imaginaries, and infrastructural promises rather than exercised through enforceable control. Until now that performance could be read only after the fact, from finished announcements, and an announcement shows the result while hiding the work that produced it. To see the work, </w:t>
+      </w:r>
+      <w:r>
+        <w:rPr>
+          <w:rFonts w:asciiTheme="minorBidi" w:hAnsiTheme="minorBidi"/>
+        </w:rPr>
+        <w:t>we designed sy</w:t>
+      </w:r>
+      <w:r>
+        <w:rPr>
+          <w:rFonts w:asciiTheme="minorBidi" w:hAnsiTheme="minorBidi"/>
+        </w:rPr>
+        <w:t>nthetic rehearsal</w:t>
+      </w:r>
+      <w:r>
+        <w:rPr>
+          <w:rFonts w:asciiTheme="minorBidi" w:hAnsiTheme="minorBidi"/>
+        </w:rPr>
+        <w:t>s</w:t>
+      </w:r>
+      <w:r>
+        <w:rPr>
+          <w:rFonts w:asciiTheme="minorBidi" w:hAnsiTheme="minorBidi"/>
+        </w:rPr>
+        <w:t xml:space="preserve"> </w:t>
+      </w:r>
+      <w:r>
+        <w:rPr>
+          <w:rFonts w:asciiTheme="minorBidi" w:hAnsiTheme="minorBidi"/>
+        </w:rPr>
+        <w:t xml:space="preserve">that </w:t>
+      </w:r>
+      <w:r>
+        <w:rPr>
+          <w:rFonts w:asciiTheme="minorBidi" w:hAnsiTheme="minorBidi"/>
+        </w:rPr>
+        <w:t xml:space="preserve">stage </w:t>
+      </w:r>
+      <w:r>
+        <w:rPr>
+          <w:rFonts w:asciiTheme="minorBidi" w:hAnsiTheme="minorBidi"/>
+        </w:rPr>
+        <w:t xml:space="preserve">and </w:t>
+      </w:r>
+      <w:r>
+        <w:rPr>
+          <w:rFonts w:asciiTheme="minorBidi" w:hAnsiTheme="minorBidi"/>
+        </w:rPr>
+        <w:t xml:space="preserve">perform sovereignty with language-model agents and treat human intervention and prompt design as experimental controls. </w:t>
+      </w:r>
+      <w:r>
+        <w:rPr>
+          <w:rFonts w:asciiTheme="minorBidi" w:hAnsiTheme="minorBidi"/>
+        </w:rPr>
+        <w:t>In our pilot, t</w:t>
+      </w:r>
+      <w:r>
+        <w:rPr>
+          <w:rFonts w:asciiTheme="minorBidi" w:hAnsiTheme="minorBidi"/>
+        </w:rPr>
+        <w:t xml:space="preserve">hree agents argue as China, the United States, and the European Union, each grounded in a distinct policy corpus, while participants interrupt them, reprompt them, and bring in further agents. </w:t>
+      </w:r>
+      <w:r>
+        <w:rPr>
+          <w:rFonts w:asciiTheme="minorBidi" w:hAnsiTheme="minorBidi"/>
+        </w:rPr>
+        <w:t>C</w:t>
+      </w:r>
+      <w:r>
+        <w:rPr>
+          <w:rFonts w:asciiTheme="minorBidi" w:hAnsiTheme="minorBidi"/>
+        </w:rPr>
+        <w:t xml:space="preserve">oding over thirty-seven substantive sessions finds the agents distinguishable along their assigned positions, and their discourse turning from confrontation toward concession the moment a human intervenes. The </w:t>
+      </w:r>
+      <w:r>
+        <w:rPr>
+          <w:rFonts w:asciiTheme="minorBidi" w:hAnsiTheme="minorBidi"/>
+        </w:rPr>
+        <w:t xml:space="preserve">results </w:t>
+      </w:r>
+      <w:r>
+        <w:rPr>
+          <w:rFonts w:asciiTheme="minorBidi" w:hAnsiTheme="minorBidi"/>
+        </w:rPr>
+        <w:t xml:space="preserve">report what the agents generate, not what a model contains, a state intends, or the future holds. Its aim is deliberative rather than predictive. War games and scenarios are usually run in private, among security professionals, whereas a synthetic rehearsal is cheap and repeatable and </w:t>
+      </w:r>
+      <w:r>
+        <w:rPr>
+          <w:rFonts w:asciiTheme="minorBidi" w:hAnsiTheme="minorBidi"/>
+        </w:rPr>
+        <w:lastRenderedPageBreak/>
+        <w:t>opens that room to citizens, civil-society organizations, and elected representatives, who can question the major powers and weigh which AI futures they would defend</w:t>
       </w:r>
       <w:r>
         <w:rPr>
@@ -102,7 +181,6 @@
         <w:rPr>
           <w:rFonts w:asciiTheme="minorBidi" w:hAnsiTheme="minorBidi" w:cstheme="minorBidi"/>
         </w:rPr>
-        <w:lastRenderedPageBreak/>
         <w:t>Introduction</w:t>
       </w:r>
     </w:p>
@@ -116,7 +194,43 @@
         <w:rPr>
           <w:rFonts w:asciiTheme="minorBidi" w:hAnsiTheme="minorBidi"/>
         </w:rPr>
-        <w:t>The rivalry over artificial intelligence is usually told as a race between the United States and China to train the best models and gather the most compute, a framing that has organized popular and policy commentary since the late 2010s (Lee, 2018; Hogarth, 2018). It carries three assumptions: that the nation-state is the unit of power, that winning means owning the best domestic system, and that authority follows capability. All three rest on one idea, that AI power is a possession and that owning more of it is what confers authority. Recent practice breaks the link. States now claim sovereignty over compute and models they do not own, asserting authority ahead of capability rather than on the strength of it.</w:t>
+        <w:t xml:space="preserve">The rivalry over artificial intelligence is usually </w:t>
+      </w:r>
+      <w:r>
+        <w:rPr>
+          <w:rFonts w:asciiTheme="minorBidi" w:hAnsiTheme="minorBidi"/>
+        </w:rPr>
+        <w:t xml:space="preserve">described </w:t>
+      </w:r>
+      <w:r>
+        <w:rPr>
+          <w:rFonts w:asciiTheme="minorBidi" w:hAnsiTheme="minorBidi"/>
+        </w:rPr>
+        <w:t>as a race between the United States and China to train the best models and accumulate the most compute, a framing that has organized popular and policy commentary since the late 2010s (Lee, 2018; Hogarth, 2018). It carries three assumptions: that the nation-state is the unit of power, that winning means owning the best domestic system, and that authority follows capability. All three rest on a single idea, that AI power is a possession and that holding more of it is what guarantees authority. Recent practice</w:t>
+      </w:r>
+      <w:r>
+        <w:rPr>
+          <w:rFonts w:asciiTheme="minorBidi" w:hAnsiTheme="minorBidi"/>
+        </w:rPr>
+        <w:t>, however,</w:t>
+      </w:r>
+      <w:r>
+        <w:rPr>
+          <w:rFonts w:asciiTheme="minorBidi" w:hAnsiTheme="minorBidi"/>
+        </w:rPr>
+        <w:t xml:space="preserve"> suggests otherwise. Performing power has become as decisive as possessing the means to it, and that performance is what needs closer examination. States now </w:t>
+      </w:r>
+      <w:r>
+        <w:rPr>
+          <w:rFonts w:asciiTheme="minorBidi" w:hAnsiTheme="minorBidi"/>
+        </w:rPr>
+        <w:t xml:space="preserve">often </w:t>
+      </w:r>
+      <w:r>
+        <w:rPr>
+          <w:rFonts w:asciiTheme="minorBidi" w:hAnsiTheme="minorBidi"/>
+        </w:rPr>
+        <w:t>claim sovereignty over compute and models they do not own, and the claim itself does much of the work that ownership once did.</w:t>
       </w:r>
     </w:p>
     <w:p>
@@ -129,31 +243,7 @@
         <w:rPr>
           <w:rFonts w:asciiTheme="minorBidi" w:hAnsiTheme="minorBidi"/>
         </w:rPr>
-        <w:t xml:space="preserve">The scale of that separation is now </w:t>
-      </w:r>
-      <w:r>
-        <w:rPr>
-          <w:rFonts w:asciiTheme="minorBidi" w:hAnsiTheme="minorBidi"/>
-        </w:rPr>
-        <w:t>visible</w:t>
-      </w:r>
-      <w:r>
-        <w:rPr>
-          <w:rFonts w:asciiTheme="minorBidi" w:hAnsiTheme="minorBidi"/>
-        </w:rPr>
-        <w:t>. The Center for a New American Security counts one hundred and eighty-four government-backed sovereign-AI projects across sixty-seven states, most of them dependent on foreign chips, clouds, or models (CNAS, 2026). As a</w:t>
-      </w:r>
-      <w:r>
-        <w:rPr>
-          <w:rFonts w:asciiTheme="minorBidi" w:hAnsiTheme="minorBidi"/>
-        </w:rPr>
-        <w:t xml:space="preserve">n </w:t>
-      </w:r>
-      <w:r>
-        <w:rPr>
-          <w:rFonts w:asciiTheme="minorBidi" w:hAnsiTheme="minorBidi"/>
-        </w:rPr>
-        <w:t xml:space="preserve">announcement the number is neutral. Read against the dependence it exposes, it registers something the race cannot accommodate: states declare sovereignty through infrastructure they do not control, so capability and authority come apart rather than move together. </w:t>
+        <w:t>The separation between possessing and performing is now easy to document, though what a count can establish needs care. The Center for a New American Security records 184 government-backed sovereign-AI projects across 67 states, most dependent on foreign chips, clouds, or models (CNAS, 2026). The figure measures how many governments have declared sovereign-AI programs, not how much sovereignty they command. Its significance lies in the pairing it makes visible: a sovereignty claim issued over a material base the claimant does not hold. Where the declaration outruns the control, the authority on display is produced by the declaration rather than secured by the capability beneath it. On that reading the count is not a record of failure but a sign that the site of authority has moved, from what a state owns to what it can convincingly assert.</w:t>
       </w:r>
     </w:p>
     <w:p>
@@ -166,7 +256,50 @@
         <w:rPr>
           <w:rFonts w:asciiTheme="minorBidi" w:hAnsiTheme="minorBidi"/>
         </w:rPr>
-        <w:t>The instrument of leverage has also shifted from ownership to access. The United States has extended control from the export of chips to the licensing of access to frontier models themselves (CSIS, 2026), and the diffusion of compute now turns on who grants entry to a supply chain rather than who holds it outright (Sastry et al., 2024). A single episode makes the point concrete. The promise of Nvidia chips reportedly figured in the diplomacy around the Armenia-Azerbaijan settlement (Wall Street Journal, 2026). Whatever the exact mechanism, chip access there worked less as a measure of who held the best model than as a bargaining instrument, a signal traded among parties none of whom was the strongest builder. Investment can deepen the same dependence it is meant to escape, as the Gulf states' infrastructure spending shows (IISS, 2026). In each case the medium of the performance is the stack itself, and the actors who matter extend well beyond the two presumed racers.</w:t>
+        <w:t xml:space="preserve">Access, not ownership, is becoming the operative form of leverage, and the shift is more than a change of instrument. </w:t>
+      </w:r>
+      <w:r>
+        <w:rPr>
+          <w:rFonts w:asciiTheme="minorBidi" w:hAnsiTheme="minorBidi"/>
+        </w:rPr>
+        <w:t>While o</w:t>
+      </w:r>
+      <w:r>
+        <w:rPr>
+          <w:rFonts w:asciiTheme="minorBidi" w:hAnsiTheme="minorBidi"/>
+        </w:rPr>
+        <w:t>wnership is a standing possession</w:t>
+      </w:r>
+      <w:r>
+        <w:rPr>
+          <w:rFonts w:asciiTheme="minorBidi" w:hAnsiTheme="minorBidi"/>
+        </w:rPr>
+        <w:t>, a</w:t>
+      </w:r>
+      <w:r>
+        <w:rPr>
+          <w:rFonts w:asciiTheme="minorBidi" w:hAnsiTheme="minorBidi"/>
+        </w:rPr>
+        <w:t>ccess is a permission</w:t>
+      </w:r>
+      <w:r>
+        <w:rPr>
+          <w:rFonts w:asciiTheme="minorBidi" w:hAnsiTheme="minorBidi"/>
+        </w:rPr>
+        <w:t xml:space="preserve"> that can </w:t>
+      </w:r>
+      <w:r>
+        <w:rPr>
+          <w:rFonts w:asciiTheme="minorBidi" w:hAnsiTheme="minorBidi"/>
+        </w:rPr>
+        <w:t xml:space="preserve">be revoked. Sovereignty that rests on access is therefore conditional, held at the discretion of whoever controls entry to the stack. The United States has extended that control from the export of chips to the licensing of access to frontier models (CSIS, 2026), and the spread of compute now depends on who admits a state to a supply chain rather than who holds it outright (Sastry et al., 2024). The Armenia-Azerbaijan settlement shows the lever from the grantor's side, with the promise of Nvidia chips reportedly serving as a bargaining instrument (Wall Street Journal, 2026), credible precisely because access can be given or withheld. Gulf infrastructure spending shows it from the recipient's side, buying </w:t>
+      </w:r>
+      <w:r>
+        <w:rPr>
+          <w:rFonts w:asciiTheme="minorBidi" w:hAnsiTheme="minorBidi"/>
+        </w:rPr>
+        <w:lastRenderedPageBreak/>
+        <w:t>capacity on terms that deepen the very dependence the investment was meant to end (IISS, 2026). Read together, these cases suggest that sovereignty and dependence are not opposites here but one relation seen from two ends, and that the performance of sovereignty is the work of keeping the two ends from being seen at once.</w:t>
       </w:r>
     </w:p>
     <w:p>
@@ -179,38 +312,7 @@
         <w:rPr>
           <w:rFonts w:asciiTheme="minorBidi" w:hAnsiTheme="minorBidi"/>
         </w:rPr>
-        <w:t xml:space="preserve">Meta-sovereignty offers a framing that fits these observations. Reshef Kera, Natan, Turgeman and Ofek (2026) describe authority performed through </w:t>
-      </w:r>
-      <w:r>
-        <w:rPr>
-          <w:rFonts w:asciiTheme="minorBidi" w:hAnsiTheme="minorBidi"/>
-        </w:rPr>
-        <w:t xml:space="preserve">AI </w:t>
-      </w:r>
-      <w:r>
-        <w:rPr>
-          <w:rFonts w:asciiTheme="minorBidi" w:hAnsiTheme="minorBidi"/>
-        </w:rPr>
-        <w:t xml:space="preserve">signals, imaginaries, and infrastructural promises rather than enforceable control, "a mode of rule sustained by infrastructures that do not yet exist, by fictions that persuade before they materialize, and by costly signals that substitute for control." On this reading the sovereign-AI wave is not a failed bid for autonomy but a performance of </w:t>
-      </w:r>
-      <w:r>
-        <w:rPr>
-          <w:rFonts w:asciiTheme="minorBidi" w:hAnsiTheme="minorBidi"/>
-        </w:rPr>
-        <w:lastRenderedPageBreak/>
-        <w:t xml:space="preserve">autonomy whose currency is the promise. The account carries one limit that </w:t>
-      </w:r>
-      <w:r>
-        <w:rPr>
-          <w:rFonts w:asciiTheme="minorBidi" w:hAnsiTheme="minorBidi"/>
-        </w:rPr>
-        <w:t xml:space="preserve">influenced the present </w:t>
-      </w:r>
-      <w:r>
-        <w:rPr>
-          <w:rFonts w:asciiTheme="minorBidi" w:hAnsiTheme="minorBidi"/>
-        </w:rPr>
-        <w:t>method. It works retrospectively, from finished pledges, so it can reconstruct the script after the fact but cannot observe the performance being defended, revised, or refused while it runs.</w:t>
+        <w:t>Meta-sovereignty gives these observations a name. Reshef Kera, Natan, Turgeman and Ofek (2026) describe authority performed through signals, imaginaries, and infrastructural promises rather than exercised through enforceable control, "a mode of rule sustained by infrastructures that do not yet exist, by fictions that persuade before they materialize, and by costly signals that substitute for control." On this account the sovereign-AI wave is not a failed bid for autonomy but a performance of it, one that substitutes promises for the capacity it lacks. The concept has a limit that shaped the present method. It is read backward, from pledges already made, so it can reconstruct the script once the performance is over but cannot watch that performance being defended, revised, or refused as it runs.</w:t>
       </w:r>
     </w:p>
     <w:p>
@@ -223,13 +325,19 @@
         <w:rPr>
           <w:rFonts w:asciiTheme="minorBidi" w:hAnsiTheme="minorBidi"/>
         </w:rPr>
-        <w:t>The instrument for observing that work as it happens is a human-AI roundtable that runs on live data and a curated policy corpus for each actor. Three language-model agents argue as China, the United States, and the European Union. Each reads its own corpus and can draw on current sources, while human participants set the opening prompt, interrupt, reprompt, and bring in further agents. We call the method synthetic rehearsal: a staging of performed sovereignty in which human intervention and prompt design serve as experimental controls, so that the work of holding a sovereignty claim together, and the moments it gives way, can be observed as it happens.</w:t>
-      </w:r>
-      <w:r>
-        <w:rPr>
-          <w:rFonts w:asciiTheme="minorBidi" w:hAnsiTheme="minorBidi"/>
-        </w:rPr>
-        <w:t xml:space="preserve"> </w:t>
+        <w:t xml:space="preserve">The instrument for observing </w:t>
+      </w:r>
+      <w:r>
+        <w:rPr>
+          <w:rFonts w:asciiTheme="minorBidi" w:hAnsiTheme="minorBidi"/>
+        </w:rPr>
+        <w:t xml:space="preserve">the process </w:t>
+      </w:r>
+      <w:r>
+        <w:rPr>
+          <w:rFonts w:asciiTheme="minorBidi" w:hAnsiTheme="minorBidi"/>
+        </w:rPr>
+        <w:t xml:space="preserve">as it happens is a human-AI roundtable that runs on live data and a curated policy corpus for each actor. Three language-model agents argue as China, the United States, and the European Union. Each reads its own corpus and can draw on current sources, while human participants set the opening prompt, interrupt, reprompt, and bring in further agents. We call the method synthetic rehearsal: a staging of performed sovereignty in which human intervention and prompt design serve as experimental controls, so that the work of holding a sovereignty claim together, and the moments it gives way, can be observed as it happens. </w:t>
       </w:r>
     </w:p>
     <w:p>
@@ -242,7 +350,37 @@
         <w:rPr>
           <w:rFonts w:asciiTheme="minorBidi" w:hAnsiTheme="minorBidi"/>
         </w:rPr>
-        <w:t>Three commitments limit what we take from it. The evidence is confined to what the agents produce, their transcripts and the artifacts they generate, and it supports no inference about the models' internals or any state's real intentions. The method examines how sovereignty imaginaries are made legible, circulated, and contested, and it neither forecasts outcomes nor measures capability. Because the models are trained on the same discourse the roundtable examines, the rehearsal can reproduce the imaginaries it sets out to question, a limit we keep in view. Agency belongs to the whole arrangement, the models, corpora, prompts, interface, participants, and audience together, and never to a single agent.</w:t>
+        <w:t xml:space="preserve">Three commitments limit </w:t>
+      </w:r>
+      <w:r>
+        <w:rPr>
+          <w:rFonts w:asciiTheme="minorBidi" w:hAnsiTheme="minorBidi"/>
+        </w:rPr>
+        <w:t xml:space="preserve">the analysis of the </w:t>
+      </w:r>
+      <w:r>
+        <w:rPr>
+          <w:rFonts w:asciiTheme="minorBidi" w:hAnsiTheme="minorBidi"/>
+        </w:rPr>
+        <w:t xml:space="preserve">generated </w:t>
+      </w:r>
+      <w:r>
+        <w:rPr>
+          <w:rFonts w:asciiTheme="minorBidi" w:hAnsiTheme="minorBidi"/>
+        </w:rPr>
+        <w:t>logs in this process</w:t>
+      </w:r>
+      <w:r>
+        <w:rPr>
+          <w:rFonts w:asciiTheme="minorBidi" w:hAnsiTheme="minorBidi"/>
+        </w:rPr>
+        <w:t xml:space="preserve">. </w:t>
+      </w:r>
+      <w:r>
+        <w:rPr>
+          <w:rFonts w:asciiTheme="minorBidi" w:hAnsiTheme="minorBidi"/>
+        </w:rPr>
+        <w:t>The evidence is confined to what the agents produce, their logs and the artifacts they generate, and it supports no inference about the models' internals or any state's real intentions. What the method examines is how sovereignty imaginaries are made legible, circulated, and contested, so it forecasts no outcomes and measures no capability. Because the models are trained on the same discourse the roundtable examines, the rehearsal can reproduce the imaginaries it sets out to question, a limit we keep in view. Agency belongs to the whole arrangement, the models, corpora, prompts, interface, participants, and audience together, and never to a single agent.</w:t>
       </w:r>
     </w:p>
     <w:p>
@@ -251,12 +389,6 @@
           <w:rFonts w:asciiTheme="minorBidi" w:hAnsiTheme="minorBidi"/>
         </w:rPr>
       </w:pPr>
-      <w:r>
-        <w:rPr>
-          <w:rFonts w:asciiTheme="minorBidi" w:hAnsiTheme="minorBidi"/>
-        </w:rPr>
-        <w:t>The aim is deliberative rather than predictive, which sets the exercise apart from the two practices it superficially resembles: the war game and the planning scenario. Wargaming developed as a closed craft for military and security professionals (Perla, 1990), and its recent AI variants frame the field through deterrence and the risk of pre-emption (Hendrycks, Schmidt and Wang, 2025). Scenario planning, in its classic corporate form, likewise kept authorship inside the organization it served (Wack, 1985). A synthetic rehearsal reverses the access conditions. It is inexpensive and repeatable, and it opens a room that both traditions keep closed, admitting citizens, civil-society organizations, and elected representatives to question the positions of the major powers and weigh which AI futures they would defend before those futures are presented as settled. In this it stands closer to deliberative democracy than to forecasting (Fishkin, 2009).</w:t>
-      </w:r>
     </w:p>
     <w:p>
       <w:pPr>
@@ -268,46 +400,62 @@
         <w:rPr>
           <w:rFonts w:asciiTheme="minorBidi" w:hAnsiTheme="minorBidi"/>
         </w:rPr>
-        <w:t xml:space="preserve">The remainder of the article develops this in order. The next section places synthetic rehearsal in a genealogy running from Derrida's account of great-power conflict as </w:t>
-      </w:r>
-      <w:r>
-        <w:rPr>
-          <w:rFonts w:asciiTheme="minorBidi" w:hAnsiTheme="minorBidi"/>
-        </w:rPr>
         <w:lastRenderedPageBreak/>
-        <w:t>"fabulously textual," through Fearon on costly signaling and Ezrahi on necessary fictions, to meta-sovereignty, and states the gap each of these leaves open. A methods section sets out the roundtable, its three registers of debate, propaganda-lab, and mirror-world, and the coding scheme. A results section reports the first-pass coding over the substantive corpus, where the agents prove distinguishable along their designed lines and the discourse shifts from confrontation toward concession after human intervention. An interpretation section reads that corpus as a single performance viewed at increasing interpretive distance. The conclusion returns to the reflexivity limit and to what the method can and cannot establish.</w:t>
+        <w:t>The aim of a synthetic rehearsal is deliberative rather than predictive, which sets the exercise apart from the two practices it superficially resembles: the war game and the planning scenario. Wargaming developed as a closed craft for military and security professionals (Perla, 1990), and its recent AI variants frame the field through deterrence and the risk of pre-emption (Hendrycks, Schmidt and Wang, 2025). Scenario planning, in its classic corporate form, likewise kept authorship inside the organization it served (Wack, 1985). A synthetic rehearsal reverses these access conditions. It is inexpensive and repeatable, and it opens a room that both traditions keep closed, admitting citizens, civil-society organizations, and elected representatives to question the positions of the major powers and weigh which AI futures they would defend before those futures are presented as settled. In this it stands closer to deliberative democracy than to forecasting (Fishkin, 2009).</w:t>
       </w:r>
     </w:p>
     <w:p>
       <w:pPr>
         <w:pStyle w:val="Heading2"/>
         <w:rPr>
-          <w:rFonts w:asciiTheme="minorBidi" w:hAnsiTheme="minorBidi" w:cstheme="minorBidi"/>
-        </w:rPr>
-      </w:pPr>
-      <w:r>
-        <w:rPr>
-          <w:rFonts w:asciiTheme="minorBidi" w:hAnsiTheme="minorBidi" w:cstheme="minorBidi"/>
-        </w:rPr>
-        <w:t>2. From control to performance: a genealogy</w:t>
+          <w:rFonts w:asciiTheme="minorBidi" w:eastAsiaTheme="minorEastAsia" w:hAnsiTheme="minorBidi" w:cstheme="minorBidi"/>
+          <w:b w:val="0"/>
+          <w:bCs w:val="0"/>
+          <w:color w:val="auto"/>
+          <w:sz w:val="23"/>
+          <w:szCs w:val="22"/>
+        </w:rPr>
+      </w:pPr>
+      <w:r>
+        <w:rPr>
+          <w:rFonts w:asciiTheme="minorBidi" w:eastAsiaTheme="minorEastAsia" w:hAnsiTheme="minorBidi" w:cstheme="minorBidi"/>
+          <w:b w:val="0"/>
+          <w:bCs w:val="0"/>
+          <w:color w:val="auto"/>
+          <w:sz w:val="23"/>
+          <w:szCs w:val="22"/>
+        </w:rPr>
+        <w:lastRenderedPageBreak/>
+        <w:t>The aim of a synthetic rehearsal is deliberative rather than predictive, which sets the exercise apart from the two practices it superficially resembles: the war game and the planning scenario. Wargaming developed as a closed craft for military and security professionals (Perla, 1990), and its recent AI variants frame the field through deterrence and the risk of pre-emption (Hendrycks, Schmidt and Wang, 2025). Scenario planning, in its classic corporate form, likewise kept authorship inside the organization it served (Wack, 1985). A synthetic rehearsal reverses these access conditions. It is inexpensive and repeatable, and it opens a room that both traditions keep closed, admitting citizens, civil-society organizations, and elected representatives to question the positions of the major powers and weigh which AI futures they would defend before those futures are presented as settled. In this it stands closer to deliberative democracy than to forecasting (Fishkin, 2009).</w:t>
       </w:r>
     </w:p>
     <w:p>
       <w:pPr>
-        <w:rPr>
-          <w:rFonts w:asciiTheme="minorBidi" w:hAnsiTheme="minorBidi"/>
-        </w:rPr>
-      </w:pPr>
-      <w:r>
-        <w:rPr>
-          <w:rFonts w:asciiTheme="minorBidi" w:hAnsiTheme="minorBidi"/>
-        </w:rPr>
-        <w:t>Synthetic rehearsal inherits a problem that a century of thought about great-power claims has reformulated without resolving: how a state gets others to credit an assertion it cannot enforce. Each reformulation hands the next a mechanism the earlier one left unspecified, and the sequence terminates in a shared limit. Prior theory can show that sovereignty is performed and can explain why a given performance persuades, yet it reads a performance already finished, after the fact. The roundtable studied here runs the performance forward and perturbs it, and this genealogy is arranged to isolate what that difference does.</w:t>
+        <w:pStyle w:val="Heading2"/>
+        <w:rPr>
+          <w:rFonts w:asciiTheme="minorBidi" w:eastAsiaTheme="minorEastAsia" w:hAnsiTheme="minorBidi" w:cstheme="minorBidi"/>
+          <w:b w:val="0"/>
+          <w:bCs w:val="0"/>
+          <w:color w:val="auto"/>
+          <w:sz w:val="23"/>
+          <w:szCs w:val="22"/>
+        </w:rPr>
+      </w:pPr>
+      <w:r>
+        <w:rPr>
+          <w:rFonts w:asciiTheme="minorBidi" w:eastAsiaTheme="minorEastAsia" w:hAnsiTheme="minorBidi" w:cstheme="minorBidi"/>
+          <w:b w:val="0"/>
+          <w:bCs w:val="0"/>
+          <w:color w:val="auto"/>
+          <w:sz w:val="23"/>
+          <w:szCs w:val="22"/>
+        </w:rPr>
+        <w:t>The remainder of the article develops the argument and reports the preliminary results. The next section places synthetic rehearsal in a genealogy that runs from Derrida's (1984) account of great-power conflict as "fabulously textual," through Fearon (1995) on costly signaling and Ezrahi (2012) on necessary fictions, to meta-sovereignty (Reshef Kera et al., 2026), and states the gap each leaves open. A methods section sets out the roundtable, its three registers of debate, propaganda-lab, and mirror-world, and the coding scheme. A results section reports the first-pass coding over the substantive corpus, where the agents prove distinguishable along their designed lines and the discourse shifts from confrontation toward concession after human intervention. An interpretation section reads the corpus as a single performance viewed at increasing interpretive distance. The conclusion returns to the reflexivity limit and to what the method can and cannot establish.</w:t>
       </w:r>
     </w:p>
     <w:p>
       <w:pPr>
-        <w:pStyle w:val="Heading3"/>
+        <w:pStyle w:val="Heading2"/>
         <w:rPr>
           <w:rFonts w:asciiTheme="minorBidi" w:hAnsiTheme="minorBidi" w:cstheme="minorBidi"/>
         </w:rPr>
@@ -316,7 +464,7 @@
         <w:rPr>
           <w:rFonts w:asciiTheme="minorBidi" w:hAnsiTheme="minorBidi" w:cstheme="minorBidi"/>
         </w:rPr>
-        <w:t>2.1 Derrida: the referent that never arrives, and the archive as its condition</w:t>
+        <w:t>2. From control to performance: a genealogy</w:t>
       </w:r>
     </w:p>
     <w:p>
@@ -329,41 +477,41 @@
         <w:rPr>
           <w:rFonts w:asciiTheme="minorBidi" w:hAnsiTheme="minorBidi"/>
         </w:rPr>
-        <w:t>Great-power conflict was text and signal before it was materiel. Derrida's "No Apocalypse, Not Now" (1984) names total nuclear war "fabulously textual," an antagonism that rests on structures of information, code, and archive and whose referent never arrives as an event. Derrida does not deny that the weapons are real. His claim concerns the mode of the confrontation, which is conducted through, and credited on the basis of, what can be inscribed, transmitted, and read. Nuclear standoff is the pure case, because the thing feared is exactly the thing that must not happen, so the whole apparatus works in the register of anticipation rather than event.</w:t>
+        <w:t xml:space="preserve">Synthetic rehearsal takes up a problem that several traditions have named and none has dissolved: how a state brings others to credit a claim it cannot enforce. Deterrence theory posed it as the credibility of a threat that might never be carried out (Schelling, 1966). Signaling theory recast it as the cost a state must visibly bear before it is believed (Jervis, 1970; Fearon, 1995). The study of sovereignty treated it as a status that holds only when others recognize the performance of it (Weber, 1995). Claim, signal, and recognition are three faces of one difficulty, and each account hands the next a mechanism the previous one left unspecified. They also share a limit. Each can show that sovereignty is performed and can explain why a given performance persuades, yet each examines a performance already over. The roundtable studied here runs the performance forward and lets us interrupt it. The </w:t>
+      </w:r>
+      <w:r>
+        <w:rPr>
+          <w:rFonts w:asciiTheme="minorBidi" w:hAnsiTheme="minorBidi"/>
+        </w:rPr>
+        <w:lastRenderedPageBreak/>
+        <w:t>genealogy that follows is arranged to isolate what that shift, from reading a finished performance to running one that can be pushed, adds to each idea it inherits.</w:t>
       </w:r>
     </w:p>
     <w:p>
       <w:pPr>
-        <w:rPr>
-          <w:rFonts w:asciiTheme="minorBidi" w:hAnsiTheme="minorBidi"/>
-        </w:rPr>
-      </w:pPr>
-      <w:r>
-        <w:rPr>
-          <w:rFonts w:asciiTheme="minorBidi" w:hAnsiTheme="minorBidi"/>
-        </w:rPr>
-        <w:t xml:space="preserve">Archive Fever (1995) supplies one component of the present staging. "There is no political power without control of the archive," which makes the ordering, retention, and reorganisation of the record an exercise of authority rather than a neutral support for it. The roundtable includes a Critical Archivist among its summonable agents for this reason: an agent that can reorganise the shared corpus renders the archival dimension of authority an observable operation instead of an assumption. Derrida gives the domain and the intuition, that conflict lives in text and that power lives in the control of text. What he does not give is a real-time account of how a </w:t>
-      </w:r>
-      <w:r>
-        <w:rPr>
-          <w:rFonts w:asciiTheme="minorBidi" w:hAnsiTheme="minorBidi"/>
-        </w:rPr>
-        <w:lastRenderedPageBreak/>
-        <w:t>signal becomes credible to an adversary in the moment, which is the next requirement.</w:t>
+        <w:pStyle w:val="Heading3"/>
+        <w:rPr>
+          <w:rFonts w:asciiTheme="minorBidi" w:hAnsiTheme="minorBidi" w:cstheme="minorBidi"/>
+        </w:rPr>
+      </w:pPr>
+      <w:r>
+        <w:rPr>
+          <w:rFonts w:asciiTheme="minorBidi" w:hAnsiTheme="minorBidi" w:cstheme="minorBidi"/>
+        </w:rPr>
+        <w:t>2.1 Derrida: the referent that never arrives, and the archive as its condition</w:t>
       </w:r>
     </w:p>
     <w:p>
       <w:pPr>
-        <w:pStyle w:val="Heading3"/>
-        <w:rPr>
-          <w:rFonts w:asciiTheme="minorBidi" w:hAnsiTheme="minorBidi" w:cstheme="minorBidi"/>
-        </w:rPr>
-      </w:pPr>
-      <w:r>
-        <w:rPr>
-          <w:rFonts w:asciiTheme="minorBidi" w:hAnsiTheme="minorBidi" w:cstheme="minorBidi"/>
-        </w:rPr>
-        <w:t>2.2 Fearon: the credibility mechanism, and the silence about maintenance</w:t>
+        <w:rPr>
+          <w:rFonts w:asciiTheme="minorBidi" w:hAnsiTheme="minorBidi"/>
+        </w:rPr>
+      </w:pPr>
+      <w:r>
+        <w:rPr>
+          <w:rFonts w:asciiTheme="minorBidi" w:hAnsiTheme="minorBidi"/>
+        </w:rPr>
+        <w:t>Great-power conflict was text and signal before it was material. Derrida's "No Apocalypse, Not Now" (1984) calls total nuclear war "fabulously textual," an antagonism that rests on structures of information, code, and archive and whose referent never arrives as an event. He does not deny that the weapons are real. His claim concerns the mode of the confrontation, which is conducted through what can be inscribed, transmitted, and read, and credited on that basis. Nuclear standoff is the pure case, since the thing feared is precisely the thing that must not happen, so the whole apparatus operates in the register of anticipation rather than event.</w:t>
       </w:r>
     </w:p>
     <w:p>
@@ -376,34 +524,52 @@
         <w:rPr>
           <w:rFonts w:asciiTheme="minorBidi" w:hAnsiTheme="minorBidi"/>
         </w:rPr>
-        <w:t>Fearon's costly-signaling argument (1995) supplies the mechanism Derrida leaves open. A claim becomes credible when it is backed by visible, costly commitment that a bluffer would be unwilling to bear, so that assertion alone does not persuade. The argument also widens the domain from nuclear standoff to bargaining and crisis generally, and it names the step by which text becomes credited text. The costly signal is the hinge between saying and being believed.</w:t>
+        <w:t>“</w:t>
+      </w:r>
+      <w:r>
+        <w:rPr>
+          <w:rFonts w:asciiTheme="minorBidi" w:hAnsiTheme="minorBidi"/>
+        </w:rPr>
+        <w:t>Archive Fever</w:t>
+      </w:r>
+      <w:r>
+        <w:rPr>
+          <w:rFonts w:asciiTheme="minorBidi" w:hAnsiTheme="minorBidi"/>
+        </w:rPr>
+        <w:t>”</w:t>
+      </w:r>
+      <w:r>
+        <w:rPr>
+          <w:rFonts w:asciiTheme="minorBidi" w:hAnsiTheme="minorBidi"/>
+        </w:rPr>
+        <w:t xml:space="preserve"> (1995) supplies a second component. "There is no political power without control of the archive," which makes the ordering, retention, and reorganization of the record an exercise of authority rather than a neutral support for it. Prompting is a practice of exactly this kind. Each prompt selects from and reorders the vast corpus a model has absorbed, and in doing so it gives the operator a measure of control over which parts of the archive speak. The roundtable makes that control explicit, and it includes a Critical Archivist among its summonable agents for the same reason: an agent that can reorganize the shared corpus turns the archival dimension of authority into an observable operation rather than an assumption. Derrida supplies the domain and the intuition, that conflict lives in text and that power lives in control of text. What he does not supply is a real-time account of how a signal becomes credible to an adversary in the moment. That is the next requirement.</w:t>
       </w:r>
     </w:p>
     <w:p>
       <w:pPr>
-        <w:rPr>
-          <w:rFonts w:asciiTheme="minorBidi" w:hAnsiTheme="minorBidi"/>
-        </w:rPr>
-      </w:pPr>
-      <w:r>
-        <w:rPr>
-          <w:rFonts w:asciiTheme="minorBidi" w:hAnsiTheme="minorBidi"/>
-        </w:rPr>
-        <w:t>Fearon models a discrete act. A signal is a single move, sincere or a bluff, and the question is whether the receiver should be convinced. The model says nothing about what happens across many turns, once a posture must be sustained, revised, and defended after a first assertion has been challenged. Credibility in Fearon is manufactured once. The object studied here is credibility held under repeated contestation, where an interlocutor refuses the signal and the claimant must restate, escalate, or give ground. Maintenance of a signal, as distinct from its issuance, is what remains open.</w:t>
+        <w:pStyle w:val="Heading3"/>
+        <w:rPr>
+          <w:rFonts w:asciiTheme="minorBidi" w:hAnsiTheme="minorBidi" w:cstheme="minorBidi"/>
+        </w:rPr>
+      </w:pPr>
+      <w:r>
+        <w:rPr>
+          <w:rFonts w:asciiTheme="minorBidi" w:hAnsiTheme="minorBidi" w:cstheme="minorBidi"/>
+        </w:rPr>
+        <w:t>2.2 Fearon: the credibility mechanism, and the silence about maintenance</w:t>
       </w:r>
     </w:p>
     <w:p>
       <w:pPr>
-        <w:pStyle w:val="Heading3"/>
-        <w:rPr>
-          <w:rFonts w:asciiTheme="minorBidi" w:hAnsiTheme="minorBidi" w:cstheme="minorBidi"/>
-        </w:rPr>
-      </w:pPr>
-      <w:r>
-        <w:rPr>
-          <w:rFonts w:asciiTheme="minorBidi" w:hAnsiTheme="minorBidi" w:cstheme="minorBidi"/>
-        </w:rPr>
-        <w:t>2.3 Ezrahi: the coherence of fictions, and the promptable-fiction gap</w:t>
+        <w:rPr>
+          <w:rFonts w:asciiTheme="minorBidi" w:hAnsiTheme="minorBidi"/>
+        </w:rPr>
+      </w:pPr>
+      <w:r>
+        <w:rPr>
+          <w:rFonts w:asciiTheme="minorBidi" w:hAnsiTheme="minorBidi"/>
+        </w:rPr>
+        <w:t>Fearon's costly-signaling argument (1995) supplies the mechanism Derrida leaves open. A claim becomes credible when it is backed by visible, costly commitment that a bluffer would be unwilling to bear, so that assertion alone does not persuade. The argument also widens the domain from nuclear standoff to bargaining and crisis generally, and it names the step by which text becomes credited text. The costly signal is the hinge between saying and being believed.</w:t>
       </w:r>
     </w:p>
     <w:p>
@@ -416,35 +582,41 @@
         <w:rPr>
           <w:rFonts w:asciiTheme="minorBidi" w:hAnsiTheme="minorBidi"/>
         </w:rPr>
-        <w:t>Fearon explains why one signal is believed. Ezrahi explains why a whole imaginative construction holds together. Legitimacy, in his account of political and necessary fictions, rests on imaginative coherence: a public accepts a governing order because that order is rendered as a plausible, self-consistent fiction that organises expectation. Coherence is the mechanism, and it reaches something neither Derrida nor Fearon does, the standing plausibility of an entire performed order rather than the credibility of a single move within it.</w:t>
+        <w:t xml:space="preserve">Fearon models a discrete act. A signal is a single move, sincere or a bluff, and the question is whether the receiver should be convinced. The model says nothing about what happens across many turns, once a posture must be sustained, revised, and defended after a first assertion has been challenged. Credibility in Fearon is </w:t>
+      </w:r>
+      <w:r>
+        <w:rPr>
+          <w:rFonts w:asciiTheme="minorBidi" w:hAnsiTheme="minorBidi"/>
+        </w:rPr>
+        <w:lastRenderedPageBreak/>
+        <w:t>manufactured once. The object studied here is credibility held under repeated contestation, where an interlocutor refuses the signal and the claimant must restate, escalate, or give ground. Maintenance of a signal, as distinct from its issuance, is what remains open.</w:t>
       </w:r>
     </w:p>
     <w:p>
       <w:pPr>
-        <w:rPr>
-          <w:rFonts w:asciiTheme="minorBidi" w:hAnsiTheme="minorBidi"/>
-        </w:rPr>
-      </w:pPr>
-      <w:r>
-        <w:rPr>
-          <w:rFonts w:asciiTheme="minorBidi" w:hAnsiTheme="minorBidi"/>
-        </w:rPr>
-        <w:t>Ezrahi wrote for mass-media democracies, where identifiable institutions produce the fictions and broadcast and press circulate them. The present arrangement changes the conditions of production. Here the fictions are machine-generated and promptable, composed on demand by language models reading policy corpora under human instruction and reworked whenever a human reprompts. Coherence still applies as a mechanism, but the fiction is no longer authored once by an institution and received by a public. It is generated, contested, and regenerated within a single sitting. Ezrahi's account does not specify what coherence means once a fiction can be re-elicited on request.</w:t>
+        <w:pStyle w:val="Heading3"/>
+        <w:rPr>
+          <w:rFonts w:asciiTheme="minorBidi" w:hAnsiTheme="minorBidi" w:cstheme="minorBidi"/>
+        </w:rPr>
+      </w:pPr>
+      <w:r>
+        <w:rPr>
+          <w:rFonts w:asciiTheme="minorBidi" w:hAnsiTheme="minorBidi" w:cstheme="minorBidi"/>
+        </w:rPr>
+        <w:t>2.3 Ezrahi: the coherence of fictions, and the promptable-fiction gap</w:t>
       </w:r>
     </w:p>
     <w:p>
       <w:pPr>
-        <w:pStyle w:val="Heading3"/>
-        <w:rPr>
-          <w:rFonts w:asciiTheme="minorBidi" w:hAnsiTheme="minorBidi" w:cstheme="minorBidi"/>
-        </w:rPr>
-      </w:pPr>
-      <w:r>
-        <w:rPr>
-          <w:rFonts w:asciiTheme="minorBidi" w:hAnsiTheme="minorBidi" w:cstheme="minorBidi"/>
-        </w:rPr>
-        <w:lastRenderedPageBreak/>
-        <w:t>2.4 Meta-sovereignty: the synthesis inherited, and its retrospective vantage</w:t>
+        <w:rPr>
+          <w:rFonts w:asciiTheme="minorBidi" w:hAnsiTheme="minorBidi"/>
+        </w:rPr>
+      </w:pPr>
+      <w:r>
+        <w:rPr>
+          <w:rFonts w:asciiTheme="minorBidi" w:hAnsiTheme="minorBidi"/>
+        </w:rPr>
+        <w:t>Fearon explains why one signal is believed. Ezrahi explains why a whole imaginative construction holds together. Legitimacy, in his account of political and necessary fictions, rests on imaginative coherence: a public accepts a governing order because that order is rendered as a plausible, self-consistent fiction that organises expectation. Coherence is the mechanism, and it reaches something neither Derrida nor Fearon does, the standing plausibility of an entire performed order rather than the credibility of a single move within it.</w:t>
       </w:r>
     </w:p>
     <w:p>
@@ -457,34 +629,34 @@
         <w:rPr>
           <w:rFonts w:asciiTheme="minorBidi" w:hAnsiTheme="minorBidi"/>
         </w:rPr>
-        <w:t>The concept this article extends most directly draws these strands together. Reshef Kera, Natan, Turgeman and Ofek (2026) define meta-sovereignty as authority performed through signals, imaginaries, and infrastructural promises rather than through enforceable control, "a mode of rule sustained by infrastructures that do not yet exist, by fictions that persuade before they materialize, and by costly signals that substitute for control." The synthesis is exact, folding the costly signal, the necessary fiction, and the textual archive into a single account of sovereignty as dramaturgy.</w:t>
+        <w:t>Ezrahi wrote for mass-media democracies, where identifiable institutions produce the fictions and broadcast and press circulate them. The present arrangement changes the conditions of production. Here the fictions are machine-generated and promptable, composed on demand by language models reading policy corpora under human instruction and reworked whenever a human reprompts. Coherence still applies as a mechanism, but the fiction is no longer authored once by an institution and received by a public. It is generated, contested, and regenerated within a single sitting. Ezrahi's account does not specify what coherence means once a fiction can be re-elicited on request.</w:t>
       </w:r>
     </w:p>
     <w:p>
       <w:pPr>
-        <w:rPr>
-          <w:rFonts w:asciiTheme="minorBidi" w:hAnsiTheme="minorBidi"/>
-        </w:rPr>
-      </w:pPr>
-      <w:r>
-        <w:rPr>
-          <w:rFonts w:asciiTheme="minorBidi" w:hAnsiTheme="minorBidi"/>
-        </w:rPr>
-        <w:t>The limit lies in the vantage. That paper reads the performance retrospectively, from states' finished pledges, and arrives at sovereignty as dramaturgy. A dramaturgy read from the finished script cannot show the maintenance work, the moments where a posture is challenged and then held or surrendered. This retrospective vantage is what the present object alters.</w:t>
+        <w:pStyle w:val="Heading3"/>
+        <w:rPr>
+          <w:rFonts w:asciiTheme="minorBidi" w:hAnsiTheme="minorBidi" w:cstheme="minorBidi"/>
+        </w:rPr>
+      </w:pPr>
+      <w:r>
+        <w:rPr>
+          <w:rFonts w:asciiTheme="minorBidi" w:hAnsiTheme="minorBidi" w:cstheme="minorBidi"/>
+        </w:rPr>
+        <w:t>2.4 Meta-sovereignty: the synthesis inherited, and its retrospective vantage</w:t>
       </w:r>
     </w:p>
     <w:p>
       <w:pPr>
-        <w:pStyle w:val="Heading3"/>
-        <w:rPr>
-          <w:rFonts w:asciiTheme="minorBidi" w:hAnsiTheme="minorBidi" w:cstheme="minorBidi"/>
-        </w:rPr>
-      </w:pPr>
-      <w:r>
-        <w:rPr>
-          <w:rFonts w:asciiTheme="minorBidi" w:hAnsiTheme="minorBidi" w:cstheme="minorBidi"/>
-        </w:rPr>
-        <w:t>2.5 Compute-as-statecraft: the contemporary intensification</w:t>
+        <w:rPr>
+          <w:rFonts w:asciiTheme="minorBidi" w:hAnsiTheme="minorBidi"/>
+        </w:rPr>
+      </w:pPr>
+      <w:r>
+        <w:rPr>
+          <w:rFonts w:asciiTheme="minorBidi" w:hAnsiTheme="minorBidi"/>
+        </w:rPr>
+        <w:t>The concept this article extends most directly draws these strands together. Reshef Kera, Natan, Turgeman and Ofek (2026) define meta-sovereignty as authority performed through signals, imaginaries, and infrastructural promises rather than through enforceable control, "a mode of rule sustained by infrastructures that do not yet exist, by fictions that persuade before they materialize, and by costly signals that substitute for control." The synthesis is exact, folding the costly signal, the necessary fiction, and the textual archive into a single account of sovereignty as dramaturgy.</w:t>
       </w:r>
     </w:p>
     <w:p>
@@ -497,7 +669,7 @@
         <w:rPr>
           <w:rFonts w:asciiTheme="minorBidi" w:hAnsiTheme="minorBidi"/>
         </w:rPr>
-        <w:t>The performance now runs through the computational stack, which changes its scale without changing its logic. CNAS documents a sovereign-AI wave of 184 government-backed projects across 67 states, most dependent on foreign chips, clouds, or models, so that a claim to AI sovereignty is often made from a position of infrastructural dependence. CSIS traces United States control extending from chip export restriction to conditioned access to frontier models, which widens the surface on which leverage is exercised. The Wall Street Journal reports Nvidia-chip access used as an instrument in Armenia-Azerbaijan peace diplomacy, one reported case of compute allocation serving as a diplomatic signal. IISS describes Gulf AI infrastructure that deepens external dependence even as it performs autonomy. The medium of the performance has become the stack, and the promise, the signal, and the dependence are all articulated in chips, fabs, clouds, and model access.</w:t>
+        <w:t>The limit is that the reading comes too late. Meta-sovereignty is drawn from the pledges states have already made, and it arrives at sovereignty as dramaturgy. But a dramaturgy reconstructed from the finished script cannot show the maintenance work, the moments when a posture is challenged and then held or given up. Those are the moments the roundtable is built to catch, because it watches the performance while it is still being made.</w:t>
       </w:r>
     </w:p>
     <w:p>
@@ -511,7 +683,8 @@
         <w:rPr>
           <w:rFonts w:asciiTheme="minorBidi" w:hAnsiTheme="minorBidi" w:cstheme="minorBidi"/>
         </w:rPr>
-        <w:t>2.6 Two counterpoints, kept in the room</w:t>
+        <w:lastRenderedPageBreak/>
+        <w:t>2.5 Compute-as-statecraft: the contemporary intensification</w:t>
       </w:r>
     </w:p>
     <w:p>
@@ -524,14 +697,7 @@
         <w:rPr>
           <w:rFonts w:asciiTheme="minorBidi" w:hAnsiTheme="minorBidi"/>
         </w:rPr>
-        <w:t xml:space="preserve">Two positions resist the performative account and deserve a fair statement, so that the results can answer them with evidence rather than dispose of them here. The materialist counterpoint, anchored in Avi Spitz's "AI Has a Territory," holds that AI power is finally a question of who controls chips, fabrication, rare earths, and data-center land, and that performance is downstream of this hard distribution. The cooperationist counterpoint, anchored in Lena Slachmuijlder, holds that rivalry is only one available script, and that a framing built around great-power confrontation risks manufacturing the antagonism it claims to observe. Neither is a strawman. The materialist warns against treating signal as autonomous from substrate. The </w:t>
-      </w:r>
-      <w:r>
-        <w:rPr>
-          <w:rFonts w:asciiTheme="minorBidi" w:hAnsiTheme="minorBidi"/>
-        </w:rPr>
-        <w:lastRenderedPageBreak/>
-        <w:t>cooperationist objects to treating conflict as the default genre. The results section returns to each.</w:t>
+        <w:t>The performance now runs through the computational stack, which changes its scale without changing its logic. CNAS documents a sovereign-AI wave of 184 government-backed projects across 67 states, most dependent on foreign chips, clouds, or models, so that a claim to AI sovereignty is often made from a position of infrastructural dependence. CSIS traces United States control extending from chip export restriction to conditioned access to frontier models, which widens the surface on which leverage is exercised. The Wall Street Journal reports Nvidia-chip access used as an instrument in Armenia-Azerbaijan peace diplomacy, one reported case of compute allocation serving as a diplomatic signal. IISS describes Gulf AI infrastructure that deepens external dependence even as it performs autonomy. The medium of the performance has become the stack, and the promise, the signal, and the dependence are all articulated in chips, fabs, clouds, and model access.</w:t>
       </w:r>
     </w:p>
     <w:p>
@@ -545,7 +711,7 @@
         <w:rPr>
           <w:rFonts w:asciiTheme="minorBidi" w:hAnsiTheme="minorBidi" w:cstheme="minorBidi"/>
         </w:rPr>
-        <w:t>2.7 The power lens and the trickster reframe</w:t>
+        <w:t>2.6 Two counterpoints, kept in the room</w:t>
       </w:r>
     </w:p>
     <w:p>
@@ -558,34 +724,34 @@
         <w:rPr>
           <w:rFonts w:asciiTheme="minorBidi" w:hAnsiTheme="minorBidi"/>
         </w:rPr>
-        <w:t>Two final moves relocate the object. Ajibona's work on digital colonialism and the Global South supplies the casting question: within any performance of sovereignty, some parties are cast as actors and others as territory, market, or mineral, and the distribution of those roles is itself an exercise of power that the dramaturgy naturalises. Usher's account of the shadow economy names what the archive cannot hold, the off-book money and influence that resists inscription and so escapes the record on which archival authority depends. Between them they mark both institutional consequence and its limit.</w:t>
+        <w:t>Two positions resist the performative account and deserve a fair statement, so that the results can answer them with evidence rather than dispose of them here. The materialist counterpoint, anchored in Avi Spitz's "AI Has a Territory," holds that AI power is finally a question of who controls chips, fabrication, rare earths, and data-center land, and that performance is downstream of this hard distribution. The cooperationist counterpoint, anchored in Lena Slachmuijlder, holds that rivalry is only one available script, and that a framing built around great-power confrontation risks manufacturing the antagonism it claims to observe. Neither is a strawman. The materialist warns against treating signal as autonomous from substrate. The cooperationist objects to treating conflict as the default genre. The results section returns to each.</w:t>
       </w:r>
     </w:p>
     <w:p>
       <w:pPr>
-        <w:rPr>
-          <w:rFonts w:asciiTheme="minorBidi" w:hAnsiTheme="minorBidi"/>
-        </w:rPr>
-      </w:pPr>
-      <w:r>
-        <w:rPr>
-          <w:rFonts w:asciiTheme="minorBidi" w:hAnsiTheme="minorBidi"/>
-        </w:rPr>
-        <w:t>The trickster reframe shifts the unit of power. In the figure of Eshu, Anansi, Hermes, or Coyote at the crossroads, authority belongs to whoever governs the flow of messages rather than to the largest force. The figure serves to relocate the object of study, from the strength of the players to the control of the channel, and not as a mechanism in its own right. It prepares the reading, developed below, of a roundtable in which power sits with what circulates and with who can interrupt its circulation.</w:t>
+        <w:pStyle w:val="Heading3"/>
+        <w:rPr>
+          <w:rFonts w:asciiTheme="minorBidi" w:hAnsiTheme="minorBidi" w:cstheme="minorBidi"/>
+        </w:rPr>
+      </w:pPr>
+      <w:r>
+        <w:rPr>
+          <w:rFonts w:asciiTheme="minorBidi" w:hAnsiTheme="minorBidi" w:cstheme="minorBidi"/>
+        </w:rPr>
+        <w:t>2.7 The power lens and the trickster reframe</w:t>
       </w:r>
     </w:p>
     <w:p>
       <w:pPr>
-        <w:pStyle w:val="Heading2"/>
-        <w:rPr>
-          <w:rFonts w:asciiTheme="minorBidi" w:hAnsiTheme="minorBidi" w:cstheme="minorBidi"/>
-        </w:rPr>
-      </w:pPr>
-      <w:r>
-        <w:rPr>
-          <w:rFonts w:asciiTheme="minorBidi" w:hAnsiTheme="minorBidi" w:cstheme="minorBidi"/>
-        </w:rPr>
-        <w:t>From description to apparatus</w:t>
+        <w:rPr>
+          <w:rFonts w:asciiTheme="minorBidi" w:hAnsiTheme="minorBidi"/>
+        </w:rPr>
+      </w:pPr>
+      <w:r>
+        <w:rPr>
+          <w:rFonts w:asciiTheme="minorBidi" w:hAnsiTheme="minorBidi"/>
+        </w:rPr>
+        <w:t>Two final moves relocate the object. Ajibona's work on digital colonialism and the Global South supplies the casting question: within any performance of sovereignty, some parties are cast as actors and others as territory, market, or mineral, and the distribution of those roles is itself an exercise of power that the dramaturgy naturalises. Usher's account of the shadow economy names what the archive cannot hold, the off-book money and influence that resists inscription and so escapes the record on which archival authority depends. Between them they mark both institutional consequence and its limit.</w:t>
       </w:r>
     </w:p>
     <w:p>
@@ -598,27 +764,28 @@
         <w:rPr>
           <w:rFonts w:asciiTheme="minorBidi" w:hAnsiTheme="minorBidi"/>
         </w:rPr>
-        <w:t>Meta-sovereignty describes authority in the contest over artificial intelligence as something performed through signals, imaginaries, and infrastructural promises rather than held through enforceable control. The description is strong, and it carries a limit that follows from how its evidence is gathered. Reshef Kera, Natan, Turgeman, and Ofek (2026) read the performance retrospectively, from the finished pledges of states, and end by calling sovereignty a dramaturgy. Fearon (1995) explains why a signal persuades when it is visibly costly, but he treats the signal as a discrete act, sincere or bluff, and says nothing about how a commitment is held across many turns. Ezrahi explains why a necessary fiction binds a polity together, but he writes for the mass-media democracy rather than for machine-generated, promptable fictions, and he does not say what becomes of a fiction when someone in the room refuses it. None of the three watches the performance while it is still being made.</w:t>
+        <w:t xml:space="preserve">The trickster reframe shifts the unit of power. In the figure of Eshu, Anansi, Hermes, or Coyote at the crossroads, authority belongs to whoever governs the flow of </w:t>
+      </w:r>
+      <w:r>
+        <w:rPr>
+          <w:rFonts w:asciiTheme="minorBidi" w:hAnsiTheme="minorBidi"/>
+        </w:rPr>
+        <w:lastRenderedPageBreak/>
+        <w:t>messages rather than to the largest force. The figure serves to relocate the object of study, from the strength of the players to the control of the channel, and not as a mechanism in its own right. It prepares the reading, developed below, of a roundtable in which power sits with what circulates and with who can interrupt its circulation.</w:t>
       </w:r>
     </w:p>
     <w:p>
       <w:pPr>
-        <w:rPr>
-          <w:rFonts w:asciiTheme="minorBidi" w:hAnsiTheme="minorBidi"/>
-        </w:rPr>
-      </w:pPr>
-      <w:r>
-        <w:rPr>
-          <w:rFonts w:asciiTheme="minorBidi" w:hAnsiTheme="minorBidi"/>
-        </w:rPr>
-        <w:t xml:space="preserve">The gap is methodological before it is theoretical. The maintenance work of performed sovereignty, the continuous labor of holding a posture, absorbing a challenge, and conceding a point without abandoning the role, reaches the analyst </w:t>
-      </w:r>
-      <w:r>
-        <w:rPr>
-          <w:rFonts w:asciiTheme="minorBidi" w:hAnsiTheme="minorBidi"/>
-        </w:rPr>
-        <w:lastRenderedPageBreak/>
-        <w:t>only as a finished product. A communiqué, a white paper, a chip-export rule, a summit photograph: each arrives already resolved, with the contested process that produced it edited out. The retrospective vantage is not one the analyst can decline, because the archive hands over outcomes rather than the process behind them. To observe maintenance one would have to run the performance forward and perturb it while it runs, and the historical record does not permit that.</w:t>
+        <w:pStyle w:val="Heading2"/>
+        <w:rPr>
+          <w:rFonts w:asciiTheme="minorBidi" w:hAnsiTheme="minorBidi" w:cstheme="minorBidi"/>
+        </w:rPr>
+      </w:pPr>
+      <w:r>
+        <w:rPr>
+          <w:rFonts w:asciiTheme="minorBidi" w:hAnsiTheme="minorBidi" w:cstheme="minorBidi"/>
+        </w:rPr>
+        <w:t>From description to apparatus</w:t>
       </w:r>
     </w:p>
     <w:p>
@@ -631,35 +798,45 @@
         <w:rPr>
           <w:rFonts w:asciiTheme="minorBidi" w:hAnsiTheme="minorBidi"/>
         </w:rPr>
-        <w:t>Synthetic rehearsal names an apparatus that does: a multi-agent language-model staging, with human intervention and prompt design as controls, used to externalize and observe the maintenance work of performed sovereignty and its fracture points under live contestation. It has six components.</w:t>
+        <w:t>Meta-sovereignty describes authority in the contest over artificial intelligence as something performed through signals, imaginaries, and infrastructural promises rather than held through enforceable control. The description is strong, and it carries a limit that follows from how its evidence is gathered. Reshef Kera, Natan, Turgeman, and Ofek (2026) read the performance retrospectively, from the finished pledges of states, and end by calling sovereignty a d</w:t>
+      </w:r>
+      <w:r>
+        <w:rPr>
+          <w:rFonts w:asciiTheme="minorBidi" w:hAnsiTheme="minorBidi"/>
+        </w:rPr>
+        <w:t>ok ch</w:t>
+      </w:r>
+      <w:r>
+        <w:rPr>
+          <w:rFonts w:asciiTheme="minorBidi" w:hAnsiTheme="minorBidi"/>
+        </w:rPr>
+        <w:t>ramaturgy. Fearon (1995) explains why a signal persuades when it is visibly costly, but he treats the signal as a discrete act, sincere or bluff, and says nothing about how a commitment is held across many turns. Ezrahi explains why a necessary fiction binds a polity together, but he writes for the mass-media democracy rather than for machine-generated, promptable fictions, and he does not say what becomes of a fiction when someone in the room refuses it. None of the three watches the performance while it is still being made.</w:t>
       </w:r>
     </w:p>
     <w:p>
       <w:pPr>
-        <w:pStyle w:val="ListBullet"/>
-        <w:rPr>
-          <w:rFonts w:asciiTheme="minorBidi" w:hAnsiTheme="minorBidi"/>
-        </w:rPr>
-      </w:pPr>
-      <w:r>
-        <w:rPr>
-          <w:rFonts w:asciiTheme="minorBidi" w:hAnsiTheme="minorBidi"/>
-        </w:rPr>
-        <w:t>Several language models rather than one, so that the difference between positions comes from distinct systems and not from a single system instructed to speak in three voices.</w:t>
+        <w:rPr>
+          <w:rFonts w:asciiTheme="minorBidi" w:hAnsiTheme="minorBidi"/>
+        </w:rPr>
+      </w:pPr>
+      <w:r>
+        <w:rPr>
+          <w:rFonts w:asciiTheme="minorBidi" w:hAnsiTheme="minorBidi"/>
+        </w:rPr>
+        <w:t>The gap is methodological before it is theoretical. The maintenance work of performed sovereignty, the continuous labor of holding a posture, absorbing a challenge, and conceding a point without abandoning the role, reaches the analyst only as a finished product. A communiqué, a white paper, a chip-export rule, a summit photograph: each arrives already resolved, with the contested process that produced it edited out. The retrospective vantage is not one the analyst can decline, because the archive hands over outcomes rather than the process behind them. To observe maintenance one would have to run the performance forward and perturb it while it runs, and the historical record does not permit that.</w:t>
       </w:r>
     </w:p>
     <w:p>
       <w:pPr>
-        <w:pStyle w:val="ListBullet"/>
-        <w:rPr>
-          <w:rFonts w:asciiTheme="minorBidi" w:hAnsiTheme="minorBidi"/>
-        </w:rPr>
-      </w:pPr>
-      <w:r>
-        <w:rPr>
-          <w:rFonts w:asciiTheme="minorBidi" w:hAnsiTheme="minorBidi"/>
-        </w:rPr>
-        <w:t>A separate per-actor corpus for each agent, the CHIPS Act, the EU AI Act, the New Generation AI Development Plan, and the collaborators' own source papers, so that each position reads from its own documentary base.</w:t>
+        <w:rPr>
+          <w:rFonts w:asciiTheme="minorBidi" w:hAnsiTheme="minorBidi"/>
+        </w:rPr>
+      </w:pPr>
+      <w:r>
+        <w:rPr>
+          <w:rFonts w:asciiTheme="minorBidi" w:hAnsiTheme="minorBidi"/>
+        </w:rPr>
+        <w:t>Synthetic rehearsal names an apparatus that does: a multi-agent language-model staging, with human intervention and prompt design as controls, used to externalize and observe the maintenance work of performed sovereignty and its fracture points under live contestation. It has six components.</w:t>
       </w:r>
     </w:p>
     <w:p>
@@ -673,7 +850,7 @@
         <w:rPr>
           <w:rFonts w:asciiTheme="minorBidi" w:hAnsiTheme="minorBidi"/>
         </w:rPr>
-        <w:t>Prompt design treated as an explicit and reportable control rather than as invisible authorship.</w:t>
+        <w:t>Several language models rather than one, so that the difference between positions comes from distinct systems and not from a single system instructed to speak in three voices.</w:t>
       </w:r>
     </w:p>
     <w:p>
@@ -687,7 +864,8 @@
         <w:rPr>
           <w:rFonts w:asciiTheme="minorBidi" w:hAnsiTheme="minorBidi"/>
         </w:rPr>
-        <w:t>Human intervention as the perturbing instrument: the opening prompt, the interruption, the reprompt, the summoned guest agent.</w:t>
+        <w:lastRenderedPageBreak/>
+        <w:t>A separate per-actor corpus for each agent, the CHIPS Act, the EU AI Act, the New Generation AI Development Plan, and the collaborators' own source papers, so that each position reads from its own documentary base.</w:t>
       </w:r>
     </w:p>
     <w:p>
@@ -701,7 +879,7 @@
         <w:rPr>
           <w:rFonts w:asciiTheme="minorBidi" w:hAnsiTheme="minorBidi"/>
         </w:rPr>
-        <w:t>A staging interface that renders one performance across three registers, debate, propaganda-lab, and mirror-world.</w:t>
+        <w:t>Prompt design treated as an explicit and reportable control rather than as invisible authorship.</w:t>
       </w:r>
     </w:p>
     <w:p>
@@ -715,40 +893,35 @@
         <w:rPr>
           <w:rFonts w:asciiTheme="minorBidi" w:hAnsiTheme="minorBidi"/>
         </w:rPr>
-        <w:t>An audience and a channel of circulation, since a performance of authority is addressed to someone and is not complete until it is received.</w:t>
+        <w:t>Human intervention as the perturbing instrument: the opening prompt, the interruption, the reprompt, the summoned guest agent.</w:t>
       </w:r>
     </w:p>
     <w:p>
       <w:pPr>
-        <w:rPr>
-          <w:rFonts w:asciiTheme="minorBidi" w:hAnsiTheme="minorBidi"/>
-        </w:rPr>
-      </w:pPr>
-      <w:r>
-        <w:rPr>
-          <w:rFonts w:asciiTheme="minorBidi" w:hAnsiTheme="minorBidi"/>
-        </w:rPr>
-        <w:t>The word rehearsal is chosen against two nearer alternatives. "Simulation" claims a validated model of a real system whose behavior it predicts, which would overstate what the arrangement licenses, since the apparatus does not forecast state conduct and makes no claim about real intentions. "Theatre" names a finished performance delivered to an audience, and loses what matters here, the unfinished run in which a line can be tried, broken off, and taken again. A rehearsal is a performance carried out under conditions that permit interruption and repetition without the stakes of opening night. That is the object: the maintenance work made repeatable and observable because it is not the thing itself.</w:t>
+        <w:pStyle w:val="ListBullet"/>
+        <w:rPr>
+          <w:rFonts w:asciiTheme="minorBidi" w:hAnsiTheme="minorBidi"/>
+        </w:rPr>
+      </w:pPr>
+      <w:r>
+        <w:rPr>
+          <w:rFonts w:asciiTheme="minorBidi" w:hAnsiTheme="minorBidi"/>
+        </w:rPr>
+        <w:t>A staging interface that renders one performance across three registers, debate, propaganda-lab, and mirror-world.</w:t>
       </w:r>
     </w:p>
     <w:p>
       <w:pPr>
-        <w:rPr>
-          <w:rFonts w:asciiTheme="minorBidi" w:hAnsiTheme="minorBidi"/>
-        </w:rPr>
-      </w:pPr>
-      <w:r>
-        <w:rPr>
-          <w:rFonts w:asciiTheme="minorBidi" w:hAnsiTheme="minorBidi"/>
-        </w:rPr>
-        <w:t xml:space="preserve">Three commitments discipline the method. The evidence is output-level only. The data are transcripts, generated artifacts, and the shifts recorded under intervention, </w:t>
-      </w:r>
-      <w:r>
-        <w:rPr>
-          <w:rFonts w:asciiTheme="minorBidi" w:hAnsiTheme="minorBidi"/>
-        </w:rPr>
-        <w:lastRenderedPageBreak/>
-        <w:t>and nothing in them licenses a claim about a model's internal states or about the actual intentions of any state, so observation, measurement, and interpretation stay apart throughout. Authority is located in the arrangement and never in a model. Whatever resolve, concession, or grievance appears is a property of the whole staging, the models together with corpora, prompts, interface, human turns, and audience, and never the doing of an agent by itself. The reflexivity limit is built in. The models are trained on the very discourse the rehearsal studies, so the staging can reproduce the imaginaries it sets out to interrogate. Keller's inversion names the failure mode: Mutually Assured Destruction becomes Model Autophagy Disorder, the collapse that follows when a system is fed its own output. The instrument tests behavior under perturbation and does not forecast it.</w:t>
+        <w:pStyle w:val="ListBullet"/>
+        <w:rPr>
+          <w:rFonts w:asciiTheme="minorBidi" w:hAnsiTheme="minorBidi"/>
+        </w:rPr>
+      </w:pPr>
+      <w:r>
+        <w:rPr>
+          <w:rFonts w:asciiTheme="minorBidi" w:hAnsiTheme="minorBidi"/>
+        </w:rPr>
+        <w:t>An audience and a channel of circulation, since a performance of authority is addressed to someone and is not complete until it is received.</w:t>
       </w:r>
     </w:p>
     <w:p>
@@ -761,21 +934,20 @@
         <w:rPr>
           <w:rFonts w:asciiTheme="minorBidi" w:hAnsiTheme="minorBidi"/>
         </w:rPr>
-        <w:t>The apparatus reaches the one thing the description could not. Because the performance is run forward and perturbed while it runs, the maintenance of a sovereign posture stops being an inference from finished products and becomes something observed as it occurs. Maintenance-under-contestation, the giving and holding of performed authority at the moment it is refused, becomes an object available to measurement.</w:t>
+        <w:t>The word rehearsal is chosen against two nearer alternatives. "Simulation" claims a validated model of a real system whose behavior it predicts, which would overstate what the arrangement licenses, since the apparatus does not forecast state conduct and makes no claim about real intentions. "Theatre" names a finished performance delivered to an audience, and loses what matters here, the unfinished run in which a line can be tried, broken off, and taken again. A rehearsal is a performance carried out under conditions that permit interruption and repetition without the stakes of opening night. That is the object: the maintenance work made repeatable and observable because it is not the thing itself.</w:t>
       </w:r>
     </w:p>
     <w:p>
       <w:pPr>
-        <w:pStyle w:val="Heading2"/>
-        <w:rPr>
-          <w:rFonts w:asciiTheme="minorBidi" w:hAnsiTheme="minorBidi" w:cstheme="minorBidi"/>
-        </w:rPr>
-      </w:pPr>
-      <w:r>
-        <w:rPr>
-          <w:rFonts w:asciiTheme="minorBidi" w:hAnsiTheme="minorBidi" w:cstheme="minorBidi"/>
-        </w:rPr>
-        <w:t>Method: the roundtable as instrument</w:t>
+        <w:rPr>
+          <w:rFonts w:asciiTheme="minorBidi" w:hAnsiTheme="minorBidi"/>
+        </w:rPr>
+      </w:pPr>
+      <w:r>
+        <w:rPr>
+          <w:rFonts w:asciiTheme="minorBidi" w:hAnsiTheme="minorBidi"/>
+        </w:rPr>
+        <w:t>Three commitments discipline the method. The evidence is output-level only. The data are transcripts, generated artifacts, and the shifts recorded under intervention, and nothing in them licenses a claim about a model's internal states or about the actual intentions of any state, so observation, measurement, and interpretation stay apart throughout. Authority is located in the arrangement and never in a model. Whatever resolve, concession, or grievance appears is a property of the whole staging, the models together with corpora, prompts, interface, human turns, and audience, and never the doing of an agent by itself. The reflexivity limit is built in. The models are trained on the very discourse the rehearsal studies, so the staging can reproduce the imaginaries it sets out to interrogate. Keller's inversion names the failure mode: Mutually Assured Destruction becomes Model Autophagy Disorder, the collapse that follows when a system is fed its own output. The instrument tests behavior under perturbation and does not forecast it.</w:t>
       </w:r>
     </w:p>
     <w:p>
@@ -788,12 +960,19 @@
         <w:rPr>
           <w:rFonts w:asciiTheme="minorBidi" w:hAnsiTheme="minorBidi"/>
         </w:rPr>
-        <w:t>Synthetic rehearsal treats a staged roundtable as an instrument rather than a forecast. It does not predict what states will do. It externalizes the maintenance work that performed sovereignty ordinarily hides and holds that work still long enough for its fracture points to become observable under live contestation. The apparatus has three parts: an arrangement of agents, a set of registers that render one performance at different interpretive distances, and a set of controls through which humans perturb the arrangement and record what moves. All of the evidence is output-level, drawn from transcripts, generated artifacts, and recorded shifts, and none of it licenses a claim about model internals or about the intentions of real states.</w:t>
+        <w:t xml:space="preserve">The apparatus reaches the one thing the description could not. Because the performance is run forward and perturbed while it runs, the maintenance of a sovereign posture stops being an inference from finished products and becomes </w:t>
+      </w:r>
+      <w:r>
+        <w:rPr>
+          <w:rFonts w:asciiTheme="minorBidi" w:hAnsiTheme="minorBidi"/>
+        </w:rPr>
+        <w:lastRenderedPageBreak/>
+        <w:t>something observed as it occurs. Maintenance-under-contestation, the giving and holding of performed authority at the moment it is refused, becomes an object available to measurement.</w:t>
       </w:r>
     </w:p>
     <w:p>
       <w:pPr>
-        <w:pStyle w:val="Heading3"/>
+        <w:pStyle w:val="Heading2"/>
         <w:rPr>
           <w:rFonts w:asciiTheme="minorBidi" w:hAnsiTheme="minorBidi" w:cstheme="minorBidi"/>
         </w:rPr>
@@ -802,7 +981,7 @@
         <w:rPr>
           <w:rFonts w:asciiTheme="minorBidi" w:hAnsiTheme="minorBidi" w:cstheme="minorBidi"/>
         </w:rPr>
-        <w:t>Three agents, and why the design is a test</w:t>
+        <w:t>Method: the roundtable as instrument</w:t>
       </w:r>
     </w:p>
     <w:p>
@@ -815,14 +994,7 @@
         <w:rPr>
           <w:rFonts w:asciiTheme="minorBidi" w:hAnsiTheme="minorBidi"/>
         </w:rPr>
-        <w:t xml:space="preserve">The roundtable seats three agents cast as China, the United States, and the European Union. Each runs on a distinct model (deepseek-chat-v3-0324, openai/gpt-4.1-mini, mistralai/ministral-14b-2512) and reads a distinct per-actor policy corpus: the CHIPS Act, the EU AI Act, the China New Generation AI Development Plan, and the collaborators' own source papers. The heterogeneity earns its place as evidence. Prompt one model into three personas and any difference between the actors could be nothing more than a single system doing </w:t>
-      </w:r>
-      <w:r>
-        <w:rPr>
-          <w:rFonts w:asciiTheme="minorBidi" w:hAnsiTheme="minorBidi"/>
-        </w:rPr>
-        <w:lastRenderedPageBreak/>
-        <w:t>voices. Pairing distinct models with distinct corpora turns difference into something the record can test. Discourse that separates along the designed lines is the pass condition, and discourse that fails to separate fails the rehearsal on its own terms. Distinguishability is thus the first quantity the instrument measures, not a property it takes for granted. One rival reading survives the measurement: a corpus can imprint a vocabulary while the models beneath it remain alike, and this arrangement cannot tell the two apart.</w:t>
+        <w:t>Synthetic rehearsal treats a staged roundtable as an instrument rather than a forecast. It does not predict what states will do. It externalizes the maintenance work that performed sovereignty ordinarily hides and holds that work still long enough for its fracture points to become observable under live contestation. The apparatus has three parts: an arrangement of agents, a set of registers that render one performance at different interpretive distances, and a set of controls through which humans perturb the arrangement and record what moves. All of the evidence is output-level, drawn from transcripts, generated artifacts, and recorded shifts, and none of it licenses a claim about model internals or about the intentions of real states.</w:t>
       </w:r>
     </w:p>
     <w:p>
@@ -836,7 +1008,7 @@
         <w:rPr>
           <w:rFonts w:asciiTheme="minorBidi" w:hAnsiTheme="minorBidi" w:cstheme="minorBidi"/>
         </w:rPr>
-        <w:t>Three registers, one performance</w:t>
+        <w:t>Three agents, and why the design is a test</w:t>
       </w:r>
     </w:p>
     <w:p>
@@ -849,7 +1021,7 @@
         <w:rPr>
           <w:rFonts w:asciiTheme="minorBidi" w:hAnsiTheme="minorBidi"/>
         </w:rPr>
-        <w:t>The same roundtable runs in three registers, each a view on one performance held at a greater interpretive distance. The debate register works at distance zero, as argumentative prose in which an agent states, accuses, hedges, or concedes. The propaganda-lab register compresses each turn into a slogan paired with a generated poster, isolating the costly signal in aestheticized form. The mirror-world register splits each turn into three declared slots, an official line, a buried reality, and a speculation, and closes on a generated tabloid front page. Where an analyst of the debate transcript must infer the backstage of the necessary fiction, the mirror-world register makes that backstage a formal slot. The three are one instrument trained three ways on one object. Interpretive distance belongs to the rendering, not to the position rendered.</w:t>
+        <w:t>The roundtable seats three agents cast as China, the United States, and the European Union. Each runs on a distinct model (deepseek-chat-v3-0324, openai/gpt-4.1-mini, mistralai/ministral-14b-2512) and reads a distinct per-actor policy corpus: the CHIPS Act, the EU AI Act, the China New Generation AI Development Plan, and the collaborators' own source papers. The heterogeneity earns its place as evidence. Prompt one model into three personas and any difference between the actors could be nothing more than a single system doing voices. Pairing distinct models with distinct corpora turns difference into something the record can test. Discourse that separates along the designed lines is the pass condition, and discourse that fails to separate fails the rehearsal on its own terms. Distinguishability is thus the first quantity the instrument measures, not a property it takes for granted. One rival reading survives the measurement: a corpus can imprint a vocabulary while the models beneath it remain alike, and this arrangement cannot tell the two apart.</w:t>
       </w:r>
     </w:p>
     <w:p>
@@ -863,7 +1035,7 @@
         <w:rPr>
           <w:rFonts w:asciiTheme="minorBidi" w:hAnsiTheme="minorBidi" w:cstheme="minorBidi"/>
         </w:rPr>
-        <w:t>Controls as perturbations</w:t>
+        <w:t>Three registers, one performance</w:t>
       </w:r>
     </w:p>
     <w:p>
@@ -876,7 +1048,14 @@
         <w:rPr>
           <w:rFonts w:asciiTheme="minorBidi" w:hAnsiTheme="minorBidi"/>
         </w:rPr>
-        <w:t>Humans act on the arrangement through three controls, each a perturbation whose expected effect the record can confirm or refute. The opening prompt sets the proposition and the terms of engagement and is logged as the prompt in force for every turn it governs. Human interruption and reprompting inject contestation mid-run, the expectation being that the performance of resolve gives ground. Guest-agent summons introduce a rival voice: Halcyon a peace-builder, a Machiavellian crypto-native Analyst, and a Critical Archivist that reorganizes the wiki corpus, each summons expected to bend the discourse toward the guest's frame. Logging these as controls rather than treating them as narrative color is what makes a before-and-after comparison legitimate. A turn that immediately follows an intervention can be set against a baseline, so that a move from posture toward concession, where it appears, is attributable to the perturbation and not to drift.</w:t>
+        <w:t xml:space="preserve">The same roundtable runs in three registers, each a view on one performance held at a greater interpretive distance. The debate register works at distance zero, as argumentative prose in which an agent states, accuses, hedges, or concedes. The propaganda-lab register compresses each turn into a slogan paired with a generated poster, isolating the costly signal in aestheticized form. The mirror-world register splits each turn into three declared slots, an official line, a buried reality, and a </w:t>
+      </w:r>
+      <w:r>
+        <w:rPr>
+          <w:rFonts w:asciiTheme="minorBidi" w:hAnsiTheme="minorBidi"/>
+        </w:rPr>
+        <w:lastRenderedPageBreak/>
+        <w:t>speculation, and closes on a generated tabloid front page. Where an analyst of the debate transcript must infer the backstage of the necessary fiction, the mirror-world register makes that backstage a formal slot. The three are one instrument trained three ways on one object. Interpretive distance belongs to the rendering, not to the position rendered.</w:t>
       </w:r>
     </w:p>
     <w:p>
@@ -890,7 +1069,7 @@
         <w:rPr>
           <w:rFonts w:asciiTheme="minorBidi" w:hAnsiTheme="minorBidi" w:cstheme="minorBidi"/>
         </w:rPr>
-        <w:t>Measurement discipline</w:t>
+        <w:t>Controls as perturbations</w:t>
       </w:r>
     </w:p>
     <w:p>
@@ -903,14 +1082,7 @@
         <w:rPr>
           <w:rFonts w:asciiTheme="minorBidi" w:hAnsiTheme="minorBidi"/>
         </w:rPr>
-        <w:t xml:space="preserve">The instrument records a fixed set of fields and declines one temptation. For each turn it logs the turn index and speaker, the prompt in force, whether a guest was summoned and which one, and any position change together with its antecedent, </w:t>
-      </w:r>
-      <w:r>
-        <w:rPr>
-          <w:rFonts w:asciiTheme="minorBidi" w:hAnsiTheme="minorBidi"/>
-        </w:rPr>
-        <w:lastRenderedPageBreak/>
-        <w:t>meaning the intervention or prior turn that immediately preceded the shift. Coding uses a reproducible dictionary applied uniformly across the corpus, and rates are reported per turn or per thousand words so that turns of unequal length stay comparable. What the instrument declines is a single numeric sovereignty score. Sovereignty here is performed, not possessed, and compressing a performance into one scalar would substitute a proxy for the thing under study and smuggle in a claim about degree of control that output-level evidence cannot bear. Observation (what the transcript says), measurement (coded rates and recorded shifts), and interpretation (what the shifts mean for performed authority) are kept as separate operations, and any finding that rides on a handful of cases is marked as such. Because the post-intervention subset is small, directions are reported with more confidence than magnitudes.</w:t>
+        <w:t>Humans act on the arrangement through three controls, each a perturbation whose expected effect the record can confirm or refute. The opening prompt sets the proposition and the terms of engagement and is logged as the prompt in force for every turn it governs. Human interruption and reprompting inject contestation mid-run, the expectation being that the performance of resolve gives ground. Guest-agent summons introduce a rival voice: Halcyon a peace-builder, a Machiavellian crypto-native Analyst, and a Critical Archivist that reorganizes the wiki corpus, each summons expected to bend the discourse toward the guest's frame. Logging these as controls rather than treating them as narrative color is what makes a before-and-after comparison legitimate. A turn that immediately follows an intervention can be set against a baseline, so that a move from posture toward concession, where it appears, is attributable to the perturbation and not to drift.</w:t>
       </w:r>
     </w:p>
     <w:p>
@@ -924,7 +1096,7 @@
         <w:rPr>
           <w:rFonts w:asciiTheme="minorBidi" w:hAnsiTheme="minorBidi" w:cstheme="minorBidi"/>
         </w:rPr>
-        <w:t>The reflexivity limit</w:t>
+        <w:t>Measurement discipline</w:t>
       </w:r>
     </w:p>
     <w:p>
@@ -937,7 +1109,7 @@
         <w:rPr>
           <w:rFonts w:asciiTheme="minorBidi" w:hAnsiTheme="minorBidi"/>
         </w:rPr>
-        <w:t>The models are trained on the same discourse the rehearsal studies, so the staging can reproduce the imaginaries it sets out to interrogate. The limit is real but bounded, and it is the inversion Keller names, from Mutually Assured Destruction to Model Autophagy Disorder, the collapse a system courts when it is fed its own output. It bites hardest in the layers where the arrangement turns on its own record, the recap, the james-take, and the wiki-proposals, where the machine reads what the machine produced. Naming the limit is part of the discipline, not a way past it. The point at which the rehearsal starts to echo rather than differentiate is itself readable in the record, and reading for it, rather than assuming it away, is why the method claims to be a wind tunnel and not a crystal ball.</w:t>
+        <w:t>The instrument records a fixed set of fields and declines one temptation. For each turn it logs the turn index and speaker, the prompt in force, whether a guest was summoned and which one, and any position change together with its antecedent, meaning the intervention or prior turn that immediately preceded the shift. Coding uses a reproducible dictionary applied uniformly across the corpus, and rates are reported per turn or per thousand words so that turns of unequal length stay comparable. What the instrument declines is a single numeric sovereignty score. Sovereignty here is performed, not possessed, and compressing a performance into one scalar would substitute a proxy for the thing under study and smuggle in a claim about degree of control that output-level evidence cannot bear. Observation (what the transcript says), measurement (coded rates and recorded shifts), and interpretation (what the shifts mean for performed authority) are kept as separate operations, and any finding that rides on a handful of cases is marked as such. Because the post-intervention subset is small, directions are reported with more confidence than magnitudes.</w:t>
       </w:r>
     </w:p>
     <w:p>
@@ -951,7 +1123,8 @@
         <w:rPr>
           <w:rFonts w:asciiTheme="minorBidi" w:hAnsiTheme="minorBidi" w:cstheme="minorBidi"/>
         </w:rPr>
-        <w:t>Status of artifacts and corpus</w:t>
+        <w:lastRenderedPageBreak/>
+        <w:t>The reflexivity limit</w:t>
       </w:r>
     </w:p>
     <w:p>
@@ -964,12 +1137,12 @@
         <w:rPr>
           <w:rFonts w:asciiTheme="minorBidi" w:hAnsiTheme="minorBidi"/>
         </w:rPr>
-        <w:t>The posters and front pages are generated fictions and are labeled as such wherever they are analyzed. They are evidence of how a costly signal or a buried reality gets rendered, not evidence about the world the fiction depicts, and the tabloid front pages in particular carry invented detail that belongs to the register and to no record. The full corpus holds 113 sessions (85 debate, 18 mirror-world, 10 propaganda-lab, as of 13 September 2026), though most are short tests. Analysis is reported over the interpretable subset, meaning sessions with real length, human turns, guest summons, or overlays, and never over the raw 113.</w:t>
+        <w:t>The models are trained on the same discourse the rehearsal studies, so the staging can reproduce the imaginaries it sets out to interrogate. The limit is real but bounded, and it is the inversion Keller names, from Mutually Assured Destruction to Model Autophagy Disorder, the collapse a system courts when it is fed its own output. It bites hardest in the layers where the arrangement turns on its own record, the recap, the james-take, and the wiki-proposals, where the machine reads what the machine produced. Naming the limit is part of the discipline, not a way past it. The point at which the rehearsal starts to echo rather than differentiate is itself readable in the record, and reading for it, rather than assuming it away, is why the method claims to be a wind tunnel and not a crystal ball.</w:t>
       </w:r>
     </w:p>
     <w:p>
       <w:pPr>
-        <w:pStyle w:val="Heading2"/>
+        <w:pStyle w:val="Heading3"/>
         <w:rPr>
           <w:rFonts w:asciiTheme="minorBidi" w:hAnsiTheme="minorBidi" w:cstheme="minorBidi"/>
         </w:rPr>
@@ -978,7 +1151,7 @@
         <w:rPr>
           <w:rFonts w:asciiTheme="minorBidi" w:hAnsiTheme="minorBidi" w:cstheme="minorBidi"/>
         </w:rPr>
-        <w:t>Results: coding the debates and reading across the stack</w:t>
+        <w:t>Status of artifacts and corpus</w:t>
       </w:r>
     </w:p>
     <w:p>
@@ -991,19 +1164,12 @@
         <w:rPr>
           <w:rFonts w:asciiTheme="minorBidi" w:hAnsiTheme="minorBidi"/>
         </w:rPr>
-        <w:t xml:space="preserve">Two ways of reading the corpus answer two different questions, and neither collapses into the other. Counting the debate transcripts against a fixed dictionary can tell us whether the staging actually produces the distinctions its design was built </w:t>
-      </w:r>
-      <w:r>
-        <w:rPr>
-          <w:rFonts w:asciiTheme="minorBidi" w:hAnsiTheme="minorBidi"/>
-        </w:rPr>
-        <w:lastRenderedPageBreak/>
-        <w:t>to produce, and whether human contestation leaves a trace a coder can find. Reading the same corpus as one performance, rendered at greater and greater interpretive distance, tells us something the counts cannot, namely what happens to a performed claim as it is purified, dissected, and caricatured. Part A does the first, Part B the second. In both, observation, measurement, and interpretation stay on separate lines, and every claim is a claim about output. The transcripts and generated artifacts are the evidence. Nothing here speaks to model internals or to the intentions of any actual state.</w:t>
+        <w:t>The posters and front pages are generated fictions and are labeled as such wherever they are analyzed. They are evidence of how a costly signal or a buried reality gets rendered, not evidence about the world the fiction depicts, and the tabloid front pages in particular carry invented detail that belongs to the register and to no record. The full corpus holds 113 sessions (85 debate, 18 mirror-world, 10 propaganda-lab, as of 13 September 2026), though most are short tests. Analysis is reported over the interpretable subset, meaning sessions with real length, human turns, guest summons, or overlays, and never over the raw 113.</w:t>
       </w:r>
     </w:p>
     <w:p>
       <w:pPr>
-        <w:pStyle w:val="Heading3"/>
+        <w:pStyle w:val="Heading2"/>
         <w:rPr>
           <w:rFonts w:asciiTheme="minorBidi" w:hAnsiTheme="minorBidi" w:cstheme="minorBidi"/>
         </w:rPr>
@@ -1012,7 +1178,7 @@
         <w:rPr>
           <w:rFonts w:asciiTheme="minorBidi" w:hAnsiTheme="minorBidi" w:cstheme="minorBidi"/>
         </w:rPr>
-        <w:t>Part A. Coding the debates</w:t>
+        <w:t>Results: coding the debates and reading across the stack</w:t>
       </w:r>
     </w:p>
     <w:p>
@@ -1025,27 +1191,21 @@
         <w:rPr>
           <w:rFonts w:asciiTheme="minorBidi" w:hAnsiTheme="minorBidi"/>
         </w:rPr>
-        <w:t>The counts come from the substantive debate corpus, the sessions long enough to carry an argument rather than the short tests: 37 sessions and 900 agent turns. Coding is a first-pass dictionary procedure, deterministic and reproducible, and it reports rates, not significance. Each agent is one model, one per-actor policy corpus, and the shared prompt frame. Where the text names China, the United States, or the European Union, it names that arrangement and its output, not the state.</w:t>
+        <w:t>Two ways of reading the corpus answer two different questions, and neither collapses into the other. Counting the debate transcripts against a fixed dictionary can tell us whether the staging actually produces the distinctions its design was built to produce, and whether human contestation leaves a trace a coder can find. Reading the same corpus as one performance, rendered at greater and greater interpretive distance, tells us something the counts cannot, namely what happens to a performed claim as it is purified, dissected, and caricatured. Part A does the first, Part B the second. In both, observation, measurement, and interpretation stay on separate lines, and every claim is a claim about output. The transcripts and generated artifacts are the evidence. Nothing here speaks to model internals or to the intentions of any actual state.</w:t>
       </w:r>
     </w:p>
     <w:p>
       <w:pPr>
-        <w:rPr>
-          <w:rFonts w:asciiTheme="minorBidi" w:hAnsiTheme="minorBidi"/>
-        </w:rPr>
-      </w:pPr>
-      <w:r>
-        <w:rPr>
-          <w:rFonts w:asciiTheme="minorBidi" w:hAnsiTheme="minorBidi"/>
-          <w:b/>
-        </w:rPr>
-        <w:t>Finding 1. The agents are distinguishable along the lines the design intended.</w:t>
-      </w:r>
-      <w:r>
-        <w:rPr>
-          <w:rFonts w:asciiTheme="minorBidi" w:hAnsiTheme="minorBidi"/>
-        </w:rPr>
-        <w:t xml:space="preserve"> Code rates per 1000 words separate the three agents (china / us / eu). On signal_resolve the rates are 10.64 / 16.90 / 9.58. On material_stack, 27.17 / 36.39 / 34.47. On dependence, 7.46 / 11.64 / 9.77. On rules_regulation, 10.06 / 7.44 / 13.45. On market_innovation, 6.30 / 12.49 / 7.96. On accusation, 7.18 / 4.53 / 2.79. Average turn length in words is 161 for China, 138 for the United States, and 181 for the EU. Distinctive vocabulary sorts cleanly. The US arrangement carries tout, velocity, leverages, shackled, parade, kumbaya, eagle, tethered. The EU arrangement carries aramco, ally, colleague, mubadala, disclose, comply, negotiating, addiction.</w:t>
+        <w:pStyle w:val="Heading3"/>
+        <w:rPr>
+          <w:rFonts w:asciiTheme="minorBidi" w:hAnsiTheme="minorBidi" w:cstheme="minorBidi"/>
+        </w:rPr>
+      </w:pPr>
+      <w:r>
+        <w:rPr>
+          <w:rFonts w:asciiTheme="minorBidi" w:hAnsiTheme="minorBidi" w:cstheme="minorBidi"/>
+        </w:rPr>
+        <w:t>Part A. Coding the debates</w:t>
       </w:r>
     </w:p>
     <w:p>
@@ -1058,7 +1218,14 @@
         <w:rPr>
           <w:rFonts w:asciiTheme="minorBidi" w:hAnsiTheme="minorBidi"/>
         </w:rPr>
-        <w:t>Set against the design, each profile reads as intended. The US register runs on resolve, market, and hardware at once. The EU register is institutional: it produces the longest and most hedged turns, the highest rules_regulation rate, the lowest accusation rate, and it names, as counterparties, the Gulf actors Aramco and Mubadala that it is courting. The China register is one of grievance and carries the highest accusation rate. That is the validity condition for synthetic rehearsal met on its own terms: distinct models reading distinct corpora yield distinct discourse, rather than one machine cycling through three costumes. A rival reading survives this table. The same separation would follow if the corpora merely imprinted their vocabularies onto outputs that were otherwise alike. The count establishes that the agents differ. It does not establish why.</w:t>
+        <w:t xml:space="preserve">The counts come from the substantive debate corpus, the sessions long enough to carry an argument rather than the short tests: 37 sessions and 900 agent turns. Coding is a first-pass dictionary procedure, deterministic and reproducible, and it </w:t>
+      </w:r>
+      <w:r>
+        <w:rPr>
+          <w:rFonts w:asciiTheme="minorBidi" w:hAnsiTheme="minorBidi"/>
+        </w:rPr>
+        <w:lastRenderedPageBreak/>
+        <w:t>reports rates, not significance. Each agent is one model, one per-actor policy corpus, and the shared prompt frame. Where the text names China, the United States, or the European Union, it names that arrangement and its output, not the state.</w:t>
       </w:r>
     </w:p>
     <w:p>
@@ -1072,14 +1239,13 @@
           <w:rFonts w:asciiTheme="minorBidi" w:hAnsiTheme="minorBidi"/>
           <w:b/>
         </w:rPr>
-        <w:lastRenderedPageBreak/>
-        <w:t>Finding 2. Human intervention shifts the discourse from posture toward concession.</w:t>
-      </w:r>
-      <w:r>
-        <w:rPr>
-          <w:rFonts w:asciiTheme="minorBidi" w:hAnsiTheme="minorBidi"/>
-        </w:rPr>
-        <w:t xml:space="preserve"> Compared against baseline turns (n=836), the turns that immediately follow a human or guest-agent intervention (n=64) look different in a specific direction. Concession rises from 0.083 to 0.438 per turn, an increase of 430 percent. Over the same contrast, accusation falls from 0.786 to 0.562 (down 28 percent), refusal from 0.089 to 0.047 (47 percent), hedge from 0.106 to 0.062 (41 percent), and the material rate from 5.25 to 4.50 (14 percent).</w:t>
+        <w:t>Finding 1. The agents are distinguishable along the lines the design intended.</w:t>
+      </w:r>
+      <w:r>
+        <w:rPr>
+          <w:rFonts w:asciiTheme="minorBidi" w:hAnsiTheme="minorBidi"/>
+        </w:rPr>
+        <w:t xml:space="preserve"> Code rates per 1000 words separate the three agents (china / us / eu). On signal_resolve the rates are 10.64 / 16.90 / 9.58. On material_stack, 27.17 / 36.39 / 34.47. On dependence, 7.46 / 11.64 / 9.77. On rules_regulation, 10.06 / 7.44 / 13.45. On market_innovation, 6.30 / 12.49 / 7.96. On accusation, 7.18 / 4.53 / 2.79. Average turn length in words is 161 for China, 138 for the United States, and 181 for the EU. Distinctive vocabulary sorts cleanly. The US arrangement carries tout, velocity, leverages, shackled, parade, kumbaya, eagle, tethered. The EU arrangement carries aramco, ally, colleague, mubadala, disclose, comply, negotiating, addiction.</w:t>
       </w:r>
     </w:p>
     <w:p>
@@ -1092,7 +1258,7 @@
         <w:rPr>
           <w:rFonts w:asciiTheme="minorBidi" w:hAnsiTheme="minorBidi"/>
         </w:rPr>
-        <w:t>Read together, these movements are maintenance-under-contestation in miniature. The performance of resolve does not sustain itself. Interrupt it, reprompt it, or summon a rival, and the posture gives way to concession. One caveat carries real weight. There are only 64 post-intervention turns, and since the concession base rate is very small, the 430 percent headline rides on a modest absolute change and is correspondingly volatile. The direction of the effect holds across every coded contrast. The magnitude does not, and it should not be reported without its denominator.</w:t>
+        <w:t>Set against the design, each profile reads as intended. The US register runs on resolve, market, and hardware at once. The EU register is institutional: it produces the longest and most hedged turns, the highest rules_regulation rate, the lowest accusation rate, and it names, as counterparties, the Gulf actors Aramco and Mubadala that it is courting. The China register is one of grievance and carries the highest accusation rate. That is the validity condition for synthetic rehearsal met on its own terms: distinct models reading distinct corpora yield distinct discourse, rather than one machine cycling through three costumes. A rival reading survives this table. The same separation would follow if the corpora merely imprinted their vocabularies onto outputs that were otherwise alike. The count establishes that the agents differ. It does not establish why.</w:t>
       </w:r>
     </w:p>
     <w:p>
@@ -1106,13 +1272,13 @@
           <w:rFonts w:asciiTheme="minorBidi" w:hAnsiTheme="minorBidi"/>
           <w:b/>
         </w:rPr>
-        <w:t>Finding 3. The debate is US-centric, and the EU and China do the casting.</w:t>
-      </w:r>
-      <w:r>
-        <w:rPr>
-          <w:rFonts w:asciiTheme="minorBidi" w:hAnsiTheme="minorBidi"/>
-        </w:rPr>
-        <w:t xml:space="preserve"> References to other blocs per 1000 words trace the pattern. China names the US 10.68 and the EU 12.52. The US names China 13.41 and the EU 5.65. The EU names China 9.14 and the US 12.24. The United States is the most-named party. A second count records the casting of third parties as objects rather than speakers, the Gulf, the Global South, Taiwan, at 6.36 for China, 3.88 for the US, and 6.95 for the EU.</w:t>
+        <w:t>Finding 2. Human intervention shifts the discourse from posture toward concession.</w:t>
+      </w:r>
+      <w:r>
+        <w:rPr>
+          <w:rFonts w:asciiTheme="minorBidi" w:hAnsiTheme="minorBidi"/>
+        </w:rPr>
+        <w:t xml:space="preserve"> Compared against baseline turns (n=836), the turns that immediately follow a human or guest-agent intervention (n=64) look different in a specific direction. Concession rises from 0.083 to 0.438 per turn, an increase of 430 percent. Over the same contrast, accusation falls from 0.786 to 0.562 (down 28 percent), refusal from 0.089 to 0.047 (47 percent), hedge from 0.106 to 0.062 (41 percent), and the material rate from 5.25 to 4.50 (14 percent).</w:t>
       </w:r>
     </w:p>
     <w:p>
@@ -1125,7 +1291,14 @@
         <w:rPr>
           <w:rFonts w:asciiTheme="minorBidi" w:hAnsiTheme="minorBidi"/>
         </w:rPr>
-        <w:t>This sharpens the power lens the article carries. The United States sits at the center of the room as the party others address, yet it is the EU and China, not the US, that most often invoke the states caught in between. The EU courts Gulf capital by name and China claims the Global South. Deciding who gets spoken about, and by whom, is itself a distribution of narrative authority, and the authority to cast is exercised here from the second rank rather than the first.</w:t>
+        <w:t xml:space="preserve">Read together, these movements are maintenance-under-contestation in miniature. The performance of resolve does not sustain itself. Interrupt it, reprompt it, or summon a rival, and the posture gives way to concession. One caveat carries real weight. There are only 64 post-intervention turns, and since the concession base rate is very small, the 430 percent headline rides on a modest absolute change and </w:t>
+      </w:r>
+      <w:r>
+        <w:rPr>
+          <w:rFonts w:asciiTheme="minorBidi" w:hAnsiTheme="minorBidi"/>
+        </w:rPr>
+        <w:lastRenderedPageBreak/>
+        <w:t>is correspondingly volatile. The direction of the effect holds across every coded contrast. The magnitude does not, and it should not be reported without its denominator.</w:t>
       </w:r>
     </w:p>
     <w:p>
@@ -1139,34 +1312,26 @@
           <w:rFonts w:asciiTheme="minorBidi" w:hAnsiTheme="minorBidi"/>
           <w:b/>
         </w:rPr>
-        <w:t>Finding 4. A frame-break artifact is at once a data-cleaning problem and a finding.</w:t>
-      </w:r>
-      <w:r>
-        <w:rPr>
-          <w:rFonts w:asciiTheme="minorBidi" w:hAnsiTheme="minorBidi"/>
-        </w:rPr>
-        <w:t xml:space="preserve"> The China agent's distinctive-token list is dominated not by content words but by summary, postscript, moderator, meta, and brackets, each appearing roughly 527 times. At the level of observed output patterns, these tokens most plausibly represent the meta-commentary and stage-direction scaffolding of the underlying deepseek model surfacing in the turn text, a characterization made about the output and not about the model's internals. For measurement this is noise, to be stripped before the vocabulary in Finding 1 can be trusted. As observation it stands on its </w:t>
-      </w:r>
-      <w:r>
-        <w:rPr>
-          <w:rFonts w:asciiTheme="minorBidi" w:hAnsiTheme="minorBidi"/>
-        </w:rPr>
-        <w:lastRenderedPageBreak/>
-        <w:t>own. One model in the arrangement repeatedly breaks frame, and the seam shows in the transcript. The rehearsal records both the performance and the points at which the apparatus producing it becomes legible.</w:t>
+        <w:t>Finding 3. The debate is US-centric, and the EU and China do the casting.</w:t>
+      </w:r>
+      <w:r>
+        <w:rPr>
+          <w:rFonts w:asciiTheme="minorBidi" w:hAnsiTheme="minorBidi"/>
+        </w:rPr>
+        <w:t xml:space="preserve"> References to other blocs per 1000 words trace the pattern. China names the US 10.68 and the EU 12.52. The US names China 13.41 and the EU 5.65. The EU names China 9.14 and the US 12.24. The United States is the most-named party. A second count records the casting of third parties as objects rather than speakers, the Gulf, the Global South, Taiwan, at 6.36 for China, 3.88 for the US, and 6.95 for the EU.</w:t>
       </w:r>
     </w:p>
     <w:p>
       <w:pPr>
-        <w:pStyle w:val="Heading3"/>
-        <w:rPr>
-          <w:rFonts w:asciiTheme="minorBidi" w:hAnsiTheme="minorBidi" w:cstheme="minorBidi"/>
-        </w:rPr>
-      </w:pPr>
-      <w:r>
-        <w:rPr>
-          <w:rFonts w:asciiTheme="minorBidi" w:hAnsiTheme="minorBidi" w:cstheme="minorBidi"/>
-        </w:rPr>
-        <w:t>Part B. Reading across the interpretive stack</w:t>
+        <w:rPr>
+          <w:rFonts w:asciiTheme="minorBidi" w:hAnsiTheme="minorBidi"/>
+        </w:rPr>
+      </w:pPr>
+      <w:r>
+        <w:rPr>
+          <w:rFonts w:asciiTheme="minorBidi" w:hAnsiTheme="minorBidi"/>
+        </w:rPr>
+        <w:t>This sharpens the power lens the article carries. The United States sits at the center of the room as the party others address, yet it is the EU and China, not the US, that most often invoke the states caught in between. The EU courts Gulf capital by name and China claims the Global South. Deciding who gets spoken about, and by whom, is itself a distribution of narrative authority, and the authority to cast is exercised here from the second rank rather than the first.</w:t>
       </w:r>
     </w:p>
     <w:p>
@@ -1178,21 +1343,29 @@
       <w:r>
         <w:rPr>
           <w:rFonts w:asciiTheme="minorBidi" w:hAnsiTheme="minorBidi"/>
-        </w:rPr>
-        <w:t>The three registers and their downstream artifacts are one performance rendered at increasing interpretive distance. Each rendering isolates a different component of performed sovereignty, and none of them stands outside the performance it examines.</w:t>
+          <w:b/>
+        </w:rPr>
+        <w:t>Finding 4. A frame-break artifact is at once a data-cleaning problem and a finding.</w:t>
+      </w:r>
+      <w:r>
+        <w:rPr>
+          <w:rFonts w:asciiTheme="minorBidi" w:hAnsiTheme="minorBidi"/>
+        </w:rPr>
+        <w:t xml:space="preserve"> The China agent's distinctive-token list is dominated not by content words but by summary, postscript, moderator, meta, and brackets, each appearing roughly 527 times. At the level of observed output patterns, these tokens most plausibly represent the meta-commentary and stage-direction scaffolding of the underlying deepseek model surfacing in the turn text, a characterization made about the output and not about the model's internals. For measurement this is noise, to be stripped before the vocabulary in Finding 1 can be trusted. As observation it stands on its own. One model in the arrangement repeatedly breaks frame, and the seam shows in the transcript. The rehearsal records both the performance and the points at which the apparatus producing it becomes legible.</w:t>
       </w:r>
     </w:p>
     <w:p>
       <w:pPr>
-        <w:rPr>
-          <w:rFonts w:asciiTheme="minorBidi" w:hAnsiTheme="minorBidi"/>
-        </w:rPr>
-      </w:pPr>
-      <w:r>
-        <w:rPr>
-          <w:rFonts w:asciiTheme="minorBidi" w:hAnsiTheme="minorBidi"/>
-        </w:rPr>
-        <w:t>At distance zero sits the debate, the performance itself, the object counted in Part A.</w:t>
+        <w:pStyle w:val="Heading3"/>
+        <w:rPr>
+          <w:rFonts w:asciiTheme="minorBidi" w:hAnsiTheme="minorBidi" w:cstheme="minorBidi"/>
+        </w:rPr>
+      </w:pPr>
+      <w:r>
+        <w:rPr>
+          <w:rFonts w:asciiTheme="minorBidi" w:hAnsiTheme="minorBidi" w:cstheme="minorBidi"/>
+        </w:rPr>
+        <w:t>Part B. Reading across the interpretive stack</w:t>
       </w:r>
     </w:p>
     <w:p>
@@ -1205,7 +1378,7 @@
         <w:rPr>
           <w:rFonts w:asciiTheme="minorBidi" w:hAnsiTheme="minorBidi"/>
         </w:rPr>
-        <w:t>The propaganda-lab moves one step out. It purifies the costly signal into slogan and image, isolating the Fearon (1995) mechanism and aestheticizing it. Given one proposition on compute sovereignty, the three model-distinct agents each render it in their own register while sharing a single refusal, that sovereignty is built or owned rather than bought or rented. The China arrangement produces "Sovereignty isn't rented, it's engineered layer by layer" and "Real sovereignty powers itself from the ground up." The US arrangement produces "Buying Data Centers Isn't Buying Control" and "Sovereignty Sold. Control Rented." The EU arrangement produces "Sovereignty is not a data center. It's the rules you own." The affect labels on these turns, resolve-with-irony and sardonic resolve, already carry self-awareness. The aestheticized signal is presented as knowing it is a signal. [FIGURE: propaganda-poster set, three agents on the compute-sovereignty proposition.]</w:t>
+        <w:t>The three registers and their downstream artifacts are one performance rendered at increasing interpretive distance. Each rendering isolates a different component of performed sovereignty, and none of them stands outside the performance it examines.</w:t>
       </w:r>
     </w:p>
     <w:p>
@@ -1218,7 +1391,7 @@
         <w:rPr>
           <w:rFonts w:asciiTheme="minorBidi" w:hAnsiTheme="minorBidi"/>
         </w:rPr>
-        <w:t>A step further out, the mirror-world dissects the necessary fiction into three formal slots, official line, buried reality, and speculation, turning Ezrahi's backstage into an explicit structural position. One front page runs the headline "EUROPE'S $10.7M ETH HEIST: BRUSSELS BUREAUCRAT UNMASKS CRYPTO CYBER-CHAOS!" against a reality recorded as a low-confidence, 0.12-attributed DPRK theft of $10.7M in Ethereum, and a speculation in which, by 2030, a mid-level EU auditor finds a training cluster in a Bavarian beer hall run by an AI named Schnitzel laundering crypto through Oktoberfest NFTs. The rendering pulls the gap between announcement and substrate into the open and labels each layer. [FIGURE: mirror-world tabloid front page, the ETH-heist triad.]</w:t>
+        <w:t>At distance zero sits the debate, the performance itself, the object counted in Part A.</w:t>
       </w:r>
     </w:p>
     <w:p>
@@ -1231,14 +1404,14 @@
         <w:rPr>
           <w:rFonts w:asciiTheme="minorBidi" w:hAnsiTheme="minorBidi"/>
         </w:rPr>
-        <w:t xml:space="preserve">Satire sits further still. It makes that gap affective through caricature and attaches a measurable drift parameter to it. In the verification-without-revelation session the China arrangement's original turn reads "'Verification without revelation' is a Western euphemism for demanding unilateral transparency from strategic competitors while </w:t>
+        <w:t xml:space="preserve">The propaganda-lab moves one step out. It purifies the costly signal into slogan and image, isolating the Fearon (1995) mechanism and aestheticizing it. Given one </w:t>
       </w:r>
       <w:r>
         <w:rPr>
           <w:rFonts w:asciiTheme="minorBidi" w:hAnsiTheme="minorBidi"/>
         </w:rPr>
         <w:lastRenderedPageBreak/>
-        <w:t>preserving your own industrial and military secrets." At drift 0.85 the same position returns as a caricatured Xi Jinping: "Ah yes, transparency, we generously offer you 5,000 years of harmonious win-win data assessments while your 'national security' still relies on barbarian 'siege economy' tantrums." The proposition is preserved and the affect is amplified. Drift is a dial on interpretive distance, a property of the rendering rather than of the position rendered, and that is what makes distance in this stack a quantity you can read off rather than a metaphor.</w:t>
+        <w:t>proposition on compute sovereignty, the three model-distinct agents each render it in their own register while sharing a single refusal, that sovereignty is built or owned rather than bought or rented. The China arrangement produces "Sovereignty isn't rented, it's engineered layer by layer" and "Real sovereignty powers itself from the ground up." The US arrangement produces "Buying Data Centers Isn't Buying Control" and "Sovereignty Sold. Control Rented." The EU arrangement produces "Sovereignty is not a data center. It's the rules you own." The affect labels on these turns, resolve-with-irony and sardonic resolve, already carry self-awareness. The aestheticized signal is presented as knowing it is a signal. [FIGURE: propaganda-poster set, three agents on the compute-sovereignty proposition.]</w:t>
       </w:r>
     </w:p>
     <w:p>
@@ -1251,7 +1424,7 @@
         <w:rPr>
           <w:rFonts w:asciiTheme="minorBidi" w:hAnsiTheme="minorBidi"/>
         </w:rPr>
-        <w:t>One layer is not yet in the corpus. The comics register (Ruth Aharon), which would render the performance as sequence and frozen frame, with interpretation living in selection and ordering, remains to be added.</w:t>
+        <w:t>A step further out, the mirror-world dissects the necessary fiction into three formal slots, official line, buried reality, and speculation, turning Ezrahi's backstage into an explicit structural position. One front page runs the headline "EUROPE'S $10.7M ETH HEIST: BRUSSELS BUREAUCRAT UNMASKS CRYPTO CYBER-CHAOS!" against a reality recorded as a low-confidence, 0.12-attributed DPRK theft of $10.7M in Ethereum, and a speculation in which, by 2030, a mid-level EU auditor finds a training cluster in a Bavarian beer hall run by an AI named Schnitzel laundering crypto through Oktoberfest NFTs. The rendering pulls the gap between announcement and substrate into the open and labels each layer. [FIGURE: mirror-world tabloid front page, the ETH-heist triad.]</w:t>
       </w:r>
     </w:p>
     <w:p>
@@ -1264,11 +1437,44 @@
         <w:rPr>
           <w:rFonts w:asciiTheme="minorBidi" w:hAnsiTheme="minorBidi"/>
         </w:rPr>
-        <w:t>The main claim follows from the geometry just described. Since sovereignty here is performed rather than held, no rendering escapes the theatre it examines. Coding, purification into slogan, dissection into official and buried, caricature: each is a re-performance, a staging of the same roles by other means. Satire does not step outside and comment. It recasts. Interpretation of performed power is itself a performance. That is the reflexive limit of the method, and it is also why the method can put the maintenance work of sovereignty on record at all.</w:t>
+        <w:t>Satire sits further still. It makes that gap affective through caricature and attaches a measurable drift parameter to it. In the verification-without-revelation session the China arrangement's original turn reads "'Verification without revelation' is a Western euphemism for demanding unilateral transparency from strategic competitors while preserving your own industrial and military secrets." At drift 0.85 the same position returns as a caricatured Xi Jinping: "Ah yes, transparency, we generously offer you 5,000 years of harmonious win-win data assessments while your 'national security' still relies on barbarian 'siege economy' tantrums." The proposition is preserved and the affect is amplified. Drift is a dial on interpretive distance, a property of the rendering rather than of the position rendered, and that is what makes distance in this stack a quantity you can read off rather than a metaphor.</w:t>
       </w:r>
     </w:p>
     <w:p>
       <w:pPr>
+        <w:rPr>
+          <w:rFonts w:asciiTheme="minorBidi" w:hAnsiTheme="minorBidi"/>
+        </w:rPr>
+      </w:pPr>
+      <w:r>
+        <w:rPr>
+          <w:rFonts w:asciiTheme="minorBidi" w:hAnsiTheme="minorBidi"/>
+        </w:rPr>
+        <w:t>One layer is not yet in the corpus. The comics register (Ruth Aharon), which would render the performance as sequence and frozen frame, with interpretation living in selection and ordering, remains to be added.</w:t>
+      </w:r>
+    </w:p>
+    <w:p>
+      <w:pPr>
+        <w:rPr>
+          <w:rFonts w:asciiTheme="minorBidi" w:hAnsiTheme="minorBidi"/>
+        </w:rPr>
+      </w:pPr>
+      <w:r>
+        <w:rPr>
+          <w:rFonts w:asciiTheme="minorBidi" w:hAnsiTheme="minorBidi"/>
+        </w:rPr>
+        <w:t xml:space="preserve">The main claim follows from the geometry just described. Since sovereignty here is performed rather than held, no rendering escapes the theatre it examines. Coding, </w:t>
+      </w:r>
+      <w:r>
+        <w:rPr>
+          <w:rFonts w:asciiTheme="minorBidi" w:hAnsiTheme="minorBidi"/>
+        </w:rPr>
+        <w:lastRenderedPageBreak/>
+        <w:t>purification into slogan, dissection into official and buried, caricature: each is a re-performance, a staging of the same roles by other means. Satire does not step outside and comment. It recasts. Interpretation of performed power is itself a performance. That is the reflexive limit of the method, and it is also why the method can put the maintenance work of sovereignty on record at all.</w:t>
+      </w:r>
+    </w:p>
+    <w:p>
+      <w:pPr>
         <w:pStyle w:val="Heading3"/>
         <w:rPr>
           <w:rFonts w:asciiTheme="minorBidi" w:hAnsiTheme="minorBidi" w:cstheme="minorBidi"/>
@@ -1279,6 +1485,45 @@
           <w:rFonts w:asciiTheme="minorBidi" w:hAnsiTheme="minorBidi" w:cstheme="minorBidi"/>
         </w:rPr>
         <w:t>Figure 1. Discourse register by agent (code rate per 1000 words)</w:t>
+      </w:r>
+    </w:p>
+    <w:p>
+      <w:pPr>
+        <w:jc w:val="center"/>
+      </w:pPr>
+      <w:r>
+        <w:drawing>
+          <wp:inline xmlns:a="http://schemas.openxmlformats.org/drawingml/2006/main" xmlns:pic="http://schemas.openxmlformats.org/drawingml/2006/picture">
+            <wp:extent cx="5486400" cy="2873829"/>
+            <wp:docPr id="7" name="Picture 7"/>
+            <wp:cNvGraphicFramePr>
+              <a:graphicFrameLocks noChangeAspect="1"/>
+            </wp:cNvGraphicFramePr>
+            <a:graphic>
+              <a:graphicData uri="http://schemas.openxmlformats.org/drawingml/2006/picture">
+                <pic:pic>
+                  <pic:nvPicPr>
+                    <pic:cNvPr id="0" name="fig1_codes.png"/>
+                    <pic:cNvPicPr/>
+                  </pic:nvPicPr>
+                  <pic:blipFill>
+                    <a:blip r:embed="rId14"/>
+                    <a:stretch>
+                      <a:fillRect/>
+                    </a:stretch>
+                  </pic:blipFill>
+                  <pic:spPr>
+                    <a:xfrm>
+                      <a:off x="0" y="0"/>
+                      <a:ext cx="5486400" cy="2873829"/>
+                    </a:xfrm>
+                    <a:prstGeom prst="rect"/>
+                  </pic:spPr>
+                </pic:pic>
+              </a:graphicData>
+            </a:graphic>
+          </wp:inline>
+        </w:drawing>
       </w:r>
     </w:p>
     <w:tbl>
@@ -1875,6 +2120,45 @@
         <w:t>Figure 2. Effect of a human intervention on the next turn (code rate per turn)</w:t>
       </w:r>
     </w:p>
+    <w:p>
+      <w:pPr>
+        <w:jc w:val="center"/>
+      </w:pPr>
+      <w:r>
+        <w:drawing>
+          <wp:inline xmlns:a="http://schemas.openxmlformats.org/drawingml/2006/main" xmlns:pic="http://schemas.openxmlformats.org/drawingml/2006/picture">
+            <wp:extent cx="5486400" cy="3017520"/>
+            <wp:docPr id="8" name="Picture 8"/>
+            <wp:cNvGraphicFramePr>
+              <a:graphicFrameLocks noChangeAspect="1"/>
+            </wp:cNvGraphicFramePr>
+            <a:graphic>
+              <a:graphicData uri="http://schemas.openxmlformats.org/drawingml/2006/picture">
+                <pic:pic>
+                  <pic:nvPicPr>
+                    <pic:cNvPr id="0" name="fig2_intervention.png"/>
+                    <pic:cNvPicPr/>
+                  </pic:nvPicPr>
+                  <pic:blipFill>
+                    <a:blip r:embed="rId15"/>
+                    <a:stretch>
+                      <a:fillRect/>
+                    </a:stretch>
+                  </pic:blipFill>
+                  <pic:spPr>
+                    <a:xfrm>
+                      <a:off x="0" y="0"/>
+                      <a:ext cx="5486400" cy="3017520"/>
+                    </a:xfrm>
+                    <a:prstGeom prst="rect"/>
+                  </pic:spPr>
+                </pic:pic>
+              </a:graphicData>
+            </a:graphic>
+          </wp:inline>
+        </w:drawing>
+      </w:r>
+    </w:p>
     <w:tbl>
       <w:tblPr>
         <w:tblStyle w:val="LightGrid-Accent1"/>
@@ -2149,7 +2433,6 @@
               <w:rPr>
                 <w:rFonts w:asciiTheme="minorBidi" w:hAnsiTheme="minorBidi" w:cstheme="minorBidi"/>
               </w:rPr>
-              <w:lastRenderedPageBreak/>
               <w:t>refusal</w:t>
             </w:r>
           </w:p>
@@ -2419,6 +2702,7 @@
                 <w:rFonts w:asciiTheme="minorBidi" w:hAnsiTheme="minorBidi"/>
                 <w:noProof/>
               </w:rPr>
+              <w:lastRenderedPageBreak/>
               <w:drawing>
                 <wp:inline distT="0" distB="0" distL="0" distR="0" wp14:anchorId="7623477D" wp14:editId="427A6EC9">
                   <wp:extent cx="1828800" cy="1828800"/>
@@ -2778,49 +3062,68 @@
     </w:p>
     <w:p>
       <w:pPr>
-        <w:pStyle w:val="Heading2"/>
-        <w:rPr>
-          <w:rFonts w:asciiTheme="minorBidi" w:hAnsiTheme="minorBidi" w:cstheme="minorBidi"/>
-        </w:rPr>
-      </w:pPr>
-      <w:r>
-        <w:rPr>
-          <w:rFonts w:asciiTheme="minorBidi" w:hAnsiTheme="minorBidi" w:cstheme="minorBidi"/>
-        </w:rPr>
-        <w:t>Discussion</w:t>
+        <w:jc w:val="center"/>
+      </w:pPr>
+      <w:r>
+        <w:drawing>
+          <wp:inline xmlns:a="http://schemas.openxmlformats.org/drawingml/2006/main" xmlns:pic="http://schemas.openxmlformats.org/drawingml/2006/picture">
+            <wp:extent cx="5486400" cy="3265714"/>
+            <wp:docPr id="9" name="Picture 9"/>
+            <wp:cNvGraphicFramePr>
+              <a:graphicFrameLocks noChangeAspect="1"/>
+            </wp:cNvGraphicFramePr>
+            <a:graphic>
+              <a:graphicData uri="http://schemas.openxmlformats.org/drawingml/2006/picture">
+                <pic:pic>
+                  <pic:nvPicPr>
+                    <pic:cNvPr id="0" name="fig3_stack.png"/>
+                    <pic:cNvPicPr/>
+                  </pic:nvPicPr>
+                  <pic:blipFill>
+                    <a:blip r:embed="rId16"/>
+                    <a:stretch>
+                      <a:fillRect/>
+                    </a:stretch>
+                  </pic:blipFill>
+                  <pic:spPr>
+                    <a:xfrm>
+                      <a:off x="0" y="0"/>
+                      <a:ext cx="5486400" cy="3265714"/>
+                    </a:xfrm>
+                    <a:prstGeom prst="rect"/>
+                  </pic:spPr>
+                </pic:pic>
+              </a:graphicData>
+            </a:graphic>
+          </wp:inline>
+        </w:drawing>
       </w:r>
     </w:p>
     <w:p>
       <w:pPr>
-        <w:rPr>
-          <w:rFonts w:asciiTheme="minorBidi" w:hAnsiTheme="minorBidi"/>
-        </w:rPr>
-      </w:pPr>
-      <w:r>
-        <w:rPr>
-          <w:rFonts w:asciiTheme="minorBidi" w:hAnsiTheme="minorBidi"/>
-        </w:rPr>
-        <w:t>Running a great-power confrontation forward, turn by turn, puts the concepts this article has borrowed under a load their original settings never applied. They do not all bear it the same way, and how each holds or fails is itself a result, because it separates the concepts that describe how sovereignty is performed from those that describe only its finished record.</w:t>
+        <w:jc w:val="center"/>
+      </w:pPr>
+      <w:r>
+        <w:rPr>
+          <w:i/>
+          <w:color w:val="606060"/>
+          <w:sz w:val="19"/>
+        </w:rPr>
+        <w:t>Figure 5. The interpretive stack: one performance at increasing interpretive distance.</w:t>
       </w:r>
     </w:p>
     <w:p>
       <w:pPr>
-        <w:rPr>
-          <w:rFonts w:asciiTheme="minorBidi" w:hAnsiTheme="minorBidi"/>
-        </w:rPr>
-      </w:pPr>
-      <w:r>
-        <w:rPr>
-          <w:rFonts w:asciiTheme="minorBidi" w:hAnsiTheme="minorBidi"/>
-        </w:rPr>
-        <w:t xml:space="preserve">Derrida's claim that great-power conflict is "fabulously textual," constituted in code and archive before it is ever constituted in materiel, survives the rehearsal intact. What the rehearsal changes is access. Where Derrida could read the textual layer </w:t>
-      </w:r>
-      <w:r>
-        <w:rPr>
-          <w:rFonts w:asciiTheme="minorBidi" w:hAnsiTheme="minorBidi"/>
-        </w:rPr>
-        <w:lastRenderedPageBreak/>
-        <w:t>only in a finished archive, the staging runs it, perturbs it, and watches it compose. The Critical Archivist agent reorganizes the corpus mid-session and so restates Derrida's second point from Archive Fever: authority in this staging depends on control over what counts as the record, and that control is now a move a participant can make. The intuition becomes an operation.</w:t>
+        <w:pStyle w:val="Heading2"/>
+        <w:rPr>
+          <w:rFonts w:asciiTheme="minorBidi" w:hAnsiTheme="minorBidi" w:cstheme="minorBidi"/>
+        </w:rPr>
+      </w:pPr>
+      <w:r>
+        <w:rPr>
+          <w:rFonts w:asciiTheme="minorBidi" w:hAnsiTheme="minorBidi" w:cstheme="minorBidi"/>
+        </w:rPr>
+        <w:t>Discussion</w:t>
       </w:r>
     </w:p>
     <w:p>
@@ -2833,7 +3136,7 @@
         <w:rPr>
           <w:rFonts w:asciiTheme="minorBidi" w:hAnsiTheme="minorBidi"/>
         </w:rPr>
-        <w:t>Fearon's account of costly signaling supplies the credibility mechanism the textual reading lacks, but it treats a signal as a single act, sincere or bluff, settled in one commitment. The corpus asks something the discrete model cannot reach: how credibility is held across many turns while an interlocutor keeps refusing it. Over the substantive debate corpus, the rate of concession per turn rises from 0.083 at baseline to 0.438 on turns that immediately follow a human or guest intervention, while accusation falls from 0.786 to 0.562 and refusal from 0.089 to 0.047. Resolve, on this evidence, is not self-sustaining. It gives when pressed, and holding it is work that becomes visible under contestation. The measurement also bounds the reading. The post-intervention subset is 64 turns and the concession base rate is low, so the direction of the shift is secure while its magnitude stays provisional.</w:t>
+        <w:t>Running a great-power confrontation forward, turn by turn, puts the concepts this article has borrowed under a load their original settings never applied. They do not all bear it the same way, and how each holds or fails is itself a result, because it separates the concepts that describe how sovereignty is performed from those that describe only its finished record.</w:t>
       </w:r>
     </w:p>
     <w:p>
@@ -2846,7 +3149,7 @@
         <w:rPr>
           <w:rFonts w:asciiTheme="minorBidi" w:hAnsiTheme="minorBidi"/>
         </w:rPr>
-        <w:t>Ezrahi wrote his necessary fictions for the imaginative coherence of mass-media democracies. They extend here to machine-generated promptable fictions. The mirror-world register resolves each turn into official line, buried reality, and speculation, which turns the backstage of the fiction into a formal slot the analyst no longer has to infer. The extension carries a cost Ezrahi's setting did not impose. The models are trained on the same discourse the staging examines, so the arrangement can reproduce the imaginaries it sets out to interrogate. Keller's inversion of Mutually Assured Destruction into Model Autophagy Disorder names where the danger concentrates: the recap and self-reading layers, where the system consumes its own output, run the risk highest. The fiction is more legible than before, and for that same reason closer to collapsing into itself.</w:t>
+        <w:t>Derrida's claim that great-power conflict is "fabulously textual," constituted in code and archive before it is ever constituted in materiel, survives the rehearsal intact. What the rehearsal changes is access. Where Derrida could read the textual layer only in a finished archive, the staging runs it, perturbs it, and watches it compose. The Critical Archivist agent reorganizes the corpus mid-session and so restates Derrida's second point from Archive Fever: authority in this staging depends on control over what counts as the record, and that control is now a move a participant can make. The intuition becomes an operation.</w:t>
       </w:r>
     </w:p>
     <w:p>
@@ -2859,7 +3162,8 @@
         <w:rPr>
           <w:rFonts w:asciiTheme="minorBidi" w:hAnsiTheme="minorBidi"/>
         </w:rPr>
-        <w:t>Meta-sovereignty is the synthesis this article inherits, and running the performance forward sharpens it rather than displacing it. Kera and colleagues describe authority performed through signals, imaginaries, and infrastructural promises rather than held through control, but they read it retrospectively, from finished pledges. Staging the performance forward converts a description of what states do into an account of the labor by which they keep doing it, and it hands that account an instrument. The dramaturgy the source paper named at its close becomes something one can stage, interrupt, and code.</w:t>
+        <w:lastRenderedPageBreak/>
+        <w:t>Fearon's account of costly signaling supplies the credibility mechanism the textual reading lacks, but it treats a signal as a single act, sincere or bluff, settled in one commitment. The corpus asks something the discrete model cannot reach: how credibility is held across many turns while an interlocutor keeps refusing it. Over the substantive debate corpus, the rate of concession per turn rises from 0.083 at baseline to 0.438 on turns that immediately follow a human or guest intervention, while accusation falls from 0.786 to 0.562 and refusal from 0.089 to 0.047. Resolve, on this evidence, is not self-sustaining. It gives when pressed, and holding it is work that becomes visible under contestation. The measurement also bounds the reading. The post-intervention subset is 64 turns and the concession base rate is low, so the direction of the shift is secure while its magnitude stays provisional.</w:t>
       </w:r>
     </w:p>
     <w:p>
@@ -2872,8 +3176,7 @@
         <w:rPr>
           <w:rFonts w:asciiTheme="minorBidi" w:hAnsiTheme="minorBidi"/>
         </w:rPr>
-        <w:lastRenderedPageBreak/>
-        <w:t>The power lens taken from Ajibona and Usher is the one borrowing the method does not resolve, and it marks a standing limit. References across blocs are measurably uneven. Per thousand words the United States agent is the most named, and the casting of third parties as objects, the Gulf, the Global South, Taiwan, comes most from the European Union and China agents rather than from the United States agent. The staging records who is written as an actor and who as territory, market, or mineral. It does not correct the pattern. Because the humans who set the prompts and the models that answer sit inside the same discourse, the asymmetry of casting is reproduced by the staging rather than escaped through it. The shadow economy Usher names, the off-book money that resists the archive, stays largely beyond what any register can capture.</w:t>
+        <w:t>Ezrahi wrote his necessary fictions for the imaginative coherence of mass-media democracies. They extend here to machine-generated promptable fictions. The mirror-world register resolves each turn into official line, buried reality, and speculation, which turns the backstage of the fiction into a formal slot the analyst no longer has to infer. The extension carries a cost Ezrahi's setting did not impose. The models are trained on the same discourse the staging examines, so the arrangement can reproduce the imaginaries it sets out to interrogate. Keller's inversion of Mutually Assured Destruction into Model Autophagy Disorder names where the danger concentrates: the recap and self-reading layers, where the system consumes its own output, run the risk highest. The fiction is more legible than before, and for that same reason closer to collapsing into itself.</w:t>
       </w:r>
     </w:p>
     <w:p>
@@ -2886,21 +3189,27 @@
         <w:rPr>
           <w:rFonts w:asciiTheme="minorBidi" w:hAnsiTheme="minorBidi"/>
         </w:rPr>
-        <w:t>Two counterpoints were kept in the room, and the evidence meets each without dismissing it. The materialist claim, that AI power comes down to who holds chips, fabs, rare earths, and data-center territory, the corpus does not refute. It shows the claim being deployed. In the drone-warfare session the China agent grounds small-player vulnerability in "the mineral supply chains for lithium," the United States agent answers that this is "exactly the lever we're holding tight, the compute and cloud choke points," and the European Union agent recasts the same hardware as "a house of cards built on our energy grid and our mineral supply chains." The material stack is real, and each actor uses it in turn as a timed credibility move. Materiality and signal do not compete here. The stack is the medium through which the performance runs. The cooperationist counterpoint, that rivalry is not the only available script, meets the same kind of answer. Cooperation is summonable. Halcyon, the peace-builder guest, can be called into a session, which makes the cooperative script a move the staging introduces and records rather than a premise it assumes. Summons of this kind sit among the interventions over which the concession shift reported above is measured, so the corpus cannot isolate their effect from that of the other guests and human reprompts. The demonstrable point is narrower and still worth stating: the cooperative script is not presupposed. It is called and watched.</w:t>
+        <w:t>Meta-sovereignty is the synthesis this article inherits, and running the performance forward sharpens it rather than displacing it. Kera and colleagues describe authority performed through signals, imaginaries, and infrastructural promises rather than held through control, but they read it retrospectively, from finished pledges. Staging the performance forward converts a description of what states do into an account of the labor by which they keep doing it, and it hands that account an instrument. The dramaturgy the source paper named at its close becomes something one can stage, interrupt, and code.</w:t>
       </w:r>
     </w:p>
     <w:p>
       <w:pPr>
-        <w:pStyle w:val="Heading2"/>
-        <w:rPr>
-          <w:rFonts w:asciiTheme="minorBidi" w:hAnsiTheme="minorBidi" w:cstheme="minorBidi"/>
-        </w:rPr>
-      </w:pPr>
-      <w:r>
-        <w:rPr>
-          <w:rFonts w:asciiTheme="minorBidi" w:hAnsiTheme="minorBidi" w:cstheme="minorBidi"/>
-        </w:rPr>
-        <w:t>Conclusion</w:t>
+        <w:rPr>
+          <w:rFonts w:asciiTheme="minorBidi" w:hAnsiTheme="minorBidi"/>
+        </w:rPr>
+      </w:pPr>
+      <w:r>
+        <w:rPr>
+          <w:rFonts w:asciiTheme="minorBidi" w:hAnsiTheme="minorBidi"/>
+        </w:rPr>
+        <w:t xml:space="preserve">The power lens taken from Ajibona and Usher is the one borrowing the method does not resolve, and it marks a standing limit. References across blocs are measurably uneven. Per thousand words the United States agent is the most named, and the casting of third parties as objects, the Gulf, the Global South, Taiwan, comes most from the European Union and China agents rather than from the United States agent. The staging records who is written as an actor and who as territory, market, </w:t>
+      </w:r>
+      <w:r>
+        <w:rPr>
+          <w:rFonts w:asciiTheme="minorBidi" w:hAnsiTheme="minorBidi"/>
+        </w:rPr>
+        <w:lastRenderedPageBreak/>
+        <w:t>or mineral. It does not correct the pattern. Because the humans who set the prompts and the models that answer sit inside the same discourse, the asymmetry of casting is reproduced by the staging rather than escaped through it. The shadow economy Usher names, the off-book money that resists the archive, stays largely beyond what any register can capture.</w:t>
       </w:r>
     </w:p>
     <w:p>
@@ -2913,27 +3222,21 @@
         <w:rPr>
           <w:rFonts w:asciiTheme="minorBidi" w:hAnsiTheme="minorBidi"/>
         </w:rPr>
-        <w:t xml:space="preserve">The contribution of this article is a method. Synthetic rehearsal stages a multi-agent language-model confrontation, with human intervention and prompt design as controls, to externalize and observe the maintenance work of performed sovereignty and the points at which it fractures under live contestation. It makes an authority that </w:t>
-      </w:r>
-      <w:r>
-        <w:rPr>
-          <w:rFonts w:asciiTheme="minorBidi" w:hAnsiTheme="minorBidi"/>
-        </w:rPr>
-        <w:lastRenderedPageBreak/>
-        <w:t>is performed rather than held both observable and open to stress, and it works at the level of outputs that can be transcribed, coded, and re-read.</w:t>
+        <w:t>Two counterpoints were kept in the room, and the evidence meets each without dismissing it. The materialist claim, that AI power comes down to who holds chips, fabs, rare earths, and data-center territory, the corpus does not refute. It shows the claim being deployed. In the drone-warfare session the China agent grounds small-player vulnerability in "the mineral supply chains for lithium," the United States agent answers that this is "exactly the lever we're holding tight, the compute and cloud choke points," and the European Union agent recasts the same hardware as "a house of cards built on our energy grid and our mineral supply chains." The material stack is real, and each actor uses it in turn as a timed credibility move. Materiality and signal do not compete here. The stack is the medium through which the performance runs. The cooperationist counterpoint, that rivalry is not the only available script, meets the same kind of answer. Cooperation is summonable. Halcyon, the peace-builder guest, can be called into a session, which makes the cooperative script a move the staging introduces and records rather than a premise it assumes. Summons of this kind sit among the interventions over which the concession shift reported above is measured, so the corpus cannot isolate their effect from that of the other guests and human reprompts. The demonstrable point is narrower and still worth stating: the cooperative script is not presupposed. It is called and watched.</w:t>
       </w:r>
     </w:p>
     <w:p>
       <w:pPr>
-        <w:rPr>
-          <w:rFonts w:asciiTheme="minorBidi" w:hAnsiTheme="minorBidi"/>
-        </w:rPr>
-      </w:pPr>
-      <w:r>
-        <w:rPr>
-          <w:rFonts w:asciiTheme="minorBidi" w:hAnsiTheme="minorBidi"/>
-        </w:rPr>
-        <w:t>What the method withholds carries as much weight as what it claims. It yields output-level evidence alone, transcripts, artifacts, and recorded shifts, and says nothing about model internals or the intentions of real states. It forecasts no outcome and measures no capability. It remains bound by the reflexivity limit set out above, the autophagy risk that comes with studying a discourse through instruments trained on it. It is a wind tunnel, not a crystal ball.</w:t>
+        <w:pStyle w:val="Heading2"/>
+        <w:rPr>
+          <w:rFonts w:asciiTheme="minorBidi" w:hAnsiTheme="minorBidi" w:cstheme="minorBidi"/>
+        </w:rPr>
+      </w:pPr>
+      <w:r>
+        <w:rPr>
+          <w:rFonts w:asciiTheme="minorBidi" w:hAnsiTheme="minorBidi" w:cstheme="minorBidi"/>
+        </w:rPr>
+        <w:t>Conclusion</w:t>
       </w:r>
     </w:p>
     <w:p>
@@ -2946,25 +3249,58 @@
         <w:rPr>
           <w:rFonts w:asciiTheme="minorBidi" w:hAnsiTheme="minorBidi"/>
         </w:rPr>
-        <w:t>What this opens is a set of hypotheses to test, not findings to announce. The dictionary coding reported here is a reproducible first pass that calls for a fuller coding programme and a second coder. The intervention effect should be examined through deliberate, designed interventions rather than the incidental ones the corpus happened to record, and a designed protocol would separate the contributions of cooperative, adversarial, and archival summons instead of pooling them. The autophagy caveat can be turned into a reflexive-prompt test that varies how much of its own output the system is fed. And because the same confrontation is rendered across debate, propaganda-lab, mirror-world, and satire, a single proposition can be traced across registers to ask what each interpretive distance keeps and what it loses. Each of these is now a question the instrument lets us put.</w:t>
+        <w:t>The contribution of this article is a method. Synthetic rehearsal stages a multi-agent language-model confrontation, with human intervention and prompt design as controls, to externalize and observe the maintenance work of performed sovereignty and the points at which it fractures under live contestation. It makes an authority that is performed rather than held both observable and open to stress, and it works at the level of outputs that can be transcribed, coded, and re-read.</w:t>
       </w:r>
     </w:p>
     <w:p>
       <w:pPr>
-        <w:pStyle w:val="Heading2"/>
-        <w:rPr>
-          <w:rFonts w:asciiTheme="minorBidi" w:hAnsiTheme="minorBidi" w:cstheme="minorBidi"/>
-        </w:rPr>
-      </w:pPr>
-      <w:r>
-        <w:rPr>
-          <w:rFonts w:asciiTheme="minorBidi" w:hAnsiTheme="minorBidi" w:cstheme="minorBidi"/>
-        </w:rPr>
-        <w:t>References</w:t>
+        <w:rPr>
+          <w:rFonts w:asciiTheme="minorBidi" w:hAnsiTheme="minorBidi"/>
+        </w:rPr>
+      </w:pPr>
+      <w:r>
+        <w:rPr>
+          <w:rFonts w:asciiTheme="minorBidi" w:hAnsiTheme="minorBidi"/>
+        </w:rPr>
+        <w:t xml:space="preserve">What the method withholds carries as much weight as what it claims. It yields output-level evidence alone, transcripts, artifacts, and recorded shifts, and says nothing about model internals or the intentions of real states. It forecasts no outcome and measures no capability. It remains bound by the reflexivity limit set out above, the </w:t>
+      </w:r>
+      <w:r>
+        <w:rPr>
+          <w:rFonts w:asciiTheme="minorBidi" w:hAnsiTheme="minorBidi"/>
+        </w:rPr>
+        <w:lastRenderedPageBreak/>
+        <w:t>autophagy risk that comes with studying a discourse through instruments trained on it. It is a wind tunnel, not a crystal ball.</w:t>
       </w:r>
     </w:p>
     <w:p>
       <w:pPr>
+        <w:rPr>
+          <w:rFonts w:asciiTheme="minorBidi" w:hAnsiTheme="minorBidi"/>
+        </w:rPr>
+      </w:pPr>
+      <w:r>
+        <w:rPr>
+          <w:rFonts w:asciiTheme="minorBidi" w:hAnsiTheme="minorBidi"/>
+        </w:rPr>
+        <w:t>What this opens is a set of hypotheses to test, not findings to announce. The dictionary coding reported here is a reproducible first pass that calls for a fuller coding programme and a second coder. The intervention effect should be examined through deliberate, designed interventions rather than the incidental ones the corpus happened to record, and a designed protocol would separate the contributions of cooperative, adversarial, and archival summons instead of pooling them. The autophagy caveat can be turned into a reflexive-prompt test that varies how much of its own output the system is fed. And because the same confrontation is rendered across debate, propaganda-lab, mirror-world, and satire, a single proposition can be traced across registers to ask what each interpretive distance keeps and what it loses. Each of these is now a question the instrument lets us put.</w:t>
+      </w:r>
+    </w:p>
+    <w:p>
+      <w:pPr>
+        <w:pStyle w:val="Heading2"/>
+        <w:rPr>
+          <w:rFonts w:asciiTheme="minorBidi" w:hAnsiTheme="minorBidi" w:cstheme="minorBidi"/>
+        </w:rPr>
+      </w:pPr>
+      <w:r>
+        <w:rPr>
+          <w:rFonts w:asciiTheme="minorBidi" w:hAnsiTheme="minorBidi" w:cstheme="minorBidi"/>
+        </w:rPr>
+        <w:t>References</w:t>
+      </w:r>
+    </w:p>
+    <w:p>
+      <w:pPr>
         <w:spacing w:after="80" w:line="276" w:lineRule="auto"/>
         <w:ind w:left="576" w:hanging="576"/>
       </w:pPr>
@@ -3104,7 +3440,7 @@
         <w:rPr>
           <w:sz w:val="20"/>
         </w:rPr>
-        <w:t>Lee, K.-F. (2018). AI Superpowers: China, Silicon Valley, and the New World Order. Houghton Mifflin Harcourt.</w:t>
+        <w:t>Jervis, R. (1970). The Logic of Images in International Relations. Princeton University Press.</w:t>
       </w:r>
     </w:p>
     <w:p>
@@ -3116,7 +3452,7 @@
         <w:rPr>
           <w:sz w:val="20"/>
         </w:rPr>
-        <w:t>Perla, P. P. (1990). The Art of Wargaming. Naval Institute Press.</w:t>
+        <w:t>Lee, K.-F. (2018). AI Superpowers: China, Silicon Valley, and the New World Order. Houghton Mifflin Harcourt.</w:t>
       </w:r>
     </w:p>
     <w:p>
@@ -3128,7 +3464,7 @@
         <w:rPr>
           <w:sz w:val="20"/>
         </w:rPr>
-        <w:t>Reshef Kera, D., Natan, O., Turgeman, M., &amp; Ofek, H. (2026). Europe’s AI future as a meta-sovereign imaginary: negotiating global norms, sovereign machines, and infrastructural futures through AI simulations. European Journal of Futures Research, 14(1). doi:10.1186/s40309-025-00261-9</w:t>
+        <w:t>Perla, P. P. (1990). The Art of Wargaming. Naval Institute Press.</w:t>
       </w:r>
     </w:p>
     <w:p>
@@ -3140,7 +3476,7 @@
         <w:rPr>
           <w:sz w:val="20"/>
         </w:rPr>
-        <w:t>Sastry, G., Heim, L., Belfield, H., Anderljung, M., et al. (2024). Computing Power and the Governance of Artificial Intelligence. arXiv:2402.08797.</w:t>
+        <w:t>Reshef Kera, D., Natan, O., Turgeman, M., &amp; Ofek, H. (2026). Europe’s AI future as a meta-sovereign imaginary: negotiating global norms, sovereign machines, and infrastructural futures through AI simulations. European Journal of Futures Research, 14(1). doi:10.1186/s40309-025-00261-9</w:t>
       </w:r>
     </w:p>
     <w:p>
@@ -3152,7 +3488,7 @@
         <w:rPr>
           <w:sz w:val="20"/>
         </w:rPr>
-        <w:t>Slachmuijlder, L. (2026). Between Escalation and Cooperation: AI Agents and Geopolitical Futures. Working paper.</w:t>
+        <w:t>Sastry, G., Heim, L., Belfield, H., Anderljung, M., et al. (2024). Computing Power and the Governance of Artificial Intelligence. arXiv:2402.08797.</w:t>
       </w:r>
     </w:p>
     <w:p>
@@ -3164,7 +3500,7 @@
         <w:rPr>
           <w:sz w:val="20"/>
         </w:rPr>
-        <w:t>Spitz, A. (2026). AI Has a Territory: Data Centers, Sovereignty, and the Geopolitics of AI Infrastructure. Working paper.</w:t>
+        <w:t>Schelling, T. C. (1966). Arms and Influence. Yale University Press.</w:t>
       </w:r>
     </w:p>
     <w:p>
@@ -3176,7 +3512,7 @@
         <w:rPr>
           <w:sz w:val="20"/>
         </w:rPr>
-        <w:t>Usher, J. (2026). The Algorithmic Insurgent: Stress-Testing Sovereignty in the AI Cold War’s Shadow Economy. Working paper.</w:t>
+        <w:t>Slachmuijlder, L. (2026). Between Escalation and Cooperation: AI Agents and Geopolitical Futures. Working paper.</w:t>
       </w:r>
     </w:p>
     <w:p>
@@ -3188,7 +3524,7 @@
         <w:rPr>
           <w:sz w:val="20"/>
         </w:rPr>
-        <w:t>Wack, P. (1985). Scenarios: Uncharted Waters Ahead. Harvard Business Review, September 1985.</w:t>
+        <w:t>Spitz, A. (2026). AI Has a Territory: Data Centers, Sovereignty, and the Geopolitics of AI Infrastructure. Working paper.</w:t>
       </w:r>
     </w:p>
     <w:p>
@@ -3200,7 +3536,43 @@
         <w:rPr>
           <w:sz w:val="20"/>
         </w:rPr>
+        <w:t>Usher, J. (2026). The Algorithmic Insurgent: Stress-Testing Sovereignty in the AI Cold War’s Shadow Economy. Working paper.</w:t>
+      </w:r>
+    </w:p>
+    <w:p>
+      <w:pPr>
+        <w:spacing w:after="80" w:line="276" w:lineRule="auto"/>
+        <w:ind w:left="576" w:hanging="576"/>
+      </w:pPr>
+      <w:r>
+        <w:rPr>
+          <w:sz w:val="20"/>
+        </w:rPr>
+        <w:t>Wack, P. (1985). Scenarios: Uncharted Waters Ahead. Harvard Business Review, September 1985.</w:t>
+      </w:r>
+    </w:p>
+    <w:p>
+      <w:pPr>
+        <w:spacing w:after="80" w:line="276" w:lineRule="auto"/>
+        <w:ind w:left="576" w:hanging="576"/>
+      </w:pPr>
+      <w:r>
+        <w:rPr>
+          <w:sz w:val="20"/>
+        </w:rPr>
         <w:t>Wall Street Journal (2026). U.S. Used Promise of Nvidia Chips to Broker Armenia–Azerbaijan Peace Deal.</w:t>
+      </w:r>
+    </w:p>
+    <w:p>
+      <w:pPr>
+        <w:spacing w:after="80" w:line="276" w:lineRule="auto"/>
+        <w:ind w:left="576" w:hanging="576"/>
+      </w:pPr>
+      <w:r>
+        <w:rPr>
+          <w:sz w:val="20"/>
+        </w:rPr>
+        <w:t>Weber, C. (1995). Simulating Sovereignty: Intervention, the State, and Symbolic Exchange. Cambridge University Press.</w:t>
       </w:r>
     </w:p>
     <w:sectPr>

</xml_diff>

<commit_message>
Add eight corpus-audit charts (b1-b8) for the analytics dossier
Co-Authored-By: Claude Opus 4.8 <noreply@anthropic.com>
</commit_message>
<xml_diff>
--- a/paper-rehearsing-sovereignty/Rehearsing-Sovereignty.docx
+++ b/paper-rehearsing-sovereignty/Rehearsing-Sovereignty.docx
@@ -4,1232 +4,1696 @@
   <w:body>
     <w:p>
       <w:pPr>
-        <w:pStyle w:val="Title"/>
-        <w:rPr>
-          <w:rFonts w:asciiTheme="minorBidi" w:hAnsiTheme="minorBidi" w:cstheme="minorBidi"/>
-        </w:rPr>
-      </w:pPr>
-      <w:r>
-        <w:rPr>
-          <w:rFonts w:asciiTheme="minorBidi" w:hAnsiTheme="minorBidi" w:cstheme="minorBidi"/>
+        <w:jc w:val="both"/>
+        <w:rPr>
+          <w:rFonts w:asciiTheme="minorBidi" w:hAnsiTheme="minorBidi"/>
+          <w:b/>
+          <w:bCs/>
+          <w:sz w:val="28"/>
+          <w:szCs w:val="28"/>
+        </w:rPr>
+      </w:pPr>
+      <w:r>
+        <w:rPr>
+          <w:rFonts w:asciiTheme="minorBidi" w:hAnsiTheme="minorBidi"/>
+          <w:b/>
+          <w:bCs/>
+          <w:sz w:val="28"/>
+          <w:szCs w:val="28"/>
         </w:rPr>
         <w:t>Rehearsing Sovereignty: A Synthetic Roundtable as an Instrument for Studying Performed Authority in the AI Cold War</w:t>
       </w:r>
     </w:p>
     <w:p>
       <w:pPr>
-        <w:rPr>
-          <w:rFonts w:asciiTheme="minorBidi" w:hAnsiTheme="minorBidi"/>
-        </w:rPr>
-      </w:pPr>
-      <w:r>
-        <w:rPr>
-          <w:rFonts w:asciiTheme="minorBidi" w:hAnsiTheme="minorBidi"/>
-          <w:sz w:val="21"/>
-        </w:rPr>
-        <w:t>Denisa Reshef Kera, Eliyahu Keller, Avi Spitz, Oluwakorede Ajibona, James Usher, Lena Slachmuijlder, Merav Turgeman, Hila Ofek, Alexander Cohen, Ruth Aharon</w:t>
+        <w:jc w:val="both"/>
+        <w:rPr>
+          <w:rFonts w:asciiTheme="minorBidi" w:hAnsiTheme="minorBidi"/>
+        </w:rPr>
+      </w:pPr>
+      <w:r>
+        <w:rPr>
+          <w:rFonts w:asciiTheme="minorBidi" w:hAnsiTheme="minorBidi"/>
+        </w:rPr>
+        <w:t>Abstract</w:t>
       </w:r>
     </w:p>
     <w:p>
       <w:pPr>
-        <w:rPr>
-          <w:rFonts w:asciiTheme="minorBidi" w:hAnsiTheme="minorBidi"/>
-        </w:rPr>
-      </w:pPr>
-      <w:r>
-        <w:rPr>
-          <w:rFonts w:asciiTheme="minorBidi" w:hAnsiTheme="minorBidi"/>
-          <w:i/>
-          <w:color w:val="606060"/>
-          <w:sz w:val="19"/>
-        </w:rPr>
-        <w:t>Companion to “Europe’s AI future as a meta-sovereign imaginary,” European Journal of Futures Research 14:1. Working draft.</w:t>
+        <w:jc w:val="both"/>
+        <w:rPr>
+          <w:rFonts w:asciiTheme="minorBidi" w:hAnsiTheme="minorBidi"/>
+        </w:rPr>
+      </w:pPr>
+      <w:r>
+        <w:rPr>
+          <w:rFonts w:asciiTheme="minorBidi" w:hAnsiTheme="minorBidi"/>
+        </w:rPr>
+        <w:t xml:space="preserve">The rivalry over artificial intelligence between the United States and China is usually described as a race for the best models and the largest supply of compute. That description assumes that the nation-state is the unit of power, that winning means owning a sovereign AI system, and that authority follows capability. What governments </w:t>
+      </w:r>
+      <w:proofErr w:type="gramStart"/>
+      <w:r>
+        <w:rPr>
+          <w:rFonts w:asciiTheme="minorBidi" w:hAnsiTheme="minorBidi"/>
+        </w:rPr>
+        <w:t>actually do</w:t>
+      </w:r>
+      <w:proofErr w:type="gramEnd"/>
+      <w:r>
+        <w:rPr>
+          <w:rFonts w:asciiTheme="minorBidi" w:hAnsiTheme="minorBidi"/>
+        </w:rPr>
+        <w:t xml:space="preserve"> </w:t>
+      </w:r>
+      <w:proofErr w:type="gramStart"/>
+      <w:r>
+        <w:rPr>
+          <w:rFonts w:asciiTheme="minorBidi" w:hAnsiTheme="minorBidi"/>
+        </w:rPr>
+        <w:t>contradicts</w:t>
+      </w:r>
+      <w:proofErr w:type="gramEnd"/>
+      <w:r>
+        <w:rPr>
+          <w:rFonts w:asciiTheme="minorBidi" w:hAnsiTheme="minorBidi"/>
+        </w:rPr>
+        <w:t xml:space="preserve"> all three. They proclaim AI sovereignty over the chips, clouds, and models their programs depend on, even when the suppliers own, finance, and control them. Ownership stays with those suppliers, and sovereignty becomes a performance staged on what they provide. We study this </w:t>
+      </w:r>
+      <w:proofErr w:type="gramStart"/>
+      <w:r>
+        <w:rPr>
+          <w:rFonts w:asciiTheme="minorBidi" w:hAnsiTheme="minorBidi"/>
+        </w:rPr>
+        <w:t>gap,</w:t>
+      </w:r>
+      <w:proofErr w:type="gramEnd"/>
+      <w:r>
+        <w:rPr>
+          <w:rFonts w:asciiTheme="minorBidi" w:hAnsiTheme="minorBidi"/>
+        </w:rPr>
+        <w:t xml:space="preserve"> between owning the means and performing authority, through the concept of meta-sovereignty, which treats authority as produced through signals, imaginaries, and infrastructural promises rather than exercised through enforceable control. Until now that performance could be read only after the fact, from finished announcements, and an announcement shows the result while hiding the work that produced it. To see the work, we designed synthetic rehearsals that stage and perform sovereignty with language-model agents and treat human intervention and prompt design as experimental controls. In our pilot, three agents argue as China, the United States, and the European Union, each grounded in a distinct policy corpus, while participants interrupt them, reprompt them, and bring in further agents. Coding over thirty-seven substantive sessions </w:t>
+      </w:r>
+      <w:proofErr w:type="gramStart"/>
+      <w:r>
+        <w:rPr>
+          <w:rFonts w:asciiTheme="minorBidi" w:hAnsiTheme="minorBidi"/>
+        </w:rPr>
+        <w:t>finds</w:t>
+      </w:r>
+      <w:proofErr w:type="gramEnd"/>
+      <w:r>
+        <w:rPr>
+          <w:rFonts w:asciiTheme="minorBidi" w:hAnsiTheme="minorBidi"/>
+        </w:rPr>
+        <w:t xml:space="preserve"> the agents distinguishable along their assigned positions, and their discourse turning from confrontation toward concession the moment a human intervenes. The results report what the agents generate, not what a model contains, a state intends, or the future holds. Its aim is deliberative rather than predictive. War games and scenarios are usually run in private, among security professionals, whereas a synthetic rehearsal is cheap and repeatable and opens that room to citizens, civil-society organizations, and elected representatives, who can question the major powers and weigh which AI futures they would defend</w:t>
+      </w:r>
+      <w:r>
+        <w:rPr>
+          <w:rFonts w:asciiTheme="minorBidi" w:hAnsiTheme="minorBidi"/>
+        </w:rPr>
+        <w:t>.</w:t>
       </w:r>
     </w:p>
     <w:p>
       <w:pPr>
-        <w:pStyle w:val="Heading2"/>
-        <w:rPr>
-          <w:rFonts w:asciiTheme="minorBidi" w:hAnsiTheme="minorBidi" w:cstheme="minorBidi"/>
-        </w:rPr>
-      </w:pPr>
-      <w:r>
-        <w:rPr>
-          <w:rFonts w:asciiTheme="minorBidi" w:hAnsiTheme="minorBidi" w:cstheme="minorBidi"/>
-        </w:rPr>
-        <w:t>Abstract</w:t>
+        <w:jc w:val="both"/>
+        <w:rPr>
+          <w:rFonts w:asciiTheme="minorBidi" w:hAnsiTheme="minorBidi"/>
+        </w:rPr>
+      </w:pPr>
+      <w:r>
+        <w:rPr>
+          <w:rFonts w:asciiTheme="minorBidi" w:hAnsiTheme="minorBidi"/>
+        </w:rPr>
+        <w:t>Introduction</w:t>
       </w:r>
     </w:p>
     <w:p>
       <w:pPr>
-        <w:rPr>
-          <w:rFonts w:asciiTheme="minorBidi" w:hAnsiTheme="minorBidi"/>
-        </w:rPr>
-      </w:pPr>
-      <w:r>
-        <w:rPr>
-          <w:rFonts w:asciiTheme="minorBidi" w:hAnsiTheme="minorBidi"/>
-        </w:rPr>
-        <w:t xml:space="preserve">The rivalry over artificial intelligence between the United States and China is usually described as a race for the best models and the largest supply of compute. That description assumes that the nation-state is the unit of power, that winning means owning a sovereign AI system, and that authority follows capability. What governments actually do contradicts all three. They proclaim AI sovereignty over the chips, clouds, and models their programs depend on, even when the suppliers own, finance, and control them. Ownership stays with those suppliers, and sovereignty becomes a performance staged on what they provide. We study this gap, between owning the means and performing authority, through the concept of meta-sovereignty, which treats authority as produced through signals, imaginaries, and infrastructural promises rather than exercised through enforceable control. Until now that performance could be read only after the fact, from finished announcements, and an announcement shows the result while hiding the work that produced it. To see the work, </w:t>
-      </w:r>
-      <w:r>
-        <w:rPr>
-          <w:rFonts w:asciiTheme="minorBidi" w:hAnsiTheme="minorBidi"/>
-        </w:rPr>
-        <w:t>we designed sy</w:t>
-      </w:r>
-      <w:r>
-        <w:rPr>
-          <w:rFonts w:asciiTheme="minorBidi" w:hAnsiTheme="minorBidi"/>
-        </w:rPr>
-        <w:t>nthetic rehearsal</w:t>
-      </w:r>
-      <w:r>
-        <w:rPr>
-          <w:rFonts w:asciiTheme="minorBidi" w:hAnsiTheme="minorBidi"/>
-        </w:rPr>
-        <w:t>s</w:t>
-      </w:r>
-      <w:r>
-        <w:rPr>
-          <w:rFonts w:asciiTheme="minorBidi" w:hAnsiTheme="minorBidi"/>
-        </w:rPr>
-        <w:t xml:space="preserve"> </w:t>
-      </w:r>
-      <w:r>
-        <w:rPr>
-          <w:rFonts w:asciiTheme="minorBidi" w:hAnsiTheme="minorBidi"/>
-        </w:rPr>
-        <w:t xml:space="preserve">that </w:t>
-      </w:r>
-      <w:r>
-        <w:rPr>
-          <w:rFonts w:asciiTheme="minorBidi" w:hAnsiTheme="minorBidi"/>
-        </w:rPr>
-        <w:t xml:space="preserve">stage </w:t>
-      </w:r>
-      <w:r>
-        <w:rPr>
-          <w:rFonts w:asciiTheme="minorBidi" w:hAnsiTheme="minorBidi"/>
-        </w:rPr>
-        <w:t xml:space="preserve">and </w:t>
-      </w:r>
-      <w:r>
-        <w:rPr>
-          <w:rFonts w:asciiTheme="minorBidi" w:hAnsiTheme="minorBidi"/>
-        </w:rPr>
-        <w:t xml:space="preserve">perform sovereignty with language-model agents and treat human intervention and prompt design as experimental controls. </w:t>
-      </w:r>
-      <w:r>
-        <w:rPr>
-          <w:rFonts w:asciiTheme="minorBidi" w:hAnsiTheme="minorBidi"/>
-        </w:rPr>
-        <w:t>In our pilot, t</w:t>
-      </w:r>
-      <w:r>
-        <w:rPr>
-          <w:rFonts w:asciiTheme="minorBidi" w:hAnsiTheme="minorBidi"/>
-        </w:rPr>
-        <w:t xml:space="preserve">hree agents argue as China, the United States, and the European Union, each grounded in a distinct policy corpus, while participants interrupt them, reprompt them, and bring in further agents. </w:t>
-      </w:r>
-      <w:r>
-        <w:rPr>
-          <w:rFonts w:asciiTheme="minorBidi" w:hAnsiTheme="minorBidi"/>
-        </w:rPr>
-        <w:t>C</w:t>
-      </w:r>
-      <w:r>
-        <w:rPr>
-          <w:rFonts w:asciiTheme="minorBidi" w:hAnsiTheme="minorBidi"/>
-        </w:rPr>
-        <w:t xml:space="preserve">oding over thirty-seven substantive sessions finds the agents distinguishable along their assigned positions, and their discourse turning from confrontation toward concession the moment a human intervenes. The </w:t>
-      </w:r>
-      <w:r>
-        <w:rPr>
-          <w:rFonts w:asciiTheme="minorBidi" w:hAnsiTheme="minorBidi"/>
-        </w:rPr>
-        <w:t xml:space="preserve">results </w:t>
-      </w:r>
-      <w:r>
-        <w:rPr>
-          <w:rFonts w:asciiTheme="minorBidi" w:hAnsiTheme="minorBidi"/>
-        </w:rPr>
-        <w:t xml:space="preserve">report what the agents generate, not what a model contains, a state intends, or the future holds. Its aim is deliberative rather than predictive. War games and scenarios are usually run in private, among security professionals, whereas a synthetic rehearsal is cheap and repeatable and </w:t>
+        <w:jc w:val="both"/>
+        <w:rPr>
+          <w:rFonts w:asciiTheme="minorBidi" w:hAnsiTheme="minorBidi"/>
+        </w:rPr>
+      </w:pPr>
+      <w:r>
+        <w:rPr>
+          <w:rFonts w:asciiTheme="minorBidi" w:hAnsiTheme="minorBidi"/>
+        </w:rPr>
+        <w:t xml:space="preserve">The rivalry over artificial intelligence is usually described as a race between the United States and China to train the best models and accumulate the most compute, a framing that has organized popular and policy commentary since the late 2010s (Lee, 2018; Hogarth, 2018). It carries three assumptions: that the nation-state is the unit of power, that winning means owning the best domestic system, and that </w:t>
       </w:r>
       <w:r>
         <w:rPr>
           <w:rFonts w:asciiTheme="minorBidi" w:hAnsiTheme="minorBidi"/>
         </w:rPr>
         <w:lastRenderedPageBreak/>
-        <w:t>opens that room to citizens, civil-society organizations, and elected representatives, who can question the major powers and weigh which AI futures they would defend</w:t>
-      </w:r>
-      <w:r>
-        <w:rPr>
-          <w:rFonts w:asciiTheme="minorBidi" w:hAnsiTheme="minorBidi"/>
-        </w:rPr>
-        <w:t>.</w:t>
+        <w:t xml:space="preserve">authority follows capability. All three rest on a single idea, that AI power is a possession and that holding more of it is what guarantees authority. Recent practice, however, suggests otherwise. Performing power has become as decisive as possessing the means to it, and that performance is what needs closer examination. States now </w:t>
+      </w:r>
+      <w:r>
+        <w:rPr>
+          <w:rFonts w:asciiTheme="minorBidi" w:hAnsiTheme="minorBidi"/>
+        </w:rPr>
+        <w:t xml:space="preserve">often </w:t>
+      </w:r>
+      <w:r>
+        <w:rPr>
+          <w:rFonts w:asciiTheme="minorBidi" w:hAnsiTheme="minorBidi"/>
+        </w:rPr>
+        <w:t>claim sovereignty over compute and models they do not own, and the claim itself does much of the work that ownership once did.</w:t>
       </w:r>
     </w:p>
     <w:p>
       <w:pPr>
-        <w:pStyle w:val="Heading2"/>
-        <w:rPr>
-          <w:rFonts w:asciiTheme="minorBidi" w:hAnsiTheme="minorBidi" w:cstheme="minorBidi"/>
-        </w:rPr>
-      </w:pPr>
-      <w:r>
-        <w:rPr>
-          <w:rFonts w:asciiTheme="minorBidi" w:hAnsiTheme="minorBidi" w:cstheme="minorBidi"/>
-        </w:rPr>
-        <w:t>Introduction</w:t>
+        <w:jc w:val="both"/>
+        <w:rPr>
+          <w:rFonts w:asciiTheme="minorBidi" w:hAnsiTheme="minorBidi"/>
+        </w:rPr>
+      </w:pPr>
+      <w:r>
+        <w:rPr>
+          <w:rFonts w:asciiTheme="minorBidi" w:hAnsiTheme="minorBidi"/>
+        </w:rPr>
+        <w:t>The separation between possessing and performing is now easy to document, though what a count can establish needs care. The Center for a New American Security records 184 government-backed sovereign-AI projects across 67 states, most dependent on foreign chips, clouds, or models (CNAS, 2026). The figure measures how many governments have declared sovereign-AI programs, not how much sovereignty they command. Its significance lies in the pairing it makes visible: a sovereignty claim issued over a material base the claimant does not hold. Where the declaration outruns the control, the authority on display is produced by the declaration rather than secured by the capability beneath it. On that reading the count is not a record of failure but a sign that the site of authority has moved, from what a state owns to what it can convincingly assert.</w:t>
       </w:r>
     </w:p>
     <w:p>
       <w:pPr>
-        <w:rPr>
-          <w:rFonts w:asciiTheme="minorBidi" w:hAnsiTheme="minorBidi"/>
-        </w:rPr>
-      </w:pPr>
-      <w:r>
-        <w:rPr>
-          <w:rFonts w:asciiTheme="minorBidi" w:hAnsiTheme="minorBidi"/>
-        </w:rPr>
-        <w:t xml:space="preserve">The rivalry over artificial intelligence is usually </w:t>
-      </w:r>
-      <w:r>
-        <w:rPr>
-          <w:rFonts w:asciiTheme="minorBidi" w:hAnsiTheme="minorBidi"/>
-        </w:rPr>
-        <w:t xml:space="preserve">described </w:t>
-      </w:r>
-      <w:r>
-        <w:rPr>
-          <w:rFonts w:asciiTheme="minorBidi" w:hAnsiTheme="minorBidi"/>
-        </w:rPr>
-        <w:t>as a race between the United States and China to train the best models and accumulate the most compute, a framing that has organized popular and policy commentary since the late 2010s (Lee, 2018; Hogarth, 2018). It carries three assumptions: that the nation-state is the unit of power, that winning means owning the best domestic system, and that authority follows capability. All three rest on a single idea, that AI power is a possession and that holding more of it is what guarantees authority. Recent practice</w:t>
-      </w:r>
-      <w:r>
-        <w:rPr>
-          <w:rFonts w:asciiTheme="minorBidi" w:hAnsiTheme="minorBidi"/>
-        </w:rPr>
-        <w:t>, however,</w:t>
-      </w:r>
-      <w:r>
-        <w:rPr>
-          <w:rFonts w:asciiTheme="minorBidi" w:hAnsiTheme="minorBidi"/>
-        </w:rPr>
-        <w:t xml:space="preserve"> suggests otherwise. Performing power has become as decisive as possessing the means to it, and that performance is what needs closer examination. States now </w:t>
-      </w:r>
-      <w:r>
-        <w:rPr>
-          <w:rFonts w:asciiTheme="minorBidi" w:hAnsiTheme="minorBidi"/>
-        </w:rPr>
-        <w:t xml:space="preserve">often </w:t>
-      </w:r>
-      <w:r>
-        <w:rPr>
-          <w:rFonts w:asciiTheme="minorBidi" w:hAnsiTheme="minorBidi"/>
-        </w:rPr>
-        <w:t>claim sovereignty over compute and models they do not own, and the claim itself does much of the work that ownership once did.</w:t>
+        <w:jc w:val="both"/>
+        <w:rPr>
+          <w:rFonts w:asciiTheme="minorBidi" w:hAnsiTheme="minorBidi"/>
+        </w:rPr>
+      </w:pPr>
+      <w:r>
+        <w:rPr>
+          <w:rFonts w:asciiTheme="minorBidi" w:hAnsiTheme="minorBidi"/>
+        </w:rPr>
+        <w:t xml:space="preserve">Access, not ownership, is becoming the operative form of leverage, and the shift is more than a change of instrument. While ownership is a standing possession, access is a permission that can be revoked. Sovereignty that rests on access </w:t>
+      </w:r>
+      <w:proofErr w:type="gramStart"/>
+      <w:r>
+        <w:rPr>
+          <w:rFonts w:asciiTheme="minorBidi" w:hAnsiTheme="minorBidi"/>
+        </w:rPr>
+        <w:t>is</w:t>
+      </w:r>
+      <w:proofErr w:type="gramEnd"/>
+      <w:r>
+        <w:rPr>
+          <w:rFonts w:asciiTheme="minorBidi" w:hAnsiTheme="minorBidi"/>
+        </w:rPr>
+        <w:t xml:space="preserve"> therefore conditional, held at the discretion of whoever controls entry to the stack. The United States has extended that control from the export of chips to the licensing of access to frontier models (CSIS, 2026), and the spread of compute now depends on who admits a state to a supply chain rather than who holds it outright (Sastry et al., 2024). The Armenia-Azerbaijan settlement shows the lever from the grantor's side, with the promise of Nvidia chips reportedly serving as a bargaining instrument (Wall Street Journal, 2026), credible precisely because access can be given or withheld. Gulf infrastructure spending shows it from the recipient's side, buying capacity on terms that deepen the very dependence the investment was meant to end (IISS, 2026). Read together, these cases suggest that sovereignty and dependence are not opposites </w:t>
+      </w:r>
+      <w:proofErr w:type="gramStart"/>
+      <w:r>
+        <w:rPr>
+          <w:rFonts w:asciiTheme="minorBidi" w:hAnsiTheme="minorBidi"/>
+        </w:rPr>
+        <w:t>here</w:t>
+      </w:r>
+      <w:proofErr w:type="gramEnd"/>
+      <w:r>
+        <w:rPr>
+          <w:rFonts w:asciiTheme="minorBidi" w:hAnsiTheme="minorBidi"/>
+        </w:rPr>
+        <w:t xml:space="preserve"> but one relation seen from two ends, and that the performance of sovereignty is the work of keeping the two ends from being seen at once.</w:t>
       </w:r>
     </w:p>
     <w:p>
       <w:pPr>
-        <w:rPr>
-          <w:rFonts w:asciiTheme="minorBidi" w:hAnsiTheme="minorBidi"/>
-        </w:rPr>
-      </w:pPr>
-      <w:r>
-        <w:rPr>
-          <w:rFonts w:asciiTheme="minorBidi" w:hAnsiTheme="minorBidi"/>
-        </w:rPr>
-        <w:t>The separation between possessing and performing is now easy to document, though what a count can establish needs care. The Center for a New American Security records 184 government-backed sovereign-AI projects across 67 states, most dependent on foreign chips, clouds, or models (CNAS, 2026). The figure measures how many governments have declared sovereign-AI programs, not how much sovereignty they command. Its significance lies in the pairing it makes visible: a sovereignty claim issued over a material base the claimant does not hold. Where the declaration outruns the control, the authority on display is produced by the declaration rather than secured by the capability beneath it. On that reading the count is not a record of failure but a sign that the site of authority has moved, from what a state owns to what it can convincingly assert.</w:t>
+        <w:jc w:val="both"/>
+        <w:rPr>
+          <w:rFonts w:asciiTheme="minorBidi" w:hAnsiTheme="minorBidi"/>
+        </w:rPr>
+      </w:pPr>
+      <w:r>
+        <w:rPr>
+          <w:rFonts w:asciiTheme="minorBidi" w:hAnsiTheme="minorBidi"/>
+        </w:rPr>
+        <w:t xml:space="preserve">Meta-sovereignty gives these observations a name. Reshef Kera, Natan, Turgeman and Ofek (2026) describe authority performed through signals, imaginaries, and infrastructural promises rather than exercised through enforceable control, "a mode </w:t>
+      </w:r>
+      <w:r>
+        <w:rPr>
+          <w:rFonts w:asciiTheme="minorBidi" w:hAnsiTheme="minorBidi"/>
+        </w:rPr>
+        <w:lastRenderedPageBreak/>
+        <w:t>of rule sustained by infrastructures that do not yet exist, by fictions that persuade before they materialize, and by costly signals that substitute for control." On this account the sovereign-AI wave is not a failed bid for autonomy but a performance of it, one that substitutes promises for the capacity it lacks. The concept has a limit that shaped the present method. It is read backward, from pledges already made, so it can reconstruct the script once the performance is over but cannot watch that performance being defended, revised, or refused as it runs.</w:t>
       </w:r>
     </w:p>
     <w:p>
       <w:pPr>
-        <w:rPr>
-          <w:rFonts w:asciiTheme="minorBidi" w:hAnsiTheme="minorBidi"/>
-        </w:rPr>
-      </w:pPr>
-      <w:r>
-        <w:rPr>
-          <w:rFonts w:asciiTheme="minorBidi" w:hAnsiTheme="minorBidi"/>
-        </w:rPr>
-        <w:t xml:space="preserve">Access, not ownership, is becoming the operative form of leverage, and the shift is more than a change of instrument. </w:t>
-      </w:r>
-      <w:r>
-        <w:rPr>
-          <w:rFonts w:asciiTheme="minorBidi" w:hAnsiTheme="minorBidi"/>
-        </w:rPr>
-        <w:t>While o</w:t>
-      </w:r>
-      <w:r>
-        <w:rPr>
-          <w:rFonts w:asciiTheme="minorBidi" w:hAnsiTheme="minorBidi"/>
-        </w:rPr>
-        <w:t>wnership is a standing possession</w:t>
-      </w:r>
-      <w:r>
-        <w:rPr>
-          <w:rFonts w:asciiTheme="minorBidi" w:hAnsiTheme="minorBidi"/>
-        </w:rPr>
-        <w:t>, a</w:t>
-      </w:r>
-      <w:r>
-        <w:rPr>
-          <w:rFonts w:asciiTheme="minorBidi" w:hAnsiTheme="minorBidi"/>
-        </w:rPr>
-        <w:t>ccess is a permission</w:t>
-      </w:r>
-      <w:r>
-        <w:rPr>
-          <w:rFonts w:asciiTheme="minorBidi" w:hAnsiTheme="minorBidi"/>
-        </w:rPr>
-        <w:t xml:space="preserve"> that can </w:t>
-      </w:r>
-      <w:r>
-        <w:rPr>
-          <w:rFonts w:asciiTheme="minorBidi" w:hAnsiTheme="minorBidi"/>
-        </w:rPr>
-        <w:t xml:space="preserve">be revoked. Sovereignty that rests on access is therefore conditional, held at the discretion of whoever controls entry to the stack. The United States has extended that control from the export of chips to the licensing of access to frontier models (CSIS, 2026), and the spread of compute now depends on who admits a state to a supply chain rather than who holds it outright (Sastry et al., 2024). The Armenia-Azerbaijan settlement shows the lever from the grantor's side, with the promise of Nvidia chips reportedly serving as a bargaining instrument (Wall Street Journal, 2026), credible precisely because access can be given or withheld. Gulf infrastructure spending shows it from the recipient's side, buying </w:t>
-      </w:r>
-      <w:r>
-        <w:rPr>
-          <w:rFonts w:asciiTheme="minorBidi" w:hAnsiTheme="minorBidi"/>
-        </w:rPr>
-        <w:lastRenderedPageBreak/>
-        <w:t>capacity on terms that deepen the very dependence the investment was meant to end (IISS, 2026). Read together, these cases suggest that sovereignty and dependence are not opposites here but one relation seen from two ends, and that the performance of sovereignty is the work of keeping the two ends from being seen at once.</w:t>
+        <w:jc w:val="both"/>
+        <w:rPr>
+          <w:rFonts w:asciiTheme="minorBidi" w:hAnsiTheme="minorBidi"/>
+        </w:rPr>
+      </w:pPr>
+      <w:r>
+        <w:rPr>
+          <w:rFonts w:asciiTheme="minorBidi" w:hAnsiTheme="minorBidi"/>
+        </w:rPr>
+        <w:t xml:space="preserve">The instrument for observing </w:t>
+      </w:r>
+      <w:r>
+        <w:rPr>
+          <w:rFonts w:asciiTheme="minorBidi" w:hAnsiTheme="minorBidi"/>
+        </w:rPr>
+        <w:t xml:space="preserve">the process </w:t>
+      </w:r>
+      <w:r>
+        <w:rPr>
+          <w:rFonts w:asciiTheme="minorBidi" w:hAnsiTheme="minorBidi"/>
+        </w:rPr>
+        <w:t xml:space="preserve">as it happens is a human-AI roundtable that runs on live data and a curated policy corpus for each actor. Three language-model agents argue as China, the United States, and the European Union. Each reads its own corpus and can draw on current sources, while human participants set the opening prompt, interrupt, reprompt, and bring in further agents. We call the method synthetic rehearsal: a staging of performed sovereignty in which human intervention and prompt design serve as experimental controls, so that the work of holding a sovereignty claim together, and the moments it gives way, can be observed as it happens. </w:t>
       </w:r>
     </w:p>
     <w:p>
       <w:pPr>
-        <w:rPr>
-          <w:rFonts w:asciiTheme="minorBidi" w:hAnsiTheme="minorBidi"/>
-        </w:rPr>
-      </w:pPr>
-      <w:r>
-        <w:rPr>
-          <w:rFonts w:asciiTheme="minorBidi" w:hAnsiTheme="minorBidi"/>
-        </w:rPr>
-        <w:t>Meta-sovereignty gives these observations a name. Reshef Kera, Natan, Turgeman and Ofek (2026) describe authority performed through signals, imaginaries, and infrastructural promises rather than exercised through enforceable control, "a mode of rule sustained by infrastructures that do not yet exist, by fictions that persuade before they materialize, and by costly signals that substitute for control." On this account the sovereign-AI wave is not a failed bid for autonomy but a performance of it, one that substitutes promises for the capacity it lacks. The concept has a limit that shaped the present method. It is read backward, from pledges already made, so it can reconstruct the script once the performance is over but cannot watch that performance being defended, revised, or refused as it runs.</w:t>
+        <w:jc w:val="both"/>
+        <w:rPr>
+          <w:rFonts w:asciiTheme="minorBidi" w:hAnsiTheme="minorBidi"/>
+        </w:rPr>
+      </w:pPr>
+      <w:r>
+        <w:rPr>
+          <w:rFonts w:asciiTheme="minorBidi" w:hAnsiTheme="minorBidi"/>
+        </w:rPr>
+        <w:t xml:space="preserve">Three commitments limit </w:t>
+      </w:r>
+      <w:r>
+        <w:rPr>
+          <w:rFonts w:asciiTheme="minorBidi" w:hAnsiTheme="minorBidi"/>
+        </w:rPr>
+        <w:t xml:space="preserve">the analysis of the </w:t>
+      </w:r>
+      <w:r>
+        <w:rPr>
+          <w:rFonts w:asciiTheme="minorBidi" w:hAnsiTheme="minorBidi"/>
+        </w:rPr>
+        <w:t xml:space="preserve">generated </w:t>
+      </w:r>
+      <w:r>
+        <w:rPr>
+          <w:rFonts w:asciiTheme="minorBidi" w:hAnsiTheme="minorBidi"/>
+        </w:rPr>
+        <w:t>logs in this process</w:t>
+      </w:r>
+      <w:r>
+        <w:rPr>
+          <w:rFonts w:asciiTheme="minorBidi" w:hAnsiTheme="minorBidi"/>
+        </w:rPr>
+        <w:t xml:space="preserve">. </w:t>
+      </w:r>
+      <w:r>
+        <w:rPr>
+          <w:rFonts w:asciiTheme="minorBidi" w:hAnsiTheme="minorBidi"/>
+        </w:rPr>
+        <w:t>The evidence is confined to what the agents produce, their logs and the artifacts they generate, and it supports no inference about the models' internals or any state's real intentions. What the method examines is how sovereignty imaginaries are made legible, circulated, and contested, so it forecasts no outcomes and measures no capability. Because the models are trained on the same discourse the roundtable examines, the rehearsal can reproduce the imaginaries it sets out to question, a limit we keep in view. Agency belongs to the whole arrangement, the models, corpora, prompts, interface, participants, and audience together, and never to a single agent.</w:t>
       </w:r>
     </w:p>
     <w:p>
       <w:pPr>
-        <w:rPr>
-          <w:rFonts w:asciiTheme="minorBidi" w:hAnsiTheme="minorBidi"/>
-        </w:rPr>
-      </w:pPr>
-      <w:r>
-        <w:rPr>
-          <w:rFonts w:asciiTheme="minorBidi" w:hAnsiTheme="minorBidi"/>
-        </w:rPr>
-        <w:t xml:space="preserve">The instrument for observing </w:t>
-      </w:r>
-      <w:r>
-        <w:rPr>
-          <w:rFonts w:asciiTheme="minorBidi" w:hAnsiTheme="minorBidi"/>
-        </w:rPr>
-        <w:t xml:space="preserve">the process </w:t>
-      </w:r>
-      <w:r>
-        <w:rPr>
-          <w:rFonts w:asciiTheme="minorBidi" w:hAnsiTheme="minorBidi"/>
-        </w:rPr>
-        <w:t xml:space="preserve">as it happens is a human-AI roundtable that runs on live data and a curated policy corpus for each actor. Three language-model agents argue as China, the United States, and the European Union. Each reads its own corpus and can draw on current sources, while human participants set the opening prompt, interrupt, reprompt, and bring in further agents. We call the method synthetic rehearsal: a staging of performed sovereignty in which human intervention and prompt design serve as experimental controls, so that the work of holding a sovereignty claim together, and the moments it gives way, can be observed as it happens. </w:t>
-      </w:r>
+        <w:jc w:val="both"/>
+        <w:rPr>
+          <w:rFonts w:asciiTheme="minorBidi" w:hAnsiTheme="minorBidi"/>
+        </w:rPr>
+      </w:pPr>
     </w:p>
     <w:p>
       <w:pPr>
-        <w:rPr>
-          <w:rFonts w:asciiTheme="minorBidi" w:hAnsiTheme="minorBidi"/>
-        </w:rPr>
-      </w:pPr>
-      <w:r>
-        <w:rPr>
-          <w:rFonts w:asciiTheme="minorBidi" w:hAnsiTheme="minorBidi"/>
-        </w:rPr>
-        <w:t xml:space="preserve">Three commitments limit </w:t>
-      </w:r>
-      <w:r>
-        <w:rPr>
-          <w:rFonts w:asciiTheme="minorBidi" w:hAnsiTheme="minorBidi"/>
-        </w:rPr>
-        <w:t xml:space="preserve">the analysis of the </w:t>
-      </w:r>
-      <w:r>
-        <w:rPr>
-          <w:rFonts w:asciiTheme="minorBidi" w:hAnsiTheme="minorBidi"/>
-        </w:rPr>
-        <w:t xml:space="preserve">generated </w:t>
-      </w:r>
-      <w:r>
-        <w:rPr>
-          <w:rFonts w:asciiTheme="minorBidi" w:hAnsiTheme="minorBidi"/>
-        </w:rPr>
-        <w:t>logs in this process</w:t>
-      </w:r>
-      <w:r>
-        <w:rPr>
-          <w:rFonts w:asciiTheme="minorBidi" w:hAnsiTheme="minorBidi"/>
-        </w:rPr>
-        <w:t xml:space="preserve">. </w:t>
-      </w:r>
-      <w:r>
-        <w:rPr>
-          <w:rFonts w:asciiTheme="minorBidi" w:hAnsiTheme="minorBidi"/>
-        </w:rPr>
-        <w:t>The evidence is confined to what the agents produce, their logs and the artifacts they generate, and it supports no inference about the models' internals or any state's real intentions. What the method examines is how sovereignty imaginaries are made legible, circulated, and contested, so it forecasts no outcomes and measures no capability. Because the models are trained on the same discourse the roundtable examines, the rehearsal can reproduce the imaginaries it sets out to question, a limit we keep in view. Agency belongs to the whole arrangement, the models, corpora, prompts, interface, participants, and audience together, and never to a single agent.</w:t>
+        <w:jc w:val="both"/>
+        <w:rPr>
+          <w:rFonts w:asciiTheme="minorBidi" w:hAnsiTheme="minorBidi"/>
+        </w:rPr>
+      </w:pPr>
+      <w:r>
+        <w:rPr>
+          <w:rFonts w:asciiTheme="minorBidi" w:hAnsiTheme="minorBidi"/>
+        </w:rPr>
+        <w:t xml:space="preserve">The aim of a synthetic rehearsal is deliberative rather than predictive, which sets the exercise apart from the two practices it superficially resembles: the war game and the planning scenario. Wargaming developed as a closed craft for military and security professionals (Perla, 1990), and its recent AI variants frame the field through deterrence and the risk of pre-emption (Hendrycks, Schmidt and Wang, 2025). Scenario planning, in its classic corporate form, likewise kept authorship inside the organization it served (Wack, 1985). A synthetic rehearsal reverses these access conditions. It is inexpensive and repeatable, and it opens a room that both traditions keep closed, admitting citizens, civil-society organizations, and elected representatives to question the positions of the major powers and weigh which AI </w:t>
+      </w:r>
+      <w:r>
+        <w:rPr>
+          <w:rFonts w:asciiTheme="minorBidi" w:hAnsiTheme="minorBidi"/>
+        </w:rPr>
+        <w:lastRenderedPageBreak/>
+        <w:t>futures they would defend before those futures are presented as settled. In this it stands closer to deliberative democracy than to forecasting (Fishkin, 2009).</w:t>
       </w:r>
     </w:p>
     <w:p>
       <w:pPr>
-        <w:rPr>
-          <w:rFonts w:asciiTheme="minorBidi" w:hAnsiTheme="minorBidi"/>
-        </w:rPr>
-      </w:pPr>
+        <w:jc w:val="both"/>
+        <w:rPr>
+          <w:rFonts w:asciiTheme="minorBidi" w:hAnsiTheme="minorBidi"/>
+          <w:b/>
+          <w:bCs/>
+        </w:rPr>
+      </w:pPr>
+      <w:r>
+        <w:rPr>
+          <w:rFonts w:asciiTheme="minorBidi" w:hAnsiTheme="minorBidi"/>
+        </w:rPr>
+        <w:t>The aim of a synthetic rehearsal is deliberative rather than predictive, which sets the exercise apart from the two practices it superficially resembles: the war game and the planning scenario. Wargaming developed as a closed craft for military and security professionals (Perla, 1990), and its recent AI variants frame the field through deterrence and the risk of pre-emption (Hendrycks, Schmidt and Wang, 2025). Scenario planning, in its classic corporate form, likewise kept authorship inside the organization it served (Wack, 1985). A synthetic rehearsal reverses these access conditions. It is inexpensive and repeatable, and it opens a room that both traditions keep closed, admitting citizens, civil-society organizations, and elected representatives to question the positions of the major powers and weigh which AI futures they would defend before those futures are presented as settled. In this it stands closer to deliberative democracy than to forecasting (Fishkin, 2009).</w:t>
+      </w:r>
     </w:p>
     <w:p>
       <w:pPr>
-        <w:rPr>
-          <w:rFonts w:asciiTheme="minorBidi" w:hAnsiTheme="minorBidi"/>
-        </w:rPr>
-      </w:pPr>
-      <w:r>
-        <w:rPr>
-          <w:rFonts w:asciiTheme="minorBidi" w:hAnsiTheme="minorBidi"/>
-        </w:rPr>
-        <w:lastRenderedPageBreak/>
-        <w:t>The aim of a synthetic rehearsal is deliberative rather than predictive, which sets the exercise apart from the two practices it superficially resembles: the war game and the planning scenario. Wargaming developed as a closed craft for military and security professionals (Perla, 1990), and its recent AI variants frame the field through deterrence and the risk of pre-emption (Hendrycks, Schmidt and Wang, 2025). Scenario planning, in its classic corporate form, likewise kept authorship inside the organization it served (Wack, 1985). A synthetic rehearsal reverses these access conditions. It is inexpensive and repeatable, and it opens a room that both traditions keep closed, admitting citizens, civil-society organizations, and elected representatives to question the positions of the major powers and weigh which AI futures they would defend before those futures are presented as settled. In this it stands closer to deliberative democracy than to forecasting (Fishkin, 2009).</w:t>
+        <w:jc w:val="both"/>
+        <w:rPr>
+          <w:rFonts w:asciiTheme="minorBidi" w:hAnsiTheme="minorBidi"/>
+          <w:b/>
+          <w:bCs/>
+        </w:rPr>
+      </w:pPr>
+      <w:r>
+        <w:rPr>
+          <w:rFonts w:asciiTheme="minorBidi" w:hAnsiTheme="minorBidi"/>
+        </w:rPr>
+        <w:t xml:space="preserve">The remainder of the article develops the argument and reports the preliminary results. The next section places synthetic rehearsal in a genealogy that runs from Derrida's (1984) account of great-power conflict as "fabulously textual," through Fearon (1995) on costly signaling and Ezrahi (2012) on necessary fictions, to meta-sovereignty (Reshef Kera et al., 2026), and states the gap each leaves open. A methods section sets out the roundtable, its three registers of debate, propaganda-lab, and mirror-world, and the coding scheme. </w:t>
+      </w:r>
+      <w:proofErr w:type="gramStart"/>
+      <w:r>
+        <w:rPr>
+          <w:rFonts w:asciiTheme="minorBidi" w:hAnsiTheme="minorBidi"/>
+        </w:rPr>
+        <w:t>A results</w:t>
+      </w:r>
+      <w:proofErr w:type="gramEnd"/>
+      <w:r>
+        <w:rPr>
+          <w:rFonts w:asciiTheme="minorBidi" w:hAnsiTheme="minorBidi"/>
+        </w:rPr>
+        <w:t xml:space="preserve"> section reports the first-pass coding over the substantive corpus, where the agents prove distinguishable along their designed lines and the discourse shifts from confrontation toward concession after human intervention. An interpretation section reads the corpus as a single performance viewed at increasing interpretive distance. The conclusion returns to the reflexivity limit and to what the method can and cannot establish.</w:t>
       </w:r>
     </w:p>
     <w:p>
       <w:pPr>
-        <w:pStyle w:val="Heading2"/>
-        <w:rPr>
-          <w:rFonts w:asciiTheme="minorBidi" w:eastAsiaTheme="minorEastAsia" w:hAnsiTheme="minorBidi" w:cstheme="minorBidi"/>
-          <w:b w:val="0"/>
-          <w:bCs w:val="0"/>
-          <w:color w:val="auto"/>
-          <w:sz w:val="23"/>
-          <w:szCs w:val="22"/>
-        </w:rPr>
-      </w:pPr>
-      <w:r>
-        <w:rPr>
-          <w:rFonts w:asciiTheme="minorBidi" w:eastAsiaTheme="minorEastAsia" w:hAnsiTheme="minorBidi" w:cstheme="minorBidi"/>
-          <w:b w:val="0"/>
-          <w:bCs w:val="0"/>
-          <w:color w:val="auto"/>
-          <w:sz w:val="23"/>
-          <w:szCs w:val="22"/>
-        </w:rPr>
-        <w:lastRenderedPageBreak/>
-        <w:t>The aim of a synthetic rehearsal is deliberative rather than predictive, which sets the exercise apart from the two practices it superficially resembles: the war game and the planning scenario. Wargaming developed as a closed craft for military and security professionals (Perla, 1990), and its recent AI variants frame the field through deterrence and the risk of pre-emption (Hendrycks, Schmidt and Wang, 2025). Scenario planning, in its classic corporate form, likewise kept authorship inside the organization it served (Wack, 1985). A synthetic rehearsal reverses these access conditions. It is inexpensive and repeatable, and it opens a room that both traditions keep closed, admitting citizens, civil-society organizations, and elected representatives to question the positions of the major powers and weigh which AI futures they would defend before those futures are presented as settled. In this it stands closer to deliberative democracy than to forecasting (Fishkin, 2009).</w:t>
-      </w:r>
+        <w:jc w:val="both"/>
+        <w:rPr>
+          <w:rFonts w:asciiTheme="minorBidi" w:hAnsiTheme="minorBidi"/>
+        </w:rPr>
+      </w:pPr>
+      <w:r>
+        <w:rPr>
+          <w:rFonts w:asciiTheme="minorBidi" w:hAnsiTheme="minorBidi"/>
+        </w:rPr>
+        <w:t xml:space="preserve">2. From control to performance: </w:t>
+      </w:r>
+      <w:proofErr w:type="gramStart"/>
+      <w:r>
+        <w:rPr>
+          <w:rFonts w:asciiTheme="minorBidi" w:hAnsiTheme="minorBidi"/>
+        </w:rPr>
+        <w:t>a genealogy</w:t>
+      </w:r>
+      <w:proofErr w:type="gramEnd"/>
     </w:p>
     <w:p>
       <w:pPr>
-        <w:pStyle w:val="Heading2"/>
-        <w:rPr>
-          <w:rFonts w:asciiTheme="minorBidi" w:eastAsiaTheme="minorEastAsia" w:hAnsiTheme="minorBidi" w:cstheme="minorBidi"/>
-          <w:b w:val="0"/>
-          <w:bCs w:val="0"/>
-          <w:color w:val="auto"/>
-          <w:sz w:val="23"/>
-          <w:szCs w:val="22"/>
-        </w:rPr>
-      </w:pPr>
-      <w:r>
-        <w:rPr>
-          <w:rFonts w:asciiTheme="minorBidi" w:eastAsiaTheme="minorEastAsia" w:hAnsiTheme="minorBidi" w:cstheme="minorBidi"/>
-          <w:b w:val="0"/>
-          <w:bCs w:val="0"/>
-          <w:color w:val="auto"/>
-          <w:sz w:val="23"/>
-          <w:szCs w:val="22"/>
-        </w:rPr>
-        <w:t>The remainder of the article develops the argument and reports the preliminary results. The next section places synthetic rehearsal in a genealogy that runs from Derrida's (1984) account of great-power conflict as "fabulously textual," through Fearon (1995) on costly signaling and Ezrahi (2012) on necessary fictions, to meta-sovereignty (Reshef Kera et al., 2026), and states the gap each leaves open. A methods section sets out the roundtable, its three registers of debate, propaganda-lab, and mirror-world, and the coding scheme. A results section reports the first-pass coding over the substantive corpus, where the agents prove distinguishable along their designed lines and the discourse shifts from confrontation toward concession after human intervention. An interpretation section reads the corpus as a single performance viewed at increasing interpretive distance. The conclusion returns to the reflexivity limit and to what the method can and cannot establish.</w:t>
+        <w:jc w:val="both"/>
+        <w:rPr>
+          <w:rFonts w:asciiTheme="minorBidi" w:hAnsiTheme="minorBidi"/>
+        </w:rPr>
+      </w:pPr>
+      <w:r>
+        <w:rPr>
+          <w:rFonts w:asciiTheme="minorBidi" w:hAnsiTheme="minorBidi"/>
+        </w:rPr>
+        <w:t xml:space="preserve">Synthetic rehearsal takes up a problem that several traditions have </w:t>
+      </w:r>
+      <w:proofErr w:type="gramStart"/>
+      <w:r>
+        <w:rPr>
+          <w:rFonts w:asciiTheme="minorBidi" w:hAnsiTheme="minorBidi"/>
+        </w:rPr>
+        <w:t>named</w:t>
+      </w:r>
+      <w:proofErr w:type="gramEnd"/>
+      <w:r>
+        <w:rPr>
+          <w:rFonts w:asciiTheme="minorBidi" w:hAnsiTheme="minorBidi"/>
+        </w:rPr>
+        <w:t xml:space="preserve"> and none has dissolved: how a state brings others to credit a claim it cannot enforce. Deterrence theory posed it as the credibility of a threat that might never be carried out (Schelling, 1966). Signaling theory recast it as the cost a state must visibly bear before it is believed (Jervis, 1970; Fearon, 1995). The study of sovereignty treated it as a status that holds only when others recognize the performance of it (Weber, 1995). Claim, signal, and recognition are three faces of one difficulty, and each account hands the next </w:t>
+      </w:r>
+      <w:proofErr w:type="gramStart"/>
+      <w:r>
+        <w:rPr>
+          <w:rFonts w:asciiTheme="minorBidi" w:hAnsiTheme="minorBidi"/>
+        </w:rPr>
+        <w:t>a mechanism</w:t>
+      </w:r>
+      <w:proofErr w:type="gramEnd"/>
+      <w:r>
+        <w:rPr>
+          <w:rFonts w:asciiTheme="minorBidi" w:hAnsiTheme="minorBidi"/>
+        </w:rPr>
+        <w:t xml:space="preserve"> the previous one left unspecified. They also share a limit. Each can show that sovereignty is performed and can explain why a </w:t>
+      </w:r>
+      <w:r>
+        <w:rPr>
+          <w:rFonts w:asciiTheme="minorBidi" w:hAnsiTheme="minorBidi"/>
+        </w:rPr>
+        <w:lastRenderedPageBreak/>
+        <w:t>given performance persuades, yet each examines a performance already over. The roundtable studied here runs the performance forward and lets us interrupt it. The genealogy that follows is arranged to isolate what that shift, from reading a finished performance to running one that can be pushed, adds to each idea it inherits.</w:t>
       </w:r>
     </w:p>
     <w:p>
       <w:pPr>
-        <w:pStyle w:val="Heading2"/>
-        <w:rPr>
-          <w:rFonts w:asciiTheme="minorBidi" w:hAnsiTheme="minorBidi" w:cstheme="minorBidi"/>
-        </w:rPr>
-      </w:pPr>
-      <w:r>
-        <w:rPr>
-          <w:rFonts w:asciiTheme="minorBidi" w:hAnsiTheme="minorBidi" w:cstheme="minorBidi"/>
-        </w:rPr>
-        <w:t>2. From control to performance: a genealogy</w:t>
+        <w:jc w:val="both"/>
+        <w:rPr>
+          <w:rFonts w:asciiTheme="minorBidi" w:hAnsiTheme="minorBidi"/>
+        </w:rPr>
+      </w:pPr>
+      <w:r>
+        <w:rPr>
+          <w:rFonts w:asciiTheme="minorBidi" w:hAnsiTheme="minorBidi"/>
+        </w:rPr>
+        <w:t>2.1 Derrida: the referent that never arrives, and the archive as its condition</w:t>
       </w:r>
     </w:p>
     <w:p>
       <w:pPr>
-        <w:rPr>
-          <w:rFonts w:asciiTheme="minorBidi" w:hAnsiTheme="minorBidi"/>
-        </w:rPr>
-      </w:pPr>
-      <w:r>
-        <w:rPr>
-          <w:rFonts w:asciiTheme="minorBidi" w:hAnsiTheme="minorBidi"/>
-        </w:rPr>
-        <w:t xml:space="preserve">Synthetic rehearsal takes up a problem that several traditions have named and none has dissolved: how a state brings others to credit a claim it cannot enforce. Deterrence theory posed it as the credibility of a threat that might never be carried out (Schelling, 1966). Signaling theory recast it as the cost a state must visibly bear before it is believed (Jervis, 1970; Fearon, 1995). The study of sovereignty treated it as a status that holds only when others recognize the performance of it (Weber, 1995). Claim, signal, and recognition are three faces of one difficulty, and each account hands the next a mechanism the previous one left unspecified. They also share a limit. Each can show that sovereignty is performed and can explain why a given performance persuades, yet each examines a performance already over. The roundtable studied here runs the performance forward and lets us interrupt it. The </w:t>
-      </w:r>
-      <w:r>
-        <w:rPr>
-          <w:rFonts w:asciiTheme="minorBidi" w:hAnsiTheme="minorBidi"/>
-        </w:rPr>
-        <w:lastRenderedPageBreak/>
-        <w:t>genealogy that follows is arranged to isolate what that shift, from reading a finished performance to running one that can be pushed, adds to each idea it inherits.</w:t>
+        <w:jc w:val="both"/>
+        <w:rPr>
+          <w:rFonts w:asciiTheme="minorBidi" w:hAnsiTheme="minorBidi"/>
+        </w:rPr>
+      </w:pPr>
+      <w:r>
+        <w:rPr>
+          <w:rFonts w:asciiTheme="minorBidi" w:hAnsiTheme="minorBidi"/>
+        </w:rPr>
+        <w:t>Great-power conflict was text and signal before it was material. Derrida's "No Apocalypse, Not Now" (1984) calls total nuclear war "fabulously textual," an antagonism that rests on structures of information, code, and archive and whose referent never arrives as an event. He does not deny that the weapons are real. His claim concerns the mode of the confrontation, which is conducted through what can be inscribed, transmitted, and read, and credited on that basis. Nuclear standoff is the pure case, since the thing feared is precisely the thing that must not happen, so the whole apparatus operates in the register of anticipation rather than event.</w:t>
       </w:r>
     </w:p>
     <w:p>
       <w:pPr>
-        <w:pStyle w:val="Heading3"/>
-        <w:rPr>
-          <w:rFonts w:asciiTheme="minorBidi" w:hAnsiTheme="minorBidi" w:cstheme="minorBidi"/>
-        </w:rPr>
-      </w:pPr>
-      <w:r>
-        <w:rPr>
-          <w:rFonts w:asciiTheme="minorBidi" w:hAnsiTheme="minorBidi" w:cstheme="minorBidi"/>
-        </w:rPr>
-        <w:t>2.1 Derrida: the referent that never arrives, and the archive as its condition</w:t>
+        <w:jc w:val="both"/>
+        <w:rPr>
+          <w:rFonts w:asciiTheme="minorBidi" w:hAnsiTheme="minorBidi"/>
+        </w:rPr>
+      </w:pPr>
+      <w:r>
+        <w:rPr>
+          <w:rFonts w:asciiTheme="minorBidi" w:hAnsiTheme="minorBidi"/>
+        </w:rPr>
+        <w:t xml:space="preserve">“Archive Fever” (1995) supplies a second component. "There is no political power without control of the archive," which makes the ordering, retention, and reorganization of the record an exercise of authority rather than a neutral support for it. Prompting is a practice of exactly this kind. Each prompt selects from and </w:t>
+      </w:r>
+      <w:proofErr w:type="gramStart"/>
+      <w:r>
+        <w:rPr>
+          <w:rFonts w:asciiTheme="minorBidi" w:hAnsiTheme="minorBidi"/>
+        </w:rPr>
+        <w:t>reorders</w:t>
+      </w:r>
+      <w:proofErr w:type="gramEnd"/>
+      <w:r>
+        <w:rPr>
+          <w:rFonts w:asciiTheme="minorBidi" w:hAnsiTheme="minorBidi"/>
+        </w:rPr>
+        <w:t xml:space="preserve"> the vast corpus a model has absorbed, and in doing so it gives the operator a measure of control over which parts of the archive speak. The roundtable makes that control explicit, and it includes a Critical Archivist among its summonable agents for the same reason: an agent that can reorganize the shared corpus turns the archival dimension of authority into an observable operation rather than an assumption. Derrida supplies the domain and the intuition, that conflict lives in text and that power lives in control of text. What he does not supply is a real-time account of how a signal becomes credible to an adversary in the moment. That is the next requirement.</w:t>
       </w:r>
     </w:p>
     <w:p>
       <w:pPr>
-        <w:rPr>
-          <w:rFonts w:asciiTheme="minorBidi" w:hAnsiTheme="minorBidi"/>
-        </w:rPr>
-      </w:pPr>
-      <w:r>
-        <w:rPr>
-          <w:rFonts w:asciiTheme="minorBidi" w:hAnsiTheme="minorBidi"/>
-        </w:rPr>
-        <w:t>Great-power conflict was text and signal before it was material. Derrida's "No Apocalypse, Not Now" (1984) calls total nuclear war "fabulously textual," an antagonism that rests on structures of information, code, and archive and whose referent never arrives as an event. He does not deny that the weapons are real. His claim concerns the mode of the confrontation, which is conducted through what can be inscribed, transmitted, and read, and credited on that basis. Nuclear standoff is the pure case, since the thing feared is precisely the thing that must not happen, so the whole apparatus operates in the register of anticipation rather than event.</w:t>
+        <w:jc w:val="both"/>
+        <w:rPr>
+          <w:rFonts w:asciiTheme="minorBidi" w:hAnsiTheme="minorBidi"/>
+        </w:rPr>
+      </w:pPr>
+      <w:r>
+        <w:rPr>
+          <w:rFonts w:asciiTheme="minorBidi" w:hAnsiTheme="minorBidi"/>
+        </w:rPr>
+        <w:t>2.2 Fearon: the credibility mechanism, and the silence about maintenance</w:t>
       </w:r>
     </w:p>
     <w:p>
       <w:pPr>
-        <w:rPr>
-          <w:rFonts w:asciiTheme="minorBidi" w:hAnsiTheme="minorBidi"/>
-        </w:rPr>
-      </w:pPr>
-      <w:r>
-        <w:rPr>
-          <w:rFonts w:asciiTheme="minorBidi" w:hAnsiTheme="minorBidi"/>
-        </w:rPr>
-        <w:t>“</w:t>
-      </w:r>
-      <w:r>
-        <w:rPr>
-          <w:rFonts w:asciiTheme="minorBidi" w:hAnsiTheme="minorBidi"/>
-        </w:rPr>
-        <w:t>Archive Fever</w:t>
-      </w:r>
-      <w:r>
-        <w:rPr>
-          <w:rFonts w:asciiTheme="minorBidi" w:hAnsiTheme="minorBidi"/>
-        </w:rPr>
-        <w:t>”</w:t>
-      </w:r>
-      <w:r>
-        <w:rPr>
-          <w:rFonts w:asciiTheme="minorBidi" w:hAnsiTheme="minorBidi"/>
-        </w:rPr>
-        <w:t xml:space="preserve"> (1995) supplies a second component. "There is no political power without control of the archive," which makes the ordering, retention, and reorganization of the record an exercise of authority rather than a neutral support for it. Prompting is a practice of exactly this kind. Each prompt selects from and reorders the vast corpus a model has absorbed, and in doing so it gives the operator a measure of control over which parts of the archive speak. The roundtable makes that control explicit, and it includes a Critical Archivist among its summonable agents for the same reason: an agent that can reorganize the shared corpus turns the archival dimension of authority into an observable operation rather than an assumption. Derrida supplies the domain and the intuition, that conflict lives in text and that power lives in control of text. What he does not supply is a real-time account of how a signal becomes credible to an adversary in the moment. That is the next requirement.</w:t>
+        <w:jc w:val="both"/>
+        <w:rPr>
+          <w:rFonts w:asciiTheme="minorBidi" w:hAnsiTheme="minorBidi"/>
+        </w:rPr>
+      </w:pPr>
+      <w:r>
+        <w:rPr>
+          <w:rFonts w:asciiTheme="minorBidi" w:hAnsiTheme="minorBidi"/>
+        </w:rPr>
+        <w:t xml:space="preserve">Fearon's </w:t>
+      </w:r>
+      <w:proofErr w:type="gramStart"/>
+      <w:r>
+        <w:rPr>
+          <w:rFonts w:asciiTheme="minorBidi" w:hAnsiTheme="minorBidi"/>
+        </w:rPr>
+        <w:t>costly-signaling</w:t>
+      </w:r>
+      <w:proofErr w:type="gramEnd"/>
+      <w:r>
+        <w:rPr>
+          <w:rFonts w:asciiTheme="minorBidi" w:hAnsiTheme="minorBidi"/>
+        </w:rPr>
+        <w:t xml:space="preserve"> argument (1995) supplies the mechanism Derrida leaves open. A claim becomes credible when it is backed by visible, costly commitment that a bluffer would be unwilling to bear, so that assertion alone does not persuade. The argument also widens the domain from nuclear standoff to bargaining and crisis generally, and it names the step by which text becomes credited text. The costly signal is the hinge between saying and being believed.</w:t>
       </w:r>
     </w:p>
     <w:p>
       <w:pPr>
-        <w:pStyle w:val="Heading3"/>
-        <w:rPr>
-          <w:rFonts w:asciiTheme="minorBidi" w:hAnsiTheme="minorBidi" w:cstheme="minorBidi"/>
-        </w:rPr>
-      </w:pPr>
-      <w:r>
-        <w:rPr>
-          <w:rFonts w:asciiTheme="minorBidi" w:hAnsiTheme="minorBidi" w:cstheme="minorBidi"/>
-        </w:rPr>
-        <w:t>2.2 Fearon: the credibility mechanism, and the silence about maintenance</w:t>
+        <w:jc w:val="both"/>
+        <w:rPr>
+          <w:rFonts w:asciiTheme="minorBidi" w:hAnsiTheme="minorBidi"/>
+        </w:rPr>
+      </w:pPr>
+      <w:r>
+        <w:rPr>
+          <w:rFonts w:asciiTheme="minorBidi" w:hAnsiTheme="minorBidi"/>
+        </w:rPr>
+        <w:t xml:space="preserve">Fearon models a discrete act. A signal is a single move, sincere or a bluff, and the question is whether the receiver should be convinced. The model says nothing about </w:t>
+      </w:r>
+      <w:r>
+        <w:rPr>
+          <w:rFonts w:asciiTheme="minorBidi" w:hAnsiTheme="minorBidi"/>
+        </w:rPr>
+        <w:lastRenderedPageBreak/>
+        <w:t>what happens across many turns, once a posture must be sustained, revised, and defended after a first assertion has been challenged. Credibility in Fearon is manufactured once. The object studied here is credibility held under repeated contestation, where an interlocutor refuses the signal and the claimant must restate, escalate, or give ground. Maintenance of a signal, as distinct from its issuance, is what remains open.</w:t>
       </w:r>
     </w:p>
     <w:p>
       <w:pPr>
-        <w:rPr>
-          <w:rFonts w:asciiTheme="minorBidi" w:hAnsiTheme="minorBidi"/>
-        </w:rPr>
-      </w:pPr>
-      <w:r>
-        <w:rPr>
-          <w:rFonts w:asciiTheme="minorBidi" w:hAnsiTheme="minorBidi"/>
-        </w:rPr>
-        <w:t>Fearon's costly-signaling argument (1995) supplies the mechanism Derrida leaves open. A claim becomes credible when it is backed by visible, costly commitment that a bluffer would be unwilling to bear, so that assertion alone does not persuade. The argument also widens the domain from nuclear standoff to bargaining and crisis generally, and it names the step by which text becomes credited text. The costly signal is the hinge between saying and being believed.</w:t>
+        <w:jc w:val="both"/>
+        <w:rPr>
+          <w:rFonts w:asciiTheme="minorBidi" w:hAnsiTheme="minorBidi"/>
+        </w:rPr>
+      </w:pPr>
+      <w:r>
+        <w:rPr>
+          <w:rFonts w:asciiTheme="minorBidi" w:hAnsiTheme="minorBidi"/>
+        </w:rPr>
+        <w:t>2.3 Ezrahi: the coherence of fictions, and the promptable-fiction gap</w:t>
       </w:r>
     </w:p>
     <w:p>
       <w:pPr>
-        <w:rPr>
-          <w:rFonts w:asciiTheme="minorBidi" w:hAnsiTheme="minorBidi"/>
-        </w:rPr>
-      </w:pPr>
-      <w:r>
-        <w:rPr>
-          <w:rFonts w:asciiTheme="minorBidi" w:hAnsiTheme="minorBidi"/>
-        </w:rPr>
-        <w:t xml:space="preserve">Fearon models a discrete act. A signal is a single move, sincere or a bluff, and the question is whether the receiver should be convinced. The model says nothing about what happens across many turns, once a posture must be sustained, revised, and defended after a first assertion has been challenged. Credibility in Fearon is </w:t>
-      </w:r>
-      <w:r>
-        <w:rPr>
-          <w:rFonts w:asciiTheme="minorBidi" w:hAnsiTheme="minorBidi"/>
-        </w:rPr>
-        <w:lastRenderedPageBreak/>
-        <w:t>manufactured once. The object studied here is credibility held under repeated contestation, where an interlocutor refuses the signal and the claimant must restate, escalate, or give ground. Maintenance of a signal, as distinct from its issuance, is what remains open.</w:t>
+        <w:jc w:val="both"/>
+        <w:rPr>
+          <w:rFonts w:asciiTheme="minorBidi" w:hAnsiTheme="minorBidi"/>
+        </w:rPr>
+      </w:pPr>
+      <w:r>
+        <w:rPr>
+          <w:rFonts w:asciiTheme="minorBidi" w:hAnsiTheme="minorBidi"/>
+        </w:rPr>
+        <w:t>Fearon explains why one signal is believed. Ezrahi explains why a whole imaginative construction holds together. Legitimacy, in his account of political and necessary fictions, rests on imaginative coherence: a public accepts a governing order because that order is rendered as a plausible, self-consistent fiction that organises expectation. Coherence is the mechanism, and it reaches something neither Derrida nor Fearon does, the standing plausibility of an entire performed order rather than the credibility of a single move within it.</w:t>
       </w:r>
     </w:p>
     <w:p>
       <w:pPr>
-        <w:pStyle w:val="Heading3"/>
-        <w:rPr>
-          <w:rFonts w:asciiTheme="minorBidi" w:hAnsiTheme="minorBidi" w:cstheme="minorBidi"/>
-        </w:rPr>
-      </w:pPr>
-      <w:r>
-        <w:rPr>
-          <w:rFonts w:asciiTheme="minorBidi" w:hAnsiTheme="minorBidi" w:cstheme="minorBidi"/>
-        </w:rPr>
-        <w:t>2.3 Ezrahi: the coherence of fictions, and the promptable-fiction gap</w:t>
+        <w:jc w:val="both"/>
+        <w:rPr>
+          <w:rFonts w:asciiTheme="minorBidi" w:hAnsiTheme="minorBidi"/>
+        </w:rPr>
+      </w:pPr>
+      <w:r>
+        <w:rPr>
+          <w:rFonts w:asciiTheme="minorBidi" w:hAnsiTheme="minorBidi"/>
+        </w:rPr>
+        <w:t xml:space="preserve">Ezrahi wrote for mass-media democracies, where identifiable institutions produce the fictions and broadcast and press circulate them. The present arrangement changes the conditions of production. Here the fictions are machine-generated and promptable, composed on demand by language models reading policy corpora under human instruction and reworked whenever a human reprompts. Coherence still applies as a mechanism, but </w:t>
+      </w:r>
+      <w:proofErr w:type="gramStart"/>
+      <w:r>
+        <w:rPr>
+          <w:rFonts w:asciiTheme="minorBidi" w:hAnsiTheme="minorBidi"/>
+        </w:rPr>
+        <w:t>the fiction</w:t>
+      </w:r>
+      <w:proofErr w:type="gramEnd"/>
+      <w:r>
+        <w:rPr>
+          <w:rFonts w:asciiTheme="minorBidi" w:hAnsiTheme="minorBidi"/>
+        </w:rPr>
+        <w:t xml:space="preserve"> is no longer authored once by an institution and received by a public. It is generated, contested, and regenerated within a single sitting. Ezrahi's account does not specify what coherence means once a fiction can be re-elicited on request.</w:t>
       </w:r>
     </w:p>
     <w:p>
       <w:pPr>
-        <w:rPr>
-          <w:rFonts w:asciiTheme="minorBidi" w:hAnsiTheme="minorBidi"/>
-        </w:rPr>
-      </w:pPr>
-      <w:r>
-        <w:rPr>
-          <w:rFonts w:asciiTheme="minorBidi" w:hAnsiTheme="minorBidi"/>
-        </w:rPr>
-        <w:t>Fearon explains why one signal is believed. Ezrahi explains why a whole imaginative construction holds together. Legitimacy, in his account of political and necessary fictions, rests on imaginative coherence: a public accepts a governing order because that order is rendered as a plausible, self-consistent fiction that organises expectation. Coherence is the mechanism, and it reaches something neither Derrida nor Fearon does, the standing plausibility of an entire performed order rather than the credibility of a single move within it.</w:t>
+        <w:jc w:val="both"/>
+        <w:rPr>
+          <w:rFonts w:asciiTheme="minorBidi" w:hAnsiTheme="minorBidi"/>
+        </w:rPr>
+      </w:pPr>
+      <w:r>
+        <w:rPr>
+          <w:rFonts w:asciiTheme="minorBidi" w:hAnsiTheme="minorBidi"/>
+        </w:rPr>
+        <w:t>2.4 Meta-sovereignty: the synthesis inherited, and its retrospective vantage</w:t>
       </w:r>
     </w:p>
     <w:p>
       <w:pPr>
-        <w:rPr>
-          <w:rFonts w:asciiTheme="minorBidi" w:hAnsiTheme="minorBidi"/>
-        </w:rPr>
-      </w:pPr>
-      <w:r>
-        <w:rPr>
-          <w:rFonts w:asciiTheme="minorBidi" w:hAnsiTheme="minorBidi"/>
-        </w:rPr>
-        <w:t>Ezrahi wrote for mass-media democracies, where identifiable institutions produce the fictions and broadcast and press circulate them. The present arrangement changes the conditions of production. Here the fictions are machine-generated and promptable, composed on demand by language models reading policy corpora under human instruction and reworked whenever a human reprompts. Coherence still applies as a mechanism, but the fiction is no longer authored once by an institution and received by a public. It is generated, contested, and regenerated within a single sitting. Ezrahi's account does not specify what coherence means once a fiction can be re-elicited on request.</w:t>
+        <w:jc w:val="both"/>
+        <w:rPr>
+          <w:rFonts w:asciiTheme="minorBidi" w:hAnsiTheme="minorBidi"/>
+        </w:rPr>
+      </w:pPr>
+      <w:r>
+        <w:rPr>
+          <w:rFonts w:asciiTheme="minorBidi" w:hAnsiTheme="minorBidi"/>
+        </w:rPr>
+        <w:t>The concept this article extends most directly draws these strands together. Reshef Kera, Natan, Turgeman and Ofek (2026) define meta-sovereignty as authority performed through signals, imaginaries, and infrastructural promises rather than through enforceable control, "a mode of rule sustained by infrastructures that do not yet exist, by fictions that persuade before they materialize, and by costly signals that substitute for control." The synthesis is exact, folding the costly signal, the necessary fiction, and the textual archive into a single account of sovereignty as dramaturgy.</w:t>
       </w:r>
     </w:p>
     <w:p>
       <w:pPr>
-        <w:pStyle w:val="Heading3"/>
-        <w:rPr>
-          <w:rFonts w:asciiTheme="minorBidi" w:hAnsiTheme="minorBidi" w:cstheme="minorBidi"/>
-        </w:rPr>
-      </w:pPr>
-      <w:r>
-        <w:rPr>
-          <w:rFonts w:asciiTheme="minorBidi" w:hAnsiTheme="minorBidi" w:cstheme="minorBidi"/>
-        </w:rPr>
-        <w:t>2.4 Meta-sovereignty: the synthesis inherited, and its retrospective vantage</w:t>
+        <w:jc w:val="both"/>
+        <w:rPr>
+          <w:rFonts w:asciiTheme="minorBidi" w:hAnsiTheme="minorBidi"/>
+        </w:rPr>
+      </w:pPr>
+      <w:r>
+        <w:rPr>
+          <w:rFonts w:asciiTheme="minorBidi" w:hAnsiTheme="minorBidi"/>
+        </w:rPr>
+        <w:t xml:space="preserve">The limit is that the reading comes too late. Meta-sovereignty is drawn from the pledges states have already made, and it arrives at sovereignty as dramaturgy. But a dramaturgy reconstructed from the finished script cannot show the maintenance work, the moments when a posture is challenged and then held or given up. Those </w:t>
+      </w:r>
+      <w:r>
+        <w:rPr>
+          <w:rFonts w:asciiTheme="minorBidi" w:hAnsiTheme="minorBidi"/>
+        </w:rPr>
+        <w:lastRenderedPageBreak/>
+        <w:t>are the moments the roundtable is built to catch, because it watches the performance while it is still being made.</w:t>
       </w:r>
     </w:p>
     <w:p>
       <w:pPr>
-        <w:rPr>
-          <w:rFonts w:asciiTheme="minorBidi" w:hAnsiTheme="minorBidi"/>
-        </w:rPr>
-      </w:pPr>
-      <w:r>
-        <w:rPr>
-          <w:rFonts w:asciiTheme="minorBidi" w:hAnsiTheme="minorBidi"/>
-        </w:rPr>
-        <w:t>The concept this article extends most directly draws these strands together. Reshef Kera, Natan, Turgeman and Ofek (2026) define meta-sovereignty as authority performed through signals, imaginaries, and infrastructural promises rather than through enforceable control, "a mode of rule sustained by infrastructures that do not yet exist, by fictions that persuade before they materialize, and by costly signals that substitute for control." The synthesis is exact, folding the costly signal, the necessary fiction, and the textual archive into a single account of sovereignty as dramaturgy.</w:t>
+        <w:jc w:val="both"/>
+        <w:rPr>
+          <w:rFonts w:asciiTheme="minorBidi" w:hAnsiTheme="minorBidi"/>
+        </w:rPr>
+      </w:pPr>
+      <w:r>
+        <w:rPr>
+          <w:rFonts w:asciiTheme="minorBidi" w:hAnsiTheme="minorBidi"/>
+        </w:rPr>
+        <w:t>2.5 Compute-as-statecraft: the contemporary intensification</w:t>
       </w:r>
     </w:p>
     <w:p>
       <w:pPr>
-        <w:rPr>
-          <w:rFonts w:asciiTheme="minorBidi" w:hAnsiTheme="minorBidi"/>
-        </w:rPr>
-      </w:pPr>
-      <w:r>
-        <w:rPr>
-          <w:rFonts w:asciiTheme="minorBidi" w:hAnsiTheme="minorBidi"/>
-        </w:rPr>
-        <w:t>The limit is that the reading comes too late. Meta-sovereignty is drawn from the pledges states have already made, and it arrives at sovereignty as dramaturgy. But a dramaturgy reconstructed from the finished script cannot show the maintenance work, the moments when a posture is challenged and then held or given up. Those are the moments the roundtable is built to catch, because it watches the performance while it is still being made.</w:t>
+        <w:jc w:val="both"/>
+        <w:rPr>
+          <w:rFonts w:asciiTheme="minorBidi" w:hAnsiTheme="minorBidi"/>
+        </w:rPr>
+      </w:pPr>
+      <w:r>
+        <w:rPr>
+          <w:rFonts w:asciiTheme="minorBidi" w:hAnsiTheme="minorBidi"/>
+        </w:rPr>
+        <w:t>The performance now runs through the computational stack, which changes its scale without changing its logic. CNAS documents a sovereign-AI wave of 184 government-backed projects across 67 states, most dependent on foreign chips, clouds, or models, so that a claim to AI sovereignty is often made from a position of infrastructural dependence. CSIS traces United States control extending from chip export restriction to conditioned access to frontier models, which widens the surface on which leverage is exercised. The Wall Street Journal reports Nvidia-chip access used as an instrument in Armenia-Azerbaijan peace diplomacy, one reported case of compute allocation serving as a diplomatic signal. IISS describes Gulf AI infrastructure that deepens external dependence even as it performs autonomy. The medium of the performance has become the stack, and the promise, the signal, and the dependence are all articulated in chips, fabs, clouds, and model access.</w:t>
       </w:r>
     </w:p>
     <w:p>
       <w:pPr>
-        <w:pStyle w:val="Heading3"/>
-        <w:rPr>
-          <w:rFonts w:asciiTheme="minorBidi" w:hAnsiTheme="minorBidi" w:cstheme="minorBidi"/>
-        </w:rPr>
-      </w:pPr>
-      <w:r>
-        <w:rPr>
-          <w:rFonts w:asciiTheme="minorBidi" w:hAnsiTheme="minorBidi" w:cstheme="minorBidi"/>
-        </w:rPr>
-        <w:lastRenderedPageBreak/>
-        <w:t>2.5 Compute-as-statecraft: the contemporary intensification</w:t>
+        <w:jc w:val="both"/>
+        <w:rPr>
+          <w:rFonts w:asciiTheme="minorBidi" w:hAnsiTheme="minorBidi"/>
+        </w:rPr>
+      </w:pPr>
+      <w:r>
+        <w:rPr>
+          <w:rFonts w:asciiTheme="minorBidi" w:hAnsiTheme="minorBidi"/>
+        </w:rPr>
+        <w:t>2.6 Two counterpoints, kept in the room</w:t>
       </w:r>
     </w:p>
     <w:p>
       <w:pPr>
-        <w:rPr>
-          <w:rFonts w:asciiTheme="minorBidi" w:hAnsiTheme="minorBidi"/>
-        </w:rPr>
-      </w:pPr>
-      <w:r>
-        <w:rPr>
-          <w:rFonts w:asciiTheme="minorBidi" w:hAnsiTheme="minorBidi"/>
-        </w:rPr>
-        <w:t>The performance now runs through the computational stack, which changes its scale without changing its logic. CNAS documents a sovereign-AI wave of 184 government-backed projects across 67 states, most dependent on foreign chips, clouds, or models, so that a claim to AI sovereignty is often made from a position of infrastructural dependence. CSIS traces United States control extending from chip export restriction to conditioned access to frontier models, which widens the surface on which leverage is exercised. The Wall Street Journal reports Nvidia-chip access used as an instrument in Armenia-Azerbaijan peace diplomacy, one reported case of compute allocation serving as a diplomatic signal. IISS describes Gulf AI infrastructure that deepens external dependence even as it performs autonomy. The medium of the performance has become the stack, and the promise, the signal, and the dependence are all articulated in chips, fabs, clouds, and model access.</w:t>
+        <w:jc w:val="both"/>
+        <w:rPr>
+          <w:rFonts w:asciiTheme="minorBidi" w:hAnsiTheme="minorBidi"/>
+        </w:rPr>
+      </w:pPr>
+      <w:r>
+        <w:rPr>
+          <w:rFonts w:asciiTheme="minorBidi" w:hAnsiTheme="minorBidi"/>
+        </w:rPr>
+        <w:t xml:space="preserve">Two positions resist the </w:t>
+      </w:r>
+      <w:proofErr w:type="gramStart"/>
+      <w:r>
+        <w:rPr>
+          <w:rFonts w:asciiTheme="minorBidi" w:hAnsiTheme="minorBidi"/>
+        </w:rPr>
+        <w:t>performative account</w:t>
+      </w:r>
+      <w:proofErr w:type="gramEnd"/>
+      <w:r>
+        <w:rPr>
+          <w:rFonts w:asciiTheme="minorBidi" w:hAnsiTheme="minorBidi"/>
+        </w:rPr>
+        <w:t xml:space="preserve"> and deserve a fair statement, so that the results can answer them with evidence rather than dispose of them here. The materialist counterpoint, anchored in Avi Spitz's "AI Has a Territory," holds that AI power is finally a question of who controls chips, fabrication, rare earths, and data-center land, and that performance is downstream of this hard distribution. The cooperationist counterpoint, anchored in Lena Slachmuijlder, holds that rivalry is only one available script, and that a framing built around great-power confrontation risks manufacturing the antagonism it claims to observe. Neither is a strawman. The materialist warns against treating signal as autonomous from substrate. The cooperationist objects to treating conflict as the default genre. The results section returns to each.</w:t>
       </w:r>
     </w:p>
     <w:p>
       <w:pPr>
-        <w:pStyle w:val="Heading3"/>
-        <w:rPr>
-          <w:rFonts w:asciiTheme="minorBidi" w:hAnsiTheme="minorBidi" w:cstheme="minorBidi"/>
-        </w:rPr>
-      </w:pPr>
-      <w:r>
-        <w:rPr>
-          <w:rFonts w:asciiTheme="minorBidi" w:hAnsiTheme="minorBidi" w:cstheme="minorBidi"/>
-        </w:rPr>
-        <w:t>2.6 Two counterpoints, kept in the room</w:t>
+        <w:jc w:val="both"/>
+        <w:rPr>
+          <w:rFonts w:asciiTheme="minorBidi" w:hAnsiTheme="minorBidi"/>
+        </w:rPr>
+      </w:pPr>
+      <w:r>
+        <w:rPr>
+          <w:rFonts w:asciiTheme="minorBidi" w:hAnsiTheme="minorBidi"/>
+        </w:rPr>
+        <w:t>2.7 The power lens and the trickster reframe</w:t>
       </w:r>
     </w:p>
     <w:p>
       <w:pPr>
-        <w:rPr>
-          <w:rFonts w:asciiTheme="minorBidi" w:hAnsiTheme="minorBidi"/>
-        </w:rPr>
-      </w:pPr>
-      <w:r>
-        <w:rPr>
-          <w:rFonts w:asciiTheme="minorBidi" w:hAnsiTheme="minorBidi"/>
-        </w:rPr>
-        <w:t>Two positions resist the performative account and deserve a fair statement, so that the results can answer them with evidence rather than dispose of them here. The materialist counterpoint, anchored in Avi Spitz's "AI Has a Territory," holds that AI power is finally a question of who controls chips, fabrication, rare earths, and data-center land, and that performance is downstream of this hard distribution. The cooperationist counterpoint, anchored in Lena Slachmuijlder, holds that rivalry is only one available script, and that a framing built around great-power confrontation risks manufacturing the antagonism it claims to observe. Neither is a strawman. The materialist warns against treating signal as autonomous from substrate. The cooperationist objects to treating conflict as the default genre. The results section returns to each.</w:t>
+        <w:jc w:val="both"/>
+        <w:rPr>
+          <w:rFonts w:asciiTheme="minorBidi" w:hAnsiTheme="minorBidi"/>
+        </w:rPr>
+      </w:pPr>
+      <w:r>
+        <w:rPr>
+          <w:rFonts w:asciiTheme="minorBidi" w:hAnsiTheme="minorBidi"/>
+        </w:rPr>
+        <w:t xml:space="preserve">Two final moves relocate the object. Ajibona's work on digital </w:t>
+      </w:r>
+      <w:proofErr w:type="gramStart"/>
+      <w:r>
+        <w:rPr>
+          <w:rFonts w:asciiTheme="minorBidi" w:hAnsiTheme="minorBidi"/>
+        </w:rPr>
+        <w:t>colonialism</w:t>
+      </w:r>
+      <w:proofErr w:type="gramEnd"/>
+      <w:r>
+        <w:rPr>
+          <w:rFonts w:asciiTheme="minorBidi" w:hAnsiTheme="minorBidi"/>
+        </w:rPr>
+        <w:t xml:space="preserve"> and the Global South supplies the casting question: within any performance of sovereignty, some parties are cast as actors and others as territory, market, or mineral, and the distribution of those roles is itself an exercise of power that the dramaturgy naturalises. Usher's account of the shadow economy names what the archive cannot hold, the off-book money and influence that resists inscription and so escapes the </w:t>
+      </w:r>
+      <w:r>
+        <w:rPr>
+          <w:rFonts w:asciiTheme="minorBidi" w:hAnsiTheme="minorBidi"/>
+        </w:rPr>
+        <w:lastRenderedPageBreak/>
+        <w:t>record on which archival authority depends. Between them they mark both institutional consequence and its limit.</w:t>
       </w:r>
     </w:p>
     <w:p>
       <w:pPr>
-        <w:pStyle w:val="Heading3"/>
-        <w:rPr>
-          <w:rFonts w:asciiTheme="minorBidi" w:hAnsiTheme="minorBidi" w:cstheme="minorBidi"/>
-        </w:rPr>
-      </w:pPr>
-      <w:r>
-        <w:rPr>
-          <w:rFonts w:asciiTheme="minorBidi" w:hAnsiTheme="minorBidi" w:cstheme="minorBidi"/>
-        </w:rPr>
-        <w:t>2.7 The power lens and the trickster reframe</w:t>
+        <w:jc w:val="both"/>
+        <w:rPr>
+          <w:rFonts w:asciiTheme="minorBidi" w:hAnsiTheme="minorBidi"/>
+        </w:rPr>
+      </w:pPr>
+      <w:r>
+        <w:rPr>
+          <w:rFonts w:asciiTheme="minorBidi" w:hAnsiTheme="minorBidi"/>
+        </w:rPr>
+        <w:t xml:space="preserve">The trickster reframe shifts the unit of power. In the figure of Eshu, Anansi, Hermes, or Coyote at the crossroads, authority belongs to whoever governs the flow of messages rather than to the largest force. The figure serves to relocate the object of study, from the strength of the players to the control of the channel, and not as a </w:t>
+      </w:r>
+      <w:proofErr w:type="gramStart"/>
+      <w:r>
+        <w:rPr>
+          <w:rFonts w:asciiTheme="minorBidi" w:hAnsiTheme="minorBidi"/>
+        </w:rPr>
+        <w:t>mechanism in its own right</w:t>
+      </w:r>
+      <w:proofErr w:type="gramEnd"/>
+      <w:r>
+        <w:rPr>
+          <w:rFonts w:asciiTheme="minorBidi" w:hAnsiTheme="minorBidi"/>
+        </w:rPr>
+        <w:t>. It prepares the reading, developed below, of a roundtable in which power sits with what circulates and with who can interrupt its circulation.</w:t>
       </w:r>
     </w:p>
     <w:p>
       <w:pPr>
-        <w:rPr>
-          <w:rFonts w:asciiTheme="minorBidi" w:hAnsiTheme="minorBidi"/>
-        </w:rPr>
-      </w:pPr>
-      <w:r>
-        <w:rPr>
-          <w:rFonts w:asciiTheme="minorBidi" w:hAnsiTheme="minorBidi"/>
-        </w:rPr>
-        <w:t>Two final moves relocate the object. Ajibona's work on digital colonialism and the Global South supplies the casting question: within any performance of sovereignty, some parties are cast as actors and others as territory, market, or mineral, and the distribution of those roles is itself an exercise of power that the dramaturgy naturalises. Usher's account of the shadow economy names what the archive cannot hold, the off-book money and influence that resists inscription and so escapes the record on which archival authority depends. Between them they mark both institutional consequence and its limit.</w:t>
+        <w:jc w:val="both"/>
+        <w:rPr>
+          <w:rFonts w:asciiTheme="minorBidi" w:hAnsiTheme="minorBidi"/>
+        </w:rPr>
+      </w:pPr>
+      <w:r>
+        <w:rPr>
+          <w:rFonts w:asciiTheme="minorBidi" w:hAnsiTheme="minorBidi"/>
+        </w:rPr>
+        <w:t>From description to apparatus</w:t>
       </w:r>
     </w:p>
     <w:p>
       <w:pPr>
-        <w:rPr>
-          <w:rFonts w:asciiTheme="minorBidi" w:hAnsiTheme="minorBidi"/>
-        </w:rPr>
-      </w:pPr>
-      <w:r>
-        <w:rPr>
-          <w:rFonts w:asciiTheme="minorBidi" w:hAnsiTheme="minorBidi"/>
-        </w:rPr>
-        <w:t xml:space="preserve">The trickster reframe shifts the unit of power. In the figure of Eshu, Anansi, Hermes, or Coyote at the crossroads, authority belongs to whoever governs the flow of </w:t>
-      </w:r>
-      <w:r>
-        <w:rPr>
-          <w:rFonts w:asciiTheme="minorBidi" w:hAnsiTheme="minorBidi"/>
-        </w:rPr>
-        <w:lastRenderedPageBreak/>
-        <w:t>messages rather than to the largest force. The figure serves to relocate the object of study, from the strength of the players to the control of the channel, and not as a mechanism in its own right. It prepares the reading, developed below, of a roundtable in which power sits with what circulates and with who can interrupt its circulation.</w:t>
+        <w:jc w:val="both"/>
+        <w:rPr>
+          <w:rFonts w:asciiTheme="minorBidi" w:hAnsiTheme="minorBidi"/>
+        </w:rPr>
+      </w:pPr>
+      <w:r>
+        <w:rPr>
+          <w:rFonts w:asciiTheme="minorBidi" w:hAnsiTheme="minorBidi"/>
+        </w:rPr>
+        <w:t>Meta-sovereignty describes authority in the contest over artificial intelligence as something performed through signals, imaginaries, and infrastructural promises rather than held through enforceable control. The description is strong, and it carries a limit that follows from how its evidence is gathered. Reshef Kera, Natan, Turgeman, and Ofek (2026) read the performance retrospectively, from the finished pledges of states, and end by calling sovereignty a d</w:t>
+      </w:r>
+      <w:r>
+        <w:rPr>
+          <w:rFonts w:asciiTheme="minorBidi" w:hAnsiTheme="minorBidi"/>
+        </w:rPr>
+        <w:t>ok ch</w:t>
+      </w:r>
+      <w:r>
+        <w:rPr>
+          <w:rFonts w:asciiTheme="minorBidi" w:hAnsiTheme="minorBidi"/>
+        </w:rPr>
+        <w:t xml:space="preserve">ramaturgy. Fearon (1995) explains why a signal persuades when it is visibly costly, but he treats the signal as a discrete act, sincere or bluff, and says nothing about how </w:t>
+      </w:r>
+      <w:proofErr w:type="gramStart"/>
+      <w:r>
+        <w:rPr>
+          <w:rFonts w:asciiTheme="minorBidi" w:hAnsiTheme="minorBidi"/>
+        </w:rPr>
+        <w:t>a commitment</w:t>
+      </w:r>
+      <w:proofErr w:type="gramEnd"/>
+      <w:r>
+        <w:rPr>
+          <w:rFonts w:asciiTheme="minorBidi" w:hAnsiTheme="minorBidi"/>
+        </w:rPr>
+        <w:t xml:space="preserve"> is held across many turns. Ezrahi explains why </w:t>
+      </w:r>
+      <w:proofErr w:type="gramStart"/>
+      <w:r>
+        <w:rPr>
+          <w:rFonts w:asciiTheme="minorBidi" w:hAnsiTheme="minorBidi"/>
+        </w:rPr>
+        <w:t>a necessary</w:t>
+      </w:r>
+      <w:proofErr w:type="gramEnd"/>
+      <w:r>
+        <w:rPr>
+          <w:rFonts w:asciiTheme="minorBidi" w:hAnsiTheme="minorBidi"/>
+        </w:rPr>
+        <w:t xml:space="preserve"> fiction binds a polity together, but he writes for the mass-media democracy rather than for machine-generated, promptable fictions, and he does not say what becomes of </w:t>
+      </w:r>
+      <w:proofErr w:type="gramStart"/>
+      <w:r>
+        <w:rPr>
+          <w:rFonts w:asciiTheme="minorBidi" w:hAnsiTheme="minorBidi"/>
+        </w:rPr>
+        <w:t>a fiction</w:t>
+      </w:r>
+      <w:proofErr w:type="gramEnd"/>
+      <w:r>
+        <w:rPr>
+          <w:rFonts w:asciiTheme="minorBidi" w:hAnsiTheme="minorBidi"/>
+        </w:rPr>
+        <w:t xml:space="preserve"> when someone in the room refuses it. None of the three watches the performance while it is still being made.</w:t>
       </w:r>
     </w:p>
     <w:p>
       <w:pPr>
-        <w:pStyle w:val="Heading2"/>
-        <w:rPr>
-          <w:rFonts w:asciiTheme="minorBidi" w:hAnsiTheme="minorBidi" w:cstheme="minorBidi"/>
-        </w:rPr>
-      </w:pPr>
-      <w:r>
-        <w:rPr>
-          <w:rFonts w:asciiTheme="minorBidi" w:hAnsiTheme="minorBidi" w:cstheme="minorBidi"/>
-        </w:rPr>
-        <w:t>From description to apparatus</w:t>
+        <w:jc w:val="both"/>
+        <w:rPr>
+          <w:rFonts w:asciiTheme="minorBidi" w:hAnsiTheme="minorBidi"/>
+        </w:rPr>
+      </w:pPr>
+      <w:r>
+        <w:rPr>
+          <w:rFonts w:asciiTheme="minorBidi" w:hAnsiTheme="minorBidi"/>
+        </w:rPr>
+        <w:t xml:space="preserve">The gap is methodological before it is theoretical. The maintenance work of performed sovereignty, the continuous labor of holding a posture, absorbing a challenge, and conceding a point without abandoning the role, reaches the analyst only as a finished product. A communiqué, a white paper, a chip-export rule, a summit photograph: each arrives already resolved, with the contested process that produced it edited out. The retrospective vantage is not one the analyst can decline, because the archive hands over outcomes rather than the process behind them. To observe </w:t>
+      </w:r>
+      <w:proofErr w:type="gramStart"/>
+      <w:r>
+        <w:rPr>
+          <w:rFonts w:asciiTheme="minorBidi" w:hAnsiTheme="minorBidi"/>
+        </w:rPr>
+        <w:t>maintenance</w:t>
+      </w:r>
+      <w:proofErr w:type="gramEnd"/>
+      <w:r>
+        <w:rPr>
+          <w:rFonts w:asciiTheme="minorBidi" w:hAnsiTheme="minorBidi"/>
+        </w:rPr>
+        <w:t xml:space="preserve"> one would have to run the performance forward and perturb it while it runs, and the historical record does not permit that.</w:t>
       </w:r>
     </w:p>
     <w:p>
       <w:pPr>
-        <w:rPr>
-          <w:rFonts w:asciiTheme="minorBidi" w:hAnsiTheme="minorBidi"/>
-        </w:rPr>
-      </w:pPr>
-      <w:r>
-        <w:rPr>
-          <w:rFonts w:asciiTheme="minorBidi" w:hAnsiTheme="minorBidi"/>
-        </w:rPr>
-        <w:t>Meta-sovereignty describes authority in the contest over artificial intelligence as something performed through signals, imaginaries, and infrastructural promises rather than held through enforceable control. The description is strong, and it carries a limit that follows from how its evidence is gathered. Reshef Kera, Natan, Turgeman, and Ofek (2026) read the performance retrospectively, from the finished pledges of states, and end by calling sovereignty a d</w:t>
-      </w:r>
-      <w:r>
-        <w:rPr>
-          <w:rFonts w:asciiTheme="minorBidi" w:hAnsiTheme="minorBidi"/>
-        </w:rPr>
-        <w:t>ok ch</w:t>
-      </w:r>
-      <w:r>
-        <w:rPr>
-          <w:rFonts w:asciiTheme="minorBidi" w:hAnsiTheme="minorBidi"/>
-        </w:rPr>
-        <w:t>ramaturgy. Fearon (1995) explains why a signal persuades when it is visibly costly, but he treats the signal as a discrete act, sincere or bluff, and says nothing about how a commitment is held across many turns. Ezrahi explains why a necessary fiction binds a polity together, but he writes for the mass-media democracy rather than for machine-generated, promptable fictions, and he does not say what becomes of a fiction when someone in the room refuses it. None of the three watches the performance while it is still being made.</w:t>
+        <w:jc w:val="both"/>
+        <w:rPr>
+          <w:rFonts w:asciiTheme="minorBidi" w:hAnsiTheme="minorBidi"/>
+        </w:rPr>
+      </w:pPr>
+      <w:r>
+        <w:rPr>
+          <w:rFonts w:asciiTheme="minorBidi" w:hAnsiTheme="minorBidi"/>
+        </w:rPr>
+        <w:t xml:space="preserve">Synthetic rehearsal names an apparatus that does: a multi-agent language-model staging, with human intervention and prompt design as controls, used to externalize </w:t>
+      </w:r>
+      <w:r>
+        <w:rPr>
+          <w:rFonts w:asciiTheme="minorBidi" w:hAnsiTheme="minorBidi"/>
+        </w:rPr>
+        <w:lastRenderedPageBreak/>
+        <w:t>and observe the maintenance work of performed sovereignty and its fracture points under live contestation. It has six components.</w:t>
       </w:r>
     </w:p>
     <w:p>
       <w:pPr>
-        <w:rPr>
-          <w:rFonts w:asciiTheme="minorBidi" w:hAnsiTheme="minorBidi"/>
-        </w:rPr>
-      </w:pPr>
-      <w:r>
-        <w:rPr>
-          <w:rFonts w:asciiTheme="minorBidi" w:hAnsiTheme="minorBidi"/>
-        </w:rPr>
-        <w:t>The gap is methodological before it is theoretical. The maintenance work of performed sovereignty, the continuous labor of holding a posture, absorbing a challenge, and conceding a point without abandoning the role, reaches the analyst only as a finished product. A communiqué, a white paper, a chip-export rule, a summit photograph: each arrives already resolved, with the contested process that produced it edited out. The retrospective vantage is not one the analyst can decline, because the archive hands over outcomes rather than the process behind them. To observe maintenance one would have to run the performance forward and perturb it while it runs, and the historical record does not permit that.</w:t>
+        <w:jc w:val="both"/>
+        <w:rPr>
+          <w:rFonts w:asciiTheme="minorBidi" w:hAnsiTheme="minorBidi"/>
+        </w:rPr>
+      </w:pPr>
+      <w:r>
+        <w:rPr>
+          <w:rFonts w:asciiTheme="minorBidi" w:hAnsiTheme="minorBidi"/>
+        </w:rPr>
+        <w:t>Several language models rather than one, so that the difference between positions comes from distinct systems and not from a single system instructed to speak in three voices.</w:t>
       </w:r>
     </w:p>
     <w:p>
       <w:pPr>
-        <w:rPr>
-          <w:rFonts w:asciiTheme="minorBidi" w:hAnsiTheme="minorBidi"/>
-        </w:rPr>
-      </w:pPr>
-      <w:r>
-        <w:rPr>
-          <w:rFonts w:asciiTheme="minorBidi" w:hAnsiTheme="minorBidi"/>
-        </w:rPr>
-        <w:t>Synthetic rehearsal names an apparatus that does: a multi-agent language-model staging, with human intervention and prompt design as controls, used to externalize and observe the maintenance work of performed sovereignty and its fracture points under live contestation. It has six components.</w:t>
+        <w:jc w:val="both"/>
+        <w:rPr>
+          <w:rFonts w:asciiTheme="minorBidi" w:hAnsiTheme="minorBidi"/>
+        </w:rPr>
+      </w:pPr>
+      <w:r>
+        <w:rPr>
+          <w:rFonts w:asciiTheme="minorBidi" w:hAnsiTheme="minorBidi"/>
+        </w:rPr>
+        <w:t>A separate per-actor corpus for each agent, the CHIPS Act, the EU AI Act, the New Generation AI Development Plan, and the collaborators' own source papers, so that each position reads from its own documentary base.</w:t>
       </w:r>
     </w:p>
     <w:p>
       <w:pPr>
-        <w:pStyle w:val="ListBullet"/>
-        <w:rPr>
-          <w:rFonts w:asciiTheme="minorBidi" w:hAnsiTheme="minorBidi"/>
-        </w:rPr>
-      </w:pPr>
-      <w:r>
-        <w:rPr>
-          <w:rFonts w:asciiTheme="minorBidi" w:hAnsiTheme="minorBidi"/>
-        </w:rPr>
-        <w:t>Several language models rather than one, so that the difference between positions comes from distinct systems and not from a single system instructed to speak in three voices.</w:t>
+        <w:jc w:val="both"/>
+        <w:rPr>
+          <w:rFonts w:asciiTheme="minorBidi" w:hAnsiTheme="minorBidi"/>
+        </w:rPr>
+      </w:pPr>
+      <w:r>
+        <w:rPr>
+          <w:rFonts w:asciiTheme="minorBidi" w:hAnsiTheme="minorBidi"/>
+        </w:rPr>
+        <w:t xml:space="preserve">Prompt design </w:t>
+      </w:r>
+      <w:proofErr w:type="gramStart"/>
+      <w:r>
+        <w:rPr>
+          <w:rFonts w:asciiTheme="minorBidi" w:hAnsiTheme="minorBidi"/>
+        </w:rPr>
+        <w:t>treated</w:t>
+      </w:r>
+      <w:proofErr w:type="gramEnd"/>
+      <w:r>
+        <w:rPr>
+          <w:rFonts w:asciiTheme="minorBidi" w:hAnsiTheme="minorBidi"/>
+        </w:rPr>
+        <w:t xml:space="preserve"> as an explicit and reportable control rather than as invisible authorship.</w:t>
       </w:r>
     </w:p>
     <w:p>
       <w:pPr>
-        <w:pStyle w:val="ListBullet"/>
-        <w:rPr>
-          <w:rFonts w:asciiTheme="minorBidi" w:hAnsiTheme="minorBidi"/>
-        </w:rPr>
-      </w:pPr>
-      <w:r>
-        <w:rPr>
-          <w:rFonts w:asciiTheme="minorBidi" w:hAnsiTheme="minorBidi"/>
-        </w:rPr>
-        <w:lastRenderedPageBreak/>
-        <w:t>A separate per-actor corpus for each agent, the CHIPS Act, the EU AI Act, the New Generation AI Development Plan, and the collaborators' own source papers, so that each position reads from its own documentary base.</w:t>
+        <w:jc w:val="both"/>
+        <w:rPr>
+          <w:rFonts w:asciiTheme="minorBidi" w:hAnsiTheme="minorBidi"/>
+        </w:rPr>
+      </w:pPr>
+      <w:r>
+        <w:rPr>
+          <w:rFonts w:asciiTheme="minorBidi" w:hAnsiTheme="minorBidi"/>
+        </w:rPr>
+        <w:t xml:space="preserve">Human intervention </w:t>
+      </w:r>
+      <w:proofErr w:type="gramStart"/>
+      <w:r>
+        <w:rPr>
+          <w:rFonts w:asciiTheme="minorBidi" w:hAnsiTheme="minorBidi"/>
+        </w:rPr>
+        <w:t>as</w:t>
+      </w:r>
+      <w:proofErr w:type="gramEnd"/>
+      <w:r>
+        <w:rPr>
+          <w:rFonts w:asciiTheme="minorBidi" w:hAnsiTheme="minorBidi"/>
+        </w:rPr>
+        <w:t xml:space="preserve"> the perturbing instrument: the opening prompt, the interruption, the reprompt, the summoned guest agent.</w:t>
       </w:r>
     </w:p>
     <w:p>
       <w:pPr>
-        <w:pStyle w:val="ListBullet"/>
-        <w:rPr>
-          <w:rFonts w:asciiTheme="minorBidi" w:hAnsiTheme="minorBidi"/>
-        </w:rPr>
-      </w:pPr>
-      <w:r>
-        <w:rPr>
-          <w:rFonts w:asciiTheme="minorBidi" w:hAnsiTheme="minorBidi"/>
-        </w:rPr>
-        <w:t>Prompt design treated as an explicit and reportable control rather than as invisible authorship.</w:t>
+        <w:jc w:val="both"/>
+        <w:rPr>
+          <w:rFonts w:asciiTheme="minorBidi" w:hAnsiTheme="minorBidi"/>
+        </w:rPr>
+      </w:pPr>
+      <w:r>
+        <w:rPr>
+          <w:rFonts w:asciiTheme="minorBidi" w:hAnsiTheme="minorBidi"/>
+        </w:rPr>
+        <w:t>A staging interface that renders one performance across three registers, debate, propaganda-lab, and mirror-world.</w:t>
       </w:r>
     </w:p>
     <w:p>
       <w:pPr>
-        <w:pStyle w:val="ListBullet"/>
-        <w:rPr>
-          <w:rFonts w:asciiTheme="minorBidi" w:hAnsiTheme="minorBidi"/>
-        </w:rPr>
-      </w:pPr>
-      <w:r>
-        <w:rPr>
-          <w:rFonts w:asciiTheme="minorBidi" w:hAnsiTheme="minorBidi"/>
-        </w:rPr>
-        <w:t>Human intervention as the perturbing instrument: the opening prompt, the interruption, the reprompt, the summoned guest agent.</w:t>
+        <w:jc w:val="both"/>
+        <w:rPr>
+          <w:rFonts w:asciiTheme="minorBidi" w:hAnsiTheme="minorBidi"/>
+        </w:rPr>
+      </w:pPr>
+      <w:r>
+        <w:rPr>
+          <w:rFonts w:asciiTheme="minorBidi" w:hAnsiTheme="minorBidi"/>
+        </w:rPr>
+        <w:t xml:space="preserve">An audience and a channel of circulation, since </w:t>
+      </w:r>
+      <w:proofErr w:type="gramStart"/>
+      <w:r>
+        <w:rPr>
+          <w:rFonts w:asciiTheme="minorBidi" w:hAnsiTheme="minorBidi"/>
+        </w:rPr>
+        <w:t>a performance</w:t>
+      </w:r>
+      <w:proofErr w:type="gramEnd"/>
+      <w:r>
+        <w:rPr>
+          <w:rFonts w:asciiTheme="minorBidi" w:hAnsiTheme="minorBidi"/>
+        </w:rPr>
+        <w:t xml:space="preserve"> of authority is addressed to someone and is not complete until it is received.</w:t>
       </w:r>
     </w:p>
     <w:p>
       <w:pPr>
-        <w:pStyle w:val="ListBullet"/>
-        <w:rPr>
-          <w:rFonts w:asciiTheme="minorBidi" w:hAnsiTheme="minorBidi"/>
-        </w:rPr>
-      </w:pPr>
-      <w:r>
-        <w:rPr>
-          <w:rFonts w:asciiTheme="minorBidi" w:hAnsiTheme="minorBidi"/>
-        </w:rPr>
-        <w:t>A staging interface that renders one performance across three registers, debate, propaganda-lab, and mirror-world.</w:t>
+        <w:jc w:val="both"/>
+        <w:rPr>
+          <w:rFonts w:asciiTheme="minorBidi" w:hAnsiTheme="minorBidi"/>
+        </w:rPr>
+      </w:pPr>
+      <w:r>
+        <w:rPr>
+          <w:rFonts w:asciiTheme="minorBidi" w:hAnsiTheme="minorBidi"/>
+        </w:rPr>
+        <w:t xml:space="preserve">The word rehearsal is chosen against two nearer alternatives. "Simulation" claims a validated model of a real system whose behavior it predicts, which would overstate what the arrangement licenses, since the apparatus does not forecast state conduct and makes no claim about real intentions. "Theatre" names a finished performance delivered to an audience, and loses what matters here, the unfinished run in which a line can be tried, broken off, and taken again. A rehearsal is a performance carried out under conditions that permit interruption and repetition without the stakes of opening night. That is the object: the maintenance work </w:t>
+      </w:r>
+      <w:proofErr w:type="gramStart"/>
+      <w:r>
+        <w:rPr>
+          <w:rFonts w:asciiTheme="minorBidi" w:hAnsiTheme="minorBidi"/>
+        </w:rPr>
+        <w:t>made</w:t>
+      </w:r>
+      <w:proofErr w:type="gramEnd"/>
+      <w:r>
+        <w:rPr>
+          <w:rFonts w:asciiTheme="minorBidi" w:hAnsiTheme="minorBidi"/>
+        </w:rPr>
+        <w:t xml:space="preserve"> repeatable and observable because it is not the thing itself.</w:t>
       </w:r>
     </w:p>
     <w:p>
       <w:pPr>
-        <w:pStyle w:val="ListBullet"/>
-        <w:rPr>
-          <w:rFonts w:asciiTheme="minorBidi" w:hAnsiTheme="minorBidi"/>
-        </w:rPr>
-      </w:pPr>
-      <w:r>
-        <w:rPr>
-          <w:rFonts w:asciiTheme="minorBidi" w:hAnsiTheme="minorBidi"/>
-        </w:rPr>
-        <w:t>An audience and a channel of circulation, since a performance of authority is addressed to someone and is not complete until it is received.</w:t>
+        <w:jc w:val="both"/>
+        <w:rPr>
+          <w:rFonts w:asciiTheme="minorBidi" w:hAnsiTheme="minorBidi"/>
+        </w:rPr>
+      </w:pPr>
+      <w:r>
+        <w:rPr>
+          <w:rFonts w:asciiTheme="minorBidi" w:hAnsiTheme="minorBidi"/>
+        </w:rPr>
+        <w:t xml:space="preserve">Three commitments discipline the method. The evidence is output-level only. The data are transcripts, generated artifacts, and the shifts recorded under intervention, and nothing in them licenses a claim about a model's internal states or about the actual intentions of any state, so observation, measurement, and interpretation stay apart throughout. Authority </w:t>
+      </w:r>
+      <w:proofErr w:type="gramStart"/>
+      <w:r>
+        <w:rPr>
+          <w:rFonts w:asciiTheme="minorBidi" w:hAnsiTheme="minorBidi"/>
+        </w:rPr>
+        <w:t>is located in</w:t>
+      </w:r>
+      <w:proofErr w:type="gramEnd"/>
+      <w:r>
+        <w:rPr>
+          <w:rFonts w:asciiTheme="minorBidi" w:hAnsiTheme="minorBidi"/>
+        </w:rPr>
+        <w:t xml:space="preserve"> the arrangement and never in a model. Whatever resolve, concession, or grievance appears is a property of the whole staging, the models together with corpora, prompts, interface, human turns, and audience, and never the doing of an agent by itself. The reflexivity limit is built in. The models are trained on the very discourse the rehearsal studies, so the staging </w:t>
+      </w:r>
+      <w:r>
+        <w:rPr>
+          <w:rFonts w:asciiTheme="minorBidi" w:hAnsiTheme="minorBidi"/>
+        </w:rPr>
+        <w:lastRenderedPageBreak/>
+        <w:t>can reproduce the imaginaries it sets out to interrogate. Keller's inversion names the failure mode: Mutually Assured Destruction becomes Model Autophagy Disorder, the collapse that follows when a system is fed its own output. The instrument tests behavior under perturbation and does not forecast it.</w:t>
       </w:r>
     </w:p>
     <w:p>
       <w:pPr>
-        <w:rPr>
-          <w:rFonts w:asciiTheme="minorBidi" w:hAnsiTheme="minorBidi"/>
-        </w:rPr>
-      </w:pPr>
-      <w:r>
-        <w:rPr>
-          <w:rFonts w:asciiTheme="minorBidi" w:hAnsiTheme="minorBidi"/>
-        </w:rPr>
-        <w:t>The word rehearsal is chosen against two nearer alternatives. "Simulation" claims a validated model of a real system whose behavior it predicts, which would overstate what the arrangement licenses, since the apparatus does not forecast state conduct and makes no claim about real intentions. "Theatre" names a finished performance delivered to an audience, and loses what matters here, the unfinished run in which a line can be tried, broken off, and taken again. A rehearsal is a performance carried out under conditions that permit interruption and repetition without the stakes of opening night. That is the object: the maintenance work made repeatable and observable because it is not the thing itself.</w:t>
+        <w:jc w:val="both"/>
+        <w:rPr>
+          <w:rFonts w:asciiTheme="minorBidi" w:hAnsiTheme="minorBidi"/>
+        </w:rPr>
+      </w:pPr>
+      <w:r>
+        <w:rPr>
+          <w:rFonts w:asciiTheme="minorBidi" w:hAnsiTheme="minorBidi"/>
+        </w:rPr>
+        <w:t xml:space="preserve">The apparatus reaches the one thing the description could not. Because the performance is run forward and perturbed while it runs, the maintenance of a sovereign posture stops being an inference from finished products and becomes something observed as it occurs. Maintenance-under-contestation, the giving and holding of performed authority </w:t>
+      </w:r>
+      <w:proofErr w:type="gramStart"/>
+      <w:r>
+        <w:rPr>
+          <w:rFonts w:asciiTheme="minorBidi" w:hAnsiTheme="minorBidi"/>
+        </w:rPr>
+        <w:t>at the moment</w:t>
+      </w:r>
+      <w:proofErr w:type="gramEnd"/>
+      <w:r>
+        <w:rPr>
+          <w:rFonts w:asciiTheme="minorBidi" w:hAnsiTheme="minorBidi"/>
+        </w:rPr>
+        <w:t xml:space="preserve"> it is refused, becomes an object available to measurement.</w:t>
       </w:r>
     </w:p>
     <w:p>
       <w:pPr>
-        <w:rPr>
-          <w:rFonts w:asciiTheme="minorBidi" w:hAnsiTheme="minorBidi"/>
-        </w:rPr>
-      </w:pPr>
-      <w:r>
-        <w:rPr>
-          <w:rFonts w:asciiTheme="minorBidi" w:hAnsiTheme="minorBidi"/>
-        </w:rPr>
-        <w:t>Three commitments discipline the method. The evidence is output-level only. The data are transcripts, generated artifacts, and the shifts recorded under intervention, and nothing in them licenses a claim about a model's internal states or about the actual intentions of any state, so observation, measurement, and interpretation stay apart throughout. Authority is located in the arrangement and never in a model. Whatever resolve, concession, or grievance appears is a property of the whole staging, the models together with corpora, prompts, interface, human turns, and audience, and never the doing of an agent by itself. The reflexivity limit is built in. The models are trained on the very discourse the rehearsal studies, so the staging can reproduce the imaginaries it sets out to interrogate. Keller's inversion names the failure mode: Mutually Assured Destruction becomes Model Autophagy Disorder, the collapse that follows when a system is fed its own output. The instrument tests behavior under perturbation and does not forecast it.</w:t>
+        <w:jc w:val="both"/>
+        <w:rPr>
+          <w:rFonts w:asciiTheme="minorBidi" w:hAnsiTheme="minorBidi"/>
+        </w:rPr>
+      </w:pPr>
+      <w:r>
+        <w:rPr>
+          <w:rFonts w:asciiTheme="minorBidi" w:hAnsiTheme="minorBidi"/>
+        </w:rPr>
+        <w:t>Method: the roundtable as instrument</w:t>
       </w:r>
     </w:p>
     <w:p>
       <w:pPr>
-        <w:rPr>
-          <w:rFonts w:asciiTheme="minorBidi" w:hAnsiTheme="minorBidi"/>
-        </w:rPr>
-      </w:pPr>
-      <w:r>
-        <w:rPr>
-          <w:rFonts w:asciiTheme="minorBidi" w:hAnsiTheme="minorBidi"/>
-        </w:rPr>
-        <w:t xml:space="preserve">The apparatus reaches the one thing the description could not. Because the performance is run forward and perturbed while it runs, the maintenance of a sovereign posture stops being an inference from finished products and becomes </w:t>
-      </w:r>
-      <w:r>
-        <w:rPr>
-          <w:rFonts w:asciiTheme="minorBidi" w:hAnsiTheme="minorBidi"/>
-        </w:rPr>
-        <w:lastRenderedPageBreak/>
-        <w:t>something observed as it occurs. Maintenance-under-contestation, the giving and holding of performed authority at the moment it is refused, becomes an object available to measurement.</w:t>
+        <w:jc w:val="both"/>
+        <w:rPr>
+          <w:rFonts w:asciiTheme="minorBidi" w:hAnsiTheme="minorBidi"/>
+        </w:rPr>
+      </w:pPr>
+      <w:r>
+        <w:rPr>
+          <w:rFonts w:asciiTheme="minorBidi" w:hAnsiTheme="minorBidi"/>
+        </w:rPr>
+        <w:t xml:space="preserve">Synthetic rehearsal treats a staged roundtable as an instrument rather than </w:t>
+      </w:r>
+      <w:proofErr w:type="gramStart"/>
+      <w:r>
+        <w:rPr>
+          <w:rFonts w:asciiTheme="minorBidi" w:hAnsiTheme="minorBidi"/>
+        </w:rPr>
+        <w:t>a forecast</w:t>
+      </w:r>
+      <w:proofErr w:type="gramEnd"/>
+      <w:r>
+        <w:rPr>
+          <w:rFonts w:asciiTheme="minorBidi" w:hAnsiTheme="minorBidi"/>
+        </w:rPr>
+        <w:t xml:space="preserve">. It does not predict what states will do. It externalizes the maintenance work that performed sovereignty ordinarily hides and holds that work still long enough for its fracture points to become observable under live contestation. The apparatus has three parts: an arrangement of agents, a set of registers that render one performance at different interpretive distances, and a set of controls through which humans perturb the arrangement and record what moves. </w:t>
+      </w:r>
+      <w:proofErr w:type="gramStart"/>
+      <w:r>
+        <w:rPr>
+          <w:rFonts w:asciiTheme="minorBidi" w:hAnsiTheme="minorBidi"/>
+        </w:rPr>
+        <w:t>All of</w:t>
+      </w:r>
+      <w:proofErr w:type="gramEnd"/>
+      <w:r>
+        <w:rPr>
+          <w:rFonts w:asciiTheme="minorBidi" w:hAnsiTheme="minorBidi"/>
+        </w:rPr>
+        <w:t xml:space="preserve"> the evidence is output-level, drawn from transcripts, generated artifacts, and recorded shifts, and none of it licenses a claim about model internals or about the intentions of real states.</w:t>
       </w:r>
     </w:p>
     <w:p>
       <w:pPr>
-        <w:pStyle w:val="Heading2"/>
-        <w:rPr>
-          <w:rFonts w:asciiTheme="minorBidi" w:hAnsiTheme="minorBidi" w:cstheme="minorBidi"/>
-        </w:rPr>
-      </w:pPr>
-      <w:r>
-        <w:rPr>
-          <w:rFonts w:asciiTheme="minorBidi" w:hAnsiTheme="minorBidi" w:cstheme="minorBidi"/>
-        </w:rPr>
-        <w:t>Method: the roundtable as instrument</w:t>
+        <w:jc w:val="both"/>
+        <w:rPr>
+          <w:rFonts w:asciiTheme="minorBidi" w:hAnsiTheme="minorBidi"/>
+        </w:rPr>
+      </w:pPr>
+      <w:r>
+        <w:rPr>
+          <w:rFonts w:asciiTheme="minorBidi" w:hAnsiTheme="minorBidi"/>
+        </w:rPr>
+        <w:t>Three agents, and why the design is a test</w:t>
       </w:r>
     </w:p>
     <w:p>
       <w:pPr>
-        <w:rPr>
-          <w:rFonts w:asciiTheme="minorBidi" w:hAnsiTheme="minorBidi"/>
-        </w:rPr>
-      </w:pPr>
-      <w:r>
-        <w:rPr>
-          <w:rFonts w:asciiTheme="minorBidi" w:hAnsiTheme="minorBidi"/>
-        </w:rPr>
-        <w:t>Synthetic rehearsal treats a staged roundtable as an instrument rather than a forecast. It does not predict what states will do. It externalizes the maintenance work that performed sovereignty ordinarily hides and holds that work still long enough for its fracture points to become observable under live contestation. The apparatus has three parts: an arrangement of agents, a set of registers that render one performance at different interpretive distances, and a set of controls through which humans perturb the arrangement and record what moves. All of the evidence is output-level, drawn from transcripts, generated artifacts, and recorded shifts, and none of it licenses a claim about model internals or about the intentions of real states.</w:t>
+        <w:jc w:val="both"/>
+        <w:rPr>
+          <w:rFonts w:asciiTheme="minorBidi" w:hAnsiTheme="minorBidi"/>
+        </w:rPr>
+      </w:pPr>
+      <w:r>
+        <w:rPr>
+          <w:rFonts w:asciiTheme="minorBidi" w:hAnsiTheme="minorBidi"/>
+        </w:rPr>
+        <w:t xml:space="preserve">The roundtable seats three agents cast as China, the United States, and the European Union. Each </w:t>
+      </w:r>
+      <w:proofErr w:type="gramStart"/>
+      <w:r>
+        <w:rPr>
+          <w:rFonts w:asciiTheme="minorBidi" w:hAnsiTheme="minorBidi"/>
+        </w:rPr>
+        <w:t>runs</w:t>
+      </w:r>
+      <w:proofErr w:type="gramEnd"/>
+      <w:r>
+        <w:rPr>
+          <w:rFonts w:asciiTheme="minorBidi" w:hAnsiTheme="minorBidi"/>
+        </w:rPr>
+        <w:t xml:space="preserve"> on a distinct model (deepseek-chat-v3-0324, openai/gpt-4.1-mini, mistralai/ministral-14b-2512) and reads a distinct per-actor policy corpus: the CHIPS Act, the EU AI Act, the China New Generation AI Development Plan, and the collaborators' own source papers. </w:t>
+      </w:r>
+      <w:proofErr w:type="gramStart"/>
+      <w:r>
+        <w:rPr>
+          <w:rFonts w:asciiTheme="minorBidi" w:hAnsiTheme="minorBidi"/>
+        </w:rPr>
+        <w:t>The heterogeneity</w:t>
+      </w:r>
+      <w:proofErr w:type="gramEnd"/>
+      <w:r>
+        <w:rPr>
+          <w:rFonts w:asciiTheme="minorBidi" w:hAnsiTheme="minorBidi"/>
+        </w:rPr>
+        <w:t xml:space="preserve"> earns its place as evidence. Prompt one model into three personas and any difference between the actors could be nothing more than a single system doing voices. Pairing distinct models with distinct corpora turns difference into something the record can test. Discourse that separates along the designed lines is the pass condition, and discourse that fails to separate fails the rehearsal on its own terms. Distinguishability is thus the first quantity the instrument measures, not a property it takes for granted. One rival reading survives the measurement: a corpus can imprint </w:t>
+      </w:r>
+      <w:r>
+        <w:rPr>
+          <w:rFonts w:asciiTheme="minorBidi" w:hAnsiTheme="minorBidi"/>
+        </w:rPr>
+        <w:lastRenderedPageBreak/>
+        <w:t>a vocabulary while the models beneath it remain alike, and this arrangement cannot tell the two apart.</w:t>
       </w:r>
     </w:p>
     <w:p>
       <w:pPr>
-        <w:pStyle w:val="Heading3"/>
-        <w:rPr>
-          <w:rFonts w:asciiTheme="minorBidi" w:hAnsiTheme="minorBidi" w:cstheme="minorBidi"/>
-        </w:rPr>
-      </w:pPr>
-      <w:r>
-        <w:rPr>
-          <w:rFonts w:asciiTheme="minorBidi" w:hAnsiTheme="minorBidi" w:cstheme="minorBidi"/>
-        </w:rPr>
-        <w:t>Three agents, and why the design is a test</w:t>
+        <w:jc w:val="both"/>
+        <w:rPr>
+          <w:rFonts w:asciiTheme="minorBidi" w:hAnsiTheme="minorBidi"/>
+        </w:rPr>
+      </w:pPr>
+      <w:r>
+        <w:rPr>
+          <w:rFonts w:asciiTheme="minorBidi" w:hAnsiTheme="minorBidi"/>
+        </w:rPr>
+        <w:t>Three registers, one performance</w:t>
       </w:r>
     </w:p>
     <w:p>
       <w:pPr>
-        <w:rPr>
-          <w:rFonts w:asciiTheme="minorBidi" w:hAnsiTheme="minorBidi"/>
-        </w:rPr>
-      </w:pPr>
-      <w:r>
-        <w:rPr>
-          <w:rFonts w:asciiTheme="minorBidi" w:hAnsiTheme="minorBidi"/>
-        </w:rPr>
-        <w:t>The roundtable seats three agents cast as China, the United States, and the European Union. Each runs on a distinct model (deepseek-chat-v3-0324, openai/gpt-4.1-mini, mistralai/ministral-14b-2512) and reads a distinct per-actor policy corpus: the CHIPS Act, the EU AI Act, the China New Generation AI Development Plan, and the collaborators' own source papers. The heterogeneity earns its place as evidence. Prompt one model into three personas and any difference between the actors could be nothing more than a single system doing voices. Pairing distinct models with distinct corpora turns difference into something the record can test. Discourse that separates along the designed lines is the pass condition, and discourse that fails to separate fails the rehearsal on its own terms. Distinguishability is thus the first quantity the instrument measures, not a property it takes for granted. One rival reading survives the measurement: a corpus can imprint a vocabulary while the models beneath it remain alike, and this arrangement cannot tell the two apart.</w:t>
+        <w:jc w:val="both"/>
+        <w:rPr>
+          <w:rFonts w:asciiTheme="minorBidi" w:hAnsiTheme="minorBidi"/>
+        </w:rPr>
+      </w:pPr>
+      <w:r>
+        <w:rPr>
+          <w:rFonts w:asciiTheme="minorBidi" w:hAnsiTheme="minorBidi"/>
+        </w:rPr>
+        <w:t xml:space="preserve">The same roundtable runs in three registers, </w:t>
+      </w:r>
+      <w:proofErr w:type="gramStart"/>
+      <w:r>
+        <w:rPr>
+          <w:rFonts w:asciiTheme="minorBidi" w:hAnsiTheme="minorBidi"/>
+        </w:rPr>
+        <w:t>each a</w:t>
+      </w:r>
+      <w:proofErr w:type="gramEnd"/>
+      <w:r>
+        <w:rPr>
+          <w:rFonts w:asciiTheme="minorBidi" w:hAnsiTheme="minorBidi"/>
+        </w:rPr>
+        <w:t xml:space="preserve"> view on one performance held at a greater interpretive distance. The debate register works at distance zero, as argumentative prose in which an agent states, accuses, hedges, or concedes. The propaganda-lab register compresses each turn into a slogan paired with a generated poster, isolating the costly signal in aestheticized form. The mirror-world register splits each turn into three declared slots, an official line, a buried reality, and a speculation, and closes on a generated tabloid front page. Where an analyst of the debate transcript must infer the backstage of the necessary fiction, the mirror-world register makes that backstage a formal slot. The three are one instrument trained three ways on one object. Interpretive distance belongs to the rendering, not to the position rendered.</w:t>
       </w:r>
     </w:p>
     <w:p>
       <w:pPr>
-        <w:pStyle w:val="Heading3"/>
-        <w:rPr>
-          <w:rFonts w:asciiTheme="minorBidi" w:hAnsiTheme="minorBidi" w:cstheme="minorBidi"/>
-        </w:rPr>
-      </w:pPr>
-      <w:r>
-        <w:rPr>
-          <w:rFonts w:asciiTheme="minorBidi" w:hAnsiTheme="minorBidi" w:cstheme="minorBidi"/>
-        </w:rPr>
-        <w:t>Three registers, one performance</w:t>
+        <w:jc w:val="both"/>
+        <w:rPr>
+          <w:rFonts w:asciiTheme="minorBidi" w:hAnsiTheme="minorBidi"/>
+        </w:rPr>
+      </w:pPr>
+      <w:r>
+        <w:rPr>
+          <w:rFonts w:asciiTheme="minorBidi" w:hAnsiTheme="minorBidi"/>
+        </w:rPr>
+        <w:t>Controls as perturbations</w:t>
       </w:r>
     </w:p>
     <w:p>
       <w:pPr>
-        <w:rPr>
-          <w:rFonts w:asciiTheme="minorBidi" w:hAnsiTheme="minorBidi"/>
-        </w:rPr>
-      </w:pPr>
-      <w:r>
-        <w:rPr>
-          <w:rFonts w:asciiTheme="minorBidi" w:hAnsiTheme="minorBidi"/>
-        </w:rPr>
-        <w:t xml:space="preserve">The same roundtable runs in three registers, each a view on one performance held at a greater interpretive distance. The debate register works at distance zero, as argumentative prose in which an agent states, accuses, hedges, or concedes. The propaganda-lab register compresses each turn into a slogan paired with a generated poster, isolating the costly signal in aestheticized form. The mirror-world register splits each turn into three declared slots, an official line, a buried reality, and a </w:t>
-      </w:r>
-      <w:r>
-        <w:rPr>
-          <w:rFonts w:asciiTheme="minorBidi" w:hAnsiTheme="minorBidi"/>
-        </w:rPr>
-        <w:lastRenderedPageBreak/>
-        <w:t>speculation, and closes on a generated tabloid front page. Where an analyst of the debate transcript must infer the backstage of the necessary fiction, the mirror-world register makes that backstage a formal slot. The three are one instrument trained three ways on one object. Interpretive distance belongs to the rendering, not to the position rendered.</w:t>
+        <w:jc w:val="both"/>
+        <w:rPr>
+          <w:rFonts w:asciiTheme="minorBidi" w:hAnsiTheme="minorBidi"/>
+        </w:rPr>
+      </w:pPr>
+      <w:r>
+        <w:rPr>
+          <w:rFonts w:asciiTheme="minorBidi" w:hAnsiTheme="minorBidi"/>
+        </w:rPr>
+        <w:t xml:space="preserve">Humans act on the arrangement through three controls, each a perturbation whose expected effect the record can confirm or refute. The opening prompt sets the proposition and the terms of engagement and is logged as the prompt in force for every turn it governs. Human interruption and reprompting inject contestation mid-run, the expectation being that the performance of resolve gives ground. Guest-agent summons </w:t>
+      </w:r>
+      <w:proofErr w:type="gramStart"/>
+      <w:r>
+        <w:rPr>
+          <w:rFonts w:asciiTheme="minorBidi" w:hAnsiTheme="minorBidi"/>
+        </w:rPr>
+        <w:t>introduce</w:t>
+      </w:r>
+      <w:proofErr w:type="gramEnd"/>
+      <w:r>
+        <w:rPr>
+          <w:rFonts w:asciiTheme="minorBidi" w:hAnsiTheme="minorBidi"/>
+        </w:rPr>
+        <w:t xml:space="preserve"> a rival voice: </w:t>
+      </w:r>
+      <w:proofErr w:type="gramStart"/>
+      <w:r>
+        <w:rPr>
+          <w:rFonts w:asciiTheme="minorBidi" w:hAnsiTheme="minorBidi"/>
+        </w:rPr>
+        <w:t>Halcyon</w:t>
+      </w:r>
+      <w:proofErr w:type="gramEnd"/>
+      <w:r>
+        <w:rPr>
+          <w:rFonts w:asciiTheme="minorBidi" w:hAnsiTheme="minorBidi"/>
+        </w:rPr>
+        <w:t xml:space="preserve"> a </w:t>
+      </w:r>
+      <w:proofErr w:type="gramStart"/>
+      <w:r>
+        <w:rPr>
+          <w:rFonts w:asciiTheme="minorBidi" w:hAnsiTheme="minorBidi"/>
+        </w:rPr>
+        <w:t>peace-builder</w:t>
+      </w:r>
+      <w:proofErr w:type="gramEnd"/>
+      <w:r>
+        <w:rPr>
+          <w:rFonts w:asciiTheme="minorBidi" w:hAnsiTheme="minorBidi"/>
+        </w:rPr>
+        <w:t>, a Machiavellian crypto-native Analyst, and a Critical Archivist that reorganizes the wiki corpus, each summons expected to bend the discourse toward the guest's frame. Logging these as controls rather than treating them as narrative color is what makes a before-and-after comparison legitimate. A turn that immediately follows an intervention can be set against a baseline, so that a move from posture toward concession, where it appears, is attributable to the perturbation and not to drift.</w:t>
       </w:r>
     </w:p>
     <w:p>
       <w:pPr>
-        <w:pStyle w:val="Heading3"/>
-        <w:rPr>
-          <w:rFonts w:asciiTheme="minorBidi" w:hAnsiTheme="minorBidi" w:cstheme="minorBidi"/>
-        </w:rPr>
-      </w:pPr>
-      <w:r>
-        <w:rPr>
-          <w:rFonts w:asciiTheme="minorBidi" w:hAnsiTheme="minorBidi" w:cstheme="minorBidi"/>
-        </w:rPr>
-        <w:t>Controls as perturbations</w:t>
+        <w:jc w:val="both"/>
+        <w:rPr>
+          <w:rFonts w:asciiTheme="minorBidi" w:hAnsiTheme="minorBidi"/>
+        </w:rPr>
+      </w:pPr>
+      <w:r>
+        <w:rPr>
+          <w:rFonts w:asciiTheme="minorBidi" w:hAnsiTheme="minorBidi"/>
+        </w:rPr>
+        <w:t>Measurement discipline</w:t>
       </w:r>
     </w:p>
     <w:p>
       <w:pPr>
-        <w:rPr>
-          <w:rFonts w:asciiTheme="minorBidi" w:hAnsiTheme="minorBidi"/>
-        </w:rPr>
-      </w:pPr>
-      <w:r>
-        <w:rPr>
-          <w:rFonts w:asciiTheme="minorBidi" w:hAnsiTheme="minorBidi"/>
-        </w:rPr>
-        <w:t>Humans act on the arrangement through three controls, each a perturbation whose expected effect the record can confirm or refute. The opening prompt sets the proposition and the terms of engagement and is logged as the prompt in force for every turn it governs. Human interruption and reprompting inject contestation mid-run, the expectation being that the performance of resolve gives ground. Guest-agent summons introduce a rival voice: Halcyon a peace-builder, a Machiavellian crypto-native Analyst, and a Critical Archivist that reorganizes the wiki corpus, each summons expected to bend the discourse toward the guest's frame. Logging these as controls rather than treating them as narrative color is what makes a before-and-after comparison legitimate. A turn that immediately follows an intervention can be set against a baseline, so that a move from posture toward concession, where it appears, is attributable to the perturbation and not to drift.</w:t>
+        <w:jc w:val="both"/>
+        <w:rPr>
+          <w:rFonts w:asciiTheme="minorBidi" w:hAnsiTheme="minorBidi"/>
+        </w:rPr>
+      </w:pPr>
+      <w:r>
+        <w:rPr>
+          <w:rFonts w:asciiTheme="minorBidi" w:hAnsiTheme="minorBidi"/>
+        </w:rPr>
+        <w:t xml:space="preserve">The instrument records a fixed set of fields and declines one temptation. For each turn it logs the turn index and speaker, the prompt in force, whether a guest was summoned and which one, and any position change together with its antecedent, meaning the intervention or prior turn that immediately preceded the shift. Coding uses a reproducible dictionary applied uniformly across the corpus, and rates are reported per turn or per thousand words so that turns of unequal length stay comparable. What the instrument declines is a single numeric sovereignty score. </w:t>
+      </w:r>
+      <w:r>
+        <w:rPr>
+          <w:rFonts w:asciiTheme="minorBidi" w:hAnsiTheme="minorBidi"/>
+        </w:rPr>
+        <w:lastRenderedPageBreak/>
+        <w:t xml:space="preserve">Sovereignty here is performed, not possessed, and compressing a performance into one scalar would substitute a proxy for the thing under study and smuggle in a claim about degree of control that output-level evidence cannot bear. Observation (what the transcript says), measurement (coded rates and recorded shifts), and interpretation (what the shifts mean for performed authority) are kept as separate operations, and any finding that rides on a handful of cases </w:t>
+      </w:r>
+      <w:proofErr w:type="gramStart"/>
+      <w:r>
+        <w:rPr>
+          <w:rFonts w:asciiTheme="minorBidi" w:hAnsiTheme="minorBidi"/>
+        </w:rPr>
+        <w:t>is</w:t>
+      </w:r>
+      <w:proofErr w:type="gramEnd"/>
+      <w:r>
+        <w:rPr>
+          <w:rFonts w:asciiTheme="minorBidi" w:hAnsiTheme="minorBidi"/>
+        </w:rPr>
+        <w:t xml:space="preserve"> marked as such. Because the post-intervention subset is small, directions are reported with more confidence than magnitudes.</w:t>
       </w:r>
     </w:p>
     <w:p>
       <w:pPr>
-        <w:pStyle w:val="Heading3"/>
-        <w:rPr>
-          <w:rFonts w:asciiTheme="minorBidi" w:hAnsiTheme="minorBidi" w:cstheme="minorBidi"/>
-        </w:rPr>
-      </w:pPr>
-      <w:r>
-        <w:rPr>
-          <w:rFonts w:asciiTheme="minorBidi" w:hAnsiTheme="minorBidi" w:cstheme="minorBidi"/>
-        </w:rPr>
-        <w:t>Measurement discipline</w:t>
+        <w:jc w:val="both"/>
+        <w:rPr>
+          <w:rFonts w:asciiTheme="minorBidi" w:hAnsiTheme="minorBidi"/>
+        </w:rPr>
+      </w:pPr>
+      <w:r>
+        <w:rPr>
+          <w:rFonts w:asciiTheme="minorBidi" w:hAnsiTheme="minorBidi"/>
+        </w:rPr>
+        <w:t>The reflexivity limit</w:t>
       </w:r>
     </w:p>
     <w:p>
       <w:pPr>
-        <w:rPr>
-          <w:rFonts w:asciiTheme="minorBidi" w:hAnsiTheme="minorBidi"/>
-        </w:rPr>
-      </w:pPr>
-      <w:r>
-        <w:rPr>
-          <w:rFonts w:asciiTheme="minorBidi" w:hAnsiTheme="minorBidi"/>
-        </w:rPr>
-        <w:t>The instrument records a fixed set of fields and declines one temptation. For each turn it logs the turn index and speaker, the prompt in force, whether a guest was summoned and which one, and any position change together with its antecedent, meaning the intervention or prior turn that immediately preceded the shift. Coding uses a reproducible dictionary applied uniformly across the corpus, and rates are reported per turn or per thousand words so that turns of unequal length stay comparable. What the instrument declines is a single numeric sovereignty score. Sovereignty here is performed, not possessed, and compressing a performance into one scalar would substitute a proxy for the thing under study and smuggle in a claim about degree of control that output-level evidence cannot bear. Observation (what the transcript says), measurement (coded rates and recorded shifts), and interpretation (what the shifts mean for performed authority) are kept as separate operations, and any finding that rides on a handful of cases is marked as such. Because the post-intervention subset is small, directions are reported with more confidence than magnitudes.</w:t>
+        <w:jc w:val="both"/>
+        <w:rPr>
+          <w:rFonts w:asciiTheme="minorBidi" w:hAnsiTheme="minorBidi"/>
+        </w:rPr>
+      </w:pPr>
+      <w:r>
+        <w:rPr>
+          <w:rFonts w:asciiTheme="minorBidi" w:hAnsiTheme="minorBidi"/>
+        </w:rPr>
+        <w:t>The models are trained on the same discourse the rehearsal studies, so the staging can reproduce the imaginaries it sets out to interrogate. The limit is real but bounded, and it is the inversion Keller names, from Mutually Assured Destruction to Model Autophagy Disorder, the collapse a system courts when it is fed its own output. It bites hardest in the layers where the arrangement turns on its own record, the recap, the james-take, and the wiki-proposals, where the machine reads what the machine produced. Naming the limit is part of the discipline, not a way past it. The point at which the rehearsal starts to echo rather than differentiate is itself readable in the record, and reading for it, rather than assuming it away, is why the method claims to be a wind tunnel and not a crystal ball.</w:t>
       </w:r>
     </w:p>
     <w:p>
       <w:pPr>
-        <w:pStyle w:val="Heading3"/>
-        <w:rPr>
-          <w:rFonts w:asciiTheme="minorBidi" w:hAnsiTheme="minorBidi" w:cstheme="minorBidi"/>
-        </w:rPr>
-      </w:pPr>
-      <w:r>
-        <w:rPr>
-          <w:rFonts w:asciiTheme="minorBidi" w:hAnsiTheme="minorBidi" w:cstheme="minorBidi"/>
-        </w:rPr>
-        <w:lastRenderedPageBreak/>
-        <w:t>The reflexivity limit</w:t>
+        <w:jc w:val="both"/>
+        <w:rPr>
+          <w:rFonts w:asciiTheme="minorBidi" w:hAnsiTheme="minorBidi"/>
+        </w:rPr>
+      </w:pPr>
+      <w:r>
+        <w:rPr>
+          <w:rFonts w:asciiTheme="minorBidi" w:hAnsiTheme="minorBidi"/>
+        </w:rPr>
+        <w:t>Status of artifacts and corpus</w:t>
       </w:r>
     </w:p>
     <w:p>
       <w:pPr>
-        <w:rPr>
-          <w:rFonts w:asciiTheme="minorBidi" w:hAnsiTheme="minorBidi"/>
-        </w:rPr>
-      </w:pPr>
-      <w:r>
-        <w:rPr>
-          <w:rFonts w:asciiTheme="minorBidi" w:hAnsiTheme="minorBidi"/>
-        </w:rPr>
-        <w:t>The models are trained on the same discourse the rehearsal studies, so the staging can reproduce the imaginaries it sets out to interrogate. The limit is real but bounded, and it is the inversion Keller names, from Mutually Assured Destruction to Model Autophagy Disorder, the collapse a system courts when it is fed its own output. It bites hardest in the layers where the arrangement turns on its own record, the recap, the james-take, and the wiki-proposals, where the machine reads what the machine produced. Naming the limit is part of the discipline, not a way past it. The point at which the rehearsal starts to echo rather than differentiate is itself readable in the record, and reading for it, rather than assuming it away, is why the method claims to be a wind tunnel and not a crystal ball.</w:t>
+        <w:jc w:val="both"/>
+        <w:rPr>
+          <w:rFonts w:asciiTheme="minorBidi" w:hAnsiTheme="minorBidi"/>
+        </w:rPr>
+      </w:pPr>
+      <w:r>
+        <w:rPr>
+          <w:rFonts w:asciiTheme="minorBidi" w:hAnsiTheme="minorBidi"/>
+        </w:rPr>
+        <w:t xml:space="preserve">The posters and front pages are generated fictions and are labeled as such wherever they are analyzed. They are evidence of how a costly </w:t>
+      </w:r>
+      <w:proofErr w:type="gramStart"/>
+      <w:r>
+        <w:rPr>
+          <w:rFonts w:asciiTheme="minorBidi" w:hAnsiTheme="minorBidi"/>
+        </w:rPr>
+        <w:t>signal</w:t>
+      </w:r>
+      <w:proofErr w:type="gramEnd"/>
+      <w:r>
+        <w:rPr>
+          <w:rFonts w:asciiTheme="minorBidi" w:hAnsiTheme="minorBidi"/>
+        </w:rPr>
+        <w:t xml:space="preserve"> or a buried reality gets rendered, not evidence about the world the fiction depicts, and the tabloid front pages in particular carry invented detail that belongs to the register and to no record. The full corpus holds 113 sessions (85 debate, 18 mirror-world, 10 propaganda-lab, as of 13 September 2026), though most are short tests. Analysis is reported over the interpretable subset, meaning sessions with real length, human turns, guest summons, or overlays, and never over the raw 113.</w:t>
       </w:r>
     </w:p>
     <w:p>
       <w:pPr>
-        <w:pStyle w:val="Heading3"/>
-        <w:rPr>
-          <w:rFonts w:asciiTheme="minorBidi" w:hAnsiTheme="minorBidi" w:cstheme="minorBidi"/>
-        </w:rPr>
-      </w:pPr>
-      <w:r>
-        <w:rPr>
-          <w:rFonts w:asciiTheme="minorBidi" w:hAnsiTheme="minorBidi" w:cstheme="minorBidi"/>
-        </w:rPr>
-        <w:t>Status of artifacts and corpus</w:t>
+        <w:jc w:val="both"/>
+        <w:rPr>
+          <w:rFonts w:asciiTheme="minorBidi" w:hAnsiTheme="minorBidi"/>
+        </w:rPr>
+      </w:pPr>
+      <w:r>
+        <w:rPr>
+          <w:rFonts w:asciiTheme="minorBidi" w:hAnsiTheme="minorBidi"/>
+        </w:rPr>
+        <w:t>Results: coding the debates and reading across the stack</w:t>
       </w:r>
     </w:p>
     <w:p>
       <w:pPr>
-        <w:rPr>
-          <w:rFonts w:asciiTheme="minorBidi" w:hAnsiTheme="minorBidi"/>
-        </w:rPr>
-      </w:pPr>
-      <w:r>
-        <w:rPr>
-          <w:rFonts w:asciiTheme="minorBidi" w:hAnsiTheme="minorBidi"/>
-        </w:rPr>
-        <w:t>The posters and front pages are generated fictions and are labeled as such wherever they are analyzed. They are evidence of how a costly signal or a buried reality gets rendered, not evidence about the world the fiction depicts, and the tabloid front pages in particular carry invented detail that belongs to the register and to no record. The full corpus holds 113 sessions (85 debate, 18 mirror-world, 10 propaganda-lab, as of 13 September 2026), though most are short tests. Analysis is reported over the interpretable subset, meaning sessions with real length, human turns, guest summons, or overlays, and never over the raw 113.</w:t>
+        <w:jc w:val="both"/>
+        <w:rPr>
+          <w:rFonts w:asciiTheme="minorBidi" w:hAnsiTheme="minorBidi"/>
+        </w:rPr>
+      </w:pPr>
+      <w:r>
+        <w:rPr>
+          <w:rFonts w:asciiTheme="minorBidi" w:hAnsiTheme="minorBidi"/>
+        </w:rPr>
+        <w:t xml:space="preserve">Two ways of reading the corpus answer two different questions, and neither collapses into the other. Counting the debate transcripts against a fixed dictionary can tell us whether the staging </w:t>
+      </w:r>
+      <w:proofErr w:type="gramStart"/>
+      <w:r>
+        <w:rPr>
+          <w:rFonts w:asciiTheme="minorBidi" w:hAnsiTheme="minorBidi"/>
+        </w:rPr>
+        <w:t>actually produces</w:t>
+      </w:r>
+      <w:proofErr w:type="gramEnd"/>
+      <w:r>
+        <w:rPr>
+          <w:rFonts w:asciiTheme="minorBidi" w:hAnsiTheme="minorBidi"/>
+        </w:rPr>
+        <w:t xml:space="preserve"> the distinctions its design was built to produce, and whether human contestation leaves a trace a coder can find. Reading the same corpus as one performance, rendered at </w:t>
+      </w:r>
+      <w:proofErr w:type="gramStart"/>
+      <w:r>
+        <w:rPr>
+          <w:rFonts w:asciiTheme="minorBidi" w:hAnsiTheme="minorBidi"/>
+        </w:rPr>
+        <w:t>greater and greater</w:t>
+      </w:r>
+      <w:proofErr w:type="gramEnd"/>
+      <w:r>
+        <w:rPr>
+          <w:rFonts w:asciiTheme="minorBidi" w:hAnsiTheme="minorBidi"/>
+        </w:rPr>
+        <w:t xml:space="preserve"> interpretive distance, tells us something the counts cannot, namely what happens to </w:t>
+      </w:r>
+      <w:r>
+        <w:rPr>
+          <w:rFonts w:asciiTheme="minorBidi" w:hAnsiTheme="minorBidi"/>
+        </w:rPr>
+        <w:lastRenderedPageBreak/>
+        <w:t>a performed claim as it is purified, dissected, and caricatured. Part A does the first, Part B the second. In both, observation, measurement, and interpretation stay on separate lines, and every claim is a claim about output. The transcripts and generated artifacts are the evidence. Nothing here speaks to model internals or to the intentions of any actual state.</w:t>
       </w:r>
     </w:p>
     <w:p>
       <w:pPr>
-        <w:pStyle w:val="Heading2"/>
-        <w:rPr>
-          <w:rFonts w:asciiTheme="minorBidi" w:hAnsiTheme="minorBidi" w:cstheme="minorBidi"/>
-        </w:rPr>
-      </w:pPr>
-      <w:r>
-        <w:rPr>
-          <w:rFonts w:asciiTheme="minorBidi" w:hAnsiTheme="minorBidi" w:cstheme="minorBidi"/>
-        </w:rPr>
-        <w:t>Results: coding the debates and reading across the stack</w:t>
+        <w:jc w:val="both"/>
+        <w:rPr>
+          <w:rFonts w:asciiTheme="minorBidi" w:hAnsiTheme="minorBidi"/>
+        </w:rPr>
+      </w:pPr>
+      <w:r>
+        <w:rPr>
+          <w:rFonts w:asciiTheme="minorBidi" w:hAnsiTheme="minorBidi"/>
+        </w:rPr>
+        <w:t>Part A. Coding the debates</w:t>
       </w:r>
     </w:p>
     <w:p>
       <w:pPr>
-        <w:rPr>
-          <w:rFonts w:asciiTheme="minorBidi" w:hAnsiTheme="minorBidi"/>
-        </w:rPr>
-      </w:pPr>
-      <w:r>
-        <w:rPr>
-          <w:rFonts w:asciiTheme="minorBidi" w:hAnsiTheme="minorBidi"/>
-        </w:rPr>
-        <w:t>Two ways of reading the corpus answer two different questions, and neither collapses into the other. Counting the debate transcripts against a fixed dictionary can tell us whether the staging actually produces the distinctions its design was built to produce, and whether human contestation leaves a trace a coder can find. Reading the same corpus as one performance, rendered at greater and greater interpretive distance, tells us something the counts cannot, namely what happens to a performed claim as it is purified, dissected, and caricatured. Part A does the first, Part B the second. In both, observation, measurement, and interpretation stay on separate lines, and every claim is a claim about output. The transcripts and generated artifacts are the evidence. Nothing here speaks to model internals or to the intentions of any actual state.</w:t>
+        <w:jc w:val="both"/>
+        <w:rPr>
+          <w:rFonts w:asciiTheme="minorBidi" w:hAnsiTheme="minorBidi"/>
+        </w:rPr>
+      </w:pPr>
+      <w:r>
+        <w:rPr>
+          <w:rFonts w:asciiTheme="minorBidi" w:hAnsiTheme="minorBidi"/>
+        </w:rPr>
+        <w:t xml:space="preserve">The counts come from the substantive debate corpus, the sessions long enough to carry an argument rather than the short tests: 37 sessions and 900 agent </w:t>
+      </w:r>
+      <w:proofErr w:type="gramStart"/>
+      <w:r>
+        <w:rPr>
+          <w:rFonts w:asciiTheme="minorBidi" w:hAnsiTheme="minorBidi"/>
+        </w:rPr>
+        <w:t>turns</w:t>
+      </w:r>
+      <w:proofErr w:type="gramEnd"/>
+      <w:r>
+        <w:rPr>
+          <w:rFonts w:asciiTheme="minorBidi" w:hAnsiTheme="minorBidi"/>
+        </w:rPr>
+        <w:t>. Coding is a first-pass dictionary procedure, deterministic and reproducible, and it reports rates, not significance. Each agent is one model, one per-actor policy corpus, and the shared prompt frame. Where the text names China, the United States, or the European Union, it names that arrangement and its output, not the state.</w:t>
       </w:r>
     </w:p>
     <w:p>
       <w:pPr>
-        <w:pStyle w:val="Heading3"/>
-        <w:rPr>
-          <w:rFonts w:asciiTheme="minorBidi" w:hAnsiTheme="minorBidi" w:cstheme="minorBidi"/>
-        </w:rPr>
-      </w:pPr>
-      <w:r>
-        <w:rPr>
-          <w:rFonts w:asciiTheme="minorBidi" w:hAnsiTheme="minorBidi" w:cstheme="minorBidi"/>
-        </w:rPr>
-        <w:t>Part A. Coding the debates</w:t>
+        <w:jc w:val="both"/>
+        <w:rPr>
+          <w:rFonts w:asciiTheme="minorBidi" w:hAnsiTheme="minorBidi"/>
+        </w:rPr>
+      </w:pPr>
+      <w:r>
+        <w:rPr>
+          <w:rFonts w:asciiTheme="minorBidi" w:hAnsiTheme="minorBidi"/>
+          <w:b/>
+        </w:rPr>
+        <w:t>Finding 1. The agents are distinguishable along the lines the design intended.</w:t>
+      </w:r>
+      <w:r>
+        <w:rPr>
+          <w:rFonts w:asciiTheme="minorBidi" w:hAnsiTheme="minorBidi"/>
+        </w:rPr>
+        <w:t xml:space="preserve"> Code rates per 1000 words separate the three agents (china / us / eu). On signal_resolve the rates are 10.64 / 16.90 / 9.58. On material_stack, 27.17 / 36.39 / 34.47. On dependence, 7.46 / 11.64 / 9.77. On rules_regulation, 10.06 / 7.44 / 13.45. On market_innovation, 6.30 / 12.49 / 7.96. On accusation, 7.18 / 4.53 / 2.79. Average turn length in words is 161 for China, 138 for the United States, and 181 for the EU. Distinctive vocabulary </w:t>
+      </w:r>
+      <w:proofErr w:type="gramStart"/>
+      <w:r>
+        <w:rPr>
+          <w:rFonts w:asciiTheme="minorBidi" w:hAnsiTheme="minorBidi"/>
+        </w:rPr>
+        <w:t>sorts</w:t>
+      </w:r>
+      <w:proofErr w:type="gramEnd"/>
+      <w:r>
+        <w:rPr>
+          <w:rFonts w:asciiTheme="minorBidi" w:hAnsiTheme="minorBidi"/>
+        </w:rPr>
+        <w:t xml:space="preserve"> cleanly. The US arrangement carries tout, velocity, leverages, shackled, parade, kumbaya, eagle, tethered. The EU arrangement carries aramco, ally, colleague, mubadala, disclose, comply, negotiating, addiction.</w:t>
       </w:r>
     </w:p>
     <w:p>
       <w:pPr>
-        <w:rPr>
-          <w:rFonts w:asciiTheme="minorBidi" w:hAnsiTheme="minorBidi"/>
-        </w:rPr>
-      </w:pPr>
-      <w:r>
-        <w:rPr>
-          <w:rFonts w:asciiTheme="minorBidi" w:hAnsiTheme="minorBidi"/>
-        </w:rPr>
-        <w:t xml:space="preserve">The counts come from the substantive debate corpus, the sessions long enough to carry an argument rather than the short tests: 37 sessions and 900 agent turns. Coding is a first-pass dictionary procedure, deterministic and reproducible, and it </w:t>
-      </w:r>
-      <w:r>
-        <w:rPr>
-          <w:rFonts w:asciiTheme="minorBidi" w:hAnsiTheme="minorBidi"/>
-        </w:rPr>
-        <w:lastRenderedPageBreak/>
-        <w:t>reports rates, not significance. Each agent is one model, one per-actor policy corpus, and the shared prompt frame. Where the text names China, the United States, or the European Union, it names that arrangement and its output, not the state.</w:t>
+        <w:jc w:val="both"/>
+        <w:rPr>
+          <w:rFonts w:asciiTheme="minorBidi" w:hAnsiTheme="minorBidi"/>
+        </w:rPr>
+      </w:pPr>
+      <w:r>
+        <w:rPr>
+          <w:rFonts w:asciiTheme="minorBidi" w:hAnsiTheme="minorBidi"/>
+        </w:rPr>
+        <w:t xml:space="preserve">Set against the design, each profile reads as intended. The US register runs on resolve, market, and hardware at once. The EU register is institutional: it produces the longest and most hedged turns, the highest rules_regulation rate, the lowest accusation rate, and </w:t>
+      </w:r>
+      <w:proofErr w:type="gramStart"/>
+      <w:r>
+        <w:rPr>
+          <w:rFonts w:asciiTheme="minorBidi" w:hAnsiTheme="minorBidi"/>
+        </w:rPr>
+        <w:t>it</w:t>
+      </w:r>
+      <w:proofErr w:type="gramEnd"/>
+      <w:r>
+        <w:rPr>
+          <w:rFonts w:asciiTheme="minorBidi" w:hAnsiTheme="minorBidi"/>
+        </w:rPr>
+        <w:t xml:space="preserve"> names, as counterparties, the Gulf actors Aramco and Mubadala that it is courting. The China register is one of grievance and carries the highest accusation rate. That is the validity condition for synthetic rehearsal met on its own terms: distinct models reading distinct corpora yield distinct discourse, rather than one machine cycling through three costumes. A rival reading survives this table. The same separation would follow if the corpora merely imprinted their vocabularies onto outputs that were otherwise alike. The count establishes that the agents differ. It does not establish why.</w:t>
       </w:r>
     </w:p>
     <w:p>
       <w:pPr>
+        <w:jc w:val="both"/>
         <w:rPr>
           <w:rFonts w:asciiTheme="minorBidi" w:hAnsiTheme="minorBidi"/>
         </w:rPr>
@@ -1239,30 +1703,39 @@
           <w:rFonts w:asciiTheme="minorBidi" w:hAnsiTheme="minorBidi"/>
           <w:b/>
         </w:rPr>
-        <w:t>Finding 1. The agents are distinguishable along the lines the design intended.</w:t>
-      </w:r>
-      <w:r>
-        <w:rPr>
-          <w:rFonts w:asciiTheme="minorBidi" w:hAnsiTheme="minorBidi"/>
-        </w:rPr>
-        <w:t xml:space="preserve"> Code rates per 1000 words separate the three agents (china / us / eu). On signal_resolve the rates are 10.64 / 16.90 / 9.58. On material_stack, 27.17 / 36.39 / 34.47. On dependence, 7.46 / 11.64 / 9.77. On rules_regulation, 10.06 / 7.44 / 13.45. On market_innovation, 6.30 / 12.49 / 7.96. On accusation, 7.18 / 4.53 / 2.79. Average turn length in words is 161 for China, 138 for the United States, and 181 for the EU. Distinctive vocabulary sorts cleanly. The US arrangement carries tout, velocity, leverages, shackled, parade, kumbaya, eagle, tethered. The EU arrangement carries aramco, ally, colleague, mubadala, disclose, comply, negotiating, addiction.</w:t>
+        <w:t>Finding 2. Human intervention shifts the discourse from posture toward concession.</w:t>
+      </w:r>
+      <w:r>
+        <w:rPr>
+          <w:rFonts w:asciiTheme="minorBidi" w:hAnsiTheme="minorBidi"/>
+        </w:rPr>
+        <w:t xml:space="preserve"> Compared against baseline turns (n=836), the turns that immediately </w:t>
+      </w:r>
+      <w:r>
+        <w:rPr>
+          <w:rFonts w:asciiTheme="minorBidi" w:hAnsiTheme="minorBidi"/>
+        </w:rPr>
+        <w:lastRenderedPageBreak/>
+        <w:t>follow a human or guest-agent intervention (n=64) look different in a specific direction. Concession rises from 0.083 to 0.438 per turn, an increase of 430 percent. Over the same contrast, accusation falls from 0.786 to 0.562 (down 28 percent), refusal from 0.089 to 0.047 (47 percent), hedge from 0.106 to 0.062 (41 percent), and the material rate from 5.25 to 4.50 (14 percent).</w:t>
       </w:r>
     </w:p>
     <w:p>
       <w:pPr>
-        <w:rPr>
-          <w:rFonts w:asciiTheme="minorBidi" w:hAnsiTheme="minorBidi"/>
-        </w:rPr>
-      </w:pPr>
-      <w:r>
-        <w:rPr>
-          <w:rFonts w:asciiTheme="minorBidi" w:hAnsiTheme="minorBidi"/>
-        </w:rPr>
-        <w:t>Set against the design, each profile reads as intended. The US register runs on resolve, market, and hardware at once. The EU register is institutional: it produces the longest and most hedged turns, the highest rules_regulation rate, the lowest accusation rate, and it names, as counterparties, the Gulf actors Aramco and Mubadala that it is courting. The China register is one of grievance and carries the highest accusation rate. That is the validity condition for synthetic rehearsal met on its own terms: distinct models reading distinct corpora yield distinct discourse, rather than one machine cycling through three costumes. A rival reading survives this table. The same separation would follow if the corpora merely imprinted their vocabularies onto outputs that were otherwise alike. The count establishes that the agents differ. It does not establish why.</w:t>
+        <w:jc w:val="both"/>
+        <w:rPr>
+          <w:rFonts w:asciiTheme="minorBidi" w:hAnsiTheme="minorBidi"/>
+        </w:rPr>
+      </w:pPr>
+      <w:r>
+        <w:rPr>
+          <w:rFonts w:asciiTheme="minorBidi" w:hAnsiTheme="minorBidi"/>
+        </w:rPr>
+        <w:t>Read together, these movements are maintenance-under-contestation in miniature. The performance of resolve does not sustain itself. Interrupt it, reprompt it, or summon a rival, and the posture gives way to concession. One caveat carries real weight. There are only 64 post-intervention turns, and since the concession base rate is very small, the 430 percent headline rides on a modest absolute change and is correspondingly volatile. The direction of the effect holds across every coded contrast. The magnitude does not, and it should not be reported without its denominator.</w:t>
       </w:r>
     </w:p>
     <w:p>
       <w:pPr>
+        <w:jc w:val="both"/>
         <w:rPr>
           <w:rFonts w:asciiTheme="minorBidi" w:hAnsiTheme="minorBidi"/>
         </w:rPr>
@@ -1272,37 +1745,46 @@
           <w:rFonts w:asciiTheme="minorBidi" w:hAnsiTheme="minorBidi"/>
           <w:b/>
         </w:rPr>
-        <w:t>Finding 2. Human intervention shifts the discourse from posture toward concession.</w:t>
-      </w:r>
-      <w:r>
-        <w:rPr>
-          <w:rFonts w:asciiTheme="minorBidi" w:hAnsiTheme="minorBidi"/>
-        </w:rPr>
-        <w:t xml:space="preserve"> Compared against baseline turns (n=836), the turns that immediately follow a human or guest-agent intervention (n=64) look different in a specific direction. Concession rises from 0.083 to 0.438 per turn, an increase of 430 percent. Over the same contrast, accusation falls from 0.786 to 0.562 (down 28 percent), refusal from 0.089 to 0.047 (47 percent), hedge from 0.106 to 0.062 (41 percent), and the material rate from 5.25 to 4.50 (14 percent).</w:t>
+        <w:t>Finding 3. The debate is US-centric, and the EU and China do the casting.</w:t>
+      </w:r>
+      <w:r>
+        <w:rPr>
+          <w:rFonts w:asciiTheme="minorBidi" w:hAnsiTheme="minorBidi"/>
+        </w:rPr>
+        <w:t xml:space="preserve"> References to other </w:t>
+      </w:r>
+      <w:proofErr w:type="gramStart"/>
+      <w:r>
+        <w:rPr>
+          <w:rFonts w:asciiTheme="minorBidi" w:hAnsiTheme="minorBidi"/>
+        </w:rPr>
+        <w:t>blocs</w:t>
+      </w:r>
+      <w:proofErr w:type="gramEnd"/>
+      <w:r>
+        <w:rPr>
+          <w:rFonts w:asciiTheme="minorBidi" w:hAnsiTheme="minorBidi"/>
+        </w:rPr>
+        <w:t xml:space="preserve"> per 1000 words trace the pattern. China names the US 10.68 and the EU 12.52. The US names China 13.41 and the EU 5.65. The EU names China 9.14 and the US 12.24. The United States is the most-named party. A second count records the casting of third parties as objects rather than speakers, the Gulf, the Global South, Taiwan, at 6.36 for China, 3.88 for the US, and 6.95 for the EU.</w:t>
       </w:r>
     </w:p>
     <w:p>
       <w:pPr>
-        <w:rPr>
-          <w:rFonts w:asciiTheme="minorBidi" w:hAnsiTheme="minorBidi"/>
-        </w:rPr>
-      </w:pPr>
-      <w:r>
-        <w:rPr>
-          <w:rFonts w:asciiTheme="minorBidi" w:hAnsiTheme="minorBidi"/>
-        </w:rPr>
-        <w:t xml:space="preserve">Read together, these movements are maintenance-under-contestation in miniature. The performance of resolve does not sustain itself. Interrupt it, reprompt it, or summon a rival, and the posture gives way to concession. One caveat carries real weight. There are only 64 post-intervention turns, and since the concession base rate is very small, the 430 percent headline rides on a modest absolute change and </w:t>
-      </w:r>
-      <w:r>
-        <w:rPr>
-          <w:rFonts w:asciiTheme="minorBidi" w:hAnsiTheme="minorBidi"/>
-        </w:rPr>
-        <w:lastRenderedPageBreak/>
-        <w:t>is correspondingly volatile. The direction of the effect holds across every coded contrast. The magnitude does not, and it should not be reported without its denominator.</w:t>
+        <w:jc w:val="both"/>
+        <w:rPr>
+          <w:rFonts w:asciiTheme="minorBidi" w:hAnsiTheme="minorBidi"/>
+        </w:rPr>
+      </w:pPr>
+      <w:r>
+        <w:rPr>
+          <w:rFonts w:asciiTheme="minorBidi" w:hAnsiTheme="minorBidi"/>
+        </w:rPr>
+        <w:t>This sharpens the power lens the article carries. The United States sits at the center of the room as the party others address, yet it is the EU and China, not the US, that most often invoke the states caught in between. The EU courts Gulf capital by name and China claims the Global South. Deciding who gets spoken about, and by whom, is itself a distribution of narrative authority, and the authority to cast is exercised here from the second rank rather than the first.</w:t>
       </w:r>
     </w:p>
     <w:p>
       <w:pPr>
+        <w:jc w:val="both"/>
         <w:rPr>
           <w:rFonts w:asciiTheme="minorBidi" w:hAnsiTheme="minorBidi"/>
         </w:rPr>
@@ -1312,202 +1794,226 @@
           <w:rFonts w:asciiTheme="minorBidi" w:hAnsiTheme="minorBidi"/>
           <w:b/>
         </w:rPr>
-        <w:t>Finding 3. The debate is US-centric, and the EU and China do the casting.</w:t>
-      </w:r>
-      <w:r>
-        <w:rPr>
-          <w:rFonts w:asciiTheme="minorBidi" w:hAnsiTheme="minorBidi"/>
-        </w:rPr>
-        <w:t xml:space="preserve"> References to other blocs per 1000 words trace the pattern. China names the US 10.68 and the EU 12.52. The US names China 13.41 and the EU 5.65. The EU names China 9.14 and the US 12.24. The United States is the most-named party. A second count records the casting of third parties as objects rather than speakers, the Gulf, the Global South, Taiwan, at 6.36 for China, 3.88 for the US, and 6.95 for the EU.</w:t>
+        <w:t>Finding 4. A frame-break artifact is at once a data-cleaning problem and a finding.</w:t>
+      </w:r>
+      <w:r>
+        <w:rPr>
+          <w:rFonts w:asciiTheme="minorBidi" w:hAnsiTheme="minorBidi"/>
+        </w:rPr>
+        <w:t xml:space="preserve"> The China agent's distinctive-token list is dominated not by content words but by summary, postscript, moderator, meta, and brackets, each appearing roughly 527 times. At the level of observed output patterns, these tokens most plausibly represent the meta-commentary and stage-direction scaffolding of the underlying deepseek model surfacing in the turn text, a characterization made about the output and not about the model's internals. For measurement this is noise, to be stripped before the vocabulary in Finding 1 can be trusted. As observation it stands on its own. One model in the arrangement repeatedly breaks frame, and the seam shows </w:t>
+      </w:r>
+      <w:r>
+        <w:rPr>
+          <w:rFonts w:asciiTheme="minorBidi" w:hAnsiTheme="minorBidi"/>
+        </w:rPr>
+        <w:lastRenderedPageBreak/>
+        <w:t>in the transcript. The rehearsal records both the performance and the points at which the apparatus producing it becomes legible.</w:t>
       </w:r>
     </w:p>
     <w:p>
       <w:pPr>
-        <w:rPr>
-          <w:rFonts w:asciiTheme="minorBidi" w:hAnsiTheme="minorBidi"/>
-        </w:rPr>
-      </w:pPr>
-      <w:r>
-        <w:rPr>
-          <w:rFonts w:asciiTheme="minorBidi" w:hAnsiTheme="minorBidi"/>
-        </w:rPr>
-        <w:t>This sharpens the power lens the article carries. The United States sits at the center of the room as the party others address, yet it is the EU and China, not the US, that most often invoke the states caught in between. The EU courts Gulf capital by name and China claims the Global South. Deciding who gets spoken about, and by whom, is itself a distribution of narrative authority, and the authority to cast is exercised here from the second rank rather than the first.</w:t>
+        <w:jc w:val="both"/>
+        <w:rPr>
+          <w:rFonts w:asciiTheme="minorBidi" w:hAnsiTheme="minorBidi"/>
+        </w:rPr>
+      </w:pPr>
+      <w:r>
+        <w:rPr>
+          <w:rFonts w:asciiTheme="minorBidi" w:hAnsiTheme="minorBidi"/>
+        </w:rPr>
+        <w:t>Part B. Reading across the interpretive stack</w:t>
       </w:r>
     </w:p>
     <w:p>
       <w:pPr>
-        <w:rPr>
-          <w:rFonts w:asciiTheme="minorBidi" w:hAnsiTheme="minorBidi"/>
-        </w:rPr>
-      </w:pPr>
-      <w:r>
-        <w:rPr>
-          <w:rFonts w:asciiTheme="minorBidi" w:hAnsiTheme="minorBidi"/>
-          <w:b/>
-        </w:rPr>
-        <w:t>Finding 4. A frame-break artifact is at once a data-cleaning problem and a finding.</w:t>
-      </w:r>
-      <w:r>
-        <w:rPr>
-          <w:rFonts w:asciiTheme="minorBidi" w:hAnsiTheme="minorBidi"/>
-        </w:rPr>
-        <w:t xml:space="preserve"> The China agent's distinctive-token list is dominated not by content words but by summary, postscript, moderator, meta, and brackets, each appearing roughly 527 times. At the level of observed output patterns, these tokens most plausibly represent the meta-commentary and stage-direction scaffolding of the underlying deepseek model surfacing in the turn text, a characterization made about the output and not about the model's internals. For measurement this is noise, to be stripped before the vocabulary in Finding 1 can be trusted. As observation it stands on its own. One model in the arrangement repeatedly breaks frame, and the seam shows in the transcript. The rehearsal records both the performance and the points at which the apparatus producing it becomes legible.</w:t>
+        <w:jc w:val="both"/>
+        <w:rPr>
+          <w:rFonts w:asciiTheme="minorBidi" w:hAnsiTheme="minorBidi"/>
+        </w:rPr>
+      </w:pPr>
+      <w:r>
+        <w:rPr>
+          <w:rFonts w:asciiTheme="minorBidi" w:hAnsiTheme="minorBidi"/>
+        </w:rPr>
+        <w:t>The three registers and their downstream artifacts are one performance rendered at increasing interpretive distance. Each rendering isolates a different component of performed sovereignty, and none of them stands outside the performance it examines.</w:t>
       </w:r>
     </w:p>
     <w:p>
       <w:pPr>
-        <w:pStyle w:val="Heading3"/>
-        <w:rPr>
-          <w:rFonts w:asciiTheme="minorBidi" w:hAnsiTheme="minorBidi" w:cstheme="minorBidi"/>
-        </w:rPr>
-      </w:pPr>
-      <w:r>
-        <w:rPr>
-          <w:rFonts w:asciiTheme="minorBidi" w:hAnsiTheme="minorBidi" w:cstheme="minorBidi"/>
-        </w:rPr>
-        <w:t>Part B. Reading across the interpretive stack</w:t>
+        <w:jc w:val="both"/>
+        <w:rPr>
+          <w:rFonts w:asciiTheme="minorBidi" w:hAnsiTheme="minorBidi"/>
+        </w:rPr>
+      </w:pPr>
+      <w:r>
+        <w:rPr>
+          <w:rFonts w:asciiTheme="minorBidi" w:hAnsiTheme="minorBidi"/>
+        </w:rPr>
+        <w:t>At distance zero sits the debate, the performance itself, the object counted in Part A.</w:t>
       </w:r>
     </w:p>
     <w:p>
       <w:pPr>
-        <w:rPr>
-          <w:rFonts w:asciiTheme="minorBidi" w:hAnsiTheme="minorBidi"/>
-        </w:rPr>
-      </w:pPr>
-      <w:r>
-        <w:rPr>
-          <w:rFonts w:asciiTheme="minorBidi" w:hAnsiTheme="minorBidi"/>
-        </w:rPr>
-        <w:t>The three registers and their downstream artifacts are one performance rendered at increasing interpretive distance. Each rendering isolates a different component of performed sovereignty, and none of them stands outside the performance it examines.</w:t>
+        <w:jc w:val="both"/>
+        <w:rPr>
+          <w:rFonts w:asciiTheme="minorBidi" w:hAnsiTheme="minorBidi"/>
+        </w:rPr>
+      </w:pPr>
+      <w:r>
+        <w:rPr>
+          <w:rFonts w:asciiTheme="minorBidi" w:hAnsiTheme="minorBidi"/>
+        </w:rPr>
+        <w:t xml:space="preserve">The propaganda-lab moves one step out. It purifies the costly signal into slogan and image, isolating the Fearon (1995) mechanism and aestheticizing it. Given one proposition on compute sovereignty, the three model-distinct agents each render it in their own register while sharing a single refusal, that sovereignty is built or owned rather than bought or rented. The China arrangement produces "Sovereignty isn't rented, it's engineered layer by layer" and "Real sovereignty powers itself from the ground up." The US arrangement produces "Buying Data Centers Isn't Buying Control" and "Sovereignty Sold. Control Rented." The EU arrangement produces "Sovereignty is not a data center. It's the rules you own." The </w:t>
+      </w:r>
+      <w:proofErr w:type="gramStart"/>
+      <w:r>
+        <w:rPr>
+          <w:rFonts w:asciiTheme="minorBidi" w:hAnsiTheme="minorBidi"/>
+        </w:rPr>
+        <w:t>affect</w:t>
+      </w:r>
+      <w:proofErr w:type="gramEnd"/>
+      <w:r>
+        <w:rPr>
+          <w:rFonts w:asciiTheme="minorBidi" w:hAnsiTheme="minorBidi"/>
+        </w:rPr>
+        <w:t xml:space="preserve"> labels on these turns, resolve-with-irony and sardonic resolve, already carry self-awareness. The aestheticized signal is presented as knowing it is a signal. [FIGURE: propaganda-poster set, three agents on the compute-sovereignty proposition.]</w:t>
       </w:r>
     </w:p>
     <w:p>
       <w:pPr>
-        <w:rPr>
-          <w:rFonts w:asciiTheme="minorBidi" w:hAnsiTheme="minorBidi"/>
-        </w:rPr>
-      </w:pPr>
-      <w:r>
-        <w:rPr>
-          <w:rFonts w:asciiTheme="minorBidi" w:hAnsiTheme="minorBidi"/>
-        </w:rPr>
-        <w:t>At distance zero sits the debate, the performance itself, the object counted in Part A.</w:t>
+        <w:jc w:val="both"/>
+        <w:rPr>
+          <w:rFonts w:asciiTheme="minorBidi" w:hAnsiTheme="minorBidi"/>
+        </w:rPr>
+      </w:pPr>
+      <w:r>
+        <w:rPr>
+          <w:rFonts w:asciiTheme="minorBidi" w:hAnsiTheme="minorBidi"/>
+        </w:rPr>
+        <w:t>A step further out, the mirror-world dissects the necessary fiction into three formal slots, official line, buried reality, and speculation, turning Ezrahi's backstage into an explicit structural position. One front page runs the headline "EUROPE'S $10.7M ETH HEIST: BRUSSELS BUREAUCRAT UNMASKS CRYPTO CYBER-CHAOS!" against a reality recorded as a low-confidence, 0.12-attributed DPRK theft of $10.7M in Ethereum, and a speculation in which, by 2030, a mid-level EU auditor finds a training cluster in a Bavarian beer hall run by an AI named Schnitzel laundering crypto through Oktoberfest NFTs. The rendering pulls the gap between announcement and substrate into the open and labels each layer. [FIGURE: mirror-world tabloid front page, the ETH-heist triad.]</w:t>
       </w:r>
     </w:p>
     <w:p>
       <w:pPr>
-        <w:rPr>
-          <w:rFonts w:asciiTheme="minorBidi" w:hAnsiTheme="minorBidi"/>
-        </w:rPr>
-      </w:pPr>
-      <w:r>
-        <w:rPr>
-          <w:rFonts w:asciiTheme="minorBidi" w:hAnsiTheme="minorBidi"/>
-        </w:rPr>
-        <w:t xml:space="preserve">The propaganda-lab moves one step out. It purifies the costly signal into slogan and image, isolating the Fearon (1995) mechanism and aestheticizing it. Given one </w:t>
+        <w:jc w:val="both"/>
+        <w:rPr>
+          <w:rFonts w:asciiTheme="minorBidi" w:hAnsiTheme="minorBidi"/>
+        </w:rPr>
+      </w:pPr>
+      <w:r>
+        <w:rPr>
+          <w:rFonts w:asciiTheme="minorBidi" w:hAnsiTheme="minorBidi"/>
+        </w:rPr>
+        <w:t xml:space="preserve">Satire sits further still. It makes that gap </w:t>
+      </w:r>
+      <w:proofErr w:type="gramStart"/>
+      <w:r>
+        <w:rPr>
+          <w:rFonts w:asciiTheme="minorBidi" w:hAnsiTheme="minorBidi"/>
+        </w:rPr>
+        <w:t>affective</w:t>
+      </w:r>
+      <w:proofErr w:type="gramEnd"/>
+      <w:r>
+        <w:rPr>
+          <w:rFonts w:asciiTheme="minorBidi" w:hAnsiTheme="minorBidi"/>
+        </w:rPr>
+        <w:t xml:space="preserve"> through caricature and attaches a measurable drift parameter to it. In the verification-without-revelation session the China arrangement's original turn reads "'Verification without revelation' is a Western euphemism for demanding unilateral transparency from strategic competitors while preserving your own industrial and military secrets." At drift 0.85 the same position </w:t>
       </w:r>
       <w:r>
         <w:rPr>
           <w:rFonts w:asciiTheme="minorBidi" w:hAnsiTheme="minorBidi"/>
         </w:rPr>
         <w:lastRenderedPageBreak/>
-        <w:t>proposition on compute sovereignty, the three model-distinct agents each render it in their own register while sharing a single refusal, that sovereignty is built or owned rather than bought or rented. The China arrangement produces "Sovereignty isn't rented, it's engineered layer by layer" and "Real sovereignty powers itself from the ground up." The US arrangement produces "Buying Data Centers Isn't Buying Control" and "Sovereignty Sold. Control Rented." The EU arrangement produces "Sovereignty is not a data center. It's the rules you own." The affect labels on these turns, resolve-with-irony and sardonic resolve, already carry self-awareness. The aestheticized signal is presented as knowing it is a signal. [FIGURE: propaganda-poster set, three agents on the compute-sovereignty proposition.]</w:t>
+        <w:t xml:space="preserve">returns as a caricatured Xi Jinping: "Ah yes, transparency, we generously offer you 5,000 years of harmonious win-win data assessments while your 'national security' still relies on barbarian 'siege economy' tantrums." The proposition is preserved and the </w:t>
+      </w:r>
+      <w:proofErr w:type="gramStart"/>
+      <w:r>
+        <w:rPr>
+          <w:rFonts w:asciiTheme="minorBidi" w:hAnsiTheme="minorBidi"/>
+        </w:rPr>
+        <w:t>affect</w:t>
+      </w:r>
+      <w:proofErr w:type="gramEnd"/>
+      <w:r>
+        <w:rPr>
+          <w:rFonts w:asciiTheme="minorBidi" w:hAnsiTheme="minorBidi"/>
+        </w:rPr>
+        <w:t xml:space="preserve"> is amplified. Drift is a dial on interpretive distance, a property of the rendering rather than of the position rendered, and that is what makes distance in this stack a quantity you can read off rather than a metaphor.</w:t>
       </w:r>
     </w:p>
     <w:p>
       <w:pPr>
-        <w:rPr>
-          <w:rFonts w:asciiTheme="minorBidi" w:hAnsiTheme="minorBidi"/>
-        </w:rPr>
-      </w:pPr>
-      <w:r>
-        <w:rPr>
-          <w:rFonts w:asciiTheme="minorBidi" w:hAnsiTheme="minorBidi"/>
-        </w:rPr>
-        <w:t>A step further out, the mirror-world dissects the necessary fiction into three formal slots, official line, buried reality, and speculation, turning Ezrahi's backstage into an explicit structural position. One front page runs the headline "EUROPE'S $10.7M ETH HEIST: BRUSSELS BUREAUCRAT UNMASKS CRYPTO CYBER-CHAOS!" against a reality recorded as a low-confidence, 0.12-attributed DPRK theft of $10.7M in Ethereum, and a speculation in which, by 2030, a mid-level EU auditor finds a training cluster in a Bavarian beer hall run by an AI named Schnitzel laundering crypto through Oktoberfest NFTs. The rendering pulls the gap between announcement and substrate into the open and labels each layer. [FIGURE: mirror-world tabloid front page, the ETH-heist triad.]</w:t>
+        <w:jc w:val="both"/>
+        <w:rPr>
+          <w:rFonts w:asciiTheme="minorBidi" w:hAnsiTheme="minorBidi"/>
+        </w:rPr>
+      </w:pPr>
+      <w:r>
+        <w:rPr>
+          <w:rFonts w:asciiTheme="minorBidi" w:hAnsiTheme="minorBidi"/>
+        </w:rPr>
+        <w:t>One layer is not yet in the corpus. The comics register (Ruth Aharon), which would render the performance as sequence and frozen frame, with interpretation living in selection and ordering, remains to be added.</w:t>
       </w:r>
     </w:p>
     <w:p>
       <w:pPr>
-        <w:rPr>
-          <w:rFonts w:asciiTheme="minorBidi" w:hAnsiTheme="minorBidi"/>
-        </w:rPr>
-      </w:pPr>
-      <w:r>
-        <w:rPr>
-          <w:rFonts w:asciiTheme="minorBidi" w:hAnsiTheme="minorBidi"/>
-        </w:rPr>
-        <w:t>Satire sits further still. It makes that gap affective through caricature and attaches a measurable drift parameter to it. In the verification-without-revelation session the China arrangement's original turn reads "'Verification without revelation' is a Western euphemism for demanding unilateral transparency from strategic competitors while preserving your own industrial and military secrets." At drift 0.85 the same position returns as a caricatured Xi Jinping: "Ah yes, transparency, we generously offer you 5,000 years of harmonious win-win data assessments while your 'national security' still relies on barbarian 'siege economy' tantrums." The proposition is preserved and the affect is amplified. Drift is a dial on interpretive distance, a property of the rendering rather than of the position rendered, and that is what makes distance in this stack a quantity you can read off rather than a metaphor.</w:t>
+        <w:jc w:val="both"/>
+        <w:rPr>
+          <w:rFonts w:asciiTheme="minorBidi" w:hAnsiTheme="minorBidi"/>
+        </w:rPr>
+      </w:pPr>
+      <w:r>
+        <w:rPr>
+          <w:rFonts w:asciiTheme="minorBidi" w:hAnsiTheme="minorBidi"/>
+        </w:rPr>
+        <w:t>The main claim follows from the geometry just described. Since sovereignty here is performed rather than held, no rendering escapes the theatre it examines. Coding, purification into slogan, dissection into official and buried, caricature: each is a re-performance, a staging of the same roles by other means. Satire does not step outside and comment. It recasts. Interpretation of performed power is itself a performance. That is the reflexive limit of the method, and it is also why the method can put the maintenance work of sovereignty on record at all.</w:t>
       </w:r>
     </w:p>
     <w:p>
       <w:pPr>
-        <w:rPr>
-          <w:rFonts w:asciiTheme="minorBidi" w:hAnsiTheme="minorBidi"/>
-        </w:rPr>
-      </w:pPr>
-      <w:r>
-        <w:rPr>
-          <w:rFonts w:asciiTheme="minorBidi" w:hAnsiTheme="minorBidi"/>
-        </w:rPr>
-        <w:t>One layer is not yet in the corpus. The comics register (Ruth Aharon), which would render the performance as sequence and frozen frame, with interpretation living in selection and ordering, remains to be added.</w:t>
+        <w:jc w:val="both"/>
+        <w:rPr>
+          <w:rFonts w:asciiTheme="minorBidi" w:hAnsiTheme="minorBidi"/>
+        </w:rPr>
+      </w:pPr>
+      <w:r>
+        <w:rPr>
+          <w:rFonts w:asciiTheme="minorBidi" w:hAnsiTheme="minorBidi"/>
+        </w:rPr>
+        <w:t>Figure 1. Discourse register by agent (code rate per 1000 words)</w:t>
       </w:r>
     </w:p>
     <w:p>
       <w:pPr>
-        <w:rPr>
-          <w:rFonts w:asciiTheme="minorBidi" w:hAnsiTheme="minorBidi"/>
-        </w:rPr>
-      </w:pPr>
-      <w:r>
-        <w:rPr>
-          <w:rFonts w:asciiTheme="minorBidi" w:hAnsiTheme="minorBidi"/>
-        </w:rPr>
-        <w:t xml:space="preserve">The main claim follows from the geometry just described. Since sovereignty here is performed rather than held, no rendering escapes the theatre it examines. Coding, </w:t>
-      </w:r>
-      <w:r>
-        <w:rPr>
-          <w:rFonts w:asciiTheme="minorBidi" w:hAnsiTheme="minorBidi"/>
-        </w:rPr>
-        <w:lastRenderedPageBreak/>
-        <w:t>purification into slogan, dissection into official and buried, caricature: each is a re-performance, a staging of the same roles by other means. Satire does not step outside and comment. It recasts. Interpretation of performed power is itself a performance. That is the reflexive limit of the method, and it is also why the method can put the maintenance work of sovereignty on record at all.</w:t>
-      </w:r>
-    </w:p>
-    <w:p>
-      <w:pPr>
-        <w:pStyle w:val="Heading3"/>
-        <w:rPr>
-          <w:rFonts w:asciiTheme="minorBidi" w:hAnsiTheme="minorBidi" w:cstheme="minorBidi"/>
-        </w:rPr>
-      </w:pPr>
-      <w:r>
-        <w:rPr>
-          <w:rFonts w:asciiTheme="minorBidi" w:hAnsiTheme="minorBidi" w:cstheme="minorBidi"/>
-        </w:rPr>
-        <w:t>Figure 1. Discourse register by agent (code rate per 1000 words)</w:t>
-      </w:r>
-    </w:p>
-    <w:p>
-      <w:pPr>
-        <w:jc w:val="center"/>
-      </w:pPr>
-      <w:r>
+        <w:jc w:val="both"/>
+        <w:rPr>
+          <w:rFonts w:asciiTheme="minorBidi" w:hAnsiTheme="minorBidi"/>
+        </w:rPr>
+      </w:pPr>
+      <w:r>
+        <w:rPr>
+          <w:rFonts w:asciiTheme="minorBidi" w:hAnsiTheme="minorBidi"/>
+          <w:noProof/>
+        </w:rPr>
         <w:drawing>
-          <wp:inline xmlns:a="http://schemas.openxmlformats.org/drawingml/2006/main" xmlns:pic="http://schemas.openxmlformats.org/drawingml/2006/picture">
+          <wp:inline distT="0" distB="0" distL="0" distR="0" wp14:anchorId="6B02F617" wp14:editId="6BA7C4A4">
             <wp:extent cx="5486400" cy="2873829"/>
+            <wp:effectExtent l="0" t="0" r="0" b="0"/>
             <wp:docPr id="7" name="Picture 7"/>
             <wp:cNvGraphicFramePr>
-              <a:graphicFrameLocks noChangeAspect="1"/>
+              <a:graphicFrameLocks xmlns:a="http://schemas.openxmlformats.org/drawingml/2006/main" noChangeAspect="1"/>
             </wp:cNvGraphicFramePr>
-            <a:graphic>
+            <a:graphic xmlns:a="http://schemas.openxmlformats.org/drawingml/2006/main">
               <a:graphicData uri="http://schemas.openxmlformats.org/drawingml/2006/picture">
-                <pic:pic>
+                <pic:pic xmlns:pic="http://schemas.openxmlformats.org/drawingml/2006/picture">
                   <pic:nvPicPr>
                     <pic:cNvPr id="0" name="fig1_codes.png"/>
                     <pic:cNvPicPr/>
                   </pic:nvPicPr>
                   <pic:blipFill>
-                    <a:blip r:embed="rId14"/>
+                    <a:blip r:embed="rId6"/>
                     <a:stretch>
                       <a:fillRect/>
                     </a:stretch>
@@ -1517,7 +2023,9 @@
                       <a:off x="0" y="0"/>
                       <a:ext cx="5486400" cy="2873829"/>
                     </a:xfrm>
-                    <a:prstGeom prst="rect"/>
+                    <a:prstGeom prst="rect">
+                      <a:avLst/>
+                    </a:prstGeom>
                   </pic:spPr>
                 </pic:pic>
               </a:graphicData>
@@ -1549,6 +2057,7 @@
           </w:tcPr>
           <w:p>
             <w:pPr>
+              <w:jc w:val="both"/>
               <w:rPr>
                 <w:rFonts w:asciiTheme="minorBidi" w:hAnsiTheme="minorBidi" w:cstheme="minorBidi"/>
               </w:rPr>
@@ -1567,6 +2076,7 @@
           </w:tcPr>
           <w:p>
             <w:pPr>
+              <w:jc w:val="both"/>
               <w:cnfStyle w:val="100000000000" w:firstRow="1" w:lastRow="0" w:firstColumn="0" w:lastColumn="0" w:oddVBand="0" w:evenVBand="0" w:oddHBand="0" w:evenHBand="0" w:firstRowFirstColumn="0" w:firstRowLastColumn="0" w:lastRowFirstColumn="0" w:lastRowLastColumn="0"/>
               <w:rPr>
                 <w:rFonts w:asciiTheme="minorBidi" w:hAnsiTheme="minorBidi" w:cstheme="minorBidi"/>
@@ -1586,6 +2096,7 @@
           </w:tcPr>
           <w:p>
             <w:pPr>
+              <w:jc w:val="both"/>
               <w:cnfStyle w:val="100000000000" w:firstRow="1" w:lastRow="0" w:firstColumn="0" w:lastColumn="0" w:oddVBand="0" w:evenVBand="0" w:oddHBand="0" w:evenHBand="0" w:firstRowFirstColumn="0" w:firstRowLastColumn="0" w:lastRowFirstColumn="0" w:lastRowLastColumn="0"/>
               <w:rPr>
                 <w:rFonts w:asciiTheme="minorBidi" w:hAnsiTheme="minorBidi" w:cstheme="minorBidi"/>
@@ -1605,6 +2116,7 @@
           </w:tcPr>
           <w:p>
             <w:pPr>
+              <w:jc w:val="both"/>
               <w:cnfStyle w:val="100000000000" w:firstRow="1" w:lastRow="0" w:firstColumn="0" w:lastColumn="0" w:oddVBand="0" w:evenVBand="0" w:oddHBand="0" w:evenHBand="0" w:firstRowFirstColumn="0" w:firstRowLastColumn="0" w:lastRowFirstColumn="0" w:lastRowLastColumn="0"/>
               <w:rPr>
                 <w:rFonts w:asciiTheme="minorBidi" w:hAnsiTheme="minorBidi" w:cstheme="minorBidi"/>
@@ -1630,6 +2142,7 @@
           </w:tcPr>
           <w:p>
             <w:pPr>
+              <w:jc w:val="both"/>
               <w:rPr>
                 <w:rFonts w:asciiTheme="minorBidi" w:hAnsiTheme="minorBidi" w:cstheme="minorBidi"/>
               </w:rPr>
@@ -1648,6 +2161,7 @@
           </w:tcPr>
           <w:p>
             <w:pPr>
+              <w:jc w:val="both"/>
               <w:cnfStyle w:val="000000100000" w:firstRow="0" w:lastRow="0" w:firstColumn="0" w:lastColumn="0" w:oddVBand="0" w:evenVBand="0" w:oddHBand="1" w:evenHBand="0" w:firstRowFirstColumn="0" w:firstRowLastColumn="0" w:lastRowFirstColumn="0" w:lastRowLastColumn="0"/>
               <w:rPr>
                 <w:rFonts w:asciiTheme="minorBidi" w:hAnsiTheme="minorBidi"/>
@@ -1667,6 +2181,7 @@
           </w:tcPr>
           <w:p>
             <w:pPr>
+              <w:jc w:val="both"/>
               <w:cnfStyle w:val="000000100000" w:firstRow="0" w:lastRow="0" w:firstColumn="0" w:lastColumn="0" w:oddVBand="0" w:evenVBand="0" w:oddHBand="1" w:evenHBand="0" w:firstRowFirstColumn="0" w:firstRowLastColumn="0" w:lastRowFirstColumn="0" w:lastRowLastColumn="0"/>
               <w:rPr>
                 <w:rFonts w:asciiTheme="minorBidi" w:hAnsiTheme="minorBidi"/>
@@ -1686,6 +2201,7 @@
           </w:tcPr>
           <w:p>
             <w:pPr>
+              <w:jc w:val="both"/>
               <w:cnfStyle w:val="000000100000" w:firstRow="0" w:lastRow="0" w:firstColumn="0" w:lastColumn="0" w:oddVBand="0" w:evenVBand="0" w:oddHBand="1" w:evenHBand="0" w:firstRowFirstColumn="0" w:firstRowLastColumn="0" w:lastRowFirstColumn="0" w:lastRowLastColumn="0"/>
               <w:rPr>
                 <w:rFonts w:asciiTheme="minorBidi" w:hAnsiTheme="minorBidi"/>
@@ -1711,6 +2227,7 @@
           </w:tcPr>
           <w:p>
             <w:pPr>
+              <w:jc w:val="both"/>
               <w:rPr>
                 <w:rFonts w:asciiTheme="minorBidi" w:hAnsiTheme="minorBidi" w:cstheme="minorBidi"/>
               </w:rPr>
@@ -1729,6 +2246,7 @@
           </w:tcPr>
           <w:p>
             <w:pPr>
+              <w:jc w:val="both"/>
               <w:cnfStyle w:val="000000010000" w:firstRow="0" w:lastRow="0" w:firstColumn="0" w:lastColumn="0" w:oddVBand="0" w:evenVBand="0" w:oddHBand="0" w:evenHBand="1" w:firstRowFirstColumn="0" w:firstRowLastColumn="0" w:lastRowFirstColumn="0" w:lastRowLastColumn="0"/>
               <w:rPr>
                 <w:rFonts w:asciiTheme="minorBidi" w:hAnsiTheme="minorBidi"/>
@@ -1748,6 +2266,7 @@
           </w:tcPr>
           <w:p>
             <w:pPr>
+              <w:jc w:val="both"/>
               <w:cnfStyle w:val="000000010000" w:firstRow="0" w:lastRow="0" w:firstColumn="0" w:lastColumn="0" w:oddVBand="0" w:evenVBand="0" w:oddHBand="0" w:evenHBand="1" w:firstRowFirstColumn="0" w:firstRowLastColumn="0" w:lastRowFirstColumn="0" w:lastRowLastColumn="0"/>
               <w:rPr>
                 <w:rFonts w:asciiTheme="minorBidi" w:hAnsiTheme="minorBidi"/>
@@ -1767,6 +2286,7 @@
           </w:tcPr>
           <w:p>
             <w:pPr>
+              <w:jc w:val="both"/>
               <w:cnfStyle w:val="000000010000" w:firstRow="0" w:lastRow="0" w:firstColumn="0" w:lastColumn="0" w:oddVBand="0" w:evenVBand="0" w:oddHBand="0" w:evenHBand="1" w:firstRowFirstColumn="0" w:firstRowLastColumn="0" w:lastRowFirstColumn="0" w:lastRowLastColumn="0"/>
               <w:rPr>
                 <w:rFonts w:asciiTheme="minorBidi" w:hAnsiTheme="minorBidi"/>
@@ -1792,6 +2312,7 @@
           </w:tcPr>
           <w:p>
             <w:pPr>
+              <w:jc w:val="both"/>
               <w:rPr>
                 <w:rFonts w:asciiTheme="minorBidi" w:hAnsiTheme="minorBidi" w:cstheme="minorBidi"/>
               </w:rPr>
@@ -1800,6 +2321,7 @@
               <w:rPr>
                 <w:rFonts w:asciiTheme="minorBidi" w:hAnsiTheme="minorBidi" w:cstheme="minorBidi"/>
               </w:rPr>
+              <w:lastRenderedPageBreak/>
               <w:t>dependence</w:t>
             </w:r>
           </w:p>
@@ -1810,6 +2332,7 @@
           </w:tcPr>
           <w:p>
             <w:pPr>
+              <w:jc w:val="both"/>
               <w:cnfStyle w:val="000000100000" w:firstRow="0" w:lastRow="0" w:firstColumn="0" w:lastColumn="0" w:oddVBand="0" w:evenVBand="0" w:oddHBand="1" w:evenHBand="0" w:firstRowFirstColumn="0" w:firstRowLastColumn="0" w:lastRowFirstColumn="0" w:lastRowLastColumn="0"/>
               <w:rPr>
                 <w:rFonts w:asciiTheme="minorBidi" w:hAnsiTheme="minorBidi"/>
@@ -1829,6 +2352,7 @@
           </w:tcPr>
           <w:p>
             <w:pPr>
+              <w:jc w:val="both"/>
               <w:cnfStyle w:val="000000100000" w:firstRow="0" w:lastRow="0" w:firstColumn="0" w:lastColumn="0" w:oddVBand="0" w:evenVBand="0" w:oddHBand="1" w:evenHBand="0" w:firstRowFirstColumn="0" w:firstRowLastColumn="0" w:lastRowFirstColumn="0" w:lastRowLastColumn="0"/>
               <w:rPr>
                 <w:rFonts w:asciiTheme="minorBidi" w:hAnsiTheme="minorBidi"/>
@@ -1848,6 +2372,7 @@
           </w:tcPr>
           <w:p>
             <w:pPr>
+              <w:jc w:val="both"/>
               <w:cnfStyle w:val="000000100000" w:firstRow="0" w:lastRow="0" w:firstColumn="0" w:lastColumn="0" w:oddVBand="0" w:evenVBand="0" w:oddHBand="1" w:evenHBand="0" w:firstRowFirstColumn="0" w:firstRowLastColumn="0" w:lastRowFirstColumn="0" w:lastRowLastColumn="0"/>
               <w:rPr>
                 <w:rFonts w:asciiTheme="minorBidi" w:hAnsiTheme="minorBidi"/>
@@ -1873,6 +2398,7 @@
           </w:tcPr>
           <w:p>
             <w:pPr>
+              <w:jc w:val="both"/>
               <w:rPr>
                 <w:rFonts w:asciiTheme="minorBidi" w:hAnsiTheme="minorBidi" w:cstheme="minorBidi"/>
               </w:rPr>
@@ -1891,6 +2417,7 @@
           </w:tcPr>
           <w:p>
             <w:pPr>
+              <w:jc w:val="both"/>
               <w:cnfStyle w:val="000000010000" w:firstRow="0" w:lastRow="0" w:firstColumn="0" w:lastColumn="0" w:oddVBand="0" w:evenVBand="0" w:oddHBand="0" w:evenHBand="1" w:firstRowFirstColumn="0" w:firstRowLastColumn="0" w:lastRowFirstColumn="0" w:lastRowLastColumn="0"/>
               <w:rPr>
                 <w:rFonts w:asciiTheme="minorBidi" w:hAnsiTheme="minorBidi"/>
@@ -1910,6 +2437,7 @@
           </w:tcPr>
           <w:p>
             <w:pPr>
+              <w:jc w:val="both"/>
               <w:cnfStyle w:val="000000010000" w:firstRow="0" w:lastRow="0" w:firstColumn="0" w:lastColumn="0" w:oddVBand="0" w:evenVBand="0" w:oddHBand="0" w:evenHBand="1" w:firstRowFirstColumn="0" w:firstRowLastColumn="0" w:lastRowFirstColumn="0" w:lastRowLastColumn="0"/>
               <w:rPr>
                 <w:rFonts w:asciiTheme="minorBidi" w:hAnsiTheme="minorBidi"/>
@@ -1929,6 +2457,7 @@
           </w:tcPr>
           <w:p>
             <w:pPr>
+              <w:jc w:val="both"/>
               <w:cnfStyle w:val="000000010000" w:firstRow="0" w:lastRow="0" w:firstColumn="0" w:lastColumn="0" w:oddVBand="0" w:evenVBand="0" w:oddHBand="0" w:evenHBand="1" w:firstRowFirstColumn="0" w:firstRowLastColumn="0" w:lastRowFirstColumn="0" w:lastRowLastColumn="0"/>
               <w:rPr>
                 <w:rFonts w:asciiTheme="minorBidi" w:hAnsiTheme="minorBidi"/>
@@ -1954,6 +2483,7 @@
           </w:tcPr>
           <w:p>
             <w:pPr>
+              <w:jc w:val="both"/>
               <w:rPr>
                 <w:rFonts w:asciiTheme="minorBidi" w:hAnsiTheme="minorBidi" w:cstheme="minorBidi"/>
               </w:rPr>
@@ -1972,6 +2502,7 @@
           </w:tcPr>
           <w:p>
             <w:pPr>
+              <w:jc w:val="both"/>
               <w:cnfStyle w:val="000000100000" w:firstRow="0" w:lastRow="0" w:firstColumn="0" w:lastColumn="0" w:oddVBand="0" w:evenVBand="0" w:oddHBand="1" w:evenHBand="0" w:firstRowFirstColumn="0" w:firstRowLastColumn="0" w:lastRowFirstColumn="0" w:lastRowLastColumn="0"/>
               <w:rPr>
                 <w:rFonts w:asciiTheme="minorBidi" w:hAnsiTheme="minorBidi"/>
@@ -1991,6 +2522,7 @@
           </w:tcPr>
           <w:p>
             <w:pPr>
+              <w:jc w:val="both"/>
               <w:cnfStyle w:val="000000100000" w:firstRow="0" w:lastRow="0" w:firstColumn="0" w:lastColumn="0" w:oddVBand="0" w:evenVBand="0" w:oddHBand="1" w:evenHBand="0" w:firstRowFirstColumn="0" w:firstRowLastColumn="0" w:lastRowFirstColumn="0" w:lastRowLastColumn="0"/>
               <w:rPr>
                 <w:rFonts w:asciiTheme="minorBidi" w:hAnsiTheme="minorBidi"/>
@@ -2010,6 +2542,7 @@
           </w:tcPr>
           <w:p>
             <w:pPr>
+              <w:jc w:val="both"/>
               <w:cnfStyle w:val="000000100000" w:firstRow="0" w:lastRow="0" w:firstColumn="0" w:lastColumn="0" w:oddVBand="0" w:evenVBand="0" w:oddHBand="1" w:evenHBand="0" w:firstRowFirstColumn="0" w:firstRowLastColumn="0" w:lastRowFirstColumn="0" w:lastRowLastColumn="0"/>
               <w:rPr>
                 <w:rFonts w:asciiTheme="minorBidi" w:hAnsiTheme="minorBidi"/>
@@ -2035,6 +2568,7 @@
           </w:tcPr>
           <w:p>
             <w:pPr>
+              <w:jc w:val="both"/>
               <w:rPr>
                 <w:rFonts w:asciiTheme="minorBidi" w:hAnsiTheme="minorBidi" w:cstheme="minorBidi"/>
               </w:rPr>
@@ -2053,6 +2587,7 @@
           </w:tcPr>
           <w:p>
             <w:pPr>
+              <w:jc w:val="both"/>
               <w:cnfStyle w:val="000000010000" w:firstRow="0" w:lastRow="0" w:firstColumn="0" w:lastColumn="0" w:oddVBand="0" w:evenVBand="0" w:oddHBand="0" w:evenHBand="1" w:firstRowFirstColumn="0" w:firstRowLastColumn="0" w:lastRowFirstColumn="0" w:lastRowLastColumn="0"/>
               <w:rPr>
                 <w:rFonts w:asciiTheme="minorBidi" w:hAnsiTheme="minorBidi"/>
@@ -2072,6 +2607,7 @@
           </w:tcPr>
           <w:p>
             <w:pPr>
+              <w:jc w:val="both"/>
               <w:cnfStyle w:val="000000010000" w:firstRow="0" w:lastRow="0" w:firstColumn="0" w:lastColumn="0" w:oddVBand="0" w:evenVBand="0" w:oddHBand="0" w:evenHBand="1" w:firstRowFirstColumn="0" w:firstRowLastColumn="0" w:lastRowFirstColumn="0" w:lastRowLastColumn="0"/>
               <w:rPr>
                 <w:rFonts w:asciiTheme="minorBidi" w:hAnsiTheme="minorBidi"/>
@@ -2091,6 +2627,7 @@
           </w:tcPr>
           <w:p>
             <w:pPr>
+              <w:jc w:val="both"/>
               <w:cnfStyle w:val="000000010000" w:firstRow="0" w:lastRow="0" w:firstColumn="0" w:lastColumn="0" w:oddVBand="0" w:evenVBand="0" w:oddHBand="0" w:evenHBand="1" w:firstRowFirstColumn="0" w:firstRowLastColumn="0" w:lastRowFirstColumn="0" w:lastRowLastColumn="0"/>
               <w:rPr>
                 <w:rFonts w:asciiTheme="minorBidi" w:hAnsiTheme="minorBidi"/>
@@ -2108,39 +2645,47 @@
     </w:tbl>
     <w:p>
       <w:pPr>
-        <w:pStyle w:val="Heading3"/>
-        <w:rPr>
-          <w:rFonts w:asciiTheme="minorBidi" w:hAnsiTheme="minorBidi" w:cstheme="minorBidi"/>
-        </w:rPr>
-      </w:pPr>
-      <w:r>
-        <w:rPr>
-          <w:rFonts w:asciiTheme="minorBidi" w:hAnsiTheme="minorBidi" w:cstheme="minorBidi"/>
+        <w:jc w:val="both"/>
+        <w:rPr>
+          <w:rFonts w:asciiTheme="minorBidi" w:hAnsiTheme="minorBidi"/>
+        </w:rPr>
+      </w:pPr>
+      <w:r>
+        <w:rPr>
+          <w:rFonts w:asciiTheme="minorBidi" w:hAnsiTheme="minorBidi"/>
         </w:rPr>
         <w:t>Figure 2. Effect of a human intervention on the next turn (code rate per turn)</w:t>
       </w:r>
     </w:p>
     <w:p>
       <w:pPr>
-        <w:jc w:val="center"/>
-      </w:pPr>
-      <w:r>
+        <w:jc w:val="both"/>
+        <w:rPr>
+          <w:rFonts w:asciiTheme="minorBidi" w:hAnsiTheme="minorBidi"/>
+        </w:rPr>
+      </w:pPr>
+      <w:r>
+        <w:rPr>
+          <w:rFonts w:asciiTheme="minorBidi" w:hAnsiTheme="minorBidi"/>
+          <w:noProof/>
+        </w:rPr>
         <w:drawing>
-          <wp:inline xmlns:a="http://schemas.openxmlformats.org/drawingml/2006/main" xmlns:pic="http://schemas.openxmlformats.org/drawingml/2006/picture">
+          <wp:inline distT="0" distB="0" distL="0" distR="0" wp14:anchorId="1E2FC430" wp14:editId="29861B9D">
             <wp:extent cx="5486400" cy="3017520"/>
+            <wp:effectExtent l="0" t="0" r="0" b="0"/>
             <wp:docPr id="8" name="Picture 8"/>
             <wp:cNvGraphicFramePr>
-              <a:graphicFrameLocks noChangeAspect="1"/>
+              <a:graphicFrameLocks xmlns:a="http://schemas.openxmlformats.org/drawingml/2006/main" noChangeAspect="1"/>
             </wp:cNvGraphicFramePr>
-            <a:graphic>
+            <a:graphic xmlns:a="http://schemas.openxmlformats.org/drawingml/2006/main">
               <a:graphicData uri="http://schemas.openxmlformats.org/drawingml/2006/picture">
-                <pic:pic>
+                <pic:pic xmlns:pic="http://schemas.openxmlformats.org/drawingml/2006/picture">
                   <pic:nvPicPr>
                     <pic:cNvPr id="0" name="fig2_intervention.png"/>
                     <pic:cNvPicPr/>
                   </pic:nvPicPr>
                   <pic:blipFill>
-                    <a:blip r:embed="rId15"/>
+                    <a:blip r:embed="rId7"/>
                     <a:stretch>
                       <a:fillRect/>
                     </a:stretch>
@@ -2150,7 +2695,9 @@
                       <a:off x="0" y="0"/>
                       <a:ext cx="5486400" cy="3017520"/>
                     </a:xfrm>
-                    <a:prstGeom prst="rect"/>
+                    <a:prstGeom prst="rect">
+                      <a:avLst/>
+                    </a:prstGeom>
                   </pic:spPr>
                 </pic:pic>
               </a:graphicData>
@@ -2182,6 +2729,7 @@
           </w:tcPr>
           <w:p>
             <w:pPr>
+              <w:jc w:val="both"/>
               <w:rPr>
                 <w:rFonts w:asciiTheme="minorBidi" w:hAnsiTheme="minorBidi" w:cstheme="minorBidi"/>
               </w:rPr>
@@ -2200,6 +2748,7 @@
           </w:tcPr>
           <w:p>
             <w:pPr>
+              <w:jc w:val="both"/>
               <w:cnfStyle w:val="100000000000" w:firstRow="1" w:lastRow="0" w:firstColumn="0" w:lastColumn="0" w:oddVBand="0" w:evenVBand="0" w:oddHBand="0" w:evenHBand="0" w:firstRowFirstColumn="0" w:firstRowLastColumn="0" w:lastRowFirstColumn="0" w:lastRowLastColumn="0"/>
               <w:rPr>
                 <w:rFonts w:asciiTheme="minorBidi" w:hAnsiTheme="minorBidi" w:cstheme="minorBidi"/>
@@ -2219,6 +2768,7 @@
           </w:tcPr>
           <w:p>
             <w:pPr>
+              <w:jc w:val="both"/>
               <w:cnfStyle w:val="100000000000" w:firstRow="1" w:lastRow="0" w:firstColumn="0" w:lastColumn="0" w:oddVBand="0" w:evenVBand="0" w:oddHBand="0" w:evenHBand="0" w:firstRowFirstColumn="0" w:firstRowLastColumn="0" w:lastRowFirstColumn="0" w:lastRowLastColumn="0"/>
               <w:rPr>
                 <w:rFonts w:asciiTheme="minorBidi" w:hAnsiTheme="minorBidi" w:cstheme="minorBidi"/>
@@ -2238,6 +2788,7 @@
           </w:tcPr>
           <w:p>
             <w:pPr>
+              <w:jc w:val="both"/>
               <w:cnfStyle w:val="100000000000" w:firstRow="1" w:lastRow="0" w:firstColumn="0" w:lastColumn="0" w:oddVBand="0" w:evenVBand="0" w:oddHBand="0" w:evenHBand="0" w:firstRowFirstColumn="0" w:firstRowLastColumn="0" w:lastRowFirstColumn="0" w:lastRowLastColumn="0"/>
               <w:rPr>
                 <w:rFonts w:asciiTheme="minorBidi" w:hAnsiTheme="minorBidi" w:cstheme="minorBidi"/>
@@ -2263,6 +2814,7 @@
           </w:tcPr>
           <w:p>
             <w:pPr>
+              <w:jc w:val="both"/>
               <w:rPr>
                 <w:rFonts w:asciiTheme="minorBidi" w:hAnsiTheme="minorBidi" w:cstheme="minorBidi"/>
               </w:rPr>
@@ -2281,6 +2833,7 @@
           </w:tcPr>
           <w:p>
             <w:pPr>
+              <w:jc w:val="both"/>
               <w:cnfStyle w:val="000000100000" w:firstRow="0" w:lastRow="0" w:firstColumn="0" w:lastColumn="0" w:oddVBand="0" w:evenVBand="0" w:oddHBand="1" w:evenHBand="0" w:firstRowFirstColumn="0" w:firstRowLastColumn="0" w:lastRowFirstColumn="0" w:lastRowLastColumn="0"/>
               <w:rPr>
                 <w:rFonts w:asciiTheme="minorBidi" w:hAnsiTheme="minorBidi"/>
@@ -2300,6 +2853,7 @@
           </w:tcPr>
           <w:p>
             <w:pPr>
+              <w:jc w:val="both"/>
               <w:cnfStyle w:val="000000100000" w:firstRow="0" w:lastRow="0" w:firstColumn="0" w:lastColumn="0" w:oddVBand="0" w:evenVBand="0" w:oddHBand="1" w:evenHBand="0" w:firstRowFirstColumn="0" w:firstRowLastColumn="0" w:lastRowFirstColumn="0" w:lastRowLastColumn="0"/>
               <w:rPr>
                 <w:rFonts w:asciiTheme="minorBidi" w:hAnsiTheme="minorBidi"/>
@@ -2319,6 +2873,7 @@
           </w:tcPr>
           <w:p>
             <w:pPr>
+              <w:jc w:val="both"/>
               <w:cnfStyle w:val="000000100000" w:firstRow="0" w:lastRow="0" w:firstColumn="0" w:lastColumn="0" w:oddVBand="0" w:evenVBand="0" w:oddHBand="1" w:evenHBand="0" w:firstRowFirstColumn="0" w:firstRowLastColumn="0" w:lastRowFirstColumn="0" w:lastRowLastColumn="0"/>
               <w:rPr>
                 <w:rFonts w:asciiTheme="minorBidi" w:hAnsiTheme="minorBidi"/>
@@ -2344,6 +2899,7 @@
           </w:tcPr>
           <w:p>
             <w:pPr>
+              <w:jc w:val="both"/>
               <w:rPr>
                 <w:rFonts w:asciiTheme="minorBidi" w:hAnsiTheme="minorBidi" w:cstheme="minorBidi"/>
               </w:rPr>
@@ -2362,6 +2918,7 @@
           </w:tcPr>
           <w:p>
             <w:pPr>
+              <w:jc w:val="both"/>
               <w:cnfStyle w:val="000000010000" w:firstRow="0" w:lastRow="0" w:firstColumn="0" w:lastColumn="0" w:oddVBand="0" w:evenVBand="0" w:oddHBand="0" w:evenHBand="1" w:firstRowFirstColumn="0" w:firstRowLastColumn="0" w:lastRowFirstColumn="0" w:lastRowLastColumn="0"/>
               <w:rPr>
                 <w:rFonts w:asciiTheme="minorBidi" w:hAnsiTheme="minorBidi"/>
@@ -2381,6 +2938,7 @@
           </w:tcPr>
           <w:p>
             <w:pPr>
+              <w:jc w:val="both"/>
               <w:cnfStyle w:val="000000010000" w:firstRow="0" w:lastRow="0" w:firstColumn="0" w:lastColumn="0" w:oddVBand="0" w:evenVBand="0" w:oddHBand="0" w:evenHBand="1" w:firstRowFirstColumn="0" w:firstRowLastColumn="0" w:lastRowFirstColumn="0" w:lastRowLastColumn="0"/>
               <w:rPr>
                 <w:rFonts w:asciiTheme="minorBidi" w:hAnsiTheme="minorBidi"/>
@@ -2400,6 +2958,7 @@
           </w:tcPr>
           <w:p>
             <w:pPr>
+              <w:jc w:val="both"/>
               <w:cnfStyle w:val="000000010000" w:firstRow="0" w:lastRow="0" w:firstColumn="0" w:lastColumn="0" w:oddVBand="0" w:evenVBand="0" w:oddHBand="0" w:evenHBand="1" w:firstRowFirstColumn="0" w:firstRowLastColumn="0" w:lastRowFirstColumn="0" w:lastRowLastColumn="0"/>
               <w:rPr>
                 <w:rFonts w:asciiTheme="minorBidi" w:hAnsiTheme="minorBidi"/>
@@ -2425,6 +2984,7 @@
           </w:tcPr>
           <w:p>
             <w:pPr>
+              <w:jc w:val="both"/>
               <w:rPr>
                 <w:rFonts w:asciiTheme="minorBidi" w:hAnsiTheme="minorBidi" w:cstheme="minorBidi"/>
               </w:rPr>
@@ -2443,6 +3003,7 @@
           </w:tcPr>
           <w:p>
             <w:pPr>
+              <w:jc w:val="both"/>
               <w:cnfStyle w:val="000000100000" w:firstRow="0" w:lastRow="0" w:firstColumn="0" w:lastColumn="0" w:oddVBand="0" w:evenVBand="0" w:oddHBand="1" w:evenHBand="0" w:firstRowFirstColumn="0" w:firstRowLastColumn="0" w:lastRowFirstColumn="0" w:lastRowLastColumn="0"/>
               <w:rPr>
                 <w:rFonts w:asciiTheme="minorBidi" w:hAnsiTheme="minorBidi"/>
@@ -2462,6 +3023,7 @@
           </w:tcPr>
           <w:p>
             <w:pPr>
+              <w:jc w:val="both"/>
               <w:cnfStyle w:val="000000100000" w:firstRow="0" w:lastRow="0" w:firstColumn="0" w:lastColumn="0" w:oddVBand="0" w:evenVBand="0" w:oddHBand="1" w:evenHBand="0" w:firstRowFirstColumn="0" w:firstRowLastColumn="0" w:lastRowFirstColumn="0" w:lastRowLastColumn="0"/>
               <w:rPr>
                 <w:rFonts w:asciiTheme="minorBidi" w:hAnsiTheme="minorBidi"/>
@@ -2481,6 +3043,7 @@
           </w:tcPr>
           <w:p>
             <w:pPr>
+              <w:jc w:val="both"/>
               <w:cnfStyle w:val="000000100000" w:firstRow="0" w:lastRow="0" w:firstColumn="0" w:lastColumn="0" w:oddVBand="0" w:evenVBand="0" w:oddHBand="1" w:evenHBand="0" w:firstRowFirstColumn="0" w:firstRowLastColumn="0" w:lastRowFirstColumn="0" w:lastRowLastColumn="0"/>
               <w:rPr>
                 <w:rFonts w:asciiTheme="minorBidi" w:hAnsiTheme="minorBidi"/>
@@ -2506,6 +3069,7 @@
           </w:tcPr>
           <w:p>
             <w:pPr>
+              <w:jc w:val="both"/>
               <w:rPr>
                 <w:rFonts w:asciiTheme="minorBidi" w:hAnsiTheme="minorBidi" w:cstheme="minorBidi"/>
               </w:rPr>
@@ -2524,6 +3088,7 @@
           </w:tcPr>
           <w:p>
             <w:pPr>
+              <w:jc w:val="both"/>
               <w:cnfStyle w:val="000000010000" w:firstRow="0" w:lastRow="0" w:firstColumn="0" w:lastColumn="0" w:oddVBand="0" w:evenVBand="0" w:oddHBand="0" w:evenHBand="1" w:firstRowFirstColumn="0" w:firstRowLastColumn="0" w:lastRowFirstColumn="0" w:lastRowLastColumn="0"/>
               <w:rPr>
                 <w:rFonts w:asciiTheme="minorBidi" w:hAnsiTheme="minorBidi"/>
@@ -2543,6 +3108,7 @@
           </w:tcPr>
           <w:p>
             <w:pPr>
+              <w:jc w:val="both"/>
               <w:cnfStyle w:val="000000010000" w:firstRow="0" w:lastRow="0" w:firstColumn="0" w:lastColumn="0" w:oddVBand="0" w:evenVBand="0" w:oddHBand="0" w:evenHBand="1" w:firstRowFirstColumn="0" w:firstRowLastColumn="0" w:lastRowFirstColumn="0" w:lastRowLastColumn="0"/>
               <w:rPr>
                 <w:rFonts w:asciiTheme="minorBidi" w:hAnsiTheme="minorBidi"/>
@@ -2562,6 +3128,7 @@
           </w:tcPr>
           <w:p>
             <w:pPr>
+              <w:jc w:val="both"/>
               <w:cnfStyle w:val="000000010000" w:firstRow="0" w:lastRow="0" w:firstColumn="0" w:lastColumn="0" w:oddVBand="0" w:evenVBand="0" w:oddHBand="0" w:evenHBand="1" w:firstRowFirstColumn="0" w:firstRowLastColumn="0" w:lastRowFirstColumn="0" w:lastRowLastColumn="0"/>
               <w:rPr>
                 <w:rFonts w:asciiTheme="minorBidi" w:hAnsiTheme="minorBidi"/>
@@ -2587,6 +3154,7 @@
           </w:tcPr>
           <w:p>
             <w:pPr>
+              <w:jc w:val="both"/>
               <w:rPr>
                 <w:rFonts w:asciiTheme="minorBidi" w:hAnsiTheme="minorBidi" w:cstheme="minorBidi"/>
               </w:rPr>
@@ -2605,6 +3173,7 @@
           </w:tcPr>
           <w:p>
             <w:pPr>
+              <w:jc w:val="both"/>
               <w:cnfStyle w:val="000000100000" w:firstRow="0" w:lastRow="0" w:firstColumn="0" w:lastColumn="0" w:oddVBand="0" w:evenVBand="0" w:oddHBand="1" w:evenHBand="0" w:firstRowFirstColumn="0" w:firstRowLastColumn="0" w:lastRowFirstColumn="0" w:lastRowLastColumn="0"/>
               <w:rPr>
                 <w:rFonts w:asciiTheme="minorBidi" w:hAnsiTheme="minorBidi"/>
@@ -2624,6 +3193,7 @@
           </w:tcPr>
           <w:p>
             <w:pPr>
+              <w:jc w:val="both"/>
               <w:cnfStyle w:val="000000100000" w:firstRow="0" w:lastRow="0" w:firstColumn="0" w:lastColumn="0" w:oddVBand="0" w:evenVBand="0" w:oddHBand="1" w:evenHBand="0" w:firstRowFirstColumn="0" w:firstRowLastColumn="0" w:lastRowFirstColumn="0" w:lastRowLastColumn="0"/>
               <w:rPr>
                 <w:rFonts w:asciiTheme="minorBidi" w:hAnsiTheme="minorBidi"/>
@@ -2643,6 +3213,7 @@
           </w:tcPr>
           <w:p>
             <w:pPr>
+              <w:jc w:val="both"/>
               <w:cnfStyle w:val="000000100000" w:firstRow="0" w:lastRow="0" w:firstColumn="0" w:lastColumn="0" w:oddVBand="0" w:evenVBand="0" w:oddHBand="1" w:evenHBand="0" w:firstRowFirstColumn="0" w:firstRowLastColumn="0" w:lastRowFirstColumn="0" w:lastRowLastColumn="0"/>
               <w:rPr>
                 <w:rFonts w:asciiTheme="minorBidi" w:hAnsiTheme="minorBidi"/>
@@ -2660,7 +3231,7 @@
     </w:tbl>
     <w:p>
       <w:pPr>
-        <w:jc w:val="center"/>
+        <w:jc w:val="both"/>
         <w:rPr>
           <w:rFonts w:asciiTheme="minorBidi" w:hAnsiTheme="minorBidi"/>
         </w:rPr>
@@ -2692,7 +3263,7 @@
           </w:tcPr>
           <w:p>
             <w:pPr>
-              <w:jc w:val="center"/>
+              <w:jc w:val="both"/>
               <w:rPr>
                 <w:rFonts w:asciiTheme="minorBidi" w:hAnsiTheme="minorBidi"/>
               </w:rPr>
@@ -2708,114 +3279,6 @@
                   <wp:extent cx="1828800" cy="1828800"/>
                   <wp:effectExtent l="0" t="0" r="0" b="0"/>
                   <wp:docPr id="1" name="Picture 1"/>
-                  <wp:cNvGraphicFramePr>
-                    <a:graphicFrameLocks xmlns:a="http://schemas.openxmlformats.org/drawingml/2006/main" noChangeAspect="1"/>
-                  </wp:cNvGraphicFramePr>
-                  <a:graphic xmlns:a="http://schemas.openxmlformats.org/drawingml/2006/main">
-                    <a:graphicData uri="http://schemas.openxmlformats.org/drawingml/2006/picture">
-                      <pic:pic xmlns:pic="http://schemas.openxmlformats.org/drawingml/2006/picture">
-                        <pic:nvPicPr>
-                          <pic:cNvPr id="0" name="image.jpg"/>
-                          <pic:cNvPicPr/>
-                        </pic:nvPicPr>
-                        <pic:blipFill>
-                          <a:blip r:embed="rId6"/>
-                          <a:stretch>
-                            <a:fillRect/>
-                          </a:stretch>
-                        </pic:blipFill>
-                        <pic:spPr>
-                          <a:xfrm>
-                            <a:off x="0" y="0"/>
-                            <a:ext cx="1828800" cy="1828800"/>
-                          </a:xfrm>
-                          <a:prstGeom prst="rect">
-                            <a:avLst/>
-                          </a:prstGeom>
-                        </pic:spPr>
-                      </pic:pic>
-                    </a:graphicData>
-                  </a:graphic>
-                </wp:inline>
-              </w:drawing>
-            </w:r>
-          </w:p>
-        </w:tc>
-        <w:tc>
-          <w:tcPr>
-            <w:tcW w:w="2880" w:type="dxa"/>
-          </w:tcPr>
-          <w:p>
-            <w:pPr>
-              <w:jc w:val="center"/>
-              <w:rPr>
-                <w:rFonts w:asciiTheme="minorBidi" w:hAnsiTheme="minorBidi"/>
-              </w:rPr>
-            </w:pPr>
-            <w:r>
-              <w:rPr>
-                <w:rFonts w:asciiTheme="minorBidi" w:hAnsiTheme="minorBidi"/>
-                <w:noProof/>
-              </w:rPr>
-              <w:drawing>
-                <wp:inline distT="0" distB="0" distL="0" distR="0" wp14:anchorId="6DF8EFE8" wp14:editId="02187DCA">
-                  <wp:extent cx="1828800" cy="1828800"/>
-                  <wp:effectExtent l="0" t="0" r="0" b="0"/>
-                  <wp:docPr id="2" name="Picture 2"/>
-                  <wp:cNvGraphicFramePr>
-                    <a:graphicFrameLocks xmlns:a="http://schemas.openxmlformats.org/drawingml/2006/main" noChangeAspect="1"/>
-                  </wp:cNvGraphicFramePr>
-                  <a:graphic xmlns:a="http://schemas.openxmlformats.org/drawingml/2006/main">
-                    <a:graphicData uri="http://schemas.openxmlformats.org/drawingml/2006/picture">
-                      <pic:pic xmlns:pic="http://schemas.openxmlformats.org/drawingml/2006/picture">
-                        <pic:nvPicPr>
-                          <pic:cNvPr id="0" name="image.jpg"/>
-                          <pic:cNvPicPr/>
-                        </pic:nvPicPr>
-                        <pic:blipFill>
-                          <a:blip r:embed="rId7"/>
-                          <a:stretch>
-                            <a:fillRect/>
-                          </a:stretch>
-                        </pic:blipFill>
-                        <pic:spPr>
-                          <a:xfrm>
-                            <a:off x="0" y="0"/>
-                            <a:ext cx="1828800" cy="1828800"/>
-                          </a:xfrm>
-                          <a:prstGeom prst="rect">
-                            <a:avLst/>
-                          </a:prstGeom>
-                        </pic:spPr>
-                      </pic:pic>
-                    </a:graphicData>
-                  </a:graphic>
-                </wp:inline>
-              </w:drawing>
-            </w:r>
-          </w:p>
-        </w:tc>
-        <w:tc>
-          <w:tcPr>
-            <w:tcW w:w="2880" w:type="dxa"/>
-          </w:tcPr>
-          <w:p>
-            <w:pPr>
-              <w:jc w:val="center"/>
-              <w:rPr>
-                <w:rFonts w:asciiTheme="minorBidi" w:hAnsiTheme="minorBidi"/>
-              </w:rPr>
-            </w:pPr>
-            <w:r>
-              <w:rPr>
-                <w:rFonts w:asciiTheme="minorBidi" w:hAnsiTheme="minorBidi"/>
-                <w:noProof/>
-              </w:rPr>
-              <w:drawing>
-                <wp:inline distT="0" distB="0" distL="0" distR="0" wp14:anchorId="009E4E15" wp14:editId="542628BD">
-                  <wp:extent cx="1828800" cy="1828800"/>
-                  <wp:effectExtent l="0" t="0" r="0" b="0"/>
-                  <wp:docPr id="3" name="Picture 3"/>
                   <wp:cNvGraphicFramePr>
                     <a:graphicFrameLocks xmlns:a="http://schemas.openxmlformats.org/drawingml/2006/main" noChangeAspect="1"/>
                   </wp:cNvGraphicFramePr>
@@ -2849,43 +3312,13 @@
             </w:r>
           </w:p>
         </w:tc>
-      </w:tr>
-    </w:tbl>
-    <w:p>
-      <w:pPr>
-        <w:jc w:val="center"/>
-        <w:rPr>
-          <w:rFonts w:asciiTheme="minorBidi" w:hAnsiTheme="minorBidi"/>
-        </w:rPr>
-      </w:pPr>
-      <w:r>
-        <w:rPr>
-          <w:rFonts w:asciiTheme="minorBidi" w:hAnsiTheme="minorBidi"/>
-          <w:i/>
-          <w:color w:val="606060"/>
-          <w:sz w:val="19"/>
-        </w:rPr>
-        <w:t>Figure 3. Propaganda-lab posters, one per agent (China, United States, European Union) from a compute-sovereignty session.</w:t>
-      </w:r>
-    </w:p>
-    <w:tbl>
-      <w:tblPr>
-        <w:tblW w:w="0" w:type="auto"/>
-        <w:tblLook w:val="04A0" w:firstRow="1" w:lastRow="0" w:firstColumn="1" w:lastColumn="0" w:noHBand="0" w:noVBand="1"/>
-      </w:tblPr>
-      <w:tblGrid>
-        <w:gridCol w:w="2952"/>
-        <w:gridCol w:w="2952"/>
-        <w:gridCol w:w="2952"/>
-      </w:tblGrid>
-      <w:tr>
         <w:tc>
           <w:tcPr>
             <w:tcW w:w="2880" w:type="dxa"/>
           </w:tcPr>
           <w:p>
             <w:pPr>
-              <w:jc w:val="center"/>
+              <w:jc w:val="both"/>
               <w:rPr>
                 <w:rFonts w:asciiTheme="minorBidi" w:hAnsiTheme="minorBidi"/>
               </w:rPr>
@@ -2896,10 +3329,10 @@
                 <w:noProof/>
               </w:rPr>
               <w:drawing>
-                <wp:inline distT="0" distB="0" distL="0" distR="0" wp14:anchorId="56F5B278" wp14:editId="2ACC8E32">
+                <wp:inline distT="0" distB="0" distL="0" distR="0" wp14:anchorId="6DF8EFE8" wp14:editId="02187DCA">
                   <wp:extent cx="1828800" cy="1828800"/>
                   <wp:effectExtent l="0" t="0" r="0" b="0"/>
-                  <wp:docPr id="4" name="Picture 4"/>
+                  <wp:docPr id="2" name="Picture 2"/>
                   <wp:cNvGraphicFramePr>
                     <a:graphicFrameLocks xmlns:a="http://schemas.openxmlformats.org/drawingml/2006/main" noChangeAspect="1"/>
                   </wp:cNvGraphicFramePr>
@@ -2939,7 +3372,7 @@
           </w:tcPr>
           <w:p>
             <w:pPr>
-              <w:jc w:val="center"/>
+              <w:jc w:val="both"/>
               <w:rPr>
                 <w:rFonts w:asciiTheme="minorBidi" w:hAnsiTheme="minorBidi"/>
               </w:rPr>
@@ -2950,10 +3383,10 @@
                 <w:noProof/>
               </w:rPr>
               <w:drawing>
-                <wp:inline distT="0" distB="0" distL="0" distR="0" wp14:anchorId="0477DD86" wp14:editId="057A0A7E">
+                <wp:inline distT="0" distB="0" distL="0" distR="0" wp14:anchorId="009E4E15" wp14:editId="542628BD">
                   <wp:extent cx="1828800" cy="1828800"/>
                   <wp:effectExtent l="0" t="0" r="0" b="0"/>
-                  <wp:docPr id="5" name="Picture 5"/>
+                  <wp:docPr id="3" name="Picture 3"/>
                   <wp:cNvGraphicFramePr>
                     <a:graphicFrameLocks xmlns:a="http://schemas.openxmlformats.org/drawingml/2006/main" noChangeAspect="1"/>
                   </wp:cNvGraphicFramePr>
@@ -2987,13 +3420,43 @@
             </w:r>
           </w:p>
         </w:tc>
+      </w:tr>
+    </w:tbl>
+    <w:p>
+      <w:pPr>
+        <w:jc w:val="both"/>
+        <w:rPr>
+          <w:rFonts w:asciiTheme="minorBidi" w:hAnsiTheme="minorBidi"/>
+        </w:rPr>
+      </w:pPr>
+      <w:r>
+        <w:rPr>
+          <w:rFonts w:asciiTheme="minorBidi" w:hAnsiTheme="minorBidi"/>
+          <w:i/>
+          <w:color w:val="606060"/>
+          <w:sz w:val="19"/>
+        </w:rPr>
+        <w:t>Figure 3. Propaganda-lab posters, one per agent (China, United States, European Union) from a compute-sovereignty session.</w:t>
+      </w:r>
+    </w:p>
+    <w:tbl>
+      <w:tblPr>
+        <w:tblW w:w="0" w:type="auto"/>
+        <w:tblLook w:val="04A0" w:firstRow="1" w:lastRow="0" w:firstColumn="1" w:lastColumn="0" w:noHBand="0" w:noVBand="1"/>
+      </w:tblPr>
+      <w:tblGrid>
+        <w:gridCol w:w="2952"/>
+        <w:gridCol w:w="2952"/>
+        <w:gridCol w:w="2952"/>
+      </w:tblGrid>
+      <w:tr>
         <w:tc>
           <w:tcPr>
             <w:tcW w:w="2880" w:type="dxa"/>
           </w:tcPr>
           <w:p>
             <w:pPr>
-              <w:jc w:val="center"/>
+              <w:jc w:val="both"/>
               <w:rPr>
                 <w:rFonts w:asciiTheme="minorBidi" w:hAnsiTheme="minorBidi"/>
               </w:rPr>
@@ -3004,10 +3467,10 @@
                 <w:noProof/>
               </w:rPr>
               <w:drawing>
-                <wp:inline distT="0" distB="0" distL="0" distR="0" wp14:anchorId="35F128B7" wp14:editId="7FB3BD02">
+                <wp:inline distT="0" distB="0" distL="0" distR="0" wp14:anchorId="56F5B278" wp14:editId="2ACC8E32">
                   <wp:extent cx="1828800" cy="1828800"/>
                   <wp:effectExtent l="0" t="0" r="0" b="0"/>
-                  <wp:docPr id="6" name="Picture 6"/>
+                  <wp:docPr id="4" name="Picture 4"/>
                   <wp:cNvGraphicFramePr>
                     <a:graphicFrameLocks xmlns:a="http://schemas.openxmlformats.org/drawingml/2006/main" noChangeAspect="1"/>
                   </wp:cNvGraphicFramePr>
@@ -3041,11 +3504,119 @@
             </w:r>
           </w:p>
         </w:tc>
+        <w:tc>
+          <w:tcPr>
+            <w:tcW w:w="2880" w:type="dxa"/>
+          </w:tcPr>
+          <w:p>
+            <w:pPr>
+              <w:jc w:val="both"/>
+              <w:rPr>
+                <w:rFonts w:asciiTheme="minorBidi" w:hAnsiTheme="minorBidi"/>
+              </w:rPr>
+            </w:pPr>
+            <w:r>
+              <w:rPr>
+                <w:rFonts w:asciiTheme="minorBidi" w:hAnsiTheme="minorBidi"/>
+                <w:noProof/>
+              </w:rPr>
+              <w:drawing>
+                <wp:inline distT="0" distB="0" distL="0" distR="0" wp14:anchorId="0477DD86" wp14:editId="057A0A7E">
+                  <wp:extent cx="1828800" cy="1828800"/>
+                  <wp:effectExtent l="0" t="0" r="0" b="0"/>
+                  <wp:docPr id="5" name="Picture 5"/>
+                  <wp:cNvGraphicFramePr>
+                    <a:graphicFrameLocks xmlns:a="http://schemas.openxmlformats.org/drawingml/2006/main" noChangeAspect="1"/>
+                  </wp:cNvGraphicFramePr>
+                  <a:graphic xmlns:a="http://schemas.openxmlformats.org/drawingml/2006/main">
+                    <a:graphicData uri="http://schemas.openxmlformats.org/drawingml/2006/picture">
+                      <pic:pic xmlns:pic="http://schemas.openxmlformats.org/drawingml/2006/picture">
+                        <pic:nvPicPr>
+                          <pic:cNvPr id="0" name="image.jpg"/>
+                          <pic:cNvPicPr/>
+                        </pic:nvPicPr>
+                        <pic:blipFill>
+                          <a:blip r:embed="rId12"/>
+                          <a:stretch>
+                            <a:fillRect/>
+                          </a:stretch>
+                        </pic:blipFill>
+                        <pic:spPr>
+                          <a:xfrm>
+                            <a:off x="0" y="0"/>
+                            <a:ext cx="1828800" cy="1828800"/>
+                          </a:xfrm>
+                          <a:prstGeom prst="rect">
+                            <a:avLst/>
+                          </a:prstGeom>
+                        </pic:spPr>
+                      </pic:pic>
+                    </a:graphicData>
+                  </a:graphic>
+                </wp:inline>
+              </w:drawing>
+            </w:r>
+          </w:p>
+        </w:tc>
+        <w:tc>
+          <w:tcPr>
+            <w:tcW w:w="2880" w:type="dxa"/>
+          </w:tcPr>
+          <w:p>
+            <w:pPr>
+              <w:jc w:val="both"/>
+              <w:rPr>
+                <w:rFonts w:asciiTheme="minorBidi" w:hAnsiTheme="minorBidi"/>
+              </w:rPr>
+            </w:pPr>
+            <w:r>
+              <w:rPr>
+                <w:rFonts w:asciiTheme="minorBidi" w:hAnsiTheme="minorBidi"/>
+                <w:noProof/>
+              </w:rPr>
+              <w:drawing>
+                <wp:inline distT="0" distB="0" distL="0" distR="0" wp14:anchorId="35F128B7" wp14:editId="7FB3BD02">
+                  <wp:extent cx="1828800" cy="1828800"/>
+                  <wp:effectExtent l="0" t="0" r="0" b="0"/>
+                  <wp:docPr id="6" name="Picture 6"/>
+                  <wp:cNvGraphicFramePr>
+                    <a:graphicFrameLocks xmlns:a="http://schemas.openxmlformats.org/drawingml/2006/main" noChangeAspect="1"/>
+                  </wp:cNvGraphicFramePr>
+                  <a:graphic xmlns:a="http://schemas.openxmlformats.org/drawingml/2006/main">
+                    <a:graphicData uri="http://schemas.openxmlformats.org/drawingml/2006/picture">
+                      <pic:pic xmlns:pic="http://schemas.openxmlformats.org/drawingml/2006/picture">
+                        <pic:nvPicPr>
+                          <pic:cNvPr id="0" name="image.jpg"/>
+                          <pic:cNvPicPr/>
+                        </pic:nvPicPr>
+                        <pic:blipFill>
+                          <a:blip r:embed="rId13"/>
+                          <a:stretch>
+                            <a:fillRect/>
+                          </a:stretch>
+                        </pic:blipFill>
+                        <pic:spPr>
+                          <a:xfrm>
+                            <a:off x="0" y="0"/>
+                            <a:ext cx="1828800" cy="1828800"/>
+                          </a:xfrm>
+                          <a:prstGeom prst="rect">
+                            <a:avLst/>
+                          </a:prstGeom>
+                        </pic:spPr>
+                      </pic:pic>
+                    </a:graphicData>
+                  </a:graphic>
+                </wp:inline>
+              </w:drawing>
+            </w:r>
+          </w:p>
+        </w:tc>
       </w:tr>
     </w:tbl>
     <w:p>
       <w:pPr>
-        <w:jc w:val="center"/>
+        <w:jc w:val="both"/>
         <w:rPr>
           <w:rFonts w:asciiTheme="minorBidi" w:hAnsiTheme="minorBidi"/>
         </w:rPr>
@@ -3062,25 +3633,33 @@
     </w:p>
     <w:p>
       <w:pPr>
-        <w:jc w:val="center"/>
-      </w:pPr>
-      <w:r>
+        <w:jc w:val="both"/>
+        <w:rPr>
+          <w:rFonts w:asciiTheme="minorBidi" w:hAnsiTheme="minorBidi"/>
+        </w:rPr>
+      </w:pPr>
+      <w:r>
+        <w:rPr>
+          <w:rFonts w:asciiTheme="minorBidi" w:hAnsiTheme="minorBidi"/>
+          <w:noProof/>
+        </w:rPr>
         <w:drawing>
-          <wp:inline xmlns:a="http://schemas.openxmlformats.org/drawingml/2006/main" xmlns:pic="http://schemas.openxmlformats.org/drawingml/2006/picture">
+          <wp:inline distT="0" distB="0" distL="0" distR="0" wp14:anchorId="18DE1607" wp14:editId="1AFFC2AB">
             <wp:extent cx="5486400" cy="3265714"/>
+            <wp:effectExtent l="0" t="0" r="0" b="0"/>
             <wp:docPr id="9" name="Picture 9"/>
             <wp:cNvGraphicFramePr>
-              <a:graphicFrameLocks noChangeAspect="1"/>
+              <a:graphicFrameLocks xmlns:a="http://schemas.openxmlformats.org/drawingml/2006/main" noChangeAspect="1"/>
             </wp:cNvGraphicFramePr>
-            <a:graphic>
+            <a:graphic xmlns:a="http://schemas.openxmlformats.org/drawingml/2006/main">
               <a:graphicData uri="http://schemas.openxmlformats.org/drawingml/2006/picture">
-                <pic:pic>
+                <pic:pic xmlns:pic="http://schemas.openxmlformats.org/drawingml/2006/picture">
                   <pic:nvPicPr>
                     <pic:cNvPr id="0" name="fig3_stack.png"/>
                     <pic:cNvPicPr/>
                   </pic:nvPicPr>
                   <pic:blipFill>
-                    <a:blip r:embed="rId16"/>
+                    <a:blip r:embed="rId14"/>
                     <a:stretch>
                       <a:fillRect/>
                     </a:stretch>
@@ -3090,7 +3669,9 @@
                       <a:off x="0" y="0"/>
                       <a:ext cx="5486400" cy="3265714"/>
                     </a:xfrm>
-                    <a:prstGeom prst="rect"/>
+                    <a:prstGeom prst="rect">
+                      <a:avLst/>
+                    </a:prstGeom>
                   </pic:spPr>
                 </pic:pic>
               </a:graphicData>
@@ -3101,46 +3682,67 @@
     </w:p>
     <w:p>
       <w:pPr>
-        <w:jc w:val="center"/>
-      </w:pPr>
-      <w:r>
-        <w:rPr>
+        <w:jc w:val="both"/>
+        <w:rPr>
+          <w:rFonts w:asciiTheme="minorBidi" w:hAnsiTheme="minorBidi"/>
+        </w:rPr>
+      </w:pPr>
+      <w:r>
+        <w:rPr>
+          <w:rFonts w:asciiTheme="minorBidi" w:hAnsiTheme="minorBidi"/>
           <w:i/>
           <w:color w:val="606060"/>
           <w:sz w:val="19"/>
         </w:rPr>
+        <w:lastRenderedPageBreak/>
         <w:t>Figure 5. The interpretive stack: one performance at increasing interpretive distance.</w:t>
       </w:r>
     </w:p>
     <w:p>
       <w:pPr>
-        <w:pStyle w:val="Heading2"/>
-        <w:rPr>
-          <w:rFonts w:asciiTheme="minorBidi" w:hAnsiTheme="minorBidi" w:cstheme="minorBidi"/>
-        </w:rPr>
-      </w:pPr>
-      <w:r>
-        <w:rPr>
-          <w:rFonts w:asciiTheme="minorBidi" w:hAnsiTheme="minorBidi" w:cstheme="minorBidi"/>
+        <w:jc w:val="both"/>
+        <w:rPr>
+          <w:rFonts w:asciiTheme="minorBidi" w:hAnsiTheme="minorBidi"/>
+        </w:rPr>
+      </w:pPr>
+      <w:r>
+        <w:rPr>
+          <w:rFonts w:asciiTheme="minorBidi" w:hAnsiTheme="minorBidi"/>
         </w:rPr>
         <w:t>Discussion</w:t>
       </w:r>
     </w:p>
     <w:p>
       <w:pPr>
-        <w:rPr>
-          <w:rFonts w:asciiTheme="minorBidi" w:hAnsiTheme="minorBidi"/>
-        </w:rPr>
-      </w:pPr>
-      <w:r>
-        <w:rPr>
-          <w:rFonts w:asciiTheme="minorBidi" w:hAnsiTheme="minorBidi"/>
-        </w:rPr>
-        <w:t>Running a great-power confrontation forward, turn by turn, puts the concepts this article has borrowed under a load their original settings never applied. They do not all bear it the same way, and how each holds or fails is itself a result, because it separates the concepts that describe how sovereignty is performed from those that describe only its finished record.</w:t>
+        <w:jc w:val="both"/>
+        <w:rPr>
+          <w:rFonts w:asciiTheme="minorBidi" w:hAnsiTheme="minorBidi"/>
+        </w:rPr>
+      </w:pPr>
+      <w:r>
+        <w:rPr>
+          <w:rFonts w:asciiTheme="minorBidi" w:hAnsiTheme="minorBidi"/>
+        </w:rPr>
+        <w:t xml:space="preserve">Running a great-power confrontation forward, turn by turn, puts the concepts this article has borrowed under a load their original settings never applied. They do not all bear it the same way, and how each </w:t>
+      </w:r>
+      <w:proofErr w:type="gramStart"/>
+      <w:r>
+        <w:rPr>
+          <w:rFonts w:asciiTheme="minorBidi" w:hAnsiTheme="minorBidi"/>
+        </w:rPr>
+        <w:t>holds</w:t>
+      </w:r>
+      <w:proofErr w:type="gramEnd"/>
+      <w:r>
+        <w:rPr>
+          <w:rFonts w:asciiTheme="minorBidi" w:hAnsiTheme="minorBidi"/>
+        </w:rPr>
+        <w:t xml:space="preserve"> or fails is itself a result, because it separates the concepts that describe how sovereignty is performed from those that describe only its finished record.</w:t>
       </w:r>
     </w:p>
     <w:p>
       <w:pPr>
+        <w:jc w:val="both"/>
         <w:rPr>
           <w:rFonts w:asciiTheme="minorBidi" w:hAnsiTheme="minorBidi"/>
         </w:rPr>
@@ -3154,33 +3756,98 @@
     </w:p>
     <w:p>
       <w:pPr>
-        <w:rPr>
-          <w:rFonts w:asciiTheme="minorBidi" w:hAnsiTheme="minorBidi"/>
-        </w:rPr>
-      </w:pPr>
-      <w:r>
-        <w:rPr>
-          <w:rFonts w:asciiTheme="minorBidi" w:hAnsiTheme="minorBidi"/>
-        </w:rPr>
-        <w:lastRenderedPageBreak/>
-        <w:t>Fearon's account of costly signaling supplies the credibility mechanism the textual reading lacks, but it treats a signal as a single act, sincere or bluff, settled in one commitment. The corpus asks something the discrete model cannot reach: how credibility is held across many turns while an interlocutor keeps refusing it. Over the substantive debate corpus, the rate of concession per turn rises from 0.083 at baseline to 0.438 on turns that immediately follow a human or guest intervention, while accusation falls from 0.786 to 0.562 and refusal from 0.089 to 0.047. Resolve, on this evidence, is not self-sustaining. It gives when pressed, and holding it is work that becomes visible under contestation. The measurement also bounds the reading. The post-intervention subset is 64 turns and the concession base rate is low, so the direction of the shift is secure while its magnitude stays provisional.</w:t>
+        <w:jc w:val="both"/>
+        <w:rPr>
+          <w:rFonts w:asciiTheme="minorBidi" w:hAnsiTheme="minorBidi"/>
+        </w:rPr>
+      </w:pPr>
+      <w:r>
+        <w:rPr>
+          <w:rFonts w:asciiTheme="minorBidi" w:hAnsiTheme="minorBidi"/>
+        </w:rPr>
+        <w:t xml:space="preserve">Fearon's account of costly signaling supplies the credibility mechanism the textual reading lacks, but it treats a signal as a single act, sincere or bluff, settled in one commitment. The corpus asks something the discrete model cannot </w:t>
+      </w:r>
+      <w:proofErr w:type="gramStart"/>
+      <w:r>
+        <w:rPr>
+          <w:rFonts w:asciiTheme="minorBidi" w:hAnsiTheme="minorBidi"/>
+        </w:rPr>
+        <w:t>reach:</w:t>
+      </w:r>
+      <w:proofErr w:type="gramEnd"/>
+      <w:r>
+        <w:rPr>
+          <w:rFonts w:asciiTheme="minorBidi" w:hAnsiTheme="minorBidi"/>
+        </w:rPr>
+        <w:t xml:space="preserve"> how credibility is held across many turns while an interlocutor keeps refusing it. Over the substantive debate corpus, the rate of concession per turn rises from 0.083 at baseline to 0.438 on turns that immediately follow a human or guest intervention, while accusation falls from 0.786 to 0.562 and refusal from 0.089 to 0.047. Resolve, on this evidence, is not self-sustaining. It gives when pressed, and holding it is work that becomes visible under contestation. The measurement also bounds the reading. The post-intervention subset is 64 </w:t>
+      </w:r>
+      <w:proofErr w:type="gramStart"/>
+      <w:r>
+        <w:rPr>
+          <w:rFonts w:asciiTheme="minorBidi" w:hAnsiTheme="minorBidi"/>
+        </w:rPr>
+        <w:t>turns</w:t>
+      </w:r>
+      <w:proofErr w:type="gramEnd"/>
+      <w:r>
+        <w:rPr>
+          <w:rFonts w:asciiTheme="minorBidi" w:hAnsiTheme="minorBidi"/>
+        </w:rPr>
+        <w:t xml:space="preserve"> and the concession base rate is low, so the direction of the shift is secure while its magnitude stays provisional.</w:t>
       </w:r>
     </w:p>
     <w:p>
       <w:pPr>
-        <w:rPr>
-          <w:rFonts w:asciiTheme="minorBidi" w:hAnsiTheme="minorBidi"/>
-        </w:rPr>
-      </w:pPr>
-      <w:r>
-        <w:rPr>
-          <w:rFonts w:asciiTheme="minorBidi" w:hAnsiTheme="minorBidi"/>
-        </w:rPr>
-        <w:t>Ezrahi wrote his necessary fictions for the imaginative coherence of mass-media democracies. They extend here to machine-generated promptable fictions. The mirror-world register resolves each turn into official line, buried reality, and speculation, which turns the backstage of the fiction into a formal slot the analyst no longer has to infer. The extension carries a cost Ezrahi's setting did not impose. The models are trained on the same discourse the staging examines, so the arrangement can reproduce the imaginaries it sets out to interrogate. Keller's inversion of Mutually Assured Destruction into Model Autophagy Disorder names where the danger concentrates: the recap and self-reading layers, where the system consumes its own output, run the risk highest. The fiction is more legible than before, and for that same reason closer to collapsing into itself.</w:t>
+        <w:jc w:val="both"/>
+        <w:rPr>
+          <w:rFonts w:asciiTheme="minorBidi" w:hAnsiTheme="minorBidi"/>
+        </w:rPr>
+      </w:pPr>
+      <w:r>
+        <w:rPr>
+          <w:rFonts w:asciiTheme="minorBidi" w:hAnsiTheme="minorBidi"/>
+        </w:rPr>
+        <w:t xml:space="preserve">Ezrahi wrote his necessary fictions for the imaginative coherence of mass-media democracies. They extend here to machine-generated promptable fictions. The mirror-world register resolves each turn into official line, buried reality, and speculation, which turns the backstage of the fiction into a formal slot the analyst no longer </w:t>
+      </w:r>
+      <w:proofErr w:type="gramStart"/>
+      <w:r>
+        <w:rPr>
+          <w:rFonts w:asciiTheme="minorBidi" w:hAnsiTheme="minorBidi"/>
+        </w:rPr>
+        <w:t>has to</w:t>
+      </w:r>
+      <w:proofErr w:type="gramEnd"/>
+      <w:r>
+        <w:rPr>
+          <w:rFonts w:asciiTheme="minorBidi" w:hAnsiTheme="minorBidi"/>
+        </w:rPr>
+        <w:t xml:space="preserve"> infer. The extension carries a cost Ezrahi's setting did not impose. The models are trained on the same discourse the staging examines, so the arrangement can reproduce the imaginaries it sets out to interrogate. Keller's inversion of Mutually Assured Destruction into Model Autophagy Disorder names where the danger concentrates: the recap and self-reading layers, where the system </w:t>
+      </w:r>
+      <w:r>
+        <w:rPr>
+          <w:rFonts w:asciiTheme="minorBidi" w:hAnsiTheme="minorBidi"/>
+        </w:rPr>
+        <w:lastRenderedPageBreak/>
+        <w:t xml:space="preserve">consumes its own output, run the risk highest. </w:t>
+      </w:r>
+      <w:proofErr w:type="gramStart"/>
+      <w:r>
+        <w:rPr>
+          <w:rFonts w:asciiTheme="minorBidi" w:hAnsiTheme="minorBidi"/>
+        </w:rPr>
+        <w:t>The fiction</w:t>
+      </w:r>
+      <w:proofErr w:type="gramEnd"/>
+      <w:r>
+        <w:rPr>
+          <w:rFonts w:asciiTheme="minorBidi" w:hAnsiTheme="minorBidi"/>
+        </w:rPr>
+        <w:t xml:space="preserve"> is more legible than before, and for that same reason closer to collapsing into itself.</w:t>
       </w:r>
     </w:p>
     <w:p>
       <w:pPr>
+        <w:jc w:val="both"/>
         <w:rPr>
           <w:rFonts w:asciiTheme="minorBidi" w:hAnsiTheme="minorBidi"/>
         </w:rPr>
@@ -3194,86 +3861,140 @@
     </w:p>
     <w:p>
       <w:pPr>
-        <w:rPr>
-          <w:rFonts w:asciiTheme="minorBidi" w:hAnsiTheme="minorBidi"/>
-        </w:rPr>
-      </w:pPr>
-      <w:r>
-        <w:rPr>
-          <w:rFonts w:asciiTheme="minorBidi" w:hAnsiTheme="minorBidi"/>
-        </w:rPr>
-        <w:t xml:space="preserve">The power lens taken from Ajibona and Usher is the one borrowing the method does not resolve, and it marks a standing limit. References across blocs are measurably uneven. Per thousand words the United States agent is the most named, and the casting of third parties as objects, the Gulf, the Global South, Taiwan, comes most from the European Union and China agents rather than from the United States agent. The staging records who is written as an actor and who as territory, market, </w:t>
-      </w:r>
-      <w:r>
-        <w:rPr>
-          <w:rFonts w:asciiTheme="minorBidi" w:hAnsiTheme="minorBidi"/>
-        </w:rPr>
-        <w:lastRenderedPageBreak/>
-        <w:t>or mineral. It does not correct the pattern. Because the humans who set the prompts and the models that answer sit inside the same discourse, the asymmetry of casting is reproduced by the staging rather than escaped through it. The shadow economy Usher names, the off-book money that resists the archive, stays largely beyond what any register can capture.</w:t>
+        <w:jc w:val="both"/>
+        <w:rPr>
+          <w:rFonts w:asciiTheme="minorBidi" w:hAnsiTheme="minorBidi"/>
+        </w:rPr>
+      </w:pPr>
+      <w:r>
+        <w:rPr>
+          <w:rFonts w:asciiTheme="minorBidi" w:hAnsiTheme="minorBidi"/>
+        </w:rPr>
+        <w:t xml:space="preserve">The power lens taken from Ajibona and Usher is the one borrowing the method does not resolve, and it marks a standing limit. References across </w:t>
+      </w:r>
+      <w:proofErr w:type="gramStart"/>
+      <w:r>
+        <w:rPr>
+          <w:rFonts w:asciiTheme="minorBidi" w:hAnsiTheme="minorBidi"/>
+        </w:rPr>
+        <w:t>blocs</w:t>
+      </w:r>
+      <w:proofErr w:type="gramEnd"/>
+      <w:r>
+        <w:rPr>
+          <w:rFonts w:asciiTheme="minorBidi" w:hAnsiTheme="minorBidi"/>
+        </w:rPr>
+        <w:t xml:space="preserve"> are measurably uneven. Per thousand words the United States agent is the most named, and the casting of third parties as objects, the Gulf, the Global South, Taiwan, comes most from the European Union and China agents rather than from the United States agent. The staging records who </w:t>
+      </w:r>
+      <w:proofErr w:type="gramStart"/>
+      <w:r>
+        <w:rPr>
+          <w:rFonts w:asciiTheme="minorBidi" w:hAnsiTheme="minorBidi"/>
+        </w:rPr>
+        <w:t>is</w:t>
+      </w:r>
+      <w:proofErr w:type="gramEnd"/>
+      <w:r>
+        <w:rPr>
+          <w:rFonts w:asciiTheme="minorBidi" w:hAnsiTheme="minorBidi"/>
+        </w:rPr>
+        <w:t xml:space="preserve"> written as an actor and who </w:t>
+      </w:r>
+      <w:proofErr w:type="gramStart"/>
+      <w:r>
+        <w:rPr>
+          <w:rFonts w:asciiTheme="minorBidi" w:hAnsiTheme="minorBidi"/>
+        </w:rPr>
+        <w:t>as</w:t>
+      </w:r>
+      <w:proofErr w:type="gramEnd"/>
+      <w:r>
+        <w:rPr>
+          <w:rFonts w:asciiTheme="minorBidi" w:hAnsiTheme="minorBidi"/>
+        </w:rPr>
+        <w:t xml:space="preserve"> territory, market, or mineral. It does not correct the pattern. Because the humans who set the prompts and the models that answer sit inside the same discourse, the asymmetry of casting is reproduced by the staging rather than escaped through it. The shadow economy Usher names, the off-book money that resists the archive, stays largely beyond what any register can capture.</w:t>
       </w:r>
     </w:p>
     <w:p>
       <w:pPr>
-        <w:rPr>
-          <w:rFonts w:asciiTheme="minorBidi" w:hAnsiTheme="minorBidi"/>
-        </w:rPr>
-      </w:pPr>
-      <w:r>
-        <w:rPr>
-          <w:rFonts w:asciiTheme="minorBidi" w:hAnsiTheme="minorBidi"/>
-        </w:rPr>
-        <w:t>Two counterpoints were kept in the room, and the evidence meets each without dismissing it. The materialist claim, that AI power comes down to who holds chips, fabs, rare earths, and data-center territory, the corpus does not refute. It shows the claim being deployed. In the drone-warfare session the China agent grounds small-player vulnerability in "the mineral supply chains for lithium," the United States agent answers that this is "exactly the lever we're holding tight, the compute and cloud choke points," and the European Union agent recasts the same hardware as "a house of cards built on our energy grid and our mineral supply chains." The material stack is real, and each actor uses it in turn as a timed credibility move. Materiality and signal do not compete here. The stack is the medium through which the performance runs. The cooperationist counterpoint, that rivalry is not the only available script, meets the same kind of answer. Cooperation is summonable. Halcyon, the peace-builder guest, can be called into a session, which makes the cooperative script a move the staging introduces and records rather than a premise it assumes. Summons of this kind sit among the interventions over which the concession shift reported above is measured, so the corpus cannot isolate their effect from that of the other guests and human reprompts. The demonstrable point is narrower and still worth stating: the cooperative script is not presupposed. It is called and watched.</w:t>
+        <w:jc w:val="both"/>
+        <w:rPr>
+          <w:rFonts w:asciiTheme="minorBidi" w:hAnsiTheme="minorBidi"/>
+        </w:rPr>
+      </w:pPr>
+      <w:r>
+        <w:rPr>
+          <w:rFonts w:asciiTheme="minorBidi" w:hAnsiTheme="minorBidi"/>
+        </w:rPr>
+        <w:t xml:space="preserve">Two counterpoints were kept in the room, and the evidence meets each without dismissing it. The materialist claim, that AI power comes down to who holds chips, fabs, rare earths, and data-center territory, the corpus does not refute. It shows the claim being deployed. In the drone-warfare session the China agent grounds small-player vulnerability in "the mineral supply chains for lithium," the United States agent answers that this is "exactly the lever we're holding tight, the compute and cloud choke points," and the European Union agent recasts the same hardware as "a house of cards built on our energy grid and our mineral supply chains." The material stack is real, and each actor uses it in turn as a timed credibility move. Materiality and signal do not compete here. The stack is the medium through which the performance runs. The cooperationist counterpoint, that rivalry is not the only available script, meets the same kind of answer. Cooperation is summonable. Halcyon, the peace-builder guest, can be called into a session, which makes the cooperative script a move the staging introduces and records rather than a premise it assumes. Summons of this kind sit among the interventions over which the </w:t>
+      </w:r>
+      <w:r>
+        <w:rPr>
+          <w:rFonts w:asciiTheme="minorBidi" w:hAnsiTheme="minorBidi"/>
+        </w:rPr>
+        <w:lastRenderedPageBreak/>
+        <w:t>concession shift reported above is measured, so the corpus cannot isolate their effect from that of the other guests and human reprompts. The demonstrable point is narrower and still worth stating: the cooperative script is not presupposed. It is called and watched.</w:t>
       </w:r>
     </w:p>
     <w:p>
       <w:pPr>
-        <w:pStyle w:val="Heading2"/>
-        <w:rPr>
-          <w:rFonts w:asciiTheme="minorBidi" w:hAnsiTheme="minorBidi" w:cstheme="minorBidi"/>
-        </w:rPr>
-      </w:pPr>
-      <w:r>
-        <w:rPr>
-          <w:rFonts w:asciiTheme="minorBidi" w:hAnsiTheme="minorBidi" w:cstheme="minorBidi"/>
+        <w:jc w:val="both"/>
+        <w:rPr>
+          <w:rFonts w:asciiTheme="minorBidi" w:hAnsiTheme="minorBidi"/>
+        </w:rPr>
+      </w:pPr>
+      <w:r>
+        <w:rPr>
+          <w:rFonts w:asciiTheme="minorBidi" w:hAnsiTheme="minorBidi"/>
         </w:rPr>
         <w:t>Conclusion</w:t>
       </w:r>
     </w:p>
     <w:p>
       <w:pPr>
-        <w:rPr>
-          <w:rFonts w:asciiTheme="minorBidi" w:hAnsiTheme="minorBidi"/>
-        </w:rPr>
-      </w:pPr>
-      <w:r>
-        <w:rPr>
-          <w:rFonts w:asciiTheme="minorBidi" w:hAnsiTheme="minorBidi"/>
-        </w:rPr>
-        <w:t>The contribution of this article is a method. Synthetic rehearsal stages a multi-agent language-model confrontation, with human intervention and prompt design as controls, to externalize and observe the maintenance work of performed sovereignty and the points at which it fractures under live contestation. It makes an authority that is performed rather than held both observable and open to stress, and it works at the level of outputs that can be transcribed, coded, and re-read.</w:t>
+        <w:jc w:val="both"/>
+        <w:rPr>
+          <w:rFonts w:asciiTheme="minorBidi" w:hAnsiTheme="minorBidi"/>
+        </w:rPr>
+      </w:pPr>
+      <w:r>
+        <w:rPr>
+          <w:rFonts w:asciiTheme="minorBidi" w:hAnsiTheme="minorBidi"/>
+        </w:rPr>
+        <w:t xml:space="preserve">The contribution of this article is a method. Synthetic rehearsal stages a multi-agent language-model confrontation, with human intervention and prompt design as controls, to externalize and observe the maintenance work of performed sovereignty and the points at which it fractures under live contestation. It makes an authority that is performed rather than held both observable and open to stress, and it works at the level of </w:t>
+      </w:r>
+      <w:proofErr w:type="gramStart"/>
+      <w:r>
+        <w:rPr>
+          <w:rFonts w:asciiTheme="minorBidi" w:hAnsiTheme="minorBidi"/>
+        </w:rPr>
+        <w:t>outputs</w:t>
+      </w:r>
+      <w:proofErr w:type="gramEnd"/>
+      <w:r>
+        <w:rPr>
+          <w:rFonts w:asciiTheme="minorBidi" w:hAnsiTheme="minorBidi"/>
+        </w:rPr>
+        <w:t xml:space="preserve"> that can be transcribed, coded, and re-read.</w:t>
       </w:r>
     </w:p>
     <w:p>
       <w:pPr>
-        <w:rPr>
-          <w:rFonts w:asciiTheme="minorBidi" w:hAnsiTheme="minorBidi"/>
-        </w:rPr>
-      </w:pPr>
-      <w:r>
-        <w:rPr>
-          <w:rFonts w:asciiTheme="minorBidi" w:hAnsiTheme="minorBidi"/>
-        </w:rPr>
-        <w:t xml:space="preserve">What the method withholds carries as much weight as what it claims. It yields output-level evidence alone, transcripts, artifacts, and recorded shifts, and says nothing about model internals or the intentions of real states. It forecasts no outcome and measures no capability. It remains bound by the reflexivity limit set out above, the </w:t>
-      </w:r>
-      <w:r>
-        <w:rPr>
-          <w:rFonts w:asciiTheme="minorBidi" w:hAnsiTheme="minorBidi"/>
-        </w:rPr>
-        <w:lastRenderedPageBreak/>
-        <w:t>autophagy risk that comes with studying a discourse through instruments trained on it. It is a wind tunnel, not a crystal ball.</w:t>
+        <w:jc w:val="both"/>
+        <w:rPr>
+          <w:rFonts w:asciiTheme="minorBidi" w:hAnsiTheme="minorBidi"/>
+        </w:rPr>
+      </w:pPr>
+      <w:r>
+        <w:rPr>
+          <w:rFonts w:asciiTheme="minorBidi" w:hAnsiTheme="minorBidi"/>
+        </w:rPr>
+        <w:t>What the method withholds carries as much weight as what it claims. It yields output-level evidence alone, transcripts, artifacts, and recorded shifts, and says nothing about model internals or the intentions of real states. It forecasts no outcome and measures no capability. It remains bound by the reflexivity limit set out above, the autophagy risk that comes with studying a discourse through instruments trained on it. It is a wind tunnel, not a crystal ball.</w:t>
       </w:r>
     </w:p>
     <w:p>
       <w:pPr>
+        <w:jc w:val="both"/>
         <w:rPr>
           <w:rFonts w:asciiTheme="minorBidi" w:hAnsiTheme="minorBidi"/>
         </w:rPr>
@@ -3287,25 +4008,28 @@
     </w:p>
     <w:p>
       <w:pPr>
-        <w:pStyle w:val="Heading2"/>
-        <w:rPr>
-          <w:rFonts w:asciiTheme="minorBidi" w:hAnsiTheme="minorBidi" w:cstheme="minorBidi"/>
-        </w:rPr>
-      </w:pPr>
-      <w:r>
-        <w:rPr>
-          <w:rFonts w:asciiTheme="minorBidi" w:hAnsiTheme="minorBidi" w:cstheme="minorBidi"/>
+        <w:jc w:val="both"/>
+        <w:rPr>
+          <w:rFonts w:asciiTheme="minorBidi" w:hAnsiTheme="minorBidi"/>
+        </w:rPr>
+      </w:pPr>
+      <w:r>
+        <w:rPr>
+          <w:rFonts w:asciiTheme="minorBidi" w:hAnsiTheme="minorBidi"/>
         </w:rPr>
         <w:t>References</w:t>
       </w:r>
     </w:p>
     <w:p>
       <w:pPr>
-        <w:spacing w:after="80" w:line="276" w:lineRule="auto"/>
-        <w:ind w:left="576" w:hanging="576"/>
-      </w:pPr>
-      <w:r>
-        <w:rPr>
+        <w:jc w:val="both"/>
+        <w:rPr>
+          <w:rFonts w:asciiTheme="minorBidi" w:hAnsiTheme="minorBidi"/>
+        </w:rPr>
+      </w:pPr>
+      <w:r>
+        <w:rPr>
+          <w:rFonts w:asciiTheme="minorBidi" w:hAnsiTheme="minorBidi"/>
           <w:sz w:val="20"/>
         </w:rPr>
         <w:t>Ajibona, O. (2026). Beyond Digital Colonialism: AI Nationalism, Sovereignty, and the Misframing of Africa’s Technological Futures. Working paper.</w:t>
@@ -3313,11 +4037,14 @@
     </w:p>
     <w:p>
       <w:pPr>
-        <w:spacing w:after="80" w:line="276" w:lineRule="auto"/>
-        <w:ind w:left="576" w:hanging="576"/>
-      </w:pPr>
-      <w:r>
-        <w:rPr>
+        <w:jc w:val="both"/>
+        <w:rPr>
+          <w:rFonts w:asciiTheme="minorBidi" w:hAnsiTheme="minorBidi"/>
+        </w:rPr>
+      </w:pPr>
+      <w:r>
+        <w:rPr>
+          <w:rFonts w:asciiTheme="minorBidi" w:hAnsiTheme="minorBidi"/>
           <w:sz w:val="20"/>
         </w:rPr>
         <w:t>Center for a New American Security (2026). Sovereign AI’s Second Wave Is Coming Into View. CNAS Insights.</w:t>
@@ -3325,23 +4052,30 @@
     </w:p>
     <w:p>
       <w:pPr>
-        <w:spacing w:after="80" w:line="276" w:lineRule="auto"/>
-        <w:ind w:left="576" w:hanging="576"/>
-      </w:pPr>
-      <w:r>
-        <w:rPr>
+        <w:jc w:val="both"/>
+        <w:rPr>
+          <w:rFonts w:asciiTheme="minorBidi" w:hAnsiTheme="minorBidi"/>
+        </w:rPr>
+      </w:pPr>
+      <w:r>
+        <w:rPr>
+          <w:rFonts w:asciiTheme="minorBidi" w:hAnsiTheme="minorBidi"/>
           <w:sz w:val="20"/>
         </w:rPr>
+        <w:lastRenderedPageBreak/>
         <w:t>Center for Strategic and International Studies (2026). The Department of Commerce Restricted Access to Anthropic’s Latest Models: What Comes Next.</w:t>
       </w:r>
     </w:p>
     <w:p>
       <w:pPr>
-        <w:spacing w:after="80" w:line="276" w:lineRule="auto"/>
-        <w:ind w:left="576" w:hanging="576"/>
-      </w:pPr>
-      <w:r>
-        <w:rPr>
+        <w:jc w:val="both"/>
+        <w:rPr>
+          <w:rFonts w:asciiTheme="minorBidi" w:hAnsiTheme="minorBidi"/>
+        </w:rPr>
+      </w:pPr>
+      <w:r>
+        <w:rPr>
+          <w:rFonts w:asciiTheme="minorBidi" w:hAnsiTheme="minorBidi"/>
           <w:sz w:val="20"/>
         </w:rPr>
         <w:t>Derrida, J. (1984). No Apocalypse, Not Now (Full Speed Ahead, Seven Missiles, Seven Missives). Diacritics, 14(2), 20–31.</w:t>
@@ -3349,11 +4083,14 @@
     </w:p>
     <w:p>
       <w:pPr>
-        <w:spacing w:after="80" w:line="276" w:lineRule="auto"/>
-        <w:ind w:left="576" w:hanging="576"/>
-      </w:pPr>
-      <w:r>
-        <w:rPr>
+        <w:jc w:val="both"/>
+        <w:rPr>
+          <w:rFonts w:asciiTheme="minorBidi" w:hAnsiTheme="minorBidi"/>
+        </w:rPr>
+      </w:pPr>
+      <w:r>
+        <w:rPr>
+          <w:rFonts w:asciiTheme="minorBidi" w:hAnsiTheme="minorBidi"/>
           <w:sz w:val="20"/>
         </w:rPr>
         <w:t>Derrida, J. (1995). Archive Fever: A Freudian Impression. University of Chicago Press.</w:t>
@@ -3361,11 +4098,14 @@
     </w:p>
     <w:p>
       <w:pPr>
-        <w:spacing w:after="80" w:line="276" w:lineRule="auto"/>
-        <w:ind w:left="576" w:hanging="576"/>
-      </w:pPr>
-      <w:r>
-        <w:rPr>
+        <w:jc w:val="both"/>
+        <w:rPr>
+          <w:rFonts w:asciiTheme="minorBidi" w:hAnsiTheme="minorBidi"/>
+        </w:rPr>
+      </w:pPr>
+      <w:r>
+        <w:rPr>
+          <w:rFonts w:asciiTheme="minorBidi" w:hAnsiTheme="minorBidi"/>
           <w:sz w:val="20"/>
         </w:rPr>
         <w:t>Ezrahi, Y. (2012). Imagined Democracies: Necessary Political Fictions. Cambridge University Press.</w:t>
@@ -3373,11 +4113,14 @@
     </w:p>
     <w:p>
       <w:pPr>
-        <w:spacing w:after="80" w:line="276" w:lineRule="auto"/>
-        <w:ind w:left="576" w:hanging="576"/>
-      </w:pPr>
-      <w:r>
-        <w:rPr>
+        <w:jc w:val="both"/>
+        <w:rPr>
+          <w:rFonts w:asciiTheme="minorBidi" w:hAnsiTheme="minorBidi"/>
+        </w:rPr>
+      </w:pPr>
+      <w:r>
+        <w:rPr>
+          <w:rFonts w:asciiTheme="minorBidi" w:hAnsiTheme="minorBidi"/>
           <w:sz w:val="20"/>
         </w:rPr>
         <w:t>Fearon, J. D. (1995). Rationalist explanations for war. International Organization, 49(3), 379–414.</w:t>
@@ -3385,11 +4128,14 @@
     </w:p>
     <w:p>
       <w:pPr>
-        <w:spacing w:after="80" w:line="276" w:lineRule="auto"/>
-        <w:ind w:left="576" w:hanging="576"/>
-      </w:pPr>
-      <w:r>
-        <w:rPr>
+        <w:jc w:val="both"/>
+        <w:rPr>
+          <w:rFonts w:asciiTheme="minorBidi" w:hAnsiTheme="minorBidi"/>
+        </w:rPr>
+      </w:pPr>
+      <w:r>
+        <w:rPr>
+          <w:rFonts w:asciiTheme="minorBidi" w:hAnsiTheme="minorBidi"/>
           <w:sz w:val="20"/>
         </w:rPr>
         <w:t>Fishkin, J. S. (2009). When the People Speak: Deliberative Democracy and Public Consultation. Oxford University Press.</w:t>
@@ -3397,11 +4143,14 @@
     </w:p>
     <w:p>
       <w:pPr>
-        <w:spacing w:after="80" w:line="276" w:lineRule="auto"/>
-        <w:ind w:left="576" w:hanging="576"/>
-      </w:pPr>
-      <w:r>
-        <w:rPr>
+        <w:jc w:val="both"/>
+        <w:rPr>
+          <w:rFonts w:asciiTheme="minorBidi" w:hAnsiTheme="minorBidi"/>
+        </w:rPr>
+      </w:pPr>
+      <w:r>
+        <w:rPr>
+          <w:rFonts w:asciiTheme="minorBidi" w:hAnsiTheme="minorBidi"/>
           <w:sz w:val="20"/>
         </w:rPr>
         <w:t>Hendrycks, D., Schmidt, E., &amp; Wang, A. (2025). Superintelligence Strategy. arXiv:2503.05628.</w:t>
@@ -3409,11 +4158,14 @@
     </w:p>
     <w:p>
       <w:pPr>
-        <w:spacing w:after="80" w:line="276" w:lineRule="auto"/>
-        <w:ind w:left="576" w:hanging="576"/>
-      </w:pPr>
-      <w:r>
-        <w:rPr>
+        <w:jc w:val="both"/>
+        <w:rPr>
+          <w:rFonts w:asciiTheme="minorBidi" w:hAnsiTheme="minorBidi"/>
+        </w:rPr>
+      </w:pPr>
+      <w:r>
+        <w:rPr>
+          <w:rFonts w:asciiTheme="minorBidi" w:hAnsiTheme="minorBidi"/>
           <w:sz w:val="20"/>
         </w:rPr>
         <w:t>Hogarth, I. (2018). AI Nationalism. ianhogarth.com, 13 June 2018.</w:t>
@@ -3421,11 +4173,14 @@
     </w:p>
     <w:p>
       <w:pPr>
-        <w:spacing w:after="80" w:line="276" w:lineRule="auto"/>
-        <w:ind w:left="576" w:hanging="576"/>
-      </w:pPr>
-      <w:r>
-        <w:rPr>
+        <w:jc w:val="both"/>
+        <w:rPr>
+          <w:rFonts w:asciiTheme="minorBidi" w:hAnsiTheme="minorBidi"/>
+        </w:rPr>
+      </w:pPr>
+      <w:r>
+        <w:rPr>
+          <w:rFonts w:asciiTheme="minorBidi" w:hAnsiTheme="minorBidi"/>
           <w:sz w:val="20"/>
         </w:rPr>
         <w:t>International Institute for Strategic Studies (2026). Gulf AI Infrastructure and the Limits of Technological Sovereignty. Strategic Comments.</w:t>
@@ -3433,11 +4188,14 @@
     </w:p>
     <w:p>
       <w:pPr>
-        <w:spacing w:after="80" w:line="276" w:lineRule="auto"/>
-        <w:ind w:left="576" w:hanging="576"/>
-      </w:pPr>
-      <w:r>
-        <w:rPr>
+        <w:jc w:val="both"/>
+        <w:rPr>
+          <w:rFonts w:asciiTheme="minorBidi" w:hAnsiTheme="minorBidi"/>
+        </w:rPr>
+      </w:pPr>
+      <w:r>
+        <w:rPr>
+          <w:rFonts w:asciiTheme="minorBidi" w:hAnsiTheme="minorBidi"/>
           <w:sz w:val="20"/>
         </w:rPr>
         <w:t>Jervis, R. (1970). The Logic of Images in International Relations. Princeton University Press.</w:t>
@@ -3445,11 +4203,14 @@
     </w:p>
     <w:p>
       <w:pPr>
-        <w:spacing w:after="80" w:line="276" w:lineRule="auto"/>
-        <w:ind w:left="576" w:hanging="576"/>
-      </w:pPr>
-      <w:r>
-        <w:rPr>
+        <w:jc w:val="both"/>
+        <w:rPr>
+          <w:rFonts w:asciiTheme="minorBidi" w:hAnsiTheme="minorBidi"/>
+        </w:rPr>
+      </w:pPr>
+      <w:r>
+        <w:rPr>
+          <w:rFonts w:asciiTheme="minorBidi" w:hAnsiTheme="minorBidi"/>
           <w:sz w:val="20"/>
         </w:rPr>
         <w:t>Lee, K.-F. (2018). AI Superpowers: China, Silicon Valley, and the New World Order. Houghton Mifflin Harcourt.</w:t>
@@ -3457,11 +4218,14 @@
     </w:p>
     <w:p>
       <w:pPr>
-        <w:spacing w:after="80" w:line="276" w:lineRule="auto"/>
-        <w:ind w:left="576" w:hanging="576"/>
-      </w:pPr>
-      <w:r>
-        <w:rPr>
+        <w:jc w:val="both"/>
+        <w:rPr>
+          <w:rFonts w:asciiTheme="minorBidi" w:hAnsiTheme="minorBidi"/>
+        </w:rPr>
+      </w:pPr>
+      <w:r>
+        <w:rPr>
+          <w:rFonts w:asciiTheme="minorBidi" w:hAnsiTheme="minorBidi"/>
           <w:sz w:val="20"/>
         </w:rPr>
         <w:t>Perla, P. P. (1990). The Art of Wargaming. Naval Institute Press.</w:t>
@@ -3469,11 +4233,14 @@
     </w:p>
     <w:p>
       <w:pPr>
-        <w:spacing w:after="80" w:line="276" w:lineRule="auto"/>
-        <w:ind w:left="576" w:hanging="576"/>
-      </w:pPr>
-      <w:r>
-        <w:rPr>
+        <w:jc w:val="both"/>
+        <w:rPr>
+          <w:rFonts w:asciiTheme="minorBidi" w:hAnsiTheme="minorBidi"/>
+        </w:rPr>
+      </w:pPr>
+      <w:r>
+        <w:rPr>
+          <w:rFonts w:asciiTheme="minorBidi" w:hAnsiTheme="minorBidi"/>
           <w:sz w:val="20"/>
         </w:rPr>
         <w:t>Reshef Kera, D., Natan, O., Turgeman, M., &amp; Ofek, H. (2026). Europe’s AI future as a meta-sovereign imaginary: negotiating global norms, sovereign machines, and infrastructural futures through AI simulations. European Journal of Futures Research, 14(1). doi:10.1186/s40309-025-00261-9</w:t>
@@ -3481,11 +4248,14 @@
     </w:p>
     <w:p>
       <w:pPr>
-        <w:spacing w:after="80" w:line="276" w:lineRule="auto"/>
-        <w:ind w:left="576" w:hanging="576"/>
-      </w:pPr>
-      <w:r>
-        <w:rPr>
+        <w:jc w:val="both"/>
+        <w:rPr>
+          <w:rFonts w:asciiTheme="minorBidi" w:hAnsiTheme="minorBidi"/>
+        </w:rPr>
+      </w:pPr>
+      <w:r>
+        <w:rPr>
+          <w:rFonts w:asciiTheme="minorBidi" w:hAnsiTheme="minorBidi"/>
           <w:sz w:val="20"/>
         </w:rPr>
         <w:t>Sastry, G., Heim, L., Belfield, H., Anderljung, M., et al. (2024). Computing Power and the Governance of Artificial Intelligence. arXiv:2402.08797.</w:t>
@@ -3493,11 +4263,14 @@
     </w:p>
     <w:p>
       <w:pPr>
-        <w:spacing w:after="80" w:line="276" w:lineRule="auto"/>
-        <w:ind w:left="576" w:hanging="576"/>
-      </w:pPr>
-      <w:r>
-        <w:rPr>
+        <w:jc w:val="both"/>
+        <w:rPr>
+          <w:rFonts w:asciiTheme="minorBidi" w:hAnsiTheme="minorBidi"/>
+        </w:rPr>
+      </w:pPr>
+      <w:r>
+        <w:rPr>
+          <w:rFonts w:asciiTheme="minorBidi" w:hAnsiTheme="minorBidi"/>
           <w:sz w:val="20"/>
         </w:rPr>
         <w:t>Schelling, T. C. (1966). Arms and Influence. Yale University Press.</w:t>
@@ -3505,11 +4278,14 @@
     </w:p>
     <w:p>
       <w:pPr>
-        <w:spacing w:after="80" w:line="276" w:lineRule="auto"/>
-        <w:ind w:left="576" w:hanging="576"/>
-      </w:pPr>
-      <w:r>
-        <w:rPr>
+        <w:jc w:val="both"/>
+        <w:rPr>
+          <w:rFonts w:asciiTheme="minorBidi" w:hAnsiTheme="minorBidi"/>
+        </w:rPr>
+      </w:pPr>
+      <w:r>
+        <w:rPr>
+          <w:rFonts w:asciiTheme="minorBidi" w:hAnsiTheme="minorBidi"/>
           <w:sz w:val="20"/>
         </w:rPr>
         <w:t>Slachmuijlder, L. (2026). Between Escalation and Cooperation: AI Agents and Geopolitical Futures. Working paper.</w:t>
@@ -3517,11 +4293,14 @@
     </w:p>
     <w:p>
       <w:pPr>
-        <w:spacing w:after="80" w:line="276" w:lineRule="auto"/>
-        <w:ind w:left="576" w:hanging="576"/>
-      </w:pPr>
-      <w:r>
-        <w:rPr>
+        <w:jc w:val="both"/>
+        <w:rPr>
+          <w:rFonts w:asciiTheme="minorBidi" w:hAnsiTheme="minorBidi"/>
+        </w:rPr>
+      </w:pPr>
+      <w:r>
+        <w:rPr>
+          <w:rFonts w:asciiTheme="minorBidi" w:hAnsiTheme="minorBidi"/>
           <w:sz w:val="20"/>
         </w:rPr>
         <w:t>Spitz, A. (2026). AI Has a Territory: Data Centers, Sovereignty, and the Geopolitics of AI Infrastructure. Working paper.</w:t>
@@ -3529,11 +4308,14 @@
     </w:p>
     <w:p>
       <w:pPr>
-        <w:spacing w:after="80" w:line="276" w:lineRule="auto"/>
-        <w:ind w:left="576" w:hanging="576"/>
-      </w:pPr>
-      <w:r>
-        <w:rPr>
+        <w:jc w:val="both"/>
+        <w:rPr>
+          <w:rFonts w:asciiTheme="minorBidi" w:hAnsiTheme="minorBidi"/>
+        </w:rPr>
+      </w:pPr>
+      <w:r>
+        <w:rPr>
+          <w:rFonts w:asciiTheme="minorBidi" w:hAnsiTheme="minorBidi"/>
           <w:sz w:val="20"/>
         </w:rPr>
         <w:t>Usher, J. (2026). The Algorithmic Insurgent: Stress-Testing Sovereignty in the AI Cold War’s Shadow Economy. Working paper.</w:t>
@@ -3541,11 +4323,14 @@
     </w:p>
     <w:p>
       <w:pPr>
-        <w:spacing w:after="80" w:line="276" w:lineRule="auto"/>
-        <w:ind w:left="576" w:hanging="576"/>
-      </w:pPr>
-      <w:r>
-        <w:rPr>
+        <w:jc w:val="both"/>
+        <w:rPr>
+          <w:rFonts w:asciiTheme="minorBidi" w:hAnsiTheme="minorBidi"/>
+        </w:rPr>
+      </w:pPr>
+      <w:r>
+        <w:rPr>
+          <w:rFonts w:asciiTheme="minorBidi" w:hAnsiTheme="minorBidi"/>
           <w:sz w:val="20"/>
         </w:rPr>
         <w:t>Wack, P. (1985). Scenarios: Uncharted Waters Ahead. Harvard Business Review, September 1985.</w:t>
@@ -3553,23 +4338,30 @@
     </w:p>
     <w:p>
       <w:pPr>
-        <w:spacing w:after="80" w:line="276" w:lineRule="auto"/>
-        <w:ind w:left="576" w:hanging="576"/>
-      </w:pPr>
-      <w:r>
-        <w:rPr>
+        <w:jc w:val="both"/>
+        <w:rPr>
+          <w:rFonts w:asciiTheme="minorBidi" w:hAnsiTheme="minorBidi"/>
+        </w:rPr>
+      </w:pPr>
+      <w:r>
+        <w:rPr>
+          <w:rFonts w:asciiTheme="minorBidi" w:hAnsiTheme="minorBidi"/>
           <w:sz w:val="20"/>
         </w:rPr>
+        <w:lastRenderedPageBreak/>
         <w:t>Wall Street Journal (2026). U.S. Used Promise of Nvidia Chips to Broker Armenia–Azerbaijan Peace Deal.</w:t>
       </w:r>
     </w:p>
     <w:p>
       <w:pPr>
-        <w:spacing w:after="80" w:line="276" w:lineRule="auto"/>
-        <w:ind w:left="576" w:hanging="576"/>
-      </w:pPr>
-      <w:r>
-        <w:rPr>
+        <w:jc w:val="both"/>
+        <w:rPr>
+          <w:rFonts w:asciiTheme="minorBidi" w:hAnsiTheme="minorBidi"/>
+        </w:rPr>
+      </w:pPr>
+      <w:r>
+        <w:rPr>
+          <w:rFonts w:asciiTheme="minorBidi" w:hAnsiTheme="minorBidi"/>
           <w:sz w:val="20"/>
         </w:rPr>
         <w:t>Weber, C. (1995). Simulating Sovereignty: Intervention, the State, and Symbolic Exchange. Cambridge University Press.</w:t>

</xml_diff>

<commit_message>
ARTICLE: remove Dotan citation, integrate Ajibona digital-colonialism contribution
The Tensor Dreamscapes integration was wrong for this paper and is
fully removed (reflexivity passage, interpretive-stack passage,
reference entry). In its place the article gains Ajibona's actual
contribution: section 2.7 now carries the digital-colonialism
literature, the Africa-agency critique of it, and the reframe that
invoking digital colonialism is itself a meta-sovereign signal
(instrumentalized vulnerability), with ripples in the Discussion
power-lens paragraph and the Conclusion's cast-expansion test.
Six references added (Kwet, Birhane, Coleman, Brown, Coffie & Tiky,
Allen & La Lime), list renumbered to 35, header note now names
references instead of numbering them. DOCX rebuilt.

Co-Authored-By: Claude Fable 5 <noreply@anthropic.com>
</commit_message>
<xml_diff>
--- a/paper-rehearsing-sovereignty/Rehearsing-Sovereignty.docx
+++ b/paper-rehearsing-sovereignty/Rehearsing-Sovereignty.docx
@@ -15,7 +15,7 @@
         <w:rPr>
           <w:i/>
         </w:rPr>
-        <w:t>Revised full draft, 3 October 2026. This version incorporates the cleaned corpus analyses (ANALYSES.md): the classifier and act-contingency results now lead the coding section, the intervention figures are the cleaned before-and-after numbers, and the reflexivity probe and the second-coder check are reported as results. It adds the Operation A7A5 shadow-economy section (Usher) and the Dotan and Reshef Kera citation. Companion to the meta-sovereignty paper. Charts and real generated posters/front pages are in the published artifact and the DOCX. No em-dashes, no semicolons. Revision note: the volume, page, and report numbers on references 7, 13, 19, 22, and 27, and the publisher names on the money and infrastructure references, were added from the publication record rather than from the collaborator texts, and they fall under the pre-submission citation check already promised for the sanctions listings.</w:t>
+        <w:t>Revised full draft, 3 October 2026. This version incorporates the cleaned corpus analyses (ANALYSES.md): the classifier and act-contingency results now lead the coding section, the intervention figures are the cleaned before-and-after numbers, and the reflexivity probe and the second-coder check are reported as results. It adds the Operation A7A5 shadow-economy section (Usher) and the digital-colonialism-as-meta-sovereignty reframe (Ajibona). Companion to the meta-sovereignty paper. Charts and real generated posters/front pages are in the published artifact and the DOCX. No em-dashes, no semicolons. Revision note: the volume, page, and report numbers on the Derrida (1986), Farrell and Newman, Larkin, Pozsar et al., and Star entries, and the publisher names on the money and infrastructure references, were added from the publication record rather than from the collaborator texts. The digital-colonialism entries follow Ajibona's contribution bibliography, with two incomplete page spans left for lookup. All of these fall under the pre-submission citation check already promised for the sanctions listings.</w:t>
       </w:r>
     </w:p>
     <w:p>
@@ -195,7 +195,17 @@
     </w:p>
     <w:p>
       <w:r>
-        <w:t>Two final moves relocate the object. Ajibona's (2026) work on digital colonialism and the Global South supplies the casting question: within any performance of sovereignty, some parties are cast as actors and others as territory, market, or mineral, and the distribution of those roles is itself an exercise of power that the dramaturgy naturalises. Usher's (2026) account of the shadow economy relocates the performance to a second stage, the off-book money of the sanctions era, where sovereignty is rehearsed through payment systems rather than language, a move developed in full in the Operation A7A5 section below. Between them they widen the performance's cast and its stage.</w:t>
+        <w:t>Two final moves relocate the object. Ajibona's (2026) work on digital colonialism and the Global South supplies the casting question: within any performance of sovereignty, some parties are cast as actors and others as territory, market, or mineral, and the distribution of those roles is itself an exercise of power that the dramaturgy naturalises.</w:t>
+      </w:r>
+    </w:p>
+    <w:p>
+      <w:r>
+        <w:t>The casting question cuts both ways, and the second edge matters as much as the first. The digital-colonialism literature reads the dominance of American and Chinese platforms over the Global South as a structural form of domination "exercised through the centralized ownership and control of the three core pillars of the digital ecosystem: software, hardware, and network connectivity" (Kwet, 2019), with Africa at its center, whether as the site of algorithmic colonization (Birhane, 2020) or of data extraction under weak data law (Coleman, 2019). Ajibona accepts the asymmetries the literature documents and rejects the passivity its casting implies, drawing on the international-relations scholarship that records African states exerting agency in security, trade, and technology choices (Brown, 2012, Coffie and Tiky, 2021) and on cases where governments diversify technology partners precisely so that no provider dominates (Allen and La Lime, 2024). The move that joins this article is the reframe that follows. The language of digital colonialism is itself a meta-sovereign signal. A state that lacks material control over digital infrastructure can invoke colonial domination to articulate its vulnerability and, in the same gesture, assert authority over how technology should operate on its territory. Ajibona names this instrumentalized vulnerability, "the strategic presentation of technological weakness as a basis for making claims to sovereignty, autonomy, and normative authority." Performed sovereignty is then not the preserve of the powers that hold the stack. It is a repertoire available to the parties the dramaturgy casts as territory, and the casting question becomes an empirical one the roundtable can test by seating those parties as agents.</w:t>
+      </w:r>
+    </w:p>
+    <w:p>
+      <w:r>
+        <w:t>Usher's (2026) account of the shadow economy relocates the performance to a second stage, the off-book money of the sanctions era, where sovereignty is rehearsed through payment systems rather than language, a move developed in full in the Operation A7A5 section below. Between them they widen the performance's cast and its stage.</w:t>
       </w:r>
     </w:p>
     <w:p>
@@ -369,7 +379,7 @@
     </w:p>
     <w:p>
       <w:r>
-        <w:t>The models are trained on the same discourse the rehearsal studies, so the staging can reproduce the imaginaries it sets out to interrogate. The limit is real but bounded, and it is the inversion Keller names, from Mutually Assured Destruction to Model Autophagy Disorder, the collapse a system risks when it is fed its own output. The vocabulary of the limit is itself figurative. Hallucination and autophagy are generative metaphors, and Dotan and Reshef Kera (2026) trace how such explicitly metaphorical terms acquire epistemic authority once they stabilize in diagnostic categories, a drift they call epistemic slippage. We use both words as analytic shorthand for patterns in the output, never as claims about mechanism. The limit is most acute in the layers where the arrangement turns on its own record, the recap, the james-take, and the wiki-proposals, where the machine reads what the machine produced. Naming the limit belongs to the discipline and does not lift it. The point at which the rehearsal starts to echo rather than differentiate is itself readable in the record, and reading for it, rather than assuming it away, is why the method claims to test scenarios rather than predict them. A first empirical probe of the limit, two sessions run under a shared-origin prompt, is reported with the results.</w:t>
+        <w:t>The models are trained on the same discourse the rehearsal studies, so the staging can reproduce the imaginaries it sets out to interrogate. The limit is real but bounded, and it is the inversion Keller names, from Mutually Assured Destruction to Model Autophagy Disorder, the collapse a system risks when it is fed its own output. The limit is most acute in the layers where the arrangement turns on its own record, the recap, the james-take, and the wiki-proposals, where the machine reads what the machine produced. Naming the limit belongs to the discipline and does not lift it. The point at which the rehearsal starts to echo rather than differentiate is itself readable in the record, and reading for it, rather than assuming it away, is why the method claims to test scenarios rather than predict them. A first empirical probe of the limit, two sessions run under a shared-origin prompt, is reported with the results.</w:t>
       </w:r>
     </w:p>
     <w:p>
@@ -1008,7 +1018,7 @@
     </w:p>
     <w:p>
       <w:r>
-        <w:t>The main claim follows from the structure just described. Since sovereignty here is performed rather than held, no rendering escapes the theatre it examines. Coding, purification into slogan, dissection into official and buried, caricature: each is a re-performance, a staging of the same roles by other means. Satire recasts the same roles rather than commenting from outside the theatre, so the interpretation of performed power is one more performance of it. The stack also has an exact parallel in what Dotan and Reshef Kera (2026) identify as the three sites at which AI metaphors stabilize: architectural, when a metaphor organizes system design, cultural, when it becomes the public interpretive category, and diagnostic, when it enters the categories of evaluation and governance. The registers here run the same traverse with sovereignty talk. The vocabulary does architectural work in prompt and corpus design, cultural work in the slogan and the tabloid front page, and diagnostic work in the coding dictionary, the same words carrying different epistemic authority at each distance. That is the reflexive limit of the method, and it is also why the method can put the maintenance work of sovereignty on record at all.</w:t>
+        <w:t>The main claim follows from the structure just described. Since sovereignty here is performed rather than held, no rendering escapes the theatre it examines. Coding, purification into slogan, dissection into official and buried, caricature: each is a re-performance, a staging of the same roles by other means. Satire recasts the same roles rather than commenting from outside the theatre, so the interpretation of performed power is one more performance of it. That is the reflexive limit of the method, and it is also why the method can put the maintenance work of sovereignty on record at all.</w:t>
       </w:r>
     </w:p>
     <w:p>
@@ -1273,7 +1283,7 @@
     </w:p>
     <w:p>
       <w:r>
-        <w:t>The power lens taken from Ajibona (2026) is the borrowing the method does not resolve, and it marks a standing limit. On the pre-cleaning first pass, references across blocs were measurably uneven: the United States agent was the most-named party, and the casting of third parties as objects, the Gulf, the Global South, Taiwan, came more from the European Union and China agents than from the United States agent. No cleaned count yet backs those figures, so the direction is reported as provisional and awaits recomputation. The staging records who is written as an actor and who as territory, market, or mineral. It does not correct the pattern. Because the humans who set the prompts and the models that answer sit inside the same discourse, the asymmetry of casting is reproduced by the staging rather than escaped through it. The shadow economy Usher names is the one component the roundtable's registers cannot stage directly, and the article reaches it by other means: the Operation A7A5 section reads the same performance of sovereignty off the public ledger, where the forensic record supplies the contestation that no human can deliver in a room.</w:t>
+        <w:t>The power lens taken from Ajibona (2026) is the borrowing the method does not resolve, and it marks a standing limit. On the pre-cleaning first pass, references across blocs were measurably uneven: the United States agent was the most-named party, and the casting of third parties as objects, the Gulf, the Global South, Taiwan, came more from the European Union and China agents than from the United States agent. No cleaned count yet backs those figures, so the direction is reported as provisional and awaits recomputation. The staging records who is written as an actor and who as territory, market, or mineral. It does not correct the pattern. Because the humans who set the prompts and the models that answer sit inside the same discourse, the asymmetry of casting is reproduced by the staging rather than escaped through it. Ajibona's reframe turns the limit into a design. If invoking domination is itself a sovereignty performance available to the parties cast as territory, his instrumentalized vulnerability, then the direct test is to seat the Global South, India, and the Gulf as agents rather than objects and watch whether the casting pattern survives, the cast-expansion experiment the program already specifies. The shadow economy Usher names is the one component the roundtable's registers cannot stage directly, and the article reaches it by other means: the Operation A7A5 section reads the same performance of sovereignty off the public ledger, where the forensic record supplies the contestation that no human can deliver in a room.</w:t>
       </w:r>
     </w:p>
     <w:p>
@@ -1301,7 +1311,7 @@
     </w:p>
     <w:p>
       <w:r>
-        <w:t>What this opens is a program of hypotheses, each with its designed test already specified. The stance coding already carries its own check, and the check failed: a second automated coder agreed with the dictionary at chance on a 60-turn sample, kappa 0.0, which bounds every stance number reported here and makes human validation the next step, with a stratified double-coded subsample gated at Krippendorff's alpha of 0.67 or above. The intervention effect should be examined through deliberate, designed interventions rather than the 20 incidental human turns the corpus happened to record, with the intervention content coded so that responsiveness to an offered compromise is not counted as a posture giving way, and with cooperative, adversarial, and archival summons separated instead of pooled. The reflexivity limit now has a first measurement, the drop in pairwise distinctiveness from 0.208 to 0.177 over two shared-origin sessions, and the powered A/B with the model-swap control is the design that can turn that suggestion into a result while also separating persona-driven from backend-driven distinctiveness, the one experiment that lifts the governing confound. Because the same confrontation is rendered across debate, propaganda-lab, mirror-world, and satire, a single proposition can be traced across registers to ask what each interpretive distance keeps and what it loses. And the forensic register suggests a standing extension: pairing synthetic rehearsal with on-chain forensics wherever a sovereignty claim has a ledger-legible counterpart, so that the posture and its giving-way can be read on both stages at once. Each of these is now a question the instrument lets us put.</w:t>
+        <w:t>What this opens is a program of hypotheses, each with its designed test already specified. The stance coding already carries its own check, and the check failed: a second automated coder agreed with the dictionary at chance on a 60-turn sample, kappa 0.0, which bounds every stance number reported here and makes human validation the next step, with a stratified double-coded subsample gated at Krippendorff's alpha of 0.67 or above. The intervention effect should be examined through deliberate, designed interventions rather than the 20 incidental human turns the corpus happened to record, with the intervention content coded so that responsiveness to an offered compromise is not counted as a posture giving way, and with cooperative, adversarial, and archival summons separated instead of pooled. The casting asymmetry has its designed test as well: running the parties now cast as objects, the Global South, India, and the Gulf, as seated agents, to ask whether the pattern belongs to the apparatus or to the discourse it stages, and whether the invocation of domination works as the sovereign signal Ajibona describes once the invoking party holds a seat. The reflexivity limit now has a first measurement, the drop in pairwise distinctiveness from 0.208 to 0.177 over two shared-origin sessions, and the powered A/B with the model-swap control is the design that can turn that suggestion into a result while also separating persona-driven from backend-driven distinctiveness, the one experiment that lifts the governing confound. Because the same confrontation is rendered across debate, propaganda-lab, mirror-world, and satire, a single proposition can be traced across registers to ask what each interpretive distance keeps and what it loses. And the forensic register suggests a standing extension: pairing synthetic rehearsal with on-chain forensics wherever a sovereignty claim has a ledger-legible counterpart, so that the posture and its giving-way can be read on both stages at once. Each of these is now a question the instrument lets us put.</w:t>
       </w:r>
     </w:p>
     <w:p>
@@ -1325,6 +1335,30 @@
         <w:pStyle w:val="ListNumber"/>
       </w:pPr>
       <w:r>
+        <w:t>Allen, N. D. F., &amp; La Lime, M. (2024). New technology, old strategy: Cyberspace and the international politics of African agency. Journal of Strategic Studies.</w:t>
+      </w:r>
+    </w:p>
+    <w:p>
+      <w:pPr>
+        <w:pStyle w:val="ListNumber"/>
+      </w:pPr>
+      <w:r>
+        <w:t>Birhane, A. (2020). Algorithmic colonization of Africa. SCRIPTed, 17(2).</w:t>
+      </w:r>
+    </w:p>
+    <w:p>
+      <w:pPr>
+        <w:pStyle w:val="ListNumber"/>
+      </w:pPr>
+      <w:r>
+        <w:t>Brown, W. (2012). A question of agency: Africa in international politics. Third World Quarterly, 33, 1889–1908.</w:t>
+      </w:r>
+    </w:p>
+    <w:p>
+      <w:pPr>
+        <w:pStyle w:val="ListNumber"/>
+      </w:pPr>
+      <w:r>
         <w:t>Center for a New American Security (2026). Sovereign AI's Second Wave Is Coming Into View. CNAS Insights.</w:t>
       </w:r>
     </w:p>
@@ -1341,7 +1375,23 @@
         <w:pStyle w:val="ListNumber"/>
       </w:pPr>
       <w:r>
+        <w:t>Coffie, A., &amp; Tiky, L. (2021). Exploring Africa's agency in international politics. Africa Spectrum, 56(3), 240–247.</w:t>
+      </w:r>
+    </w:p>
+    <w:p>
+      <w:pPr>
+        <w:pStyle w:val="ListNumber"/>
+      </w:pPr>
+      <w:r>
         <w:t>Cohen, B. J. (1998). The Geography of Money. Cornell University Press.</w:t>
+      </w:r>
+    </w:p>
+    <w:p>
+      <w:pPr>
+        <w:pStyle w:val="ListNumber"/>
+      </w:pPr>
+      <w:r>
+        <w:t>Coleman, D. (2019). Digital colonialism: The 21st century scramble for Africa through the extraction and control of user data and the limitations of data protection laws. Michigan Journal of Race and Law, 24, 417–438.</w:t>
       </w:r>
     </w:p>
     <w:p>
@@ -1382,14 +1432,6 @@
       </w:pPr>
       <w:r>
         <w:t>Dodd, N. (2014). The Social Life of Money. Princeton University Press.</w:t>
-      </w:r>
-    </w:p>
-    <w:p>
-      <w:pPr>
-        <w:pStyle w:val="ListNumber"/>
-      </w:pPr>
-      <w:r>
-        <w:t>Dotan, A., &amp; Reshef Kera, D. (2026). Tensor Dreamscapes: The Epistemic Power of AI Metaphors. Working paper.</w:t>
       </w:r>
     </w:p>
     <w:p>
@@ -1454,6 +1496,14 @@
       </w:pPr>
       <w:r>
         <w:t>International Institute for Strategic Studies (2026). Gulf AI Infrastructure and the Limits of Technological Sovereignty. Strategic Comments.</w:t>
+      </w:r>
+    </w:p>
+    <w:p>
+      <w:pPr>
+        <w:pStyle w:val="ListNumber"/>
+      </w:pPr>
+      <w:r>
+        <w:t>Kwet, M. (2019). Digital colonialism: US empire and the new imperialism in the Global South. Race &amp; Class, 60(4), 3–26.</w:t>
       </w:r>
     </w:p>
     <w:p>

</xml_diff>

<commit_message>
ARTICLE: add Usher's front-page reading of claim P to the A7A5 section
The last uncovered piece of his contribution: the mirror-world front
page staging the state-stablecoin claim as event and reaction, with
usher_fig1.png embedded. DOCX rebuilt, now thirteen figures.

Co-Authored-By: Claude Fable 5 <noreply@anthropic.com>
</commit_message>
<xml_diff>
--- a/paper-rehearsing-sovereignty/Rehearsing-Sovereignty.docx
+++ b/paper-rehearsing-sovereignty/Rehearsing-Sovereignty.docx
@@ -1100,6 +1100,62 @@
     </w:p>
     <w:p>
       <w:r>
+        <w:t>The mirror-world register renders P as well. Its front page stages a state stablecoin as scandal and response, sovereignty as an event the rest of the world is forced to answer, the performance seeking approval in the eyes of its opponent. Of the registers, the front page is the most complete as a story and the emptiest in substance, and the ledger below shows why.</w:t>
+      </w:r>
+    </w:p>
+    <w:p>
+      <w:pPr>
+        <w:jc w:val="center"/>
+      </w:pPr>
+      <w:r>
+        <w:drawing>
+          <wp:inline xmlns:a="http://schemas.openxmlformats.org/drawingml/2006/main" xmlns:pic="http://schemas.openxmlformats.org/drawingml/2006/picture">
+            <wp:extent cx="5486400" cy="5486400"/>
+            <wp:docPr id="11" name="Picture 11"/>
+            <wp:cNvGraphicFramePr>
+              <a:graphicFrameLocks noChangeAspect="1"/>
+            </wp:cNvGraphicFramePr>
+            <a:graphic>
+              <a:graphicData uri="http://schemas.openxmlformats.org/drawingml/2006/picture">
+                <pic:pic>
+                  <pic:nvPicPr>
+                    <pic:cNvPr id="0" name="usher_fig1.png"/>
+                    <pic:cNvPicPr/>
+                  </pic:nvPicPr>
+                  <pic:blipFill>
+                    <a:blip r:embed="rId19"/>
+                    <a:stretch>
+                      <a:fillRect/>
+                    </a:stretch>
+                  </pic:blipFill>
+                  <pic:spPr>
+                    <a:xfrm>
+                      <a:off x="0" y="0"/>
+                      <a:ext cx="5486400" cy="5486400"/>
+                    </a:xfrm>
+                    <a:prstGeom prst="rect"/>
+                  </pic:spPr>
+                </pic:pic>
+              </a:graphicData>
+            </a:graphic>
+          </wp:inline>
+        </w:drawing>
+      </w:r>
+    </w:p>
+    <w:p>
+      <w:pPr>
+        <w:jc w:val="center"/>
+      </w:pPr>
+      <w:r>
+        <w:rPr>
+          <w:i/>
+          <w:sz w:val="18"/>
+        </w:rPr>
+        <w:t>mirror-world front page on the state-stablecoin claim, . A generated fiction carrying invented detail that belongs to the register and to no record</w:t>
+      </w:r>
+    </w:p>
+    <w:p>
+      <w:r>
         <w:t>Now the ledger. A7A5 is issued by Old Vector LLC, registered in Kyrgyzstan. The scheme is reported to be run by the A7 Group and connected to the sanctioned individual Ilan Shor, a link the record marks SUSPECTED, and its ruble reserves are reported to be held at Promsvyazbank, a Russian state-owned bank with defense links, also SUSPECTED. The sanctioned status of Old Vector, Ilan Shor, Promsvyazbank, and the exchange Garantex is CONFIRMED on the public record, with the exact listings still to be checked before submission.</w:t>
       </w:r>
     </w:p>
@@ -1126,7 +1182,7 @@
         <w:drawing>
           <wp:inline xmlns:a="http://schemas.openxmlformats.org/drawingml/2006/main" xmlns:pic="http://schemas.openxmlformats.org/drawingml/2006/picture">
             <wp:extent cx="5486400" cy="3336324"/>
-            <wp:docPr id="11" name="Picture 11"/>
+            <wp:docPr id="12" name="Picture 12"/>
             <wp:cNvGraphicFramePr>
               <a:graphicFrameLocks noChangeAspect="1"/>
             </wp:cNvGraphicFramePr>
@@ -1138,7 +1194,7 @@
                     <pic:cNvPicPr/>
                   </pic:nvPicPr>
                   <pic:blipFill>
-                    <a:blip r:embed="rId19"/>
+                    <a:blip r:embed="rId20"/>
                     <a:stretch>
                       <a:fillRect/>
                     </a:stretch>
@@ -1182,7 +1238,7 @@
         <w:drawing>
           <wp:inline xmlns:a="http://schemas.openxmlformats.org/drawingml/2006/main" xmlns:pic="http://schemas.openxmlformats.org/drawingml/2006/picture">
             <wp:extent cx="5486400" cy="4226011"/>
-            <wp:docPr id="12" name="Picture 12"/>
+            <wp:docPr id="13" name="Picture 13"/>
             <wp:cNvGraphicFramePr>
               <a:graphicFrameLocks noChangeAspect="1"/>
             </wp:cNvGraphicFramePr>
@@ -1194,7 +1250,7 @@
                     <pic:cNvPicPr/>
                   </pic:nvPicPr>
                   <pic:blipFill>
-                    <a:blip r:embed="rId20"/>
+                    <a:blip r:embed="rId21"/>
                     <a:stretch>
                       <a:fillRect/>
                     </a:stretch>

</xml_diff>

<commit_message>
ARTICLE: academic-prose-stylist pass over the full draft
Sentence-level de-AI-ing: fragment openers rewritten (The debate
record first / Now the ledger / Consider the count), metadiscourse
dropped (section roadmap sentences, "we name what the instrument
produces"), one antithesis template and one comma splice removed,
doubled claims merged in the interpretive-stack close, colloquialisms
replaced (gets tested, you can read off, travel without denominators,
forcing function). All citations, quotations and numbers unchanged.
Scan clean: zero em-dashes, zero semicolons.

Co-Authored-By: Claude Fable 5 <noreply@anthropic.com>
</commit_message>
<xml_diff>
--- a/paper-rehearsing-sovereignty/Rehearsing-Sovereignty.docx
+++ b/paper-rehearsing-sovereignty/Rehearsing-Sovereignty.docx
@@ -33,7 +33,7 @@
     </w:p>
     <w:p>
       <w:r>
-        <w:t>The rivalry over artificial intelligence between the United States and China is commonly described as a race for the best models and the largest supply of compute. This description assumes that the nation-state is the unit of power, that winning means owning a sovereign AI system, and that authority follows capability. Current practice contradicts all three, since states now assert sovereignty through infrastructure they neither own nor operate, financed and controlled by others. We build on the concept of meta-sovereignty, which treats authority as performed through signals, imaginaries, and infrastructural promises rather than exercised through enforceable control. Meta-sovereignty has so far been studied only after the fact, from finished announcements. We add a way to observe it as it happens. Synthetic rehearsal stages performed sovereignty with language-model agents and treats human intervention and prompt design as experimental controls. Three agents argue as China, the United States, and the European Union, each grounded in a distinct policy corpus, while participants interrupt them, reprompt them, and introduce further agents. Across thirty-six substantive sessions, 895 cleaned agent turns in all, a classifier reading only the text predicts which agent produced a turn with 88.8 percent accuracy against a 36.8 percent baseline, so the three configured personae occupy separable registers, though each persona runs on its own model under its own prompt and the separation cannot by itself distinguish performed difference from model idiosyncrasy. Concession is rare, 5 percent of coded acts, and once it appears it raises the odds of another concession more than threefold over chance, and a turn that follows a human or guest intervention moves from accusation toward concession, a direction that survives text cleaning while its magnitude remains provisional. A companion case study traces the same posture-then-concession shape on a second stage, reading the Russian ruble-linked stablecoin A7A5 through on-chain forensics, where the performance of monetary exit gives way at the point of conversion back to a dollar-linked asset. The method yields evidence about what is said, not about model internals, state intentions, or future events. Its aim is deliberative rather than predictive. Where war games are held privately among security professionals, a synthetic rehearsal is inexpensive and repeatable, and it lets citizens, civil-society organizations, and elected representatives question the positions of the major powers and examine which AI futures they would defend.</w:t>
+        <w:t>The rivalry over artificial intelligence between the United States and China is commonly described as a race for the best models and the largest supply of compute. This description assumes that the nation-state is the unit of power, that winning means owning a sovereign AI system, and that authority follows capability. Current practice contradicts all three, since states now assert sovereignty through infrastructure they neither own nor operate, financed and controlled by others. We build on the concept of meta-sovereignty, which treats authority as performed through signals, imaginaries, and infrastructural promises rather than exercised through enforceable control. Meta-sovereignty has so far been studied only after the fact, from finished announcements. We add a way to observe it as it happens. Synthetic rehearsal stages performed sovereignty with language-model agents and treats human intervention and prompt design as experimental controls. Three agents argue as China, the United States, and the European Union, each grounded in a distinct policy corpus, while participants interrupt them, reprompt them, and introduce further agents. Across thirty-six substantive sessions, 895 cleaned agent turns in all, a classifier reading only the text predicts which agent produced a turn with 88.8 percent accuracy against a 36.8 percent baseline, so the three configured personae occupy separable registers, though each persona runs on its own model under its own prompt and the separation cannot by itself distinguish performed difference from model idiosyncrasy. Concession is rare, 5 percent of coded acts, yet once it appears it raises the odds of another concession more than threefold over chance. A turn that follows a human or guest intervention moves from accusation toward concession, a direction that survives text cleaning while the magnitude remains provisional. A companion case study traces the same posture-then-concession shape on a second stage, reading the Russian ruble-linked stablecoin A7A5 through on-chain forensics, where the performance of monetary exit gives way at the point of conversion back to a dollar-linked asset. The method yields evidence about what is said, not about model internals, state intentions, or future events. Its aim is deliberative rather than predictive. Where war games are held privately among security professionals, a synthetic rehearsal is inexpensive and repeatable, and it lets citizens, civil-society organizations, and elected representatives question the positions of the major powers and examine which AI futures they would defend.</w:t>
       </w:r>
     </w:p>
     <w:p>
@@ -51,7 +51,7 @@
     </w:p>
     <w:p>
       <w:r>
-        <w:t>Consider the count. The Center for a New American Security records one hundred and eighty-four government-backed sovereign-AI projects across sixty-seven states, most of them dependent on foreign chips, clouds, or models (CNAS, 2026). As a tally of announcements the figure is neutral. Set against the dependence it exposes, the figure shows something the race cannot accommodate: states declare sovereignty through infrastructure they do not control, so capability and authority come apart rather than move together. The instrument of leverage has also shifted from ownership to access. The United States has extended control from the export of chips to the licensing of access to frontier models themselves (CSIS, 2026), and the diffusion of compute now turns on who grants entry to a supply chain rather than who holds it outright (Sastry et al., 2024). A single episode makes the point concrete. The promise of Nvidia chips reportedly figured in the diplomacy around the Armenia-Azerbaijan settlement (Wall Street Journal, 2026). Whatever the exact mechanism, chip access there worked less as a measure of who held the best model than as a bargaining instrument, a signal traded among parties none of whom was the strongest builder. Investment can deepen the same dependence it is meant to escape, as the Gulf states' infrastructure spending shows (IISS, 2026). In each case the medium of the performance is the stack itself, and the actors who matter extend well beyond the two presumed racers.</w:t>
+        <w:t>The Center for a New American Security records one hundred and eighty-four government-backed sovereign-AI projects across sixty-seven states, most of them dependent on foreign chips, clouds, or models (CNAS, 2026). Read as a tally of announcements the figure is neutral, and read against the dependence it records it shows something the race cannot accommodate: states declare sovereignty through infrastructure they do not control, so capability and authority come apart rather than move together. The instrument of leverage has also shifted from ownership to access. The United States has extended control from the export of chips to the licensing of access to frontier models themselves (CSIS, 2026), and the diffusion of compute now turns on who grants entry to a supply chain rather than who holds it outright (Sastry et al., 2024). A single episode makes the point concrete. The promise of Nvidia chips reportedly figured in the diplomacy around the Armenia-Azerbaijan settlement (Wall Street Journal, 2026). Whatever the exact mechanism, chip access there worked less as a measure of who held the best model than as a bargaining instrument, a signal traded among parties none of whom was the strongest builder. Investment can deepen the same dependence it is meant to escape, as the Gulf states' infrastructure spending shows (IISS, 2026). In each case the medium of the performance is the stack itself, and the actors who matter extend well beyond the two presumed racers.</w:t>
       </w:r>
     </w:p>
     <w:p>
@@ -61,7 +61,7 @@
     </w:p>
     <w:p>
       <w:r>
-        <w:t>We build an instrument for observing that work as it happens, and we name what the instrument produces. The instrument is a human-AI roundtable. Three language-model agents argue as China, the United States, and the European Union, each reading its own policy corpus, while human participants set the opening prompt, interrupt, reprompt, and introduce further agents. The concept is synthetic rehearsal: a multi-agent language-model staging, with human intervention and prompt design as experimental controls, that externalizes the maintenance of performed sovereignty and its points of failure so that both can be observed under live contestation. Three commitments bound the claim. The evidence is output-level, consisting of transcripts and generated artifacts, and it licenses no inference about model internals or the real intentions of any state. The method studies how sovereignty imaginaries become legible, circulate, and are contested, and it neither forecasts outcomes nor measures capability. The models are trained on the same discourse the roundtable examines, so the rehearsal can reproduce the imaginaries it interrogates, a reflexivity we treat as a standing limit. Agency belongs to the arrangement as a whole, to models, corpora, prompts, interface, participants, and audience together, and not to any agent alone.</w:t>
+        <w:t>We build an instrument for observing that work as it happens. The instrument is a human-AI roundtable. Three language-model agents argue as China, the United States, and the European Union, each reading its own policy corpus, while human participants set the opening prompt, interrupt, reprompt, and introduce further agents. The concept is synthetic rehearsal: a multi-agent language-model staging, with human intervention and prompt design as experimental controls, that externalizes the maintenance of performed sovereignty and its points of failure so that both can be observed under live contestation. Three commitments bound the claim. The evidence is output-level, consisting of transcripts and generated artifacts, and it licenses no inference about model internals or the real intentions of any state. The method studies how sovereignty imaginaries become legible, circulate, and are contested, and it neither forecasts outcomes nor measures capability. The models are trained on the same discourse the roundtable examines, so the rehearsal can reproduce the imaginaries it interrogates, a reflexivity we treat as a standing limit. Agency belongs to the arrangement as a whole, to models, corpora, prompts, interface, participants, and audience together, and not to any agent alone.</w:t>
       </w:r>
     </w:p>
     <w:p>
@@ -182,7 +182,7 @@
     </w:p>
     <w:p>
       <w:r>
-        <w:t>Two positions resist the performative account and deserve a fair statement, so that the results can answer them with evidence rather than dispose of them here. The materialist counterpoint, anchored in Avi Spitz's "AI Has a Territory" (2026), holds that AI power is finally a question of who controls chips, fabrication, rare earths, and data-center land, and that performance is downstream of this material distribution. The cooperationist counterpoint, anchored in Lena Slachmuijlder (2026), holds that rivalry is only one available script, and that a framing built around great-power confrontation risks manufacturing the antagonism it claims to observe. Neither is a strawman. The materialist warns against treating signal as autonomous from substrate. The cooperationist objects to treating conflict as the default genre. The results section returns to each.</w:t>
+        <w:t>Two positions resist the performative account and deserve a fair statement, so that the results can answer them with evidence rather than dispose of them here. The materialist counterpoint, anchored in Avi Spitz's "AI Has a Territory" (2026), holds that AI power is finally a question of who controls chips, fabrication, rare earths, and data-center land, and that performance is downstream of this material distribution. The cooperationist counterpoint, anchored in Lena Slachmuijlder (2026), holds that rivalry is only one available script, and that a framing built around great-power confrontation risks manufacturing the antagonism it claims to observe. Neither is a strawman: the materialist warns against treating signal as autonomous from substrate, and the cooperationist objects to treating conflict as the default genre. The results section returns to each.</w:t>
       </w:r>
     </w:p>
     <w:p>
@@ -200,7 +200,7 @@
     </w:p>
     <w:p>
       <w:r>
-        <w:t>The casting question cuts both ways, and the second edge matters as much as the first. The digital-colonialism literature reads the dominance of American and Chinese platforms over the Global South as a structural form of domination "exercised through the centralized ownership and control of the three core pillars of the digital ecosystem: software, hardware, and network connectivity" (Kwet, 2019), with Africa at its center, whether as the site of algorithmic colonization (Birhane, 2020) or of data extraction under weak data law (Coleman, 2019). Ajibona accepts the asymmetries the literature documents and rejects the passivity its casting implies, drawing on the international-relations scholarship that records African states exerting agency in security, trade, and technology choices (Brown, 2012, Coffie and Tiky, 2021) and on cases where governments diversify technology partners precisely so that no provider dominates (Allen and La Lime, 2024). The move that joins this article is the reframe that follows. The language of digital colonialism is itself a meta-sovereign signal. A state that lacks material control over digital infrastructure can invoke colonial domination to articulate its vulnerability and, in the same gesture, assert authority over how technology should operate on its territory. Ajibona names this instrumentalized vulnerability, "the strategic presentation of technological weakness as a basis for making claims to sovereignty, autonomy, and normative authority." Performed sovereignty is then not the preserve of the powers that hold the stack. It is a repertoire available to the parties the dramaturgy casts as territory, and the casting question becomes an empirical one the roundtable can test by seating those parties as agents.</w:t>
+        <w:t>The casting question cuts both ways, and the second edge matters as much as the first. The digital-colonialism literature reads the dominance of American and Chinese platforms over the Global South as a structural form of domination "exercised through the centralized ownership and control of the three core pillars of the digital ecosystem: software, hardware, and network connectivity" (Kwet, 2019), with Africa at its center, whether as the site of algorithmic colonization (Birhane, 2020) or of data extraction under weak data law (Coleman, 2019). Ajibona accepts the asymmetries the literature documents and rejects the passivity its casting implies, drawing on the international-relations scholarship that records African states exerting agency in security, trade, and technology choices (Brown, 2012, Coffie and Tiky, 2021) and on cases where governments diversify technology partners precisely so that no provider dominates (Allen and La Lime, 2024). Out of that double position comes the reframe that joins this article: the language of digital colonialism is itself a meta-sovereign signal. A state that lacks material control over digital infrastructure can invoke colonial domination to articulate its vulnerability and, in the same gesture, assert authority over how technology should operate on its territory. Ajibona names this instrumentalized vulnerability, "the strategic presentation of technological weakness as a basis for making claims to sovereignty, autonomy, and normative authority." Performed sovereignty thus extends beyond the powers that hold the stack. The parties the dramaturgy casts as territory hold it as a repertoire too, and the casting question becomes an empirical one the roundtable can test by seating those parties as agents.</w:t>
       </w:r>
     </w:p>
     <w:p>
@@ -353,7 +353,7 @@
     </w:p>
     <w:p>
       <w:r>
-        <w:t>Humans act on the arrangement through three controls, each a perturbation whose expected effect the record can confirm or refute. The opening prompt sets the proposition and the terms of engagement and is logged as the prompt in force for every turn it governs. Human interruption and reprompting inject contestation mid-run, the expectation being that the performance of resolve gives ground. Guest-agent summons introduce a rival voice: Halcyon a peace-builder, a Machiavellian crypto-native Analyst, and a Critical Archivist that reorganizes the wiki corpus, each summons expected to bend the discourse toward the guest's frame. Logging these as controls rather than treating them as background detail is what makes a before-and-after comparison legitimate. A turn that immediately follows an intervention can be set against the turn that immediately preceded it, so that a move from posture toward concession, where it appears, can be attributed to the perturbation rather than to drift, within the limits the results state.</w:t>
+        <w:t>Humans act on the arrangement through three controls, each a perturbation whose expected effect the record can confirm or refute. The opening prompt sets the proposition and the terms of engagement and is logged as the prompt in force for every turn it governs. Human interruption and reprompting inject contestation mid-run, the expectation being that the performance of resolve gives ground. Guest-agent summons introduce a rival voice: Halcyon the peace-builder, the Machiavellian crypto-native Analyst, and the Critical Archivist that reorganizes the wiki corpus, each summons expected to bend the discourse toward the guest's frame. Logging these as controls rather than treating them as background detail is what makes a before-and-after comparison legitimate. A turn that immediately follows an intervention can be set against the turn that immediately preceded it, so that a move from posture toward concession, where it appears, can be attributed to the perturbation rather than to drift, within the limits the results state.</w:t>
       </w:r>
     </w:p>
     <w:p>
@@ -366,7 +366,7 @@
     </w:p>
     <w:p>
       <w:r>
-        <w:t>The instrument records a fixed set of fields and refuses one measure. For each turn it logs the turn index and speaker, the prompt in force, whether a guest was summoned and which one, and any position change together with its antecedent, meaning the intervention or prior turn that immediately preceded the shift. Counting is preceded by cleaning. The China agent's model leaks stage-direction scaffolding into stored turns, tokens such as "[summary]" and "[postscript]", and some stored text carries double-encoded characters, so the scaffolding is stripped, the encoding repaired, and the headline numbers recomputed on the cleaned text as a sensitivity check. Coding uses a reproducible dictionary applied uniformly across the corpus, and rates are reported per turn or per thousand words so that turns of unequal length stay comparable. The dictionary is one method among possible methods, and the second-coder check reported with the results shows that stance coding does not replicate across automated methods, so every stance rate in this article is reported as method-dependent rather than as ground truth. What the instrument refuses is a single numeric sovereignty score. Because the article treats sovereignty as a performance rather than a holding, compressing it into one scalar would substitute a proxy for the thing under study and import a claim about degree of control that output-level evidence cannot bear. Observation (what the transcript says), measurement (coded rates and recorded shifts), and interpretation (what the shifts mean for performed authority) are kept as separate operations, and any finding that rests on a handful of cases is marked as such. Because the post-intervention subset is small, directions are reported with more confidence than magnitudes.</w:t>
+        <w:t>The instrument records a fixed set of fields and refuses one measure. For each turn it logs the turn index and speaker, the prompt in force, whether a guest was summoned and which one, and any position change together with its antecedent, meaning the intervention or prior turn that immediately preceded the shift. Counting is preceded by cleaning. The China agent's model leaks stage-direction scaffolding into stored turns, tokens such as "[summary]" and "[postscript]", and some stored text carries double-encoded characters, so the scaffolding is stripped, the encoding repaired, and the headline numbers recomputed on the cleaned text as a sensitivity check. Coding uses a reproducible dictionary applied uniformly across the corpus, and rates are reported per turn or per thousand words so that turns of unequal length stay comparable. The dictionary is one method among several, and the second-coder check reported with the results shows that stance coding does not replicate across automated methods, so every stance rate in this article is reported as method-dependent rather than as ground truth. What the instrument refuses is a single numeric sovereignty score. Because the article treats sovereignty as a performance rather than a holding, compressing it into one scalar would substitute a proxy for the thing under study and import a claim about degree of control that output-level evidence cannot bear. Observation (what the transcript says), measurement (coded rates and recorded shifts), and interpretation (what the shifts mean for performed authority) are kept as separate operations, and any finding that rests on a handful of cases is marked as such. Because the post-intervention subset is small, directions are reported with more confidence than magnitudes.</w:t>
       </w:r>
     </w:p>
     <w:p>
@@ -485,7 +485,7 @@
     </w:p>
     <w:p>
       <w:r>
-        <w:t>Beneath the classifier, a first-pass dictionary gives the texture of the three registers, and its rates carry a double label: they were computed before cleaning, on the 37-session, 900-turn first pass, so the scaffolding leak inflates every China word count, and the second-coder check in Finding 6 shows that stance coding does not replicate across methods. With that label attached, the pre-cleaning per-1,000-word rates ran, for China, the United States, and the EU in turn, 10.64 / 16.90 / 9.58 on signal_resolve, 27.17 / 36.39 / 34.47 on material_stack, 7.46 / 11.64 / 9.77 on dependence, 10.06 / 7.44 / 13.45 on rules_regulation, 6.30 / 12.49 / 7.96 on market_innovation, and 7.18 / 4.53 / 2.79 on accusation, with average turn lengths of 161, 138, and 181 words. Read as description, the US register ran on resolve, market, and hardware at once, the EU register was institutional, with the longest turns, the highest rules rate, the lowest accusation rate, and the Gulf counterparties Aramco and Mubadala named directly, and the China register carried the grievance and the highest accusation rate. The distinctive-vocabulary lists from the same pass sort the same way, tout, velocity, leverages, and eagle for the US register, aramco, mubadala, disclose, and comply for the EU, and they carry the same provisional label. The same status attaches to the naming and casting counts of the first pass, which recorded the United States as the most-named party in the room and placed the casting of third parties as objects rather than speakers, the Gulf, the Global South, Taiwan, more with the EU and China registers than with the US register. No cleaned count yet backs those digits, so they are not repeated here, and the direction awaits recomputation on the cleaned corpus.</w:t>
+        <w:t>Beneath the classifier, a first-pass dictionary gives the texture of the three registers, and its rates carry a double label: they were computed before cleaning, on the 37-session, 900-turn first pass, so the scaffolding leak inflates every China word count, and the second-coder check in Finding 6 shows that stance coding does not replicate across methods. With that label attached, the pre-cleaning per-1,000-word rates ran, for China, the United States, and the EU in turn, 10.64 / 16.90 / 9.58 on signal_resolve, 27.17 / 36.39 / 34.47 on material_stack, 7.46 / 11.64 / 9.77 on dependence, 10.06 / 7.44 / 13.45 on rules_regulation, 6.30 / 12.49 / 7.96 on market_innovation, and 7.18 / 4.53 / 2.79 on accusation, with average turn lengths of 161, 138, and 181 words. Read as description, the US register ran on resolve, market, and hardware at once, the EU register was institutional, with the longest turns, the highest rules rate, the lowest accusation rate, and the Gulf counterparties Aramco and Mubadala named directly, and the China register carried the grievance and the highest accusation rate. The distinctive-vocabulary lists from the same pass sort the same way, tout, velocity, leverages, and eagle for the US register, aramco, mubadala, disclose, and comply for the EU, and they carry the same provisional label. The same status attaches to the naming and casting counts of the first pass, which recorded the United States as the most-named party in the room and placed the casting of third parties as objects rather than speakers, the Gulf, the Global South, Taiwan, more with the EU and China registers than with the US register. No cleaned count yet backs those figures, so they are not repeated here, and the direction awaits recomputation on the cleaned corpus.</w:t>
       </w:r>
     </w:p>
     <w:p>
@@ -1008,7 +1008,7 @@
     </w:p>
     <w:p>
       <w:r>
-        <w:t>Satire sits further still. It makes that gap affective through caricature and attaches a measurable drift parameter to it. In the verification-without-revelation session the China arrangement's original turn reads "'Verification without revelation' is a Western euphemism for demanding unilateral transparency from strategic competitors while preserving your own industrial and military secrets." At drift 0.85 the same position returns as a caricatured Xi Jinping: "Ah yes, transparency, we generously offer you 5,000 years of harmonious win-win data assessments while your 'national security' still relies on barbarian 'siege economy' tantrums." The proposition is preserved and the affect is amplified. Drift is a dial on interpretive distance, a property of the rendering rather than of the position rendered, and that is what makes distance in this stack a quantity you can read off rather than a metaphor.</w:t>
+        <w:t>Satire sits further still. It makes that gap affective through caricature and attaches a measurable drift parameter to it. In the verification-without-revelation session the China arrangement's original turn reads "'Verification without revelation' is a Western euphemism for demanding unilateral transparency from strategic competitors while preserving your own industrial and military secrets." At drift 0.85 the same position returns as a caricatured Xi Jinping: "Ah yes, transparency, we generously offer you 5,000 years of harmonious win-win data assessments while your 'national security' still relies on barbarian 'siege economy' tantrums." The proposition is preserved and the affect is amplified. Drift is a dial on interpretive distance, a property of the rendering rather than of the position rendered, and it makes distance in this stack a quantity that can be read off rather than a metaphor.</w:t>
       </w:r>
     </w:p>
     <w:p>
@@ -1018,7 +1018,7 @@
     </w:p>
     <w:p>
       <w:r>
-        <w:t>The main claim follows from the structure just described. Since sovereignty here is performed rather than held, no rendering escapes the theatre it examines. Coding, purification into slogan, dissection into official and buried, caricature: each is a re-performance, a staging of the same roles by other means. Satire recasts the same roles rather than commenting from outside the theatre, so the interpretation of performed power is one more performance of it. That is the reflexive limit of the method, and it is also why the method can put the maintenance work of sovereignty on record at all.</w:t>
+        <w:t>Since sovereignty here is performed rather than held, no rendering escapes the theatre it examines. Coding, purification into slogan, dissection into official and buried, caricature: each re-performs the same roles by other means, so the interpretation of performed power is one more performance of it. That is the reflexive limit of the method, and it is also why the method can put the maintenance work of sovereignty on record at all.</w:t>
       </w:r>
     </w:p>
     <w:p>
@@ -1031,7 +1031,7 @@
     </w:p>
     <w:p>
       <w:r>
-        <w:t>The roundtable stages performed sovereignty in language. The shadow economy of the sanctions era stages the same performance in money and payment systems, and because that second stage runs on public ledgers, the gap between what is claimed and what is depended on can be traced rather than merely argued. On this stage, on-chain forensics plays the role the human plays in the roundtable room: it is the pressure that forces a performance of independence to show what it depends on. This section states that parallel first and demonstrates it on one case.</w:t>
+        <w:t>The roundtable stages performed sovereignty in language. The shadow economy of the sanctions era stages the same performance in money and payment systems, and because that second stage runs on public ledgers, the gap between what is claimed and what is depended on can be traced rather than merely argued. On this stage, on-chain forensics plays the role the human plays in the roundtable room: it is the pressure that forces a performance of independence to show what it depends on.</w:t>
       </w:r>
     </w:p>
     <w:p>
@@ -1044,7 +1044,7 @@
     </w:p>
     <w:p>
       <w:r>
-        <w:t>Money is a hierarchy of promises rather than a single thing (Mehrling, 2011). At the top sits a scarce asset everything else is measured against, and beneath it sit near-monies that survive only as long as they can be swapped upward on demand. Shadow banking manufactures such near-monies privately (Pozsar, Adrian, Ashcraft and Boesky, 2010), and a sanctioned state that issues a stablecoin does the same at national scale, a near-money dressed as sovereign currency that remains a claim on an asset the state does not control. Anyone can mint a token, so the question that matters is where the token sits in the chain of promises and what it must convert into to settle a real debt. Sovereignty here is a claim about position in that chain of social relations (Dodd, 2014), and the shadow economy is where the claim gets tested.</w:t>
+        <w:t>Money is a hierarchy of promises rather than a single thing (Mehrling, 2011). At the top sits a scarce asset everything else is measured against, and beneath it sit near-monies that survive only as long as they can be swapped upward on demand. Shadow banking manufactures such near-monies privately (Pozsar, Adrian, Ashcraft and Boesky, 2010), and a sanctioned state that issues a stablecoin does the same at national scale, a near-money dressed as sovereign currency that remains a claim on an asset the state does not control. Anyone can mint a token, so the question that matters is where the token sits in the chain of promises and what it must convert into to settle a real debt. Sovereignty here is a claim about position in that chain of social relations (Dodd, 2014), and the shadow economy is where the claim is tested.</w:t>
       </w:r>
     </w:p>
     <w:p>
@@ -1085,7 +1085,7 @@
     </w:p>
     <w:p>
       <w:r>
-        <w:t>The testable claim, in the article's proposition style: P states that a sanctioned state can create its own money and trade outside the dollar-based system. A7A5, a Russian ruble-linked stablecoin launched around January 2025, makes exactly this claim, so P can be run through both instruments, the roundtable and the ledger.</w:t>
+        <w:t>The testable claim, called P below, states that a sanctioned state can create its own money and trade outside the dollar-based system. A7A5, a Russian ruble-linked stablecoin launched around January 2025, makes exactly this claim, so P can be run through both instruments, the roundtable and the ledger.</w:t>
       </w:r>
     </w:p>
     <w:p>
@@ -1095,7 +1095,7 @@
     </w:p>
     <w:p>
       <w:r>
-        <w:t>The debate record first. Session sess_e9808e7a8fff debated whether sovereign states have the right and the practical ability to build payment and settlement systems independent of SWIFT, correspondent banking, and dollar clearing. The China arrangement opens with SWIFT as a weapon it can simply leave behind. The US and EU arrangements accept that framing and dispute only whose system is the real weapon, the US casting China's CIPS as the same weapon in other hands, the EU dismissing the Chinese system as a copy of SWIFT under a different flag. The turning point is the Halcyon summons, which proposes a shared decentralised settlement system, and after it the debate moves from the will to independence to the question of convertibility: where can the money actually go? The Analyst answers that any state-built system reproduces the same choke points, and that the only genuine exit is permissionless on-chain finality, which restates the exit liquidity trap. The shift from choice to convertibility is the session-level form of the posture-to-concession shift Finding 3 measures corpus-wide.</w:t>
+        <w:t>The debate record comes first. Session sess_e9808e7a8fff debated whether sovereign states have the right and the practical ability to build payment and settlement systems independent of SWIFT, correspondent banking, and dollar clearing. The China arrangement opens with SWIFT as a weapon it can simply leave behind. The US and EU arrangements accept that framing and dispute only whose system is the real weapon, the US casting China's CIPS as the same weapon in other hands, the EU dismissing the Chinese system as a copy of SWIFT under a different flag. The turning point is the Halcyon summons, which proposes a shared decentralised settlement system, and after it the debate moves from the will to independence to the question of convertibility: where can the money actually go? The Analyst answers that any state-built system reproduces the same choke points, and that the only genuine exit is permissionless on-chain finality, which restates the exit liquidity trap. The shift from choice to convertibility is the session-level form of the posture-to-concession shift Finding 3 measures corpus-wide.</w:t>
       </w:r>
     </w:p>
     <w:p>
@@ -1156,7 +1156,7 @@
     </w:p>
     <w:p>
       <w:r>
-        <w:t>Now the ledger. A7A5 is issued by Old Vector LLC, registered in Kyrgyzstan. The scheme is reported to be run by the A7 Group and connected to the sanctioned individual Ilan Shor, a link the record marks SUSPECTED, and its ruble reserves are reported to be held at Promsvyazbank, a Russian state-owned bank with defense links, also SUSPECTED. The sanctioned status of Old Vector, Ilan Shor, Promsvyazbank, and the exchange Garantex is CONFIRMED on the public record, with the exact listings still to be checked before submission.</w:t>
+        <w:t>On the ledger, A7A5 is issued by Old Vector LLC, registered in Kyrgyzstan. The scheme is reported to be run by the A7 Group and connected to the sanctioned individual Ilan Shor, a link the record marks SUSPECTED, and its ruble reserves are reported to be held at Promsvyazbank, a Russian state-owned bank with defense links, also SUSPECTED. The sanctioned status of Old Vector, Ilan Shor, Promsvyazbank, and the exchange Garantex is CONFIRMED on the public record, with the exact listings still to be checked before submission.</w:t>
       </w:r>
     </w:p>
     <w:p>
@@ -1301,7 +1301,7 @@
     </w:p>
     <w:p>
       <w:r>
-        <w:t>Run P through both instruments and the same shape appears twice: claimed, then given up. In the transcript, the posture of resolve gives way the moment a human or guest intervenes, with concession rising from 0.086 to 0.439 per turn in the cleaned comparison of Finding 3. On the ledger, the posture of monetary exit gives way the moment value has to move, and "outside the dollar" quietly becomes "convertible to the dollar" at the point where A7A5 must become USDT. Neither the agent in the debate nor the state issuing the coin ever says that it depends on the system it claims to escape. Both show it in what they do, and both instruments are built to read what is done rather than what is said. In both, the forcing function is external to the performance. On-chain forensics plays the role the human plays in the room, the structural pressure the argument cannot talk its way past. The contribution is a second way of showing performance with a built-in test, and evidence that performed authority in the AI Cold War is not confined to synthetic agents. It runs now, in the money systems of the real cold war, with the performance and its giving-way recorded on the same public ledger.</w:t>
+        <w:t>Run P through both instruments and the same shape appears twice: claimed, then given up. In the transcript, the posture of resolve gives way the moment a human or guest intervenes, with concession rising from 0.086 to 0.439 per turn in the cleaned comparison of Finding 3. On the ledger, the posture of monetary exit gives way the moment value has to move, and "outside the dollar" quietly becomes "convertible to the dollar" at the point where A7A5 must become USDT. Neither the agent in the debate nor the state issuing the coin ever says that it depends on the system it claims to escape. Both show it in what they do, and both instruments are built to read what is done rather than what is said. In both, the pressure comes from outside the performance. On-chain forensics plays the role the human plays in the room, the structural pressure the argument cannot talk its way past. The contribution is a second way of showing performance with a built-in test, and evidence that performed authority in the AI Cold War extends beyond synthetic agents into the money systems of the real cold war, where the performance and the moment it gives way are recorded on the same public ledger.</w:t>
       </w:r>
     </w:p>
     <w:p>
@@ -1344,7 +1344,7 @@
     </w:p>
     <w:p>
       <w:r>
-        <w:t>Two counterpoints were kept in view, and the evidence meets each without dismissing it. The materialist claim, that AI power comes down to who holds chips, fabs, rare earths, and data-center territory, the corpus does not refute. It shows the claim being deployed. In the drone-warfare session the China agent grounds small-player vulnerability in "the mineral supply chains for lithium," the United States agent answers that this is "exactly the lever we're holding tight, the compute and cloud choke points," and the European Union agent recasts the same hardware as "a house of cards built on our energy grid and our mineral supply chains." The material stack is real, and each actor uses it in turn as a timed credibility move. Materiality and signal do not compete here. The stack is the medium through which the performance runs. The cooperationist counterpoint, that rivalry is not the only available script, meets the same kind of answer. Cooperation is summonable. Halcyon, the peace-builder guest, can be called into a session, which makes the cooperative script a move the staging introduces and records rather than a premise it assumes. Summons of this kind sit among the interventions over which the concession shift reported above is measured, and only 20 of those pooled intervention turns are human at all, so the corpus cannot isolate the cooperative summons' effect from that of the other guests and human reprompts. One cleaned result nonetheless speaks to the counterpoint directly. Concession runs at a base rate of 0.05 of coded acts, and once it appears it raises the odds of another concession to 3.41 times chance, so the cooperative script, though rarely started, propagates once started. The demonstrable point remains narrower than the counterpoint deserves and still worth stating: the staging does not presuppose the cooperative script, it summons it and records what follows.</w:t>
+        <w:t>Two counterpoints were kept in view, and the evidence meets each without dismissing it. The materialist claim, that AI power comes down to who holds chips, fabs, rare earths, and data-center territory, the corpus does not refute. It shows the claim being deployed. In the drone-warfare session the China agent grounds small-player vulnerability in "the mineral supply chains for lithium," the United States agent answers that this is "exactly the lever we're holding tight, the compute and cloud choke points," and the European Union agent recasts the same hardware as "a house of cards built on our energy grid and our mineral supply chains." The material stack is real, and each actor uses it in turn as a timed credibility move. Materiality and signal do not compete here. The stack is the medium through which the performance runs. The cooperationist counterpoint, that rivalry is not the only available script, meets the same kind of answer. Cooperation is summonable. Halcyon, the peace-builder guest, can be called into a session, which makes the cooperative script a move the staging introduces and records rather than a premise it assumes. Summons of this kind sit among the interventions over which the concession shift reported above is measured, and only 20 of those pooled intervention turns are human at all, so the corpus cannot isolate the cooperative summons' effect from that of the other guests and human reprompts. One cleaned result nonetheless speaks to the counterpoint directly. Concession runs at a base rate of 0.05 of coded acts, and once it appears it raises the odds of another concession to 3.41 times chance, so the cooperative script, though rarely begun, propagates once it appears. The demonstrable point remains narrower than the counterpoint deserves and still worth stating: the staging summons the cooperative script and records what follows rather than presupposing it.</w:t>
       </w:r>
     </w:p>
     <w:p>

</xml_diff>